<commit_message>
Feito da aula 8 ate a 13
</commit_message>
<xml_diff>
--- a/Javascript.docx
+++ b/Javascript.docx
@@ -696,7 +696,7 @@
           <w:sz w:val="28"/>
           <w:szCs w:val="36"/>
         </w:rPr>
-        <w:t>Todos os elementos da página, tendo uma hierarquia que o DOM cria uma arvore de referencia dos elementos(</w:t>
+        <w:t xml:space="preserve">Todos os elementos da página, tendo uma hierarquia que o DOM cria uma arvore de </w:t>
       </w:r>
       <w:proofErr w:type="spellStart"/>
       <w:r>
@@ -704,6 +704,22 @@
           <w:sz w:val="28"/>
           <w:szCs w:val="36"/>
         </w:rPr>
+        <w:t>referencia</w:t>
+      </w:r>
+      <w:proofErr w:type="spellEnd"/>
+      <w:r>
+        <w:rPr>
+          <w:sz w:val="28"/>
+          <w:szCs w:val="36"/>
+        </w:rPr>
+        <w:t xml:space="preserve"> dos elementos(</w:t>
+      </w:r>
+      <w:proofErr w:type="spellStart"/>
+      <w:r>
+        <w:rPr>
+          <w:sz w:val="28"/>
+          <w:szCs w:val="36"/>
+        </w:rPr>
         <w:t>innerHTML,innerTest</w:t>
       </w:r>
       <w:proofErr w:type="spellEnd"/>
@@ -728,33 +744,3207 @@
           <w:sz w:val="28"/>
           <w:szCs w:val="36"/>
         </w:rPr>
-        <w:t xml:space="preserve"> nesta arvore </w:t>
+        <w:t xml:space="preserve"> nesta arvore que o Browser usa para poder desenhar os elementos desta página. E o </w:t>
+      </w:r>
+      <w:proofErr w:type="spellStart"/>
+      <w:r>
+        <w:rPr>
+          <w:sz w:val="28"/>
+          <w:szCs w:val="36"/>
+        </w:rPr>
+        <w:t>javascript</w:t>
+      </w:r>
+      <w:proofErr w:type="spellEnd"/>
+      <w:r>
+        <w:rPr>
+          <w:sz w:val="28"/>
+          <w:szCs w:val="36"/>
+        </w:rPr>
+        <w:t xml:space="preserve"> consegue enxergar essa arvore e usar os elementos </w:t>
+      </w:r>
+    </w:p>
+    <w:p>
+      <w:pPr>
+        <w:rPr>
+          <w:color w:val="FF0000"/>
+          <w:sz w:val="36"/>
+          <w:szCs w:val="36"/>
+        </w:rPr>
+      </w:pPr>
+      <w:r>
+        <w:rPr>
+          <w:color w:val="FF0000"/>
+          <w:sz w:val="36"/>
+          <w:szCs w:val="36"/>
+        </w:rPr>
+        <w:t xml:space="preserve">Vídeo </w:t>
+      </w:r>
+      <w:r>
+        <w:rPr>
+          <w:color w:val="FF0000"/>
+          <w:sz w:val="36"/>
+          <w:szCs w:val="36"/>
+        </w:rPr>
+        <w:t>8.</w:t>
+      </w:r>
+    </w:p>
+    <w:p>
+      <w:pPr>
+        <w:rPr>
+          <w:sz w:val="28"/>
+          <w:szCs w:val="36"/>
+        </w:rPr>
+      </w:pPr>
+      <w:r>
+        <w:rPr>
+          <w:sz w:val="28"/>
+          <w:szCs w:val="36"/>
+        </w:rPr>
+        <w:t>Operadores lógicos.</w:t>
+      </w:r>
+    </w:p>
+    <w:p>
+      <w:pPr>
+        <w:rPr>
+          <w:sz w:val="28"/>
+          <w:szCs w:val="36"/>
+        </w:rPr>
+      </w:pPr>
+      <w:r>
+        <w:rPr>
+          <w:sz w:val="28"/>
+          <w:szCs w:val="36"/>
+        </w:rPr>
+        <w:t xml:space="preserve">&amp;&amp; = E ou </w:t>
+      </w:r>
+      <w:proofErr w:type="spellStart"/>
+      <w:r>
+        <w:rPr>
+          <w:sz w:val="28"/>
+          <w:szCs w:val="36"/>
+        </w:rPr>
+        <w:t>and</w:t>
+      </w:r>
+      <w:proofErr w:type="spellEnd"/>
+    </w:p>
+    <w:p>
+      <w:pPr>
+        <w:rPr>
+          <w:sz w:val="28"/>
+          <w:szCs w:val="36"/>
+        </w:rPr>
+      </w:pPr>
+      <w:r>
+        <w:rPr>
+          <w:sz w:val="28"/>
+          <w:szCs w:val="36"/>
+        </w:rPr>
+        <w:t xml:space="preserve">|| = Ou </w:t>
+      </w:r>
+      <w:proofErr w:type="spellStart"/>
+      <w:r>
+        <w:rPr>
+          <w:sz w:val="28"/>
+          <w:szCs w:val="36"/>
+        </w:rPr>
+        <w:t>ou</w:t>
+      </w:r>
+      <w:proofErr w:type="spellEnd"/>
+      <w:r>
+        <w:rPr>
+          <w:sz w:val="28"/>
+          <w:szCs w:val="36"/>
+        </w:rPr>
+        <w:t xml:space="preserve"> </w:t>
+      </w:r>
+      <w:proofErr w:type="spellStart"/>
+      <w:r>
+        <w:rPr>
+          <w:sz w:val="28"/>
+          <w:szCs w:val="36"/>
+        </w:rPr>
+        <w:t>or</w:t>
+      </w:r>
+      <w:proofErr w:type="spellEnd"/>
+    </w:p>
+    <w:p>
+      <w:pPr>
+        <w:rPr>
+          <w:sz w:val="28"/>
+          <w:szCs w:val="36"/>
+        </w:rPr>
+      </w:pPr>
+      <w:r>
+        <w:rPr>
+          <w:sz w:val="28"/>
+          <w:szCs w:val="36"/>
+        </w:rPr>
+        <w:t xml:space="preserve">! = não ou </w:t>
+      </w:r>
+      <w:proofErr w:type="spellStart"/>
+      <w:r>
+        <w:rPr>
+          <w:sz w:val="28"/>
+          <w:szCs w:val="36"/>
+        </w:rPr>
+        <w:t>not</w:t>
+      </w:r>
+      <w:proofErr w:type="spellEnd"/>
+      <w:r>
+        <w:rPr>
+          <w:sz w:val="28"/>
+          <w:szCs w:val="36"/>
+        </w:rPr>
+        <w:t xml:space="preserve"> </w:t>
+      </w:r>
+    </w:p>
+    <w:p>
+      <w:pPr>
+        <w:rPr>
+          <w:color w:val="FF0000"/>
+          <w:sz w:val="36"/>
+          <w:szCs w:val="36"/>
+        </w:rPr>
+      </w:pPr>
+      <w:r>
+        <w:rPr>
+          <w:color w:val="FF0000"/>
+          <w:sz w:val="36"/>
+          <w:szCs w:val="36"/>
+        </w:rPr>
+        <w:t xml:space="preserve">Vídeo </w:t>
+      </w:r>
+      <w:r>
+        <w:rPr>
+          <w:color w:val="FF0000"/>
+          <w:sz w:val="36"/>
+          <w:szCs w:val="36"/>
+        </w:rPr>
+        <w:t>9.</w:t>
+      </w:r>
+    </w:p>
+    <w:p>
+      <w:pPr>
+        <w:rPr>
+          <w:sz w:val="28"/>
+          <w:szCs w:val="36"/>
+        </w:rPr>
+      </w:pPr>
+      <w:proofErr w:type="spellStart"/>
+      <w:r>
+        <w:rPr>
+          <w:sz w:val="28"/>
+          <w:szCs w:val="36"/>
+        </w:rPr>
+        <w:t>Bitewise</w:t>
+      </w:r>
+      <w:proofErr w:type="spellEnd"/>
+      <w:r>
+        <w:rPr>
+          <w:sz w:val="28"/>
+          <w:szCs w:val="36"/>
+        </w:rPr>
+        <w:t xml:space="preserve">: Pega o valor binário do número e vê se tem alguma equivalência. </w:t>
+      </w:r>
+    </w:p>
+    <w:p>
+      <w:pPr>
+        <w:shd w:val="clear" w:color="auto" w:fill="21222C"/>
+        <w:spacing w:after="240" w:line="240" w:lineRule="auto"/>
+        <w:rPr>
+          <w:rFonts w:eastAsia="Times New Roman" w:cstheme="minorHAnsi"/>
+          <w:sz w:val="20"/>
+          <w:szCs w:val="20"/>
+          <w:lang w:eastAsia="pt-BR"/>
+        </w:rPr>
+      </w:pPr>
+      <w:r>
+        <w:rPr>
+          <w:rFonts w:eastAsia="Times New Roman" w:cstheme="minorHAnsi"/>
+          <w:b/>
+          <w:bCs/>
+          <w:sz w:val="20"/>
+          <w:szCs w:val="20"/>
+          <w:lang w:eastAsia="pt-BR"/>
+        </w:rPr>
+        <w:t>Valores iniciais</w:t>
+      </w:r>
+    </w:p>
+    <w:p>
+      <w:pPr>
+        <w:numPr>
+          <w:ilvl w:val="0"/>
+          <w:numId w:val="1"/>
+        </w:numPr>
+        <w:shd w:val="clear" w:color="auto" w:fill="21222C"/>
+        <w:spacing w:before="100" w:beforeAutospacing="1" w:after="100" w:afterAutospacing="1" w:line="240" w:lineRule="auto"/>
+        <w:rPr>
+          <w:rFonts w:eastAsia="Times New Roman" w:cstheme="minorHAnsi"/>
+          <w:sz w:val="20"/>
+          <w:szCs w:val="20"/>
+          <w:lang w:eastAsia="pt-BR"/>
+        </w:rPr>
+      </w:pPr>
+      <w:r>
+        <w:rPr>
+          <w:rFonts w:eastAsia="Times New Roman" w:cstheme="minorHAnsi"/>
+          <w:sz w:val="18"/>
+          <w:szCs w:val="18"/>
+          <w:bdr w:val="none" w:sz="0" w:space="0" w:color="auto" w:frame="1"/>
+          <w:lang w:eastAsia="pt-BR"/>
+        </w:rPr>
+        <w:t>n1 = 10</w:t>
+      </w:r>
+      <w:r>
+        <w:rPr>
+          <w:rFonts w:eastAsia="Times New Roman" w:cstheme="minorHAnsi"/>
+          <w:sz w:val="20"/>
+          <w:szCs w:val="20"/>
+          <w:lang w:eastAsia="pt-BR"/>
+        </w:rPr>
+        <w:t> → binário: </w:t>
+      </w:r>
+      <w:r>
+        <w:rPr>
+          <w:rFonts w:eastAsia="Times New Roman" w:cstheme="minorHAnsi"/>
+          <w:sz w:val="18"/>
+          <w:szCs w:val="18"/>
+          <w:bdr w:val="none" w:sz="0" w:space="0" w:color="auto" w:frame="1"/>
+          <w:lang w:eastAsia="pt-BR"/>
+        </w:rPr>
+        <w:t>1010</w:t>
+      </w:r>
+    </w:p>
+    <w:p>
+      <w:pPr>
+        <w:numPr>
+          <w:ilvl w:val="0"/>
+          <w:numId w:val="1"/>
+        </w:numPr>
+        <w:shd w:val="clear" w:color="auto" w:fill="21222C"/>
+        <w:spacing w:before="100" w:beforeAutospacing="1" w:after="100" w:afterAutospacing="1" w:line="240" w:lineRule="auto"/>
+        <w:rPr>
+          <w:rFonts w:eastAsia="Times New Roman" w:cstheme="minorHAnsi"/>
+          <w:sz w:val="20"/>
+          <w:szCs w:val="20"/>
+          <w:lang w:eastAsia="pt-BR"/>
+        </w:rPr>
+      </w:pPr>
+      <w:r>
+        <w:rPr>
+          <w:rFonts w:eastAsia="Times New Roman" w:cstheme="minorHAnsi"/>
+          <w:sz w:val="18"/>
+          <w:szCs w:val="18"/>
+          <w:bdr w:val="none" w:sz="0" w:space="0" w:color="auto" w:frame="1"/>
+          <w:lang w:eastAsia="pt-BR"/>
+        </w:rPr>
+        <w:t>n2 = 11</w:t>
+      </w:r>
+      <w:r>
+        <w:rPr>
+          <w:rFonts w:eastAsia="Times New Roman" w:cstheme="minorHAnsi"/>
+          <w:sz w:val="20"/>
+          <w:szCs w:val="20"/>
+          <w:lang w:eastAsia="pt-BR"/>
+        </w:rPr>
+        <w:t> → binário: </w:t>
+      </w:r>
+      <w:r>
+        <w:rPr>
+          <w:rFonts w:eastAsia="Times New Roman" w:cstheme="minorHAnsi"/>
+          <w:sz w:val="18"/>
+          <w:szCs w:val="18"/>
+          <w:bdr w:val="none" w:sz="0" w:space="0" w:color="auto" w:frame="1"/>
+          <w:lang w:eastAsia="pt-BR"/>
+        </w:rPr>
+        <w:t>1011</w:t>
+      </w:r>
+    </w:p>
+    <w:p>
+      <w:pPr>
+        <w:spacing w:after="0" w:line="240" w:lineRule="auto"/>
+        <w:rPr>
+          <w:rFonts w:eastAsia="Times New Roman" w:cstheme="minorHAnsi"/>
+          <w:sz w:val="24"/>
+          <w:szCs w:val="24"/>
+          <w:lang w:eastAsia="pt-BR"/>
+        </w:rPr>
+      </w:pPr>
+      <w:r>
+        <w:rPr>
+          <w:rFonts w:eastAsia="Times New Roman" w:cstheme="minorHAnsi"/>
+          <w:sz w:val="24"/>
+          <w:szCs w:val="24"/>
+          <w:lang w:eastAsia="pt-BR"/>
+        </w:rPr>
+        <w:pict w14:anchorId="7BCFC340">
+          <v:rect id="_x0000_i1025" style="width:0;height:1.5pt" o:hralign="center" o:hrstd="t" o:hr="t" fillcolor="#a0a0a0" stroked="f"/>
+        </w:pict>
+      </w:r>
+    </w:p>
+    <w:p>
+      <w:pPr>
+        <w:shd w:val="clear" w:color="auto" w:fill="21222C"/>
+        <w:spacing w:after="120" w:line="240" w:lineRule="auto"/>
+        <w:outlineLvl w:val="2"/>
+        <w:rPr>
+          <w:rFonts w:eastAsia="Times New Roman" w:cstheme="minorHAnsi"/>
+          <w:b/>
+          <w:bCs/>
+          <w:sz w:val="20"/>
+          <w:szCs w:val="20"/>
+          <w:lang w:eastAsia="pt-BR"/>
+        </w:rPr>
+      </w:pPr>
+      <w:r>
+        <w:rPr>
+          <w:rFonts w:eastAsia="Times New Roman" w:cstheme="minorHAnsi"/>
+          <w:b/>
+          <w:bCs/>
+          <w:sz w:val="20"/>
+          <w:szCs w:val="20"/>
+          <w:lang w:eastAsia="pt-BR"/>
+        </w:rPr>
+        <w:t>1) </w:t>
+      </w:r>
+      <w:proofErr w:type="spellStart"/>
+      <w:r>
+        <w:rPr>
+          <w:rFonts w:eastAsia="Times New Roman" w:cstheme="minorHAnsi"/>
+          <w:b/>
+          <w:bCs/>
+          <w:sz w:val="18"/>
+          <w:szCs w:val="18"/>
+          <w:bdr w:val="none" w:sz="0" w:space="0" w:color="auto" w:frame="1"/>
+          <w:lang w:eastAsia="pt-BR"/>
+        </w:rPr>
+        <w:t>let</w:t>
+      </w:r>
+      <w:proofErr w:type="spellEnd"/>
+      <w:r>
+        <w:rPr>
+          <w:rFonts w:eastAsia="Times New Roman" w:cstheme="minorHAnsi"/>
+          <w:b/>
+          <w:bCs/>
+          <w:sz w:val="18"/>
+          <w:szCs w:val="18"/>
+          <w:bdr w:val="none" w:sz="0" w:space="0" w:color="auto" w:frame="1"/>
+          <w:lang w:eastAsia="pt-BR"/>
+        </w:rPr>
+        <w:t xml:space="preserve"> res = n1 &amp; n2</w:t>
+      </w:r>
+      <w:r>
+        <w:rPr>
+          <w:rFonts w:eastAsia="Times New Roman" w:cstheme="minorHAnsi"/>
+          <w:b/>
+          <w:bCs/>
+          <w:sz w:val="20"/>
+          <w:szCs w:val="20"/>
+          <w:lang w:eastAsia="pt-BR"/>
+        </w:rPr>
+        <w:t> </w:t>
+      </w:r>
+      <w:r>
+        <w:rPr>
+          <w:rFonts w:ascii="Segoe UI Emoji" w:eastAsia="Times New Roman" w:hAnsi="Segoe UI Emoji" w:cs="Segoe UI Emoji"/>
+          <w:b/>
+          <w:bCs/>
+          <w:sz w:val="20"/>
+          <w:szCs w:val="20"/>
+          <w:lang w:eastAsia="pt-BR"/>
+        </w:rPr>
+        <w:t>🔧</w:t>
+      </w:r>
+    </w:p>
+    <w:p>
+      <w:pPr>
+        <w:numPr>
+          <w:ilvl w:val="0"/>
+          <w:numId w:val="2"/>
+        </w:numPr>
+        <w:shd w:val="clear" w:color="auto" w:fill="21222C"/>
+        <w:spacing w:before="100" w:beforeAutospacing="1" w:after="100" w:afterAutospacing="1" w:line="240" w:lineRule="auto"/>
+        <w:rPr>
+          <w:rFonts w:eastAsia="Times New Roman" w:cstheme="minorHAnsi"/>
+          <w:sz w:val="20"/>
+          <w:szCs w:val="20"/>
+          <w:lang w:val="en-US" w:eastAsia="pt-BR"/>
+        </w:rPr>
+      </w:pPr>
+      <w:proofErr w:type="spellStart"/>
+      <w:r>
+        <w:rPr>
+          <w:rFonts w:eastAsia="Times New Roman" w:cstheme="minorHAnsi"/>
+          <w:b/>
+          <w:bCs/>
+          <w:sz w:val="20"/>
+          <w:szCs w:val="20"/>
+          <w:lang w:val="en-US" w:eastAsia="pt-BR"/>
+        </w:rPr>
+        <w:t>Operador</w:t>
+      </w:r>
+      <w:proofErr w:type="spellEnd"/>
+      <w:r>
+        <w:rPr>
+          <w:rFonts w:eastAsia="Times New Roman" w:cstheme="minorHAnsi"/>
+          <w:b/>
+          <w:bCs/>
+          <w:sz w:val="20"/>
+          <w:szCs w:val="20"/>
+          <w:lang w:val="en-US" w:eastAsia="pt-BR"/>
+        </w:rPr>
+        <w:t>:</w:t>
+      </w:r>
+      <w:r>
+        <w:rPr>
+          <w:rFonts w:eastAsia="Times New Roman" w:cstheme="minorHAnsi"/>
+          <w:sz w:val="20"/>
+          <w:szCs w:val="20"/>
+          <w:lang w:val="en-US" w:eastAsia="pt-BR"/>
+        </w:rPr>
+        <w:t> </w:t>
+      </w:r>
+      <w:r>
+        <w:rPr>
+          <w:rFonts w:eastAsia="Times New Roman" w:cstheme="minorHAnsi"/>
+          <w:sz w:val="18"/>
+          <w:szCs w:val="18"/>
+          <w:bdr w:val="none" w:sz="0" w:space="0" w:color="auto" w:frame="1"/>
+          <w:lang w:val="en-US" w:eastAsia="pt-BR"/>
+        </w:rPr>
+        <w:t>&amp;</w:t>
+      </w:r>
+      <w:r>
+        <w:rPr>
+          <w:rFonts w:eastAsia="Times New Roman" w:cstheme="minorHAnsi"/>
+          <w:sz w:val="20"/>
+          <w:szCs w:val="20"/>
+          <w:lang w:val="en-US" w:eastAsia="pt-BR"/>
+        </w:rPr>
+        <w:t> — </w:t>
+      </w:r>
+      <w:r>
+        <w:rPr>
+          <w:rFonts w:eastAsia="Times New Roman" w:cstheme="minorHAnsi"/>
+          <w:b/>
+          <w:bCs/>
+          <w:sz w:val="20"/>
+          <w:szCs w:val="20"/>
+          <w:lang w:val="en-US" w:eastAsia="pt-BR"/>
+        </w:rPr>
+        <w:t>AND bit a bit</w:t>
+      </w:r>
+      <w:r>
+        <w:rPr>
+          <w:rFonts w:eastAsia="Times New Roman" w:cstheme="minorHAnsi"/>
+          <w:sz w:val="20"/>
+          <w:szCs w:val="20"/>
+          <w:lang w:val="en-US" w:eastAsia="pt-BR"/>
+        </w:rPr>
+        <w:t>.</w:t>
+      </w:r>
+    </w:p>
+    <w:p>
+      <w:pPr>
+        <w:numPr>
+          <w:ilvl w:val="0"/>
+          <w:numId w:val="2"/>
+        </w:numPr>
+        <w:shd w:val="clear" w:color="auto" w:fill="21222C"/>
+        <w:spacing w:before="100" w:beforeAutospacing="1" w:after="100" w:afterAutospacing="1" w:line="240" w:lineRule="auto"/>
+        <w:rPr>
+          <w:rFonts w:eastAsia="Times New Roman" w:cstheme="minorHAnsi"/>
+          <w:sz w:val="20"/>
+          <w:szCs w:val="20"/>
+          <w:lang w:eastAsia="pt-BR"/>
+        </w:rPr>
+      </w:pPr>
+      <w:r>
+        <w:rPr>
+          <w:rFonts w:eastAsia="Times New Roman" w:cstheme="minorHAnsi"/>
+          <w:b/>
+          <w:bCs/>
+          <w:sz w:val="20"/>
+          <w:szCs w:val="20"/>
+          <w:lang w:eastAsia="pt-BR"/>
+        </w:rPr>
+        <w:t>Como funciona:</w:t>
+      </w:r>
+      <w:r>
+        <w:rPr>
+          <w:rFonts w:eastAsia="Times New Roman" w:cstheme="minorHAnsi"/>
+          <w:sz w:val="20"/>
+          <w:szCs w:val="20"/>
+          <w:lang w:eastAsia="pt-BR"/>
+        </w:rPr>
+        <w:t> compara cada bit: </w:t>
+      </w:r>
+      <w:r>
+        <w:rPr>
+          <w:rFonts w:eastAsia="Times New Roman" w:cstheme="minorHAnsi"/>
+          <w:sz w:val="18"/>
+          <w:szCs w:val="18"/>
+          <w:bdr w:val="none" w:sz="0" w:space="0" w:color="auto" w:frame="1"/>
+          <w:lang w:eastAsia="pt-BR"/>
+        </w:rPr>
+        <w:t>1010 &amp; 1011 = 1010</w:t>
+      </w:r>
+      <w:r>
+        <w:rPr>
+          <w:rFonts w:eastAsia="Times New Roman" w:cstheme="minorHAnsi"/>
+          <w:sz w:val="20"/>
+          <w:szCs w:val="20"/>
+          <w:lang w:eastAsia="pt-BR"/>
+        </w:rPr>
+        <w:t>.</w:t>
+      </w:r>
+    </w:p>
+    <w:p>
+      <w:pPr>
+        <w:numPr>
+          <w:ilvl w:val="0"/>
+          <w:numId w:val="2"/>
+        </w:numPr>
+        <w:shd w:val="clear" w:color="auto" w:fill="21222C"/>
+        <w:spacing w:before="100" w:beforeAutospacing="1" w:after="100" w:afterAutospacing="1" w:line="240" w:lineRule="auto"/>
+        <w:rPr>
+          <w:rFonts w:eastAsia="Times New Roman" w:cstheme="minorHAnsi"/>
+          <w:sz w:val="20"/>
+          <w:szCs w:val="20"/>
+          <w:lang w:eastAsia="pt-BR"/>
+        </w:rPr>
+      </w:pPr>
+      <w:r>
+        <w:rPr>
+          <w:rFonts w:eastAsia="Times New Roman" w:cstheme="minorHAnsi"/>
+          <w:b/>
+          <w:bCs/>
+          <w:sz w:val="20"/>
+          <w:szCs w:val="20"/>
+          <w:lang w:eastAsia="pt-BR"/>
+        </w:rPr>
+        <w:t>Resultado:</w:t>
+      </w:r>
+      <w:r>
+        <w:rPr>
+          <w:rFonts w:eastAsia="Times New Roman" w:cstheme="minorHAnsi"/>
+          <w:sz w:val="20"/>
+          <w:szCs w:val="20"/>
+          <w:lang w:eastAsia="pt-BR"/>
+        </w:rPr>
+        <w:t> </w:t>
+      </w:r>
+      <w:r>
+        <w:rPr>
+          <w:rFonts w:eastAsia="Times New Roman" w:cstheme="minorHAnsi"/>
+          <w:sz w:val="18"/>
+          <w:szCs w:val="18"/>
+          <w:bdr w:val="none" w:sz="0" w:space="0" w:color="auto" w:frame="1"/>
+          <w:lang w:eastAsia="pt-BR"/>
+        </w:rPr>
+        <w:t>res === 10</w:t>
+      </w:r>
+      <w:r>
+        <w:rPr>
+          <w:rFonts w:eastAsia="Times New Roman" w:cstheme="minorHAnsi"/>
+          <w:sz w:val="20"/>
+          <w:szCs w:val="20"/>
+          <w:lang w:eastAsia="pt-BR"/>
+        </w:rPr>
+        <w:t>.</w:t>
+      </w:r>
+    </w:p>
+    <w:p>
+      <w:pPr>
+        <w:shd w:val="clear" w:color="auto" w:fill="21222C"/>
+        <w:spacing w:after="120" w:line="240" w:lineRule="auto"/>
+        <w:outlineLvl w:val="2"/>
+        <w:rPr>
+          <w:rFonts w:eastAsia="Times New Roman" w:cstheme="minorHAnsi"/>
+          <w:b/>
+          <w:bCs/>
+          <w:sz w:val="20"/>
+          <w:szCs w:val="20"/>
+          <w:lang w:eastAsia="pt-BR"/>
+        </w:rPr>
+      </w:pPr>
+      <w:r>
+        <w:rPr>
+          <w:rFonts w:eastAsia="Times New Roman" w:cstheme="minorHAnsi"/>
+          <w:b/>
+          <w:bCs/>
+          <w:sz w:val="20"/>
+          <w:szCs w:val="20"/>
+          <w:lang w:eastAsia="pt-BR"/>
+        </w:rPr>
+        <w:t>2</w:t>
+      </w:r>
+      <w:r>
+        <w:rPr>
+          <w:rFonts w:eastAsia="Times New Roman" w:cstheme="minorHAnsi"/>
+          <w:b/>
+          <w:bCs/>
+          <w:sz w:val="20"/>
+          <w:szCs w:val="20"/>
+          <w:lang w:eastAsia="pt-BR"/>
+        </w:rPr>
+        <w:t>) </w:t>
+      </w:r>
+      <w:proofErr w:type="spellStart"/>
+      <w:r>
+        <w:rPr>
+          <w:rFonts w:eastAsia="Times New Roman" w:cstheme="minorHAnsi"/>
+          <w:b/>
+          <w:bCs/>
+          <w:sz w:val="18"/>
+          <w:szCs w:val="18"/>
+          <w:bdr w:val="none" w:sz="0" w:space="0" w:color="auto" w:frame="1"/>
+          <w:lang w:eastAsia="pt-BR"/>
+        </w:rPr>
+        <w:t>let</w:t>
+      </w:r>
+      <w:proofErr w:type="spellEnd"/>
+      <w:r>
+        <w:rPr>
+          <w:rFonts w:eastAsia="Times New Roman" w:cstheme="minorHAnsi"/>
+          <w:b/>
+          <w:bCs/>
+          <w:sz w:val="18"/>
+          <w:szCs w:val="18"/>
+          <w:bdr w:val="none" w:sz="0" w:space="0" w:color="auto" w:frame="1"/>
+          <w:lang w:eastAsia="pt-BR"/>
+        </w:rPr>
+        <w:t xml:space="preserve"> res2 = n1 ^ n2</w:t>
+      </w:r>
+      <w:r>
+        <w:rPr>
+          <w:rFonts w:eastAsia="Times New Roman" w:cstheme="minorHAnsi"/>
+          <w:b/>
+          <w:bCs/>
+          <w:sz w:val="20"/>
+          <w:szCs w:val="20"/>
+          <w:lang w:eastAsia="pt-BR"/>
+        </w:rPr>
+        <w:t> </w:t>
+      </w:r>
+      <w:r>
+        <w:rPr>
+          <w:rFonts w:ascii="Segoe UI Emoji" w:eastAsia="Times New Roman" w:hAnsi="Segoe UI Emoji" w:cs="Segoe UI Emoji"/>
+          <w:b/>
+          <w:bCs/>
+          <w:sz w:val="20"/>
+          <w:szCs w:val="20"/>
+          <w:lang w:eastAsia="pt-BR"/>
+        </w:rPr>
+        <w:t>✳️</w:t>
+      </w:r>
+    </w:p>
+    <w:p>
+      <w:pPr>
+        <w:numPr>
+          <w:ilvl w:val="0"/>
+          <w:numId w:val="4"/>
+        </w:numPr>
+        <w:shd w:val="clear" w:color="auto" w:fill="21222C"/>
+        <w:spacing w:before="100" w:beforeAutospacing="1" w:after="100" w:afterAutospacing="1" w:line="240" w:lineRule="auto"/>
+        <w:rPr>
+          <w:rFonts w:eastAsia="Times New Roman" w:cstheme="minorHAnsi"/>
+          <w:sz w:val="20"/>
+          <w:szCs w:val="20"/>
+          <w:lang w:val="en-US" w:eastAsia="pt-BR"/>
+        </w:rPr>
+      </w:pPr>
+      <w:proofErr w:type="spellStart"/>
+      <w:r>
+        <w:rPr>
+          <w:rFonts w:eastAsia="Times New Roman" w:cstheme="minorHAnsi"/>
+          <w:b/>
+          <w:bCs/>
+          <w:sz w:val="20"/>
+          <w:szCs w:val="20"/>
+          <w:lang w:val="en-US" w:eastAsia="pt-BR"/>
+        </w:rPr>
+        <w:t>Operador</w:t>
+      </w:r>
+      <w:proofErr w:type="spellEnd"/>
+      <w:r>
+        <w:rPr>
+          <w:rFonts w:eastAsia="Times New Roman" w:cstheme="minorHAnsi"/>
+          <w:b/>
+          <w:bCs/>
+          <w:sz w:val="20"/>
+          <w:szCs w:val="20"/>
+          <w:lang w:val="en-US" w:eastAsia="pt-BR"/>
+        </w:rPr>
+        <w:t>:</w:t>
+      </w:r>
+      <w:r>
+        <w:rPr>
+          <w:rFonts w:eastAsia="Times New Roman" w:cstheme="minorHAnsi"/>
+          <w:sz w:val="20"/>
+          <w:szCs w:val="20"/>
+          <w:lang w:val="en-US" w:eastAsia="pt-BR"/>
+        </w:rPr>
+        <w:t> </w:t>
+      </w:r>
+      <w:r>
+        <w:rPr>
+          <w:rFonts w:eastAsia="Times New Roman" w:cstheme="minorHAnsi"/>
+          <w:sz w:val="18"/>
+          <w:szCs w:val="18"/>
+          <w:bdr w:val="none" w:sz="0" w:space="0" w:color="auto" w:frame="1"/>
+          <w:lang w:val="en-US" w:eastAsia="pt-BR"/>
+        </w:rPr>
+        <w:t>^</w:t>
+      </w:r>
+      <w:r>
+        <w:rPr>
+          <w:rFonts w:eastAsia="Times New Roman" w:cstheme="minorHAnsi"/>
+          <w:sz w:val="20"/>
+          <w:szCs w:val="20"/>
+          <w:lang w:val="en-US" w:eastAsia="pt-BR"/>
+        </w:rPr>
+        <w:t> — </w:t>
+      </w:r>
+      <w:r>
+        <w:rPr>
+          <w:rFonts w:eastAsia="Times New Roman" w:cstheme="minorHAnsi"/>
+          <w:b/>
+          <w:bCs/>
+          <w:sz w:val="20"/>
+          <w:szCs w:val="20"/>
+          <w:lang w:val="en-US" w:eastAsia="pt-BR"/>
+        </w:rPr>
+        <w:t>XOR bit a bit</w:t>
+      </w:r>
+      <w:r>
+        <w:rPr>
+          <w:rFonts w:eastAsia="Times New Roman" w:cstheme="minorHAnsi"/>
+          <w:sz w:val="20"/>
+          <w:szCs w:val="20"/>
+          <w:lang w:val="en-US" w:eastAsia="pt-BR"/>
+        </w:rPr>
+        <w:t>.</w:t>
+      </w:r>
+    </w:p>
+    <w:p>
+      <w:pPr>
+        <w:numPr>
+          <w:ilvl w:val="0"/>
+          <w:numId w:val="4"/>
+        </w:numPr>
+        <w:shd w:val="clear" w:color="auto" w:fill="21222C"/>
+        <w:spacing w:before="100" w:beforeAutospacing="1" w:after="100" w:afterAutospacing="1" w:line="240" w:lineRule="auto"/>
+        <w:rPr>
+          <w:rFonts w:eastAsia="Times New Roman" w:cstheme="minorHAnsi"/>
+          <w:sz w:val="20"/>
+          <w:szCs w:val="20"/>
+          <w:lang w:eastAsia="pt-BR"/>
+        </w:rPr>
+      </w:pPr>
+      <w:r>
+        <w:rPr>
+          <w:rFonts w:eastAsia="Times New Roman" w:cstheme="minorHAnsi"/>
+          <w:b/>
+          <w:bCs/>
+          <w:sz w:val="20"/>
+          <w:szCs w:val="20"/>
+          <w:lang w:eastAsia="pt-BR"/>
+        </w:rPr>
+        <w:t>Cálculo:</w:t>
+      </w:r>
+      <w:r>
+        <w:rPr>
+          <w:rFonts w:eastAsia="Times New Roman" w:cstheme="minorHAnsi"/>
+          <w:sz w:val="20"/>
+          <w:szCs w:val="20"/>
+          <w:lang w:eastAsia="pt-BR"/>
+        </w:rPr>
+        <w:t> </w:t>
+      </w:r>
+      <w:r>
+        <w:rPr>
+          <w:rFonts w:eastAsia="Times New Roman" w:cstheme="minorHAnsi"/>
+          <w:sz w:val="18"/>
+          <w:szCs w:val="18"/>
+          <w:bdr w:val="none" w:sz="0" w:space="0" w:color="auto" w:frame="1"/>
+          <w:lang w:eastAsia="pt-BR"/>
+        </w:rPr>
+        <w:t>1010 ^ 1011 = 0001</w:t>
+      </w:r>
+      <w:r>
+        <w:rPr>
+          <w:rFonts w:eastAsia="Times New Roman" w:cstheme="minorHAnsi"/>
+          <w:sz w:val="20"/>
+          <w:szCs w:val="20"/>
+          <w:lang w:eastAsia="pt-BR"/>
+        </w:rPr>
+        <w:t>.</w:t>
+      </w:r>
+    </w:p>
+    <w:p>
+      <w:pPr>
+        <w:numPr>
+          <w:ilvl w:val="0"/>
+          <w:numId w:val="4"/>
+        </w:numPr>
+        <w:shd w:val="clear" w:color="auto" w:fill="21222C"/>
+        <w:spacing w:before="100" w:beforeAutospacing="1" w:after="100" w:afterAutospacing="1" w:line="240" w:lineRule="auto"/>
+        <w:rPr>
+          <w:rFonts w:eastAsia="Times New Roman" w:cstheme="minorHAnsi"/>
+          <w:sz w:val="20"/>
+          <w:szCs w:val="20"/>
+          <w:lang w:eastAsia="pt-BR"/>
+        </w:rPr>
+      </w:pPr>
+      <w:r>
+        <w:rPr>
+          <w:rFonts w:eastAsia="Times New Roman" w:cstheme="minorHAnsi"/>
+          <w:b/>
+          <w:bCs/>
+          <w:sz w:val="20"/>
+          <w:szCs w:val="20"/>
+          <w:lang w:eastAsia="pt-BR"/>
+        </w:rPr>
+        <w:t>Resultado:</w:t>
+      </w:r>
+      <w:r>
+        <w:rPr>
+          <w:rFonts w:eastAsia="Times New Roman" w:cstheme="minorHAnsi"/>
+          <w:sz w:val="20"/>
+          <w:szCs w:val="20"/>
+          <w:lang w:eastAsia="pt-BR"/>
+        </w:rPr>
+        <w:t> </w:t>
+      </w:r>
+      <w:r>
+        <w:rPr>
+          <w:rFonts w:eastAsia="Times New Roman" w:cstheme="minorHAnsi"/>
+          <w:sz w:val="18"/>
+          <w:szCs w:val="18"/>
+          <w:bdr w:val="none" w:sz="0" w:space="0" w:color="auto" w:frame="1"/>
+          <w:lang w:eastAsia="pt-BR"/>
+        </w:rPr>
+        <w:t>res2 === 1</w:t>
+      </w:r>
+      <w:r>
+        <w:rPr>
+          <w:rFonts w:eastAsia="Times New Roman" w:cstheme="minorHAnsi"/>
+          <w:sz w:val="20"/>
+          <w:szCs w:val="20"/>
+          <w:lang w:eastAsia="pt-BR"/>
+        </w:rPr>
+        <w:t>.</w:t>
+      </w:r>
+    </w:p>
+    <w:p>
+      <w:pPr>
+        <w:spacing w:after="0" w:line="240" w:lineRule="auto"/>
+        <w:rPr>
+          <w:rFonts w:eastAsia="Times New Roman" w:cstheme="minorHAnsi"/>
+          <w:sz w:val="24"/>
+          <w:szCs w:val="24"/>
+          <w:lang w:eastAsia="pt-BR"/>
+        </w:rPr>
+      </w:pPr>
+      <w:r>
+        <w:rPr>
+          <w:rFonts w:eastAsia="Times New Roman" w:cstheme="minorHAnsi"/>
+          <w:sz w:val="24"/>
+          <w:szCs w:val="24"/>
+          <w:lang w:eastAsia="pt-BR"/>
+        </w:rPr>
+        <w:pict w14:anchorId="1FBEF3C7">
+          <v:rect id="_x0000_i1026" style="width:0;height:1.5pt" o:hralign="center" o:hrstd="t" o:hr="t" fillcolor="#a0a0a0" stroked="f"/>
+        </w:pict>
+      </w:r>
+    </w:p>
+    <w:p>
+      <w:pPr>
+        <w:shd w:val="clear" w:color="auto" w:fill="21222C"/>
+        <w:spacing w:after="120" w:line="240" w:lineRule="auto"/>
+        <w:outlineLvl w:val="2"/>
+        <w:rPr>
+          <w:rFonts w:eastAsia="Times New Roman" w:cstheme="minorHAnsi"/>
+          <w:b/>
+          <w:bCs/>
+          <w:sz w:val="20"/>
+          <w:szCs w:val="20"/>
+          <w:lang w:eastAsia="pt-BR"/>
+        </w:rPr>
+      </w:pPr>
+      <w:r>
+        <w:rPr>
+          <w:rFonts w:eastAsia="Times New Roman" w:cstheme="minorHAnsi"/>
+          <w:b/>
+          <w:bCs/>
+          <w:sz w:val="20"/>
+          <w:szCs w:val="20"/>
+          <w:lang w:eastAsia="pt-BR"/>
+        </w:rPr>
+        <w:t>3</w:t>
+      </w:r>
+      <w:r>
+        <w:rPr>
+          <w:rFonts w:eastAsia="Times New Roman" w:cstheme="minorHAnsi"/>
+          <w:b/>
+          <w:bCs/>
+          <w:sz w:val="20"/>
+          <w:szCs w:val="20"/>
+          <w:lang w:eastAsia="pt-BR"/>
+        </w:rPr>
+        <w:t>) </w:t>
+      </w:r>
+      <w:proofErr w:type="spellStart"/>
+      <w:r>
+        <w:rPr>
+          <w:rFonts w:eastAsia="Times New Roman" w:cstheme="minorHAnsi"/>
+          <w:b/>
+          <w:bCs/>
+          <w:sz w:val="18"/>
+          <w:szCs w:val="18"/>
+          <w:bdr w:val="none" w:sz="0" w:space="0" w:color="auto" w:frame="1"/>
+          <w:lang w:eastAsia="pt-BR"/>
+        </w:rPr>
+        <w:t>let</w:t>
+      </w:r>
+      <w:proofErr w:type="spellEnd"/>
+      <w:r>
+        <w:rPr>
+          <w:rFonts w:eastAsia="Times New Roman" w:cstheme="minorHAnsi"/>
+          <w:b/>
+          <w:bCs/>
+          <w:sz w:val="18"/>
+          <w:szCs w:val="18"/>
+          <w:bdr w:val="none" w:sz="0" w:space="0" w:color="auto" w:frame="1"/>
+          <w:lang w:eastAsia="pt-BR"/>
+        </w:rPr>
+        <w:t xml:space="preserve"> res3 = n1 &gt;&gt; 1</w:t>
+      </w:r>
+      <w:r>
+        <w:rPr>
+          <w:rFonts w:eastAsia="Times New Roman" w:cstheme="minorHAnsi"/>
+          <w:b/>
+          <w:bCs/>
+          <w:sz w:val="20"/>
+          <w:szCs w:val="20"/>
+          <w:lang w:eastAsia="pt-BR"/>
+        </w:rPr>
+        <w:t> ↘️</w:t>
+      </w:r>
+    </w:p>
+    <w:p>
+      <w:pPr>
+        <w:numPr>
+          <w:ilvl w:val="0"/>
+          <w:numId w:val="5"/>
+        </w:numPr>
+        <w:shd w:val="clear" w:color="auto" w:fill="21222C"/>
+        <w:spacing w:before="100" w:beforeAutospacing="1" w:after="100" w:afterAutospacing="1" w:line="240" w:lineRule="auto"/>
+        <w:rPr>
+          <w:rFonts w:eastAsia="Times New Roman" w:cstheme="minorHAnsi"/>
+          <w:sz w:val="20"/>
+          <w:szCs w:val="20"/>
+          <w:lang w:eastAsia="pt-BR"/>
+        </w:rPr>
+      </w:pPr>
+      <w:r>
+        <w:rPr>
+          <w:rFonts w:eastAsia="Times New Roman" w:cstheme="minorHAnsi"/>
+          <w:b/>
+          <w:bCs/>
+          <w:sz w:val="20"/>
+          <w:szCs w:val="20"/>
+          <w:lang w:eastAsia="pt-BR"/>
+        </w:rPr>
+        <w:t>Operador:</w:t>
+      </w:r>
+      <w:r>
+        <w:rPr>
+          <w:rFonts w:eastAsia="Times New Roman" w:cstheme="minorHAnsi"/>
+          <w:sz w:val="20"/>
+          <w:szCs w:val="20"/>
+          <w:lang w:eastAsia="pt-BR"/>
+        </w:rPr>
+        <w:t> </w:t>
+      </w:r>
+      <w:r>
+        <w:rPr>
+          <w:rFonts w:eastAsia="Times New Roman" w:cstheme="minorHAnsi"/>
+          <w:sz w:val="18"/>
+          <w:szCs w:val="18"/>
+          <w:bdr w:val="none" w:sz="0" w:space="0" w:color="auto" w:frame="1"/>
+          <w:lang w:eastAsia="pt-BR"/>
+        </w:rPr>
+        <w:t>&gt;&gt;</w:t>
+      </w:r>
+      <w:r>
+        <w:rPr>
+          <w:rFonts w:eastAsia="Times New Roman" w:cstheme="minorHAnsi"/>
+          <w:sz w:val="20"/>
+          <w:szCs w:val="20"/>
+          <w:lang w:eastAsia="pt-BR"/>
+        </w:rPr>
+        <w:t> — </w:t>
+      </w:r>
+      <w:r>
+        <w:rPr>
+          <w:rFonts w:eastAsia="Times New Roman" w:cstheme="minorHAnsi"/>
+          <w:b/>
+          <w:bCs/>
+          <w:sz w:val="20"/>
+          <w:szCs w:val="20"/>
+          <w:lang w:eastAsia="pt-BR"/>
+        </w:rPr>
+        <w:t>deslocamento à direita</w:t>
+      </w:r>
+      <w:r>
+        <w:rPr>
+          <w:rFonts w:eastAsia="Times New Roman" w:cstheme="minorHAnsi"/>
+          <w:sz w:val="20"/>
+          <w:szCs w:val="20"/>
+          <w:lang w:eastAsia="pt-BR"/>
+        </w:rPr>
+        <w:t xml:space="preserve"> (shift </w:t>
+      </w:r>
+      <w:proofErr w:type="spellStart"/>
+      <w:r>
+        <w:rPr>
+          <w:rFonts w:eastAsia="Times New Roman" w:cstheme="minorHAnsi"/>
+          <w:sz w:val="20"/>
+          <w:szCs w:val="20"/>
+          <w:lang w:eastAsia="pt-BR"/>
+        </w:rPr>
+        <w:t>right</w:t>
+      </w:r>
+      <w:proofErr w:type="spellEnd"/>
+      <w:r>
+        <w:rPr>
+          <w:rFonts w:eastAsia="Times New Roman" w:cstheme="minorHAnsi"/>
+          <w:sz w:val="20"/>
+          <w:szCs w:val="20"/>
+          <w:lang w:eastAsia="pt-BR"/>
+        </w:rPr>
+        <w:t>).</w:t>
+      </w:r>
+    </w:p>
+    <w:p>
+      <w:pPr>
+        <w:numPr>
+          <w:ilvl w:val="0"/>
+          <w:numId w:val="5"/>
+        </w:numPr>
+        <w:shd w:val="clear" w:color="auto" w:fill="21222C"/>
+        <w:spacing w:before="100" w:beforeAutospacing="1" w:after="100" w:afterAutospacing="1" w:line="240" w:lineRule="auto"/>
+        <w:rPr>
+          <w:rFonts w:eastAsia="Times New Roman" w:cstheme="minorHAnsi"/>
+          <w:sz w:val="20"/>
+          <w:szCs w:val="20"/>
+          <w:lang w:eastAsia="pt-BR"/>
+        </w:rPr>
+      </w:pPr>
+      <w:r>
+        <w:rPr>
+          <w:rFonts w:eastAsia="Times New Roman" w:cstheme="minorHAnsi"/>
+          <w:b/>
+          <w:bCs/>
+          <w:sz w:val="20"/>
+          <w:szCs w:val="20"/>
+          <w:lang w:eastAsia="pt-BR"/>
+        </w:rPr>
+        <w:t>Cálculo:</w:t>
+      </w:r>
+      <w:r>
+        <w:rPr>
+          <w:rFonts w:eastAsia="Times New Roman" w:cstheme="minorHAnsi"/>
+          <w:sz w:val="20"/>
+          <w:szCs w:val="20"/>
+          <w:lang w:eastAsia="pt-BR"/>
+        </w:rPr>
+        <w:t> </w:t>
+      </w:r>
+      <w:r>
+        <w:rPr>
+          <w:rFonts w:eastAsia="Times New Roman" w:cstheme="minorHAnsi"/>
+          <w:sz w:val="18"/>
+          <w:szCs w:val="18"/>
+          <w:bdr w:val="none" w:sz="0" w:space="0" w:color="auto" w:frame="1"/>
+          <w:lang w:eastAsia="pt-BR"/>
+        </w:rPr>
+        <w:t>1010 &gt;&gt; 1 = 0101</w:t>
+      </w:r>
+      <w:r>
+        <w:rPr>
+          <w:rFonts w:eastAsia="Times New Roman" w:cstheme="minorHAnsi"/>
+          <w:sz w:val="20"/>
+          <w:szCs w:val="20"/>
+          <w:lang w:eastAsia="pt-BR"/>
+        </w:rPr>
+        <w:t>.</w:t>
+      </w:r>
+    </w:p>
+    <w:p>
+      <w:pPr>
+        <w:numPr>
+          <w:ilvl w:val="0"/>
+          <w:numId w:val="5"/>
+        </w:numPr>
+        <w:shd w:val="clear" w:color="auto" w:fill="21222C"/>
+        <w:spacing w:before="100" w:beforeAutospacing="1" w:after="100" w:afterAutospacing="1" w:line="240" w:lineRule="auto"/>
+        <w:rPr>
+          <w:rFonts w:eastAsia="Times New Roman" w:cstheme="minorHAnsi"/>
+          <w:sz w:val="20"/>
+          <w:szCs w:val="20"/>
+          <w:lang w:eastAsia="pt-BR"/>
+        </w:rPr>
+      </w:pPr>
+      <w:r>
+        <w:rPr>
+          <w:rFonts w:eastAsia="Times New Roman" w:cstheme="minorHAnsi"/>
+          <w:b/>
+          <w:bCs/>
+          <w:sz w:val="20"/>
+          <w:szCs w:val="20"/>
+          <w:lang w:eastAsia="pt-BR"/>
+        </w:rPr>
+        <w:t>Resultado:</w:t>
+      </w:r>
+      <w:r>
+        <w:rPr>
+          <w:rFonts w:eastAsia="Times New Roman" w:cstheme="minorHAnsi"/>
+          <w:sz w:val="20"/>
+          <w:szCs w:val="20"/>
+          <w:lang w:eastAsia="pt-BR"/>
+        </w:rPr>
+        <w:t> </w:t>
+      </w:r>
+      <w:r>
+        <w:rPr>
+          <w:rFonts w:eastAsia="Times New Roman" w:cstheme="minorHAnsi"/>
+          <w:sz w:val="18"/>
+          <w:szCs w:val="18"/>
+          <w:bdr w:val="none" w:sz="0" w:space="0" w:color="auto" w:frame="1"/>
+          <w:lang w:eastAsia="pt-BR"/>
+        </w:rPr>
+        <w:t>res3 === 5</w:t>
+      </w:r>
+      <w:r>
+        <w:rPr>
+          <w:rFonts w:eastAsia="Times New Roman" w:cstheme="minorHAnsi"/>
+          <w:sz w:val="20"/>
+          <w:szCs w:val="20"/>
+          <w:lang w:eastAsia="pt-BR"/>
+        </w:rPr>
+        <w:t>.</w:t>
+      </w:r>
+    </w:p>
+    <w:p>
+      <w:pPr>
+        <w:ind w:left="360"/>
+        <w:rPr>
+          <w:color w:val="FF0000"/>
+          <w:sz w:val="36"/>
+          <w:szCs w:val="36"/>
+        </w:rPr>
+      </w:pPr>
+    </w:p>
+    <w:p>
+      <w:pPr>
+        <w:rPr>
+          <w:color w:val="FF0000"/>
+          <w:sz w:val="36"/>
+          <w:szCs w:val="36"/>
+        </w:rPr>
+      </w:pPr>
+      <w:r>
+        <w:rPr>
+          <w:color w:val="FF0000"/>
+          <w:sz w:val="36"/>
+          <w:szCs w:val="36"/>
+        </w:rPr>
+        <w:lastRenderedPageBreak/>
+        <w:t xml:space="preserve">Vídeo </w:t>
+      </w:r>
+      <w:r>
+        <w:rPr>
+          <w:color w:val="FF0000"/>
+          <w:sz w:val="36"/>
+          <w:szCs w:val="36"/>
+        </w:rPr>
+        <w:t>10</w:t>
+      </w:r>
+      <w:r>
+        <w:rPr>
+          <w:color w:val="FF0000"/>
+          <w:sz w:val="36"/>
+          <w:szCs w:val="36"/>
+        </w:rPr>
+        <w:t>.</w:t>
+      </w:r>
+    </w:p>
+    <w:p>
+      <w:pPr>
+        <w:rPr>
+          <w:sz w:val="28"/>
+          <w:szCs w:val="36"/>
+        </w:rPr>
+      </w:pPr>
+      <w:r>
+        <w:rPr>
+          <w:sz w:val="28"/>
+          <w:szCs w:val="36"/>
+        </w:rPr>
+        <w:t>Operador ternário: Uma forma de simplificar uma operação condicional.</w:t>
+      </w:r>
+    </w:p>
+    <w:p>
+      <w:pPr>
+        <w:rPr>
+          <w:b/>
+          <w:bCs/>
+          <w:sz w:val="28"/>
+          <w:szCs w:val="36"/>
+        </w:rPr>
+      </w:pPr>
+      <w:r>
+        <w:rPr>
+          <w:b/>
+          <w:bCs/>
+          <w:sz w:val="28"/>
+          <w:szCs w:val="36"/>
+        </w:rPr>
+        <w:t xml:space="preserve">Normalmente: </w:t>
+      </w:r>
+    </w:p>
+    <w:p>
+      <w:pPr>
+        <w:shd w:val="clear" w:color="auto" w:fill="282A36"/>
+        <w:spacing w:after="0" w:line="300" w:lineRule="atLeast"/>
+        <w:rPr>
+          <w:rFonts w:ascii="Consolas" w:eastAsia="Times New Roman" w:hAnsi="Consolas" w:cs="Times New Roman"/>
+          <w:color w:val="F8F8F2"/>
+          <w:sz w:val="23"/>
+          <w:szCs w:val="23"/>
+          <w:lang w:eastAsia="pt-BR"/>
+        </w:rPr>
+      </w:pPr>
+      <w:proofErr w:type="spellStart"/>
+      <w:r>
+        <w:rPr>
+          <w:rFonts w:ascii="Consolas" w:eastAsia="Times New Roman" w:hAnsi="Consolas" w:cs="Times New Roman"/>
+          <w:color w:val="FF79C6"/>
+          <w:sz w:val="23"/>
+          <w:szCs w:val="23"/>
+          <w:lang w:eastAsia="pt-BR"/>
+        </w:rPr>
+        <w:t>if</w:t>
+      </w:r>
+      <w:proofErr w:type="spellEnd"/>
+      <w:r>
+        <w:rPr>
+          <w:rFonts w:ascii="Consolas" w:eastAsia="Times New Roman" w:hAnsi="Consolas" w:cs="Times New Roman"/>
+          <w:color w:val="F8F8F2"/>
+          <w:sz w:val="23"/>
+          <w:szCs w:val="23"/>
+          <w:lang w:eastAsia="pt-BR"/>
+        </w:rPr>
+        <w:t xml:space="preserve"> (res </w:t>
+      </w:r>
+      <w:r>
+        <w:rPr>
+          <w:rFonts w:ascii="Consolas" w:eastAsia="Times New Roman" w:hAnsi="Consolas" w:cs="Times New Roman"/>
+          <w:color w:val="FF79C6"/>
+          <w:sz w:val="23"/>
+          <w:szCs w:val="23"/>
+          <w:lang w:eastAsia="pt-BR"/>
+        </w:rPr>
+        <w:t>==</w:t>
+      </w:r>
+      <w:r>
+        <w:rPr>
+          <w:rFonts w:ascii="Consolas" w:eastAsia="Times New Roman" w:hAnsi="Consolas" w:cs="Times New Roman"/>
+          <w:color w:val="F8F8F2"/>
+          <w:sz w:val="23"/>
+          <w:szCs w:val="23"/>
+          <w:lang w:eastAsia="pt-BR"/>
+        </w:rPr>
+        <w:t xml:space="preserve"> </w:t>
+      </w:r>
+      <w:r>
+        <w:rPr>
+          <w:rFonts w:ascii="Consolas" w:eastAsia="Times New Roman" w:hAnsi="Consolas" w:cs="Times New Roman"/>
+          <w:color w:val="BD93F9"/>
+          <w:sz w:val="23"/>
+          <w:szCs w:val="23"/>
+          <w:lang w:eastAsia="pt-BR"/>
+        </w:rPr>
+        <w:t>0</w:t>
+      </w:r>
+      <w:r>
+        <w:rPr>
+          <w:rFonts w:ascii="Consolas" w:eastAsia="Times New Roman" w:hAnsi="Consolas" w:cs="Times New Roman"/>
+          <w:color w:val="F8F8F2"/>
+          <w:sz w:val="23"/>
+          <w:szCs w:val="23"/>
+          <w:lang w:eastAsia="pt-BR"/>
+        </w:rPr>
+        <w:t>) {</w:t>
+      </w:r>
+    </w:p>
+    <w:p>
+      <w:pPr>
+        <w:shd w:val="clear" w:color="auto" w:fill="282A36"/>
+        <w:spacing w:after="0" w:line="300" w:lineRule="atLeast"/>
+        <w:rPr>
+          <w:rFonts w:ascii="Consolas" w:eastAsia="Times New Roman" w:hAnsi="Consolas" w:cs="Times New Roman"/>
+          <w:color w:val="F8F8F2"/>
+          <w:sz w:val="23"/>
+          <w:szCs w:val="23"/>
+          <w:lang w:eastAsia="pt-BR"/>
+        </w:rPr>
+      </w:pPr>
+      <w:r>
+        <w:rPr>
+          <w:rFonts w:ascii="Consolas" w:eastAsia="Times New Roman" w:hAnsi="Consolas" w:cs="Times New Roman"/>
+          <w:color w:val="F8F8F2"/>
+          <w:sz w:val="23"/>
+          <w:szCs w:val="23"/>
+          <w:lang w:eastAsia="pt-BR"/>
+        </w:rPr>
+        <w:t xml:space="preserve">    </w:t>
+      </w:r>
+      <w:r>
+        <w:rPr>
+          <w:rFonts w:ascii="Consolas" w:eastAsia="Times New Roman" w:hAnsi="Consolas" w:cs="Times New Roman"/>
+          <w:color w:val="BD93F9"/>
+          <w:sz w:val="23"/>
+          <w:szCs w:val="23"/>
+          <w:lang w:eastAsia="pt-BR"/>
+        </w:rPr>
+        <w:t>console</w:t>
+      </w:r>
+      <w:r>
+        <w:rPr>
+          <w:rFonts w:ascii="Consolas" w:eastAsia="Times New Roman" w:hAnsi="Consolas" w:cs="Times New Roman"/>
+          <w:color w:val="F8F8F2"/>
+          <w:sz w:val="23"/>
+          <w:szCs w:val="23"/>
+          <w:lang w:eastAsia="pt-BR"/>
+        </w:rPr>
+        <w:t>.</w:t>
+      </w:r>
+      <w:r>
+        <w:rPr>
+          <w:rFonts w:ascii="Consolas" w:eastAsia="Times New Roman" w:hAnsi="Consolas" w:cs="Times New Roman"/>
+          <w:color w:val="50FA7B"/>
+          <w:sz w:val="23"/>
+          <w:szCs w:val="23"/>
+          <w:lang w:eastAsia="pt-BR"/>
+        </w:rPr>
+        <w:t>log</w:t>
+      </w:r>
+      <w:r>
+        <w:rPr>
+          <w:rFonts w:ascii="Consolas" w:eastAsia="Times New Roman" w:hAnsi="Consolas" w:cs="Times New Roman"/>
+          <w:color w:val="F8F8F2"/>
+          <w:sz w:val="23"/>
+          <w:szCs w:val="23"/>
+          <w:lang w:eastAsia="pt-BR"/>
+        </w:rPr>
+        <w:t>(</w:t>
+      </w:r>
+      <w:r>
+        <w:rPr>
+          <w:rFonts w:ascii="Consolas" w:eastAsia="Times New Roman" w:hAnsi="Consolas" w:cs="Times New Roman"/>
+          <w:color w:val="E9F284"/>
+          <w:sz w:val="23"/>
+          <w:szCs w:val="23"/>
+          <w:lang w:eastAsia="pt-BR"/>
+        </w:rPr>
+        <w:t>"</w:t>
+      </w:r>
+      <w:r>
+        <w:rPr>
+          <w:rFonts w:ascii="Consolas" w:eastAsia="Times New Roman" w:hAnsi="Consolas" w:cs="Times New Roman"/>
+          <w:color w:val="F1FA8C"/>
+          <w:sz w:val="23"/>
+          <w:szCs w:val="23"/>
+          <w:lang w:eastAsia="pt-BR"/>
+        </w:rPr>
+        <w:t>Par</w:t>
+      </w:r>
+      <w:r>
+        <w:rPr>
+          <w:rFonts w:ascii="Consolas" w:eastAsia="Times New Roman" w:hAnsi="Consolas" w:cs="Times New Roman"/>
+          <w:color w:val="E9F284"/>
+          <w:sz w:val="23"/>
+          <w:szCs w:val="23"/>
+          <w:lang w:eastAsia="pt-BR"/>
+        </w:rPr>
+        <w:t>"</w:t>
+      </w:r>
+      <w:r>
+        <w:rPr>
+          <w:rFonts w:ascii="Consolas" w:eastAsia="Times New Roman" w:hAnsi="Consolas" w:cs="Times New Roman"/>
+          <w:color w:val="F8F8F2"/>
+          <w:sz w:val="23"/>
+          <w:szCs w:val="23"/>
+          <w:lang w:eastAsia="pt-BR"/>
+        </w:rPr>
+        <w:t>)</w:t>
+      </w:r>
+    </w:p>
+    <w:p>
+      <w:pPr>
+        <w:shd w:val="clear" w:color="auto" w:fill="282A36"/>
+        <w:spacing w:after="0" w:line="300" w:lineRule="atLeast"/>
+        <w:rPr>
+          <w:rFonts w:ascii="Consolas" w:eastAsia="Times New Roman" w:hAnsi="Consolas" w:cs="Times New Roman"/>
+          <w:color w:val="F8F8F2"/>
+          <w:sz w:val="23"/>
+          <w:szCs w:val="23"/>
+          <w:lang w:eastAsia="pt-BR"/>
+        </w:rPr>
+      </w:pPr>
+      <w:r>
+        <w:rPr>
+          <w:rFonts w:ascii="Consolas" w:eastAsia="Times New Roman" w:hAnsi="Consolas" w:cs="Times New Roman"/>
+          <w:color w:val="F8F8F2"/>
+          <w:sz w:val="23"/>
+          <w:szCs w:val="23"/>
+          <w:lang w:eastAsia="pt-BR"/>
+        </w:rPr>
+        <w:t xml:space="preserve">} </w:t>
+      </w:r>
+      <w:proofErr w:type="spellStart"/>
+      <w:r>
+        <w:rPr>
+          <w:rFonts w:ascii="Consolas" w:eastAsia="Times New Roman" w:hAnsi="Consolas" w:cs="Times New Roman"/>
+          <w:color w:val="FF79C6"/>
+          <w:sz w:val="23"/>
+          <w:szCs w:val="23"/>
+          <w:lang w:eastAsia="pt-BR"/>
+        </w:rPr>
+        <w:t>else</w:t>
+      </w:r>
+      <w:proofErr w:type="spellEnd"/>
+      <w:r>
+        <w:rPr>
+          <w:rFonts w:ascii="Consolas" w:eastAsia="Times New Roman" w:hAnsi="Consolas" w:cs="Times New Roman"/>
+          <w:color w:val="F8F8F2"/>
+          <w:sz w:val="23"/>
+          <w:szCs w:val="23"/>
+          <w:lang w:eastAsia="pt-BR"/>
+        </w:rPr>
+        <w:t xml:space="preserve"> {</w:t>
+      </w:r>
+    </w:p>
+    <w:p>
+      <w:pPr>
+        <w:shd w:val="clear" w:color="auto" w:fill="282A36"/>
+        <w:spacing w:after="0" w:line="300" w:lineRule="atLeast"/>
+        <w:rPr>
+          <w:rFonts w:ascii="Consolas" w:eastAsia="Times New Roman" w:hAnsi="Consolas" w:cs="Times New Roman"/>
+          <w:color w:val="F8F8F2"/>
+          <w:sz w:val="23"/>
+          <w:szCs w:val="23"/>
+          <w:lang w:eastAsia="pt-BR"/>
+        </w:rPr>
+      </w:pPr>
+      <w:r>
+        <w:rPr>
+          <w:rFonts w:ascii="Consolas" w:eastAsia="Times New Roman" w:hAnsi="Consolas" w:cs="Times New Roman"/>
+          <w:color w:val="F8F8F2"/>
+          <w:sz w:val="23"/>
+          <w:szCs w:val="23"/>
+          <w:lang w:eastAsia="pt-BR"/>
+        </w:rPr>
+        <w:t xml:space="preserve">    </w:t>
+      </w:r>
+      <w:r>
+        <w:rPr>
+          <w:rFonts w:ascii="Consolas" w:eastAsia="Times New Roman" w:hAnsi="Consolas" w:cs="Times New Roman"/>
+          <w:color w:val="BD93F9"/>
+          <w:sz w:val="23"/>
+          <w:szCs w:val="23"/>
+          <w:lang w:eastAsia="pt-BR"/>
+        </w:rPr>
+        <w:t>console</w:t>
+      </w:r>
+      <w:r>
+        <w:rPr>
+          <w:rFonts w:ascii="Consolas" w:eastAsia="Times New Roman" w:hAnsi="Consolas" w:cs="Times New Roman"/>
+          <w:color w:val="F8F8F2"/>
+          <w:sz w:val="23"/>
+          <w:szCs w:val="23"/>
+          <w:lang w:eastAsia="pt-BR"/>
+        </w:rPr>
+        <w:t>.</w:t>
+      </w:r>
+      <w:r>
+        <w:rPr>
+          <w:rFonts w:ascii="Consolas" w:eastAsia="Times New Roman" w:hAnsi="Consolas" w:cs="Times New Roman"/>
+          <w:color w:val="50FA7B"/>
+          <w:sz w:val="23"/>
+          <w:szCs w:val="23"/>
+          <w:lang w:eastAsia="pt-BR"/>
+        </w:rPr>
+        <w:t>log</w:t>
+      </w:r>
+      <w:r>
+        <w:rPr>
+          <w:rFonts w:ascii="Consolas" w:eastAsia="Times New Roman" w:hAnsi="Consolas" w:cs="Times New Roman"/>
+          <w:color w:val="F8F8F2"/>
+          <w:sz w:val="23"/>
+          <w:szCs w:val="23"/>
+          <w:lang w:eastAsia="pt-BR"/>
+        </w:rPr>
+        <w:t>(</w:t>
+      </w:r>
+      <w:r>
+        <w:rPr>
+          <w:rFonts w:ascii="Consolas" w:eastAsia="Times New Roman" w:hAnsi="Consolas" w:cs="Times New Roman"/>
+          <w:color w:val="E9F284"/>
+          <w:sz w:val="23"/>
+          <w:szCs w:val="23"/>
+          <w:lang w:eastAsia="pt-BR"/>
+        </w:rPr>
+        <w:t>"</w:t>
+      </w:r>
+      <w:r>
+        <w:rPr>
+          <w:rFonts w:ascii="Consolas" w:eastAsia="Times New Roman" w:hAnsi="Consolas" w:cs="Times New Roman"/>
+          <w:color w:val="F1FA8C"/>
+          <w:sz w:val="23"/>
+          <w:szCs w:val="23"/>
+          <w:lang w:eastAsia="pt-BR"/>
+        </w:rPr>
+        <w:t>Impar</w:t>
+      </w:r>
+      <w:r>
+        <w:rPr>
+          <w:rFonts w:ascii="Consolas" w:eastAsia="Times New Roman" w:hAnsi="Consolas" w:cs="Times New Roman"/>
+          <w:color w:val="E9F284"/>
+          <w:sz w:val="23"/>
+          <w:szCs w:val="23"/>
+          <w:lang w:eastAsia="pt-BR"/>
+        </w:rPr>
+        <w:t>"</w:t>
+      </w:r>
+      <w:r>
+        <w:rPr>
+          <w:rFonts w:ascii="Consolas" w:eastAsia="Times New Roman" w:hAnsi="Consolas" w:cs="Times New Roman"/>
+          <w:color w:val="F8F8F2"/>
+          <w:sz w:val="23"/>
+          <w:szCs w:val="23"/>
+          <w:lang w:eastAsia="pt-BR"/>
+        </w:rPr>
+        <w:t>)</w:t>
+      </w:r>
+    </w:p>
+    <w:p>
+      <w:pPr>
+        <w:shd w:val="clear" w:color="auto" w:fill="282A36"/>
+        <w:spacing w:after="0" w:line="300" w:lineRule="atLeast"/>
+        <w:rPr>
+          <w:rFonts w:ascii="Consolas" w:eastAsia="Times New Roman" w:hAnsi="Consolas" w:cs="Times New Roman"/>
+          <w:color w:val="F8F8F2"/>
+          <w:sz w:val="23"/>
+          <w:szCs w:val="23"/>
+          <w:lang w:eastAsia="pt-BR"/>
+        </w:rPr>
+      </w:pPr>
+      <w:r>
+        <w:rPr>
+          <w:rFonts w:ascii="Consolas" w:eastAsia="Times New Roman" w:hAnsi="Consolas" w:cs="Times New Roman"/>
+          <w:color w:val="F8F8F2"/>
+          <w:sz w:val="23"/>
+          <w:szCs w:val="23"/>
+          <w:lang w:eastAsia="pt-BR"/>
+        </w:rPr>
+        <w:t>}</w:t>
+      </w:r>
+    </w:p>
+    <w:p>
+      <w:pPr>
+        <w:rPr>
+          <w:sz w:val="28"/>
+          <w:szCs w:val="36"/>
+        </w:rPr>
+      </w:pPr>
+    </w:p>
+    <w:p>
+      <w:pPr>
+        <w:rPr>
+          <w:rFonts w:cstheme="minorHAnsi"/>
+          <w:b/>
+          <w:bCs/>
+          <w:sz w:val="28"/>
+          <w:szCs w:val="36"/>
+        </w:rPr>
+      </w:pPr>
+      <w:r>
+        <w:rPr>
+          <w:rFonts w:cstheme="minorHAnsi"/>
+          <w:b/>
+          <w:bCs/>
+          <w:sz w:val="28"/>
+          <w:szCs w:val="36"/>
+        </w:rPr>
+        <w:t xml:space="preserve">Ternário: </w:t>
+      </w:r>
+    </w:p>
+    <w:p>
+      <w:pPr>
+        <w:shd w:val="clear" w:color="auto" w:fill="282A36"/>
+        <w:spacing w:after="0" w:line="300" w:lineRule="atLeast"/>
+        <w:rPr>
+          <w:rFonts w:ascii="Consolas" w:eastAsia="Times New Roman" w:hAnsi="Consolas" w:cs="Times New Roman"/>
+          <w:color w:val="F8F8F2"/>
+          <w:sz w:val="23"/>
+          <w:szCs w:val="23"/>
+          <w:lang w:eastAsia="pt-BR"/>
+        </w:rPr>
+      </w:pPr>
+      <w:proofErr w:type="spellStart"/>
+      <w:r>
+        <w:rPr>
+          <w:rFonts w:ascii="Consolas" w:eastAsia="Times New Roman" w:hAnsi="Consolas" w:cs="Times New Roman"/>
+          <w:color w:val="FF79C6"/>
+          <w:sz w:val="23"/>
+          <w:szCs w:val="23"/>
+          <w:lang w:eastAsia="pt-BR"/>
+        </w:rPr>
+        <w:t>let</w:t>
+      </w:r>
+      <w:proofErr w:type="spellEnd"/>
+      <w:r>
+        <w:rPr>
+          <w:rFonts w:ascii="Consolas" w:eastAsia="Times New Roman" w:hAnsi="Consolas" w:cs="Times New Roman"/>
+          <w:color w:val="F8F8F2"/>
+          <w:sz w:val="23"/>
+          <w:szCs w:val="23"/>
+          <w:lang w:eastAsia="pt-BR"/>
+        </w:rPr>
+        <w:t xml:space="preserve"> res2 </w:t>
+      </w:r>
+      <w:r>
+        <w:rPr>
+          <w:rFonts w:ascii="Consolas" w:eastAsia="Times New Roman" w:hAnsi="Consolas" w:cs="Times New Roman"/>
+          <w:color w:val="FF79C6"/>
+          <w:sz w:val="23"/>
+          <w:szCs w:val="23"/>
+          <w:lang w:eastAsia="pt-BR"/>
+        </w:rPr>
+        <w:t>=</w:t>
+      </w:r>
+      <w:r>
+        <w:rPr>
+          <w:rFonts w:ascii="Consolas" w:eastAsia="Times New Roman" w:hAnsi="Consolas" w:cs="Times New Roman"/>
+          <w:color w:val="F8F8F2"/>
+          <w:sz w:val="23"/>
+          <w:szCs w:val="23"/>
+          <w:lang w:eastAsia="pt-BR"/>
+        </w:rPr>
+        <w:t xml:space="preserve"> (n </w:t>
+      </w:r>
+      <w:r>
+        <w:rPr>
+          <w:rFonts w:ascii="Consolas" w:eastAsia="Times New Roman" w:hAnsi="Consolas" w:cs="Times New Roman"/>
+          <w:color w:val="FF79C6"/>
+          <w:sz w:val="23"/>
+          <w:szCs w:val="23"/>
+          <w:lang w:eastAsia="pt-BR"/>
+        </w:rPr>
+        <w:t>%</w:t>
+      </w:r>
+      <w:r>
+        <w:rPr>
+          <w:rFonts w:ascii="Consolas" w:eastAsia="Times New Roman" w:hAnsi="Consolas" w:cs="Times New Roman"/>
+          <w:color w:val="F8F8F2"/>
+          <w:sz w:val="23"/>
+          <w:szCs w:val="23"/>
+          <w:lang w:eastAsia="pt-BR"/>
+        </w:rPr>
+        <w:t xml:space="preserve"> </w:t>
+      </w:r>
+      <w:proofErr w:type="gramStart"/>
+      <w:r>
+        <w:rPr>
+          <w:rFonts w:ascii="Consolas" w:eastAsia="Times New Roman" w:hAnsi="Consolas" w:cs="Times New Roman"/>
+          <w:color w:val="BD93F9"/>
+          <w:sz w:val="23"/>
+          <w:szCs w:val="23"/>
+          <w:lang w:eastAsia="pt-BR"/>
+        </w:rPr>
+        <w:t>2</w:t>
+      </w:r>
+      <w:r>
+        <w:rPr>
+          <w:rFonts w:ascii="Consolas" w:eastAsia="Times New Roman" w:hAnsi="Consolas" w:cs="Times New Roman"/>
+          <w:color w:val="F8F8F2"/>
+          <w:sz w:val="23"/>
+          <w:szCs w:val="23"/>
+          <w:lang w:eastAsia="pt-BR"/>
+        </w:rPr>
+        <w:t xml:space="preserve"> </w:t>
+      </w:r>
+      <w:r>
+        <w:rPr>
+          <w:rFonts w:ascii="Consolas" w:eastAsia="Times New Roman" w:hAnsi="Consolas" w:cs="Times New Roman"/>
+          <w:color w:val="FF79C6"/>
+          <w:sz w:val="23"/>
+          <w:szCs w:val="23"/>
+          <w:lang w:eastAsia="pt-BR"/>
+        </w:rPr>
+        <w:t>?</w:t>
+      </w:r>
+      <w:proofErr w:type="gramEnd"/>
+      <w:r>
+        <w:rPr>
+          <w:rFonts w:ascii="Consolas" w:eastAsia="Times New Roman" w:hAnsi="Consolas" w:cs="Times New Roman"/>
+          <w:color w:val="F8F8F2"/>
+          <w:sz w:val="23"/>
+          <w:szCs w:val="23"/>
+          <w:lang w:eastAsia="pt-BR"/>
+        </w:rPr>
+        <w:t xml:space="preserve"> </w:t>
+      </w:r>
+      <w:r>
+        <w:rPr>
+          <w:rFonts w:ascii="Consolas" w:eastAsia="Times New Roman" w:hAnsi="Consolas" w:cs="Times New Roman"/>
+          <w:color w:val="E9F284"/>
+          <w:sz w:val="23"/>
+          <w:szCs w:val="23"/>
+          <w:lang w:eastAsia="pt-BR"/>
+        </w:rPr>
+        <w:t>"</w:t>
+      </w:r>
+      <w:r>
+        <w:rPr>
+          <w:rFonts w:ascii="Consolas" w:eastAsia="Times New Roman" w:hAnsi="Consolas" w:cs="Times New Roman"/>
+          <w:color w:val="F1FA8C"/>
+          <w:sz w:val="23"/>
+          <w:szCs w:val="23"/>
+          <w:lang w:eastAsia="pt-BR"/>
+        </w:rPr>
+        <w:t>Par</w:t>
+      </w:r>
+      <w:proofErr w:type="gramStart"/>
+      <w:r>
+        <w:rPr>
+          <w:rFonts w:ascii="Consolas" w:eastAsia="Times New Roman" w:hAnsi="Consolas" w:cs="Times New Roman"/>
+          <w:color w:val="E9F284"/>
+          <w:sz w:val="23"/>
+          <w:szCs w:val="23"/>
+          <w:lang w:eastAsia="pt-BR"/>
+        </w:rPr>
+        <w:t>"</w:t>
+      </w:r>
+      <w:r>
+        <w:rPr>
+          <w:rFonts w:ascii="Consolas" w:eastAsia="Times New Roman" w:hAnsi="Consolas" w:cs="Times New Roman"/>
+          <w:color w:val="F8F8F2"/>
+          <w:sz w:val="23"/>
+          <w:szCs w:val="23"/>
+          <w:lang w:eastAsia="pt-BR"/>
+        </w:rPr>
+        <w:t xml:space="preserve"> </w:t>
+      </w:r>
+      <w:r>
+        <w:rPr>
+          <w:rFonts w:ascii="Consolas" w:eastAsia="Times New Roman" w:hAnsi="Consolas" w:cs="Times New Roman"/>
+          <w:color w:val="FF79C6"/>
+          <w:sz w:val="23"/>
+          <w:szCs w:val="23"/>
+          <w:lang w:eastAsia="pt-BR"/>
+        </w:rPr>
+        <w:t>:</w:t>
+      </w:r>
+      <w:proofErr w:type="gramEnd"/>
+      <w:r>
+        <w:rPr>
+          <w:rFonts w:ascii="Consolas" w:eastAsia="Times New Roman" w:hAnsi="Consolas" w:cs="Times New Roman"/>
+          <w:color w:val="F8F8F2"/>
+          <w:sz w:val="23"/>
+          <w:szCs w:val="23"/>
+          <w:lang w:eastAsia="pt-BR"/>
+        </w:rPr>
+        <w:t xml:space="preserve"> </w:t>
+      </w:r>
+      <w:r>
+        <w:rPr>
+          <w:rFonts w:ascii="Consolas" w:eastAsia="Times New Roman" w:hAnsi="Consolas" w:cs="Times New Roman"/>
+          <w:color w:val="E9F284"/>
+          <w:sz w:val="23"/>
+          <w:szCs w:val="23"/>
+          <w:lang w:eastAsia="pt-BR"/>
+        </w:rPr>
+        <w:t>"</w:t>
+      </w:r>
+      <w:r>
+        <w:rPr>
+          <w:rFonts w:ascii="Consolas" w:eastAsia="Times New Roman" w:hAnsi="Consolas" w:cs="Times New Roman"/>
+          <w:color w:val="F1FA8C"/>
+          <w:sz w:val="23"/>
+          <w:szCs w:val="23"/>
+          <w:lang w:eastAsia="pt-BR"/>
+        </w:rPr>
+        <w:t>Impar</w:t>
+      </w:r>
+      <w:r>
+        <w:rPr>
+          <w:rFonts w:ascii="Consolas" w:eastAsia="Times New Roman" w:hAnsi="Consolas" w:cs="Times New Roman"/>
+          <w:color w:val="E9F284"/>
+          <w:sz w:val="23"/>
+          <w:szCs w:val="23"/>
+          <w:lang w:eastAsia="pt-BR"/>
+        </w:rPr>
+        <w:t>"</w:t>
+      </w:r>
+      <w:r>
+        <w:rPr>
+          <w:rFonts w:ascii="Consolas" w:eastAsia="Times New Roman" w:hAnsi="Consolas" w:cs="Times New Roman"/>
+          <w:color w:val="F8F8F2"/>
+          <w:sz w:val="23"/>
+          <w:szCs w:val="23"/>
+          <w:lang w:eastAsia="pt-BR"/>
+        </w:rPr>
+        <w:t>)</w:t>
+      </w:r>
+    </w:p>
+    <w:p>
+      <w:pPr>
+        <w:rPr>
+          <w:rFonts w:cstheme="minorHAnsi"/>
+          <w:sz w:val="28"/>
+          <w:szCs w:val="36"/>
+        </w:rPr>
+      </w:pPr>
+    </w:p>
+    <w:p>
+      <w:pPr>
+        <w:rPr>
+          <w:rFonts w:cstheme="minorHAnsi"/>
+          <w:sz w:val="28"/>
+          <w:szCs w:val="36"/>
+        </w:rPr>
+      </w:pPr>
+      <w:r>
+        <w:rPr>
+          <w:rFonts w:cstheme="minorHAnsi"/>
+          <w:sz w:val="28"/>
+          <w:szCs w:val="36"/>
+        </w:rPr>
+        <w:t>? Se for verdadeiro ele retorna 1 e mostra a primeira condicional, se não</w:t>
+      </w:r>
+      <w:r>
+        <w:rPr>
+          <w:rFonts w:cstheme="minorHAnsi"/>
+          <w:sz w:val="28"/>
+          <w:szCs w:val="36"/>
+        </w:rPr>
+        <w:t>, ou seja, for 0(false)</w:t>
+      </w:r>
+      <w:r>
+        <w:rPr>
+          <w:rFonts w:cstheme="minorHAnsi"/>
+          <w:sz w:val="28"/>
+          <w:szCs w:val="36"/>
+        </w:rPr>
+        <w:t xml:space="preserve"> retorna </w:t>
+      </w:r>
+      <w:proofErr w:type="gramStart"/>
+      <w:r>
+        <w:rPr>
+          <w:rFonts w:cstheme="minorHAnsi"/>
+          <w:sz w:val="28"/>
+          <w:szCs w:val="36"/>
+        </w:rPr>
+        <w:t>a</w:t>
+      </w:r>
+      <w:proofErr w:type="gramEnd"/>
+      <w:r>
+        <w:rPr>
+          <w:rFonts w:cstheme="minorHAnsi"/>
+          <w:sz w:val="28"/>
+          <w:szCs w:val="36"/>
+        </w:rPr>
+        <w:t xml:space="preserve"> segunda</w:t>
+      </w:r>
+    </w:p>
+    <w:p>
+      <w:pPr>
+        <w:rPr>
+          <w:rFonts w:cstheme="minorHAnsi"/>
+          <w:sz w:val="28"/>
+          <w:szCs w:val="36"/>
+        </w:rPr>
+      </w:pPr>
+      <w:r>
+        <w:rPr>
+          <w:rFonts w:cstheme="minorHAnsi"/>
+          <w:sz w:val="28"/>
+          <w:szCs w:val="36"/>
+        </w:rPr>
+        <w:t>Exemplo: Se o n valer 10, nesta situação iria retornar impar porque o resultado do resto da divisão vai ser 0</w:t>
+      </w:r>
+    </w:p>
+    <w:p>
+      <w:pPr>
+        <w:rPr>
+          <w:rFonts w:cstheme="minorHAnsi"/>
+          <w:sz w:val="28"/>
+          <w:szCs w:val="36"/>
+        </w:rPr>
+      </w:pPr>
+      <w:r>
+        <w:rPr>
+          <w:rFonts w:cstheme="minorHAnsi"/>
+          <w:sz w:val="28"/>
+          <w:szCs w:val="36"/>
+        </w:rPr>
+        <w:t xml:space="preserve">O certo: </w:t>
+      </w:r>
+    </w:p>
+    <w:p>
+      <w:pPr>
+        <w:shd w:val="clear" w:color="auto" w:fill="282A36"/>
+        <w:spacing w:after="0" w:line="300" w:lineRule="atLeast"/>
+        <w:rPr>
+          <w:rFonts w:ascii="Consolas" w:eastAsia="Times New Roman" w:hAnsi="Consolas" w:cs="Times New Roman"/>
+          <w:color w:val="F8F8F2"/>
+          <w:sz w:val="23"/>
+          <w:szCs w:val="23"/>
+          <w:lang w:eastAsia="pt-BR"/>
+        </w:rPr>
+      </w:pPr>
+      <w:proofErr w:type="spellStart"/>
+      <w:r>
+        <w:rPr>
+          <w:rFonts w:ascii="Consolas" w:eastAsia="Times New Roman" w:hAnsi="Consolas" w:cs="Times New Roman"/>
+          <w:color w:val="FF79C6"/>
+          <w:sz w:val="23"/>
+          <w:szCs w:val="23"/>
+          <w:lang w:eastAsia="pt-BR"/>
+        </w:rPr>
+        <w:t>let</w:t>
+      </w:r>
+      <w:proofErr w:type="spellEnd"/>
+      <w:r>
+        <w:rPr>
+          <w:rFonts w:ascii="Consolas" w:eastAsia="Times New Roman" w:hAnsi="Consolas" w:cs="Times New Roman"/>
+          <w:color w:val="F8F8F2"/>
+          <w:sz w:val="23"/>
+          <w:szCs w:val="23"/>
+          <w:lang w:eastAsia="pt-BR"/>
+        </w:rPr>
+        <w:t xml:space="preserve"> res2 </w:t>
+      </w:r>
+      <w:r>
+        <w:rPr>
+          <w:rFonts w:ascii="Consolas" w:eastAsia="Times New Roman" w:hAnsi="Consolas" w:cs="Times New Roman"/>
+          <w:color w:val="FF79C6"/>
+          <w:sz w:val="23"/>
+          <w:szCs w:val="23"/>
+          <w:lang w:eastAsia="pt-BR"/>
+        </w:rPr>
+        <w:t>=</w:t>
+      </w:r>
+      <w:r>
+        <w:rPr>
+          <w:rFonts w:ascii="Consolas" w:eastAsia="Times New Roman" w:hAnsi="Consolas" w:cs="Times New Roman"/>
+          <w:color w:val="F8F8F2"/>
+          <w:sz w:val="23"/>
+          <w:szCs w:val="23"/>
+          <w:lang w:eastAsia="pt-BR"/>
+        </w:rPr>
+        <w:t xml:space="preserve"> </w:t>
+      </w:r>
+      <w:proofErr w:type="gramStart"/>
+      <w:r>
+        <w:rPr>
+          <w:rFonts w:ascii="Consolas" w:eastAsia="Times New Roman" w:hAnsi="Consolas" w:cs="Times New Roman"/>
+          <w:color w:val="F8F8F2"/>
+          <w:sz w:val="23"/>
+          <w:szCs w:val="23"/>
+          <w:lang w:eastAsia="pt-BR"/>
+        </w:rPr>
+        <w:t>(</w:t>
+      </w:r>
+      <w:r>
+        <w:rPr>
+          <w:rFonts w:ascii="Consolas" w:eastAsia="Times New Roman" w:hAnsi="Consolas" w:cs="Times New Roman"/>
+          <w:color w:val="FF79C6"/>
+          <w:sz w:val="23"/>
+          <w:szCs w:val="23"/>
+          <w:lang w:eastAsia="pt-BR"/>
+        </w:rPr>
+        <w:t>!</w:t>
+      </w:r>
+      <w:r>
+        <w:rPr>
+          <w:rFonts w:ascii="Consolas" w:eastAsia="Times New Roman" w:hAnsi="Consolas" w:cs="Times New Roman"/>
+          <w:color w:val="F8F8F2"/>
+          <w:sz w:val="23"/>
+          <w:szCs w:val="23"/>
+          <w:lang w:eastAsia="pt-BR"/>
+        </w:rPr>
+        <w:t>(</w:t>
+      </w:r>
+      <w:proofErr w:type="gramEnd"/>
+      <w:r>
+        <w:rPr>
+          <w:rFonts w:ascii="Consolas" w:eastAsia="Times New Roman" w:hAnsi="Consolas" w:cs="Times New Roman"/>
+          <w:color w:val="F8F8F2"/>
+          <w:sz w:val="23"/>
+          <w:szCs w:val="23"/>
+          <w:lang w:eastAsia="pt-BR"/>
+        </w:rPr>
+        <w:t xml:space="preserve">n </w:t>
+      </w:r>
+      <w:r>
+        <w:rPr>
+          <w:rFonts w:ascii="Consolas" w:eastAsia="Times New Roman" w:hAnsi="Consolas" w:cs="Times New Roman"/>
+          <w:color w:val="FF79C6"/>
+          <w:sz w:val="23"/>
+          <w:szCs w:val="23"/>
+          <w:lang w:eastAsia="pt-BR"/>
+        </w:rPr>
+        <w:t>%</w:t>
+      </w:r>
+      <w:r>
+        <w:rPr>
+          <w:rFonts w:ascii="Consolas" w:eastAsia="Times New Roman" w:hAnsi="Consolas" w:cs="Times New Roman"/>
+          <w:color w:val="F8F8F2"/>
+          <w:sz w:val="23"/>
+          <w:szCs w:val="23"/>
+          <w:lang w:eastAsia="pt-BR"/>
+        </w:rPr>
+        <w:t xml:space="preserve"> </w:t>
+      </w:r>
+      <w:r>
+        <w:rPr>
+          <w:rFonts w:ascii="Consolas" w:eastAsia="Times New Roman" w:hAnsi="Consolas" w:cs="Times New Roman"/>
+          <w:color w:val="BD93F9"/>
+          <w:sz w:val="23"/>
+          <w:szCs w:val="23"/>
+          <w:lang w:eastAsia="pt-BR"/>
+        </w:rPr>
+        <w:t>2</w:t>
+      </w:r>
+      <w:r>
+        <w:rPr>
+          <w:rFonts w:ascii="Consolas" w:eastAsia="Times New Roman" w:hAnsi="Consolas" w:cs="Times New Roman"/>
+          <w:color w:val="F8F8F2"/>
+          <w:sz w:val="23"/>
+          <w:szCs w:val="23"/>
+          <w:lang w:eastAsia="pt-BR"/>
+        </w:rPr>
+        <w:t xml:space="preserve"> )</w:t>
+      </w:r>
+      <w:r>
+        <w:rPr>
+          <w:rFonts w:ascii="Consolas" w:eastAsia="Times New Roman" w:hAnsi="Consolas" w:cs="Times New Roman"/>
+          <w:color w:val="FF79C6"/>
+          <w:sz w:val="23"/>
+          <w:szCs w:val="23"/>
+          <w:lang w:eastAsia="pt-BR"/>
+        </w:rPr>
+        <w:t>?</w:t>
+      </w:r>
+      <w:r>
+        <w:rPr>
+          <w:rFonts w:ascii="Consolas" w:eastAsia="Times New Roman" w:hAnsi="Consolas" w:cs="Times New Roman"/>
+          <w:color w:val="F8F8F2"/>
+          <w:sz w:val="23"/>
+          <w:szCs w:val="23"/>
+          <w:lang w:eastAsia="pt-BR"/>
+        </w:rPr>
+        <w:t xml:space="preserve"> </w:t>
+      </w:r>
+      <w:r>
+        <w:rPr>
+          <w:rFonts w:ascii="Consolas" w:eastAsia="Times New Roman" w:hAnsi="Consolas" w:cs="Times New Roman"/>
+          <w:color w:val="E9F284"/>
+          <w:sz w:val="23"/>
+          <w:szCs w:val="23"/>
+          <w:lang w:eastAsia="pt-BR"/>
+        </w:rPr>
+        <w:t>"</w:t>
+      </w:r>
+      <w:r>
+        <w:rPr>
+          <w:rFonts w:ascii="Consolas" w:eastAsia="Times New Roman" w:hAnsi="Consolas" w:cs="Times New Roman"/>
+          <w:color w:val="F1FA8C"/>
+          <w:sz w:val="23"/>
+          <w:szCs w:val="23"/>
+          <w:lang w:eastAsia="pt-BR"/>
+        </w:rPr>
+        <w:t>Par</w:t>
+      </w:r>
+      <w:proofErr w:type="gramStart"/>
+      <w:r>
+        <w:rPr>
+          <w:rFonts w:ascii="Consolas" w:eastAsia="Times New Roman" w:hAnsi="Consolas" w:cs="Times New Roman"/>
+          <w:color w:val="E9F284"/>
+          <w:sz w:val="23"/>
+          <w:szCs w:val="23"/>
+          <w:lang w:eastAsia="pt-BR"/>
+        </w:rPr>
+        <w:t>"</w:t>
+      </w:r>
+      <w:r>
+        <w:rPr>
+          <w:rFonts w:ascii="Consolas" w:eastAsia="Times New Roman" w:hAnsi="Consolas" w:cs="Times New Roman"/>
+          <w:color w:val="F8F8F2"/>
+          <w:sz w:val="23"/>
+          <w:szCs w:val="23"/>
+          <w:lang w:eastAsia="pt-BR"/>
+        </w:rPr>
+        <w:t xml:space="preserve"> </w:t>
+      </w:r>
+      <w:r>
+        <w:rPr>
+          <w:rFonts w:ascii="Consolas" w:eastAsia="Times New Roman" w:hAnsi="Consolas" w:cs="Times New Roman"/>
+          <w:color w:val="FF79C6"/>
+          <w:sz w:val="23"/>
+          <w:szCs w:val="23"/>
+          <w:lang w:eastAsia="pt-BR"/>
+        </w:rPr>
+        <w:t>:</w:t>
+      </w:r>
+      <w:proofErr w:type="gramEnd"/>
+      <w:r>
+        <w:rPr>
+          <w:rFonts w:ascii="Consolas" w:eastAsia="Times New Roman" w:hAnsi="Consolas" w:cs="Times New Roman"/>
+          <w:color w:val="F8F8F2"/>
+          <w:sz w:val="23"/>
+          <w:szCs w:val="23"/>
+          <w:lang w:eastAsia="pt-BR"/>
+        </w:rPr>
+        <w:t xml:space="preserve"> </w:t>
+      </w:r>
+      <w:r>
+        <w:rPr>
+          <w:rFonts w:ascii="Consolas" w:eastAsia="Times New Roman" w:hAnsi="Consolas" w:cs="Times New Roman"/>
+          <w:color w:val="E9F284"/>
+          <w:sz w:val="23"/>
+          <w:szCs w:val="23"/>
+          <w:lang w:eastAsia="pt-BR"/>
+        </w:rPr>
+        <w:t>"</w:t>
+      </w:r>
+      <w:r>
+        <w:rPr>
+          <w:rFonts w:ascii="Consolas" w:eastAsia="Times New Roman" w:hAnsi="Consolas" w:cs="Times New Roman"/>
+          <w:color w:val="F1FA8C"/>
+          <w:sz w:val="23"/>
+          <w:szCs w:val="23"/>
+          <w:lang w:eastAsia="pt-BR"/>
+        </w:rPr>
+        <w:t>Impar</w:t>
+      </w:r>
+      <w:r>
+        <w:rPr>
+          <w:rFonts w:ascii="Consolas" w:eastAsia="Times New Roman" w:hAnsi="Consolas" w:cs="Times New Roman"/>
+          <w:color w:val="E9F284"/>
+          <w:sz w:val="23"/>
+          <w:szCs w:val="23"/>
+          <w:lang w:eastAsia="pt-BR"/>
+        </w:rPr>
+        <w:t>"</w:t>
+      </w:r>
+      <w:r>
+        <w:rPr>
+          <w:rFonts w:ascii="Consolas" w:eastAsia="Times New Roman" w:hAnsi="Consolas" w:cs="Times New Roman"/>
+          <w:color w:val="F8F8F2"/>
+          <w:sz w:val="23"/>
+          <w:szCs w:val="23"/>
+          <w:lang w:eastAsia="pt-BR"/>
+        </w:rPr>
+        <w:t>)</w:t>
+      </w:r>
+    </w:p>
+    <w:p>
+      <w:pPr>
+        <w:rPr>
+          <w:color w:val="FF0000"/>
+          <w:sz w:val="36"/>
+          <w:szCs w:val="36"/>
+        </w:rPr>
+      </w:pPr>
+      <w:r>
+        <w:rPr>
+          <w:color w:val="FF0000"/>
+          <w:sz w:val="36"/>
+          <w:szCs w:val="36"/>
+        </w:rPr>
+        <w:t xml:space="preserve">Vídeo </w:t>
+      </w:r>
+      <w:r>
+        <w:rPr>
+          <w:color w:val="FF0000"/>
+          <w:sz w:val="36"/>
+          <w:szCs w:val="36"/>
+        </w:rPr>
+        <w:t>11</w:t>
+      </w:r>
+      <w:r>
+        <w:rPr>
+          <w:color w:val="FF0000"/>
+          <w:sz w:val="36"/>
+          <w:szCs w:val="36"/>
+        </w:rPr>
+        <w:t>.</w:t>
+      </w:r>
+    </w:p>
+    <w:p>
+      <w:pPr>
+        <w:rPr>
+          <w:rFonts w:cstheme="minorHAnsi"/>
+          <w:sz w:val="28"/>
+          <w:szCs w:val="36"/>
+        </w:rPr>
+      </w:pPr>
+      <w:proofErr w:type="spellStart"/>
+      <w:r>
+        <w:rPr>
+          <w:rFonts w:cstheme="minorHAnsi"/>
+          <w:b/>
+          <w:bCs/>
+          <w:sz w:val="28"/>
+          <w:szCs w:val="36"/>
+        </w:rPr>
+        <w:t>Typeof</w:t>
+      </w:r>
+      <w:proofErr w:type="spellEnd"/>
+      <w:r>
+        <w:rPr>
+          <w:rFonts w:cstheme="minorHAnsi"/>
+          <w:b/>
+          <w:bCs/>
+          <w:sz w:val="28"/>
+          <w:szCs w:val="36"/>
+        </w:rPr>
+        <w:t xml:space="preserve"> </w:t>
+      </w:r>
+      <w:r>
+        <w:rPr>
+          <w:rFonts w:cstheme="minorHAnsi"/>
+          <w:sz w:val="28"/>
+          <w:szCs w:val="36"/>
+        </w:rPr>
+        <w:t xml:space="preserve">= Retorna o tipo do operador/variável que </w:t>
+      </w:r>
+      <w:proofErr w:type="spellStart"/>
+      <w:proofErr w:type="gramStart"/>
+      <w:r>
+        <w:rPr>
+          <w:rFonts w:cstheme="minorHAnsi"/>
+          <w:sz w:val="28"/>
+          <w:szCs w:val="36"/>
+        </w:rPr>
+        <w:t>esta</w:t>
+      </w:r>
+      <w:proofErr w:type="spellEnd"/>
+      <w:proofErr w:type="gramEnd"/>
+      <w:r>
+        <w:rPr>
+          <w:rFonts w:cstheme="minorHAnsi"/>
+          <w:sz w:val="28"/>
+          <w:szCs w:val="36"/>
+        </w:rPr>
+        <w:t xml:space="preserve"> sendo usado.</w:t>
+      </w:r>
+    </w:p>
+    <w:p>
+      <w:pPr>
+        <w:shd w:val="clear" w:color="auto" w:fill="282A36"/>
+        <w:spacing w:after="0" w:line="300" w:lineRule="atLeast"/>
+        <w:rPr>
+          <w:rFonts w:ascii="Consolas" w:eastAsia="Times New Roman" w:hAnsi="Consolas" w:cs="Times New Roman"/>
+          <w:color w:val="F8F8F2"/>
+          <w:sz w:val="23"/>
+          <w:szCs w:val="23"/>
+          <w:lang w:val="en-US" w:eastAsia="pt-BR"/>
+        </w:rPr>
+      </w:pPr>
+      <w:r>
+        <w:rPr>
+          <w:rFonts w:ascii="Consolas" w:eastAsia="Times New Roman" w:hAnsi="Consolas" w:cs="Times New Roman"/>
+          <w:color w:val="BD93F9"/>
+          <w:sz w:val="23"/>
+          <w:szCs w:val="23"/>
+          <w:lang w:val="en-US" w:eastAsia="pt-BR"/>
+        </w:rPr>
+        <w:t>console</w:t>
+      </w:r>
+      <w:r>
+        <w:rPr>
+          <w:rFonts w:ascii="Consolas" w:eastAsia="Times New Roman" w:hAnsi="Consolas" w:cs="Times New Roman"/>
+          <w:color w:val="F8F8F2"/>
+          <w:sz w:val="23"/>
+          <w:szCs w:val="23"/>
+          <w:lang w:val="en-US" w:eastAsia="pt-BR"/>
+        </w:rPr>
+        <w:t>.</w:t>
+      </w:r>
+      <w:r>
+        <w:rPr>
+          <w:rFonts w:ascii="Consolas" w:eastAsia="Times New Roman" w:hAnsi="Consolas" w:cs="Times New Roman"/>
+          <w:color w:val="50FA7B"/>
+          <w:sz w:val="23"/>
+          <w:szCs w:val="23"/>
+          <w:lang w:val="en-US" w:eastAsia="pt-BR"/>
+        </w:rPr>
+        <w:t>log</w:t>
+      </w:r>
+      <w:r>
+        <w:rPr>
+          <w:rFonts w:ascii="Consolas" w:eastAsia="Times New Roman" w:hAnsi="Consolas" w:cs="Times New Roman"/>
+          <w:color w:val="F8F8F2"/>
+          <w:sz w:val="23"/>
+          <w:szCs w:val="23"/>
+          <w:lang w:val="en-US" w:eastAsia="pt-BR"/>
+        </w:rPr>
+        <w:t>(</w:t>
+      </w:r>
+      <w:proofErr w:type="spellStart"/>
+      <w:r>
+        <w:rPr>
+          <w:rFonts w:ascii="Consolas" w:eastAsia="Times New Roman" w:hAnsi="Consolas" w:cs="Times New Roman"/>
+          <w:color w:val="FF79C6"/>
+          <w:sz w:val="23"/>
+          <w:szCs w:val="23"/>
+          <w:lang w:val="en-US" w:eastAsia="pt-BR"/>
+        </w:rPr>
+        <w:t>typeof</w:t>
+      </w:r>
+      <w:proofErr w:type="spellEnd"/>
+      <w:r>
+        <w:rPr>
+          <w:rFonts w:ascii="Consolas" w:eastAsia="Times New Roman" w:hAnsi="Consolas" w:cs="Times New Roman"/>
+          <w:color w:val="F8F8F2"/>
+          <w:sz w:val="23"/>
+          <w:szCs w:val="23"/>
+          <w:lang w:val="en-US" w:eastAsia="pt-BR"/>
+        </w:rPr>
+        <w:t>(v1))</w:t>
+      </w:r>
+    </w:p>
+    <w:p>
+      <w:pPr>
+        <w:rPr>
+          <w:color w:val="FF0000"/>
+          <w:sz w:val="36"/>
+          <w:szCs w:val="36"/>
+          <w:lang w:val="en-US"/>
+        </w:rPr>
+      </w:pPr>
+    </w:p>
+    <w:p>
+      <w:pPr>
+        <w:rPr>
+          <w:color w:val="FF0000"/>
+          <w:sz w:val="36"/>
+          <w:szCs w:val="36"/>
+          <w:lang w:val="en-US"/>
+        </w:rPr>
+      </w:pPr>
+      <w:r>
+        <w:rPr>
+          <w:color w:val="FF0000"/>
+          <w:sz w:val="36"/>
+          <w:szCs w:val="36"/>
+          <w:lang w:val="en-US"/>
+        </w:rPr>
+        <w:t>Video</w:t>
+      </w:r>
+      <w:r>
+        <w:rPr>
+          <w:color w:val="FF0000"/>
+          <w:sz w:val="36"/>
+          <w:szCs w:val="36"/>
+          <w:lang w:val="en-US"/>
+        </w:rPr>
+        <w:t xml:space="preserve"> 12.</w:t>
+      </w:r>
+    </w:p>
+    <w:p>
+      <w:pPr>
+        <w:rPr>
+          <w:rFonts w:cstheme="minorHAnsi"/>
+          <w:sz w:val="28"/>
+          <w:szCs w:val="36"/>
+        </w:rPr>
+      </w:pPr>
+      <w:r>
+        <w:rPr>
+          <w:rFonts w:cstheme="minorHAnsi"/>
+          <w:b/>
+          <w:bCs/>
+          <w:sz w:val="28"/>
+          <w:szCs w:val="36"/>
+        </w:rPr>
+        <w:t>Spread</w:t>
+      </w:r>
+      <w:r>
+        <w:rPr>
+          <w:rFonts w:cstheme="minorHAnsi"/>
+          <w:sz w:val="28"/>
+          <w:szCs w:val="36"/>
+        </w:rPr>
+        <w:t xml:space="preserve"> = Ele quebra um </w:t>
+      </w:r>
+      <w:proofErr w:type="spellStart"/>
+      <w:r>
+        <w:rPr>
+          <w:rFonts w:cstheme="minorHAnsi"/>
+          <w:sz w:val="28"/>
+          <w:szCs w:val="36"/>
+        </w:rPr>
+        <w:t>a</w:t>
+      </w:r>
+      <w:r>
+        <w:rPr>
+          <w:rFonts w:cstheme="minorHAnsi"/>
+          <w:sz w:val="28"/>
+          <w:szCs w:val="36"/>
+        </w:rPr>
+        <w:t>rray</w:t>
+      </w:r>
+      <w:proofErr w:type="spellEnd"/>
+      <w:r>
+        <w:rPr>
+          <w:rFonts w:cstheme="minorHAnsi"/>
+          <w:sz w:val="28"/>
+          <w:szCs w:val="36"/>
+        </w:rPr>
+        <w:t>, quebrando um conjunto de elementos e devolvendo elemento por elemento.</w:t>
+      </w:r>
+    </w:p>
+    <w:p>
+      <w:pPr>
+        <w:rPr>
+          <w:rFonts w:cstheme="minorHAnsi"/>
+          <w:b/>
+          <w:bCs/>
+          <w:sz w:val="28"/>
+          <w:szCs w:val="36"/>
+        </w:rPr>
+      </w:pPr>
+      <w:r>
+        <w:rPr>
+          <w:rFonts w:cstheme="minorHAnsi"/>
+          <w:b/>
+          <w:bCs/>
+          <w:sz w:val="28"/>
+          <w:szCs w:val="36"/>
+        </w:rPr>
+        <w:t xml:space="preserve">Se quiser copiar um </w:t>
+      </w:r>
+      <w:proofErr w:type="spellStart"/>
+      <w:r>
+        <w:rPr>
+          <w:rFonts w:cstheme="minorHAnsi"/>
+          <w:b/>
+          <w:bCs/>
+          <w:sz w:val="28"/>
+          <w:szCs w:val="36"/>
+        </w:rPr>
+        <w:t>array</w:t>
+      </w:r>
+      <w:proofErr w:type="spellEnd"/>
+      <w:r>
+        <w:rPr>
+          <w:rFonts w:cstheme="minorHAnsi"/>
+          <w:b/>
+          <w:bCs/>
+          <w:sz w:val="28"/>
+          <w:szCs w:val="36"/>
+        </w:rPr>
+        <w:t xml:space="preserve"> para o outro:</w:t>
+      </w:r>
+    </w:p>
+    <w:p>
+      <w:pPr>
+        <w:shd w:val="clear" w:color="auto" w:fill="282A36"/>
+        <w:spacing w:after="0" w:line="300" w:lineRule="atLeast"/>
+        <w:rPr>
+          <w:rFonts w:ascii="Consolas" w:eastAsia="Times New Roman" w:hAnsi="Consolas" w:cs="Times New Roman"/>
+          <w:color w:val="F8F8F2"/>
+          <w:sz w:val="23"/>
+          <w:szCs w:val="23"/>
+          <w:lang w:eastAsia="pt-BR"/>
+        </w:rPr>
+      </w:pPr>
+      <w:proofErr w:type="spellStart"/>
+      <w:r>
+        <w:rPr>
+          <w:rFonts w:ascii="Consolas" w:eastAsia="Times New Roman" w:hAnsi="Consolas" w:cs="Times New Roman"/>
+          <w:color w:val="FF79C6"/>
+          <w:sz w:val="23"/>
+          <w:szCs w:val="23"/>
+          <w:lang w:eastAsia="pt-BR"/>
+        </w:rPr>
+        <w:t>let</w:t>
+      </w:r>
+      <w:proofErr w:type="spellEnd"/>
+      <w:r>
+        <w:rPr>
+          <w:rFonts w:ascii="Consolas" w:eastAsia="Times New Roman" w:hAnsi="Consolas" w:cs="Times New Roman"/>
+          <w:color w:val="F8F8F2"/>
+          <w:sz w:val="23"/>
+          <w:szCs w:val="23"/>
+          <w:lang w:eastAsia="pt-BR"/>
+        </w:rPr>
+        <w:t xml:space="preserve"> n3 </w:t>
+      </w:r>
+      <w:r>
+        <w:rPr>
+          <w:rFonts w:ascii="Consolas" w:eastAsia="Times New Roman" w:hAnsi="Consolas" w:cs="Times New Roman"/>
+          <w:color w:val="FF79C6"/>
+          <w:sz w:val="23"/>
+          <w:szCs w:val="23"/>
+          <w:lang w:eastAsia="pt-BR"/>
+        </w:rPr>
+        <w:t>=</w:t>
+      </w:r>
+      <w:r>
+        <w:rPr>
+          <w:rFonts w:ascii="Consolas" w:eastAsia="Times New Roman" w:hAnsi="Consolas" w:cs="Times New Roman"/>
+          <w:color w:val="F8F8F2"/>
+          <w:sz w:val="23"/>
+          <w:szCs w:val="23"/>
+          <w:lang w:eastAsia="pt-BR"/>
+        </w:rPr>
+        <w:t xml:space="preserve"> [</w:t>
+      </w:r>
+      <w:r>
+        <w:rPr>
+          <w:rFonts w:ascii="Consolas" w:eastAsia="Times New Roman" w:hAnsi="Consolas" w:cs="Times New Roman"/>
+          <w:color w:val="FF79C6"/>
+          <w:sz w:val="23"/>
+          <w:szCs w:val="23"/>
+          <w:lang w:eastAsia="pt-BR"/>
+        </w:rPr>
+        <w:t>...</w:t>
+      </w:r>
+      <w:r>
+        <w:rPr>
+          <w:rFonts w:ascii="Consolas" w:eastAsia="Times New Roman" w:hAnsi="Consolas" w:cs="Times New Roman"/>
+          <w:color w:val="F8F8F2"/>
+          <w:sz w:val="23"/>
+          <w:szCs w:val="23"/>
+          <w:lang w:eastAsia="pt-BR"/>
+        </w:rPr>
+        <w:t>n1]</w:t>
+      </w:r>
+    </w:p>
+    <w:p>
+      <w:pPr>
+        <w:rPr>
+          <w:rFonts w:cstheme="minorHAnsi"/>
+          <w:b/>
+          <w:bCs/>
+          <w:sz w:val="28"/>
+          <w:szCs w:val="36"/>
+        </w:rPr>
+      </w:pPr>
+      <w:r>
+        <w:rPr>
+          <w:rFonts w:cstheme="minorHAnsi"/>
+          <w:b/>
+          <w:bCs/>
+          <w:sz w:val="28"/>
+          <w:szCs w:val="36"/>
+        </w:rPr>
+        <w:t xml:space="preserve">Se quiser juntar dois </w:t>
+      </w:r>
+      <w:proofErr w:type="spellStart"/>
+      <w:r>
+        <w:rPr>
+          <w:rFonts w:cstheme="minorHAnsi"/>
+          <w:b/>
+          <w:bCs/>
+          <w:sz w:val="28"/>
+          <w:szCs w:val="36"/>
+        </w:rPr>
+        <w:t>arrays</w:t>
+      </w:r>
+      <w:proofErr w:type="spellEnd"/>
+      <w:r>
+        <w:rPr>
+          <w:rFonts w:cstheme="minorHAnsi"/>
+          <w:b/>
+          <w:bCs/>
+          <w:sz w:val="28"/>
+          <w:szCs w:val="36"/>
+        </w:rPr>
+        <w:t xml:space="preserve">: </w:t>
+      </w:r>
+    </w:p>
+    <w:p>
+      <w:pPr>
+        <w:shd w:val="clear" w:color="auto" w:fill="282A36"/>
+        <w:spacing w:after="0" w:line="300" w:lineRule="atLeast"/>
+        <w:rPr>
+          <w:rFonts w:ascii="Consolas" w:eastAsia="Times New Roman" w:hAnsi="Consolas" w:cs="Times New Roman"/>
+          <w:color w:val="F8F8F2"/>
+          <w:sz w:val="23"/>
+          <w:szCs w:val="23"/>
+          <w:lang w:eastAsia="pt-BR"/>
+        </w:rPr>
+      </w:pPr>
+      <w:proofErr w:type="spellStart"/>
+      <w:r>
+        <w:rPr>
+          <w:rFonts w:ascii="Consolas" w:eastAsia="Times New Roman" w:hAnsi="Consolas" w:cs="Times New Roman"/>
+          <w:color w:val="FF79C6"/>
+          <w:sz w:val="23"/>
+          <w:szCs w:val="23"/>
+          <w:lang w:eastAsia="pt-BR"/>
+        </w:rPr>
+        <w:t>let</w:t>
+      </w:r>
+      <w:proofErr w:type="spellEnd"/>
+      <w:r>
+        <w:rPr>
+          <w:rFonts w:ascii="Consolas" w:eastAsia="Times New Roman" w:hAnsi="Consolas" w:cs="Times New Roman"/>
+          <w:color w:val="F8F8F2"/>
+          <w:sz w:val="23"/>
+          <w:szCs w:val="23"/>
+          <w:lang w:eastAsia="pt-BR"/>
+        </w:rPr>
+        <w:t xml:space="preserve"> n3 </w:t>
+      </w:r>
+      <w:r>
+        <w:rPr>
+          <w:rFonts w:ascii="Consolas" w:eastAsia="Times New Roman" w:hAnsi="Consolas" w:cs="Times New Roman"/>
+          <w:color w:val="FF79C6"/>
+          <w:sz w:val="23"/>
+          <w:szCs w:val="23"/>
+          <w:lang w:eastAsia="pt-BR"/>
+        </w:rPr>
+        <w:t>=</w:t>
+      </w:r>
+      <w:r>
+        <w:rPr>
+          <w:rFonts w:ascii="Consolas" w:eastAsia="Times New Roman" w:hAnsi="Consolas" w:cs="Times New Roman"/>
+          <w:color w:val="F8F8F2"/>
+          <w:sz w:val="23"/>
+          <w:szCs w:val="23"/>
+          <w:lang w:eastAsia="pt-BR"/>
+        </w:rPr>
+        <w:t xml:space="preserve"> [n</w:t>
+      </w:r>
+      <w:proofErr w:type="gramStart"/>
+      <w:r>
+        <w:rPr>
+          <w:rFonts w:ascii="Consolas" w:eastAsia="Times New Roman" w:hAnsi="Consolas" w:cs="Times New Roman"/>
+          <w:color w:val="F8F8F2"/>
+          <w:sz w:val="23"/>
+          <w:szCs w:val="23"/>
+          <w:lang w:eastAsia="pt-BR"/>
+        </w:rPr>
+        <w:t>1,n</w:t>
+      </w:r>
+      <w:proofErr w:type="gramEnd"/>
+      <w:r>
+        <w:rPr>
+          <w:rFonts w:ascii="Consolas" w:eastAsia="Times New Roman" w:hAnsi="Consolas" w:cs="Times New Roman"/>
+          <w:color w:val="F8F8F2"/>
+          <w:sz w:val="23"/>
+          <w:szCs w:val="23"/>
+          <w:lang w:eastAsia="pt-BR"/>
+        </w:rPr>
+        <w:t>2]</w:t>
+      </w:r>
+    </w:p>
+    <w:p>
+      <w:pPr>
+        <w:rPr>
+          <w:rFonts w:cstheme="minorHAnsi"/>
+          <w:b/>
+          <w:bCs/>
+          <w:sz w:val="28"/>
+          <w:szCs w:val="36"/>
+        </w:rPr>
+      </w:pPr>
+      <w:r>
+        <w:rPr>
+          <w:rFonts w:cstheme="minorHAnsi"/>
+          <w:b/>
+          <w:bCs/>
+          <w:sz w:val="28"/>
+          <w:szCs w:val="36"/>
+        </w:rPr>
+        <w:t>Usando Spread:</w:t>
+      </w:r>
+    </w:p>
+    <w:p>
+      <w:pPr>
+        <w:shd w:val="clear" w:color="auto" w:fill="282A36"/>
+        <w:spacing w:after="0" w:line="300" w:lineRule="atLeast"/>
+        <w:rPr>
+          <w:rFonts w:ascii="Consolas" w:eastAsia="Times New Roman" w:hAnsi="Consolas" w:cs="Times New Roman"/>
+          <w:color w:val="F8F8F2"/>
+          <w:sz w:val="23"/>
+          <w:szCs w:val="23"/>
+          <w:lang w:eastAsia="pt-BR"/>
+        </w:rPr>
+      </w:pPr>
+      <w:proofErr w:type="spellStart"/>
+      <w:r>
+        <w:rPr>
+          <w:rFonts w:ascii="Consolas" w:eastAsia="Times New Roman" w:hAnsi="Consolas" w:cs="Times New Roman"/>
+          <w:color w:val="FF79C6"/>
+          <w:sz w:val="23"/>
+          <w:szCs w:val="23"/>
+          <w:lang w:eastAsia="pt-BR"/>
+        </w:rPr>
+        <w:t>let</w:t>
+      </w:r>
+      <w:proofErr w:type="spellEnd"/>
+      <w:r>
+        <w:rPr>
+          <w:rFonts w:ascii="Consolas" w:eastAsia="Times New Roman" w:hAnsi="Consolas" w:cs="Times New Roman"/>
+          <w:color w:val="F8F8F2"/>
+          <w:sz w:val="23"/>
+          <w:szCs w:val="23"/>
+          <w:lang w:eastAsia="pt-BR"/>
+        </w:rPr>
+        <w:t xml:space="preserve"> n3 </w:t>
+      </w:r>
+      <w:r>
+        <w:rPr>
+          <w:rFonts w:ascii="Consolas" w:eastAsia="Times New Roman" w:hAnsi="Consolas" w:cs="Times New Roman"/>
+          <w:color w:val="FF79C6"/>
+          <w:sz w:val="23"/>
+          <w:szCs w:val="23"/>
+          <w:lang w:eastAsia="pt-BR"/>
+        </w:rPr>
+        <w:t>=</w:t>
+      </w:r>
+      <w:r>
+        <w:rPr>
+          <w:rFonts w:ascii="Consolas" w:eastAsia="Times New Roman" w:hAnsi="Consolas" w:cs="Times New Roman"/>
+          <w:color w:val="F8F8F2"/>
+          <w:sz w:val="23"/>
+          <w:szCs w:val="23"/>
+          <w:lang w:eastAsia="pt-BR"/>
+        </w:rPr>
+        <w:t xml:space="preserve"> [</w:t>
+      </w:r>
+      <w:r>
+        <w:rPr>
+          <w:rFonts w:ascii="Consolas" w:eastAsia="Times New Roman" w:hAnsi="Consolas" w:cs="Times New Roman"/>
+          <w:color w:val="F8F8F2"/>
+          <w:sz w:val="23"/>
+          <w:szCs w:val="23"/>
+          <w:lang w:eastAsia="pt-BR"/>
+        </w:rPr>
+        <w:t>...</w:t>
+      </w:r>
+      <w:r>
+        <w:rPr>
+          <w:rFonts w:ascii="Consolas" w:eastAsia="Times New Roman" w:hAnsi="Consolas" w:cs="Times New Roman"/>
+          <w:color w:val="F8F8F2"/>
+          <w:sz w:val="23"/>
+          <w:szCs w:val="23"/>
+          <w:lang w:eastAsia="pt-BR"/>
+        </w:rPr>
+        <w:t>n</w:t>
+      </w:r>
+      <w:proofErr w:type="gramStart"/>
+      <w:r>
+        <w:rPr>
+          <w:rFonts w:ascii="Consolas" w:eastAsia="Times New Roman" w:hAnsi="Consolas" w:cs="Times New Roman"/>
+          <w:color w:val="F8F8F2"/>
+          <w:sz w:val="23"/>
+          <w:szCs w:val="23"/>
+          <w:lang w:eastAsia="pt-BR"/>
+        </w:rPr>
+        <w:t>1,</w:t>
+      </w:r>
+      <w:r>
+        <w:rPr>
+          <w:rFonts w:ascii="Consolas" w:eastAsia="Times New Roman" w:hAnsi="Consolas" w:cs="Times New Roman"/>
+          <w:color w:val="F8F8F2"/>
+          <w:sz w:val="23"/>
+          <w:szCs w:val="23"/>
+          <w:lang w:eastAsia="pt-BR"/>
+        </w:rPr>
+        <w:t>...</w:t>
+      </w:r>
+      <w:proofErr w:type="gramEnd"/>
+      <w:r>
+        <w:rPr>
+          <w:rFonts w:ascii="Consolas" w:eastAsia="Times New Roman" w:hAnsi="Consolas" w:cs="Times New Roman"/>
+          <w:color w:val="F8F8F2"/>
+          <w:sz w:val="23"/>
+          <w:szCs w:val="23"/>
+          <w:lang w:eastAsia="pt-BR"/>
+        </w:rPr>
+        <w:t>n2]</w:t>
+      </w:r>
+    </w:p>
+    <w:p>
+      <w:pPr>
+        <w:rPr>
+          <w:rFonts w:cstheme="minorHAnsi"/>
+          <w:sz w:val="28"/>
+          <w:szCs w:val="36"/>
+        </w:rPr>
+      </w:pPr>
+      <w:r>
+        <w:rPr>
+          <w:rFonts w:cstheme="minorHAnsi"/>
+          <w:b/>
+          <w:bCs/>
+          <w:sz w:val="28"/>
+          <w:szCs w:val="36"/>
+        </w:rPr>
+        <w:lastRenderedPageBreak/>
+        <w:t>Qual a diferença de usar [n</w:t>
+      </w:r>
+      <w:proofErr w:type="gramStart"/>
+      <w:r>
+        <w:rPr>
+          <w:rFonts w:cstheme="minorHAnsi"/>
+          <w:b/>
+          <w:bCs/>
+          <w:sz w:val="28"/>
+          <w:szCs w:val="36"/>
+        </w:rPr>
+        <w:t>1,n</w:t>
+      </w:r>
+      <w:proofErr w:type="gramEnd"/>
+      <w:r>
+        <w:rPr>
+          <w:rFonts w:cstheme="minorHAnsi"/>
+          <w:b/>
+          <w:bCs/>
+          <w:sz w:val="28"/>
+          <w:szCs w:val="36"/>
+        </w:rPr>
+        <w:t>2] entre usar [...n1,...n2]?</w:t>
+      </w:r>
+      <w:r>
+        <w:rPr>
+          <w:rFonts w:cstheme="minorHAnsi"/>
+          <w:b/>
+          <w:bCs/>
+          <w:sz w:val="28"/>
+          <w:szCs w:val="36"/>
+        </w:rPr>
+        <w:t xml:space="preserve"> – </w:t>
+      </w:r>
+      <w:r>
+        <w:rPr>
+          <w:rFonts w:cstheme="minorHAnsi"/>
+          <w:sz w:val="28"/>
+          <w:szCs w:val="36"/>
+        </w:rPr>
+        <w:t xml:space="preserve">Se você usar o primeiro apresentado, ele cria uma lista com outras listas(matriz). Mas se usar o segundo apresentado, ele cria uma lista </w:t>
+      </w:r>
+      <w:proofErr w:type="gramStart"/>
+      <w:r>
+        <w:rPr>
+          <w:rFonts w:cstheme="minorHAnsi"/>
+          <w:sz w:val="28"/>
+          <w:szCs w:val="36"/>
+        </w:rPr>
+        <w:t>plana(</w:t>
+      </w:r>
+      <w:proofErr w:type="gramEnd"/>
+      <w:r>
+        <w:rPr>
+          <w:rFonts w:cstheme="minorHAnsi"/>
+          <w:sz w:val="28"/>
+          <w:szCs w:val="36"/>
+        </w:rPr>
+        <w:t xml:space="preserve">um </w:t>
+      </w:r>
+      <w:proofErr w:type="spellStart"/>
+      <w:r>
+        <w:rPr>
+          <w:rFonts w:cstheme="minorHAnsi"/>
+          <w:sz w:val="28"/>
+          <w:szCs w:val="36"/>
+        </w:rPr>
+        <w:t>array</w:t>
+      </w:r>
+      <w:proofErr w:type="spellEnd"/>
+      <w:r>
+        <w:rPr>
+          <w:rFonts w:cstheme="minorHAnsi"/>
+          <w:sz w:val="28"/>
+          <w:szCs w:val="36"/>
+        </w:rPr>
+        <w:t xml:space="preserve"> normal).</w:t>
+      </w:r>
+    </w:p>
+    <w:p>
+      <w:pPr>
+        <w:rPr>
+          <w:rFonts w:cstheme="minorHAnsi"/>
+          <w:b/>
+          <w:bCs/>
+          <w:sz w:val="28"/>
+          <w:szCs w:val="36"/>
+        </w:rPr>
+      </w:pPr>
+      <w:r>
+        <w:rPr>
+          <w:rFonts w:cstheme="minorHAnsi"/>
+          <w:b/>
+          <w:bCs/>
+          <w:sz w:val="28"/>
+          <w:szCs w:val="36"/>
+        </w:rPr>
+        <w:t>Usar funções usando spread:</w:t>
+      </w:r>
+    </w:p>
+    <w:p>
+      <w:pPr>
+        <w:shd w:val="clear" w:color="auto" w:fill="282A36"/>
+        <w:spacing w:after="0" w:line="300" w:lineRule="atLeast"/>
+        <w:rPr>
+          <w:rFonts w:ascii="Consolas" w:eastAsia="Times New Roman" w:hAnsi="Consolas" w:cs="Times New Roman"/>
+          <w:color w:val="F8F8F2"/>
+          <w:sz w:val="23"/>
+          <w:szCs w:val="23"/>
+          <w:lang w:eastAsia="pt-BR"/>
+        </w:rPr>
+      </w:pPr>
+      <w:proofErr w:type="gramStart"/>
+      <w:r>
+        <w:rPr>
+          <w:rFonts w:ascii="Consolas" w:eastAsia="Times New Roman" w:hAnsi="Consolas" w:cs="Times New Roman"/>
+          <w:color w:val="BD93F9"/>
+          <w:sz w:val="23"/>
+          <w:szCs w:val="23"/>
+          <w:lang w:eastAsia="pt-BR"/>
+        </w:rPr>
+        <w:t>console</w:t>
+      </w:r>
+      <w:r>
+        <w:rPr>
+          <w:rFonts w:ascii="Consolas" w:eastAsia="Times New Roman" w:hAnsi="Consolas" w:cs="Times New Roman"/>
+          <w:color w:val="F8F8F2"/>
+          <w:sz w:val="23"/>
+          <w:szCs w:val="23"/>
+          <w:lang w:eastAsia="pt-BR"/>
+        </w:rPr>
+        <w:t>.</w:t>
+      </w:r>
+      <w:r>
+        <w:rPr>
+          <w:rFonts w:ascii="Consolas" w:eastAsia="Times New Roman" w:hAnsi="Consolas" w:cs="Times New Roman"/>
+          <w:color w:val="50FA7B"/>
+          <w:sz w:val="23"/>
+          <w:szCs w:val="23"/>
+          <w:lang w:eastAsia="pt-BR"/>
+        </w:rPr>
+        <w:t>log</w:t>
+      </w:r>
+      <w:r>
+        <w:rPr>
+          <w:rFonts w:ascii="Consolas" w:eastAsia="Times New Roman" w:hAnsi="Consolas" w:cs="Times New Roman"/>
+          <w:color w:val="F8F8F2"/>
+          <w:sz w:val="23"/>
+          <w:szCs w:val="23"/>
+          <w:lang w:eastAsia="pt-BR"/>
+        </w:rPr>
+        <w:t>(</w:t>
+      </w:r>
+      <w:proofErr w:type="gramEnd"/>
+      <w:r>
+        <w:rPr>
+          <w:rFonts w:ascii="Consolas" w:eastAsia="Times New Roman" w:hAnsi="Consolas" w:cs="Times New Roman"/>
+          <w:color w:val="E9F284"/>
+          <w:sz w:val="23"/>
+          <w:szCs w:val="23"/>
+          <w:lang w:eastAsia="pt-BR"/>
+        </w:rPr>
+        <w:t>"</w:t>
+      </w:r>
+      <w:r>
+        <w:rPr>
+          <w:rFonts w:ascii="Consolas" w:eastAsia="Times New Roman" w:hAnsi="Consolas" w:cs="Times New Roman"/>
+          <w:color w:val="F1FA8C"/>
+          <w:sz w:val="23"/>
+          <w:szCs w:val="23"/>
+          <w:lang w:eastAsia="pt-BR"/>
+        </w:rPr>
+        <w:t xml:space="preserve">Soma: </w:t>
+      </w:r>
+      <w:r>
+        <w:rPr>
+          <w:rFonts w:ascii="Consolas" w:eastAsia="Times New Roman" w:hAnsi="Consolas" w:cs="Times New Roman"/>
+          <w:color w:val="E9F284"/>
+          <w:sz w:val="23"/>
+          <w:szCs w:val="23"/>
+          <w:lang w:eastAsia="pt-BR"/>
+        </w:rPr>
+        <w:t>"</w:t>
+      </w:r>
+      <w:r>
+        <w:rPr>
+          <w:rFonts w:ascii="Consolas" w:eastAsia="Times New Roman" w:hAnsi="Consolas" w:cs="Times New Roman"/>
+          <w:color w:val="F8F8F2"/>
+          <w:sz w:val="23"/>
+          <w:szCs w:val="23"/>
+          <w:lang w:eastAsia="pt-BR"/>
+        </w:rPr>
+        <w:t xml:space="preserve"> </w:t>
+      </w:r>
+      <w:r>
+        <w:rPr>
+          <w:rFonts w:ascii="Consolas" w:eastAsia="Times New Roman" w:hAnsi="Consolas" w:cs="Times New Roman"/>
+          <w:color w:val="FF79C6"/>
+          <w:sz w:val="23"/>
+          <w:szCs w:val="23"/>
+          <w:lang w:eastAsia="pt-BR"/>
+        </w:rPr>
+        <w:t>+</w:t>
+      </w:r>
+      <w:r>
+        <w:rPr>
+          <w:rFonts w:ascii="Consolas" w:eastAsia="Times New Roman" w:hAnsi="Consolas" w:cs="Times New Roman"/>
+          <w:color w:val="F8F8F2"/>
+          <w:sz w:val="23"/>
+          <w:szCs w:val="23"/>
+          <w:lang w:eastAsia="pt-BR"/>
+        </w:rPr>
+        <w:t xml:space="preserve"> </w:t>
+      </w:r>
+      <w:r>
+        <w:rPr>
+          <w:rFonts w:ascii="Consolas" w:eastAsia="Times New Roman" w:hAnsi="Consolas" w:cs="Times New Roman"/>
+          <w:color w:val="50FA7B"/>
+          <w:sz w:val="23"/>
+          <w:szCs w:val="23"/>
+          <w:lang w:eastAsia="pt-BR"/>
+        </w:rPr>
+        <w:t>soma</w:t>
+      </w:r>
+      <w:r>
+        <w:rPr>
+          <w:rFonts w:ascii="Consolas" w:eastAsia="Times New Roman" w:hAnsi="Consolas" w:cs="Times New Roman"/>
+          <w:color w:val="F8F8F2"/>
+          <w:sz w:val="23"/>
+          <w:szCs w:val="23"/>
+          <w:lang w:eastAsia="pt-BR"/>
+        </w:rPr>
+        <w:t>(</w:t>
+      </w:r>
+      <w:r>
+        <w:rPr>
+          <w:rFonts w:ascii="Consolas" w:eastAsia="Times New Roman" w:hAnsi="Consolas" w:cs="Times New Roman"/>
+          <w:color w:val="FF79C6"/>
+          <w:sz w:val="23"/>
+          <w:szCs w:val="23"/>
+          <w:lang w:eastAsia="pt-BR"/>
+        </w:rPr>
+        <w:t>...</w:t>
+      </w:r>
+      <w:r>
+        <w:rPr>
+          <w:rFonts w:ascii="Consolas" w:eastAsia="Times New Roman" w:hAnsi="Consolas" w:cs="Times New Roman"/>
+          <w:color w:val="F8F8F2"/>
+          <w:sz w:val="23"/>
+          <w:szCs w:val="23"/>
+          <w:lang w:eastAsia="pt-BR"/>
+        </w:rPr>
+        <w:t>valores))</w:t>
+      </w:r>
+    </w:p>
+    <w:p>
+      <w:pPr>
+        <w:rPr>
+          <w:rFonts w:cstheme="minorHAnsi"/>
+          <w:sz w:val="28"/>
+          <w:szCs w:val="36"/>
+        </w:rPr>
+      </w:pPr>
+    </w:p>
+    <w:p>
+      <w:pPr>
+        <w:rPr>
+          <w:color w:val="FF0000"/>
+          <w:sz w:val="36"/>
+          <w:szCs w:val="36"/>
+          <w:lang w:val="en-US"/>
+        </w:rPr>
+      </w:pPr>
+      <w:r>
+        <w:rPr>
+          <w:color w:val="FF0000"/>
+          <w:sz w:val="36"/>
+          <w:szCs w:val="36"/>
+          <w:lang w:val="en-US"/>
+        </w:rPr>
+        <w:t>Video</w:t>
+      </w:r>
+      <w:r>
+        <w:rPr>
+          <w:color w:val="FF0000"/>
+          <w:sz w:val="36"/>
+          <w:szCs w:val="36"/>
+          <w:lang w:val="en-US"/>
+        </w:rPr>
+        <w:t xml:space="preserve"> 1</w:t>
+      </w:r>
+      <w:r>
+        <w:rPr>
+          <w:color w:val="FF0000"/>
+          <w:sz w:val="36"/>
+          <w:szCs w:val="36"/>
+          <w:lang w:val="en-US"/>
+        </w:rPr>
+        <w:t>3</w:t>
+      </w:r>
+      <w:r>
+        <w:rPr>
+          <w:color w:val="FF0000"/>
+          <w:sz w:val="36"/>
+          <w:szCs w:val="36"/>
+          <w:lang w:val="en-US"/>
+        </w:rPr>
+        <w:t>.</w:t>
+      </w:r>
+    </w:p>
+    <w:p>
+      <w:pPr>
+        <w:rPr>
+          <w:rFonts w:cstheme="minorHAnsi"/>
+          <w:sz w:val="28"/>
+          <w:szCs w:val="36"/>
+        </w:rPr>
+      </w:pPr>
+      <w:r>
+        <w:rPr>
+          <w:rFonts w:cstheme="minorHAnsi"/>
+          <w:sz w:val="28"/>
+          <w:szCs w:val="36"/>
+        </w:rPr>
+        <w:t xml:space="preserve">Estrutura </w:t>
+      </w:r>
+      <w:proofErr w:type="spellStart"/>
+      <w:r>
+        <w:rPr>
+          <w:rFonts w:cstheme="minorHAnsi"/>
+          <w:sz w:val="28"/>
+          <w:szCs w:val="36"/>
+        </w:rPr>
+        <w:t>If</w:t>
       </w:r>
       <w:bookmarkStart w:id="0" w:name="_GoBack"/>
       <w:bookmarkEnd w:id="0"/>
-      <w:r>
-        <w:rPr>
-          <w:sz w:val="28"/>
-          <w:szCs w:val="36"/>
-        </w:rPr>
-        <w:t xml:space="preserve">que o Browser usa para poder desenhar os elementos desta página. E o </w:t>
-      </w:r>
-      <w:proofErr w:type="spellStart"/>
-      <w:r>
-        <w:rPr>
-          <w:sz w:val="28"/>
-          <w:szCs w:val="36"/>
-        </w:rPr>
-        <w:t>javascript</w:t>
-      </w:r>
       <w:proofErr w:type="spellEnd"/>
-      <w:r>
-        <w:rPr>
-          <w:sz w:val="28"/>
-          <w:szCs w:val="36"/>
-        </w:rPr>
-        <w:t xml:space="preserve"> consegue enxergar essa arvore e usar os elementos </w:t>
-      </w:r>
     </w:p>
     <w:sectPr>
       <w:pgSz w:w="11906" w:h="16838"/>
@@ -764,6 +3954,771 @@
     </w:sectPr>
   </w:body>
 </w:document>
+</file>
+
+<file path=word/numbering.xml><?xml version="1.0" encoding="utf-8"?>
+<w:numbering xmlns:wpc="http://schemas.microsoft.com/office/word/2010/wordprocessingCanvas" xmlns:cx="http://schemas.microsoft.com/office/drawing/2014/chartex" xmlns:cx1="http://schemas.microsoft.com/office/drawing/2015/9/8/chartex" xmlns:cx2="http://schemas.microsoft.com/office/drawing/2015/10/21/chartex" xmlns:cx3="http://schemas.microsoft.com/office/drawing/2016/5/9/chartex" xmlns:cx4="http://schemas.microsoft.com/office/drawing/2016/5/10/chartex" xmlns:cx5="http://schemas.microsoft.com/office/drawing/2016/5/11/chartex" xmlns:cx6="http://schemas.microsoft.com/office/drawing/2016/5/12/chartex" xmlns:cx7="http://schemas.microsoft.com/office/drawing/2016/5/13/chartex" xmlns:cx8="http://schemas.microsoft.com/office/drawing/2016/5/14/chartex" xmlns:mc="http://schemas.openxmlformats.org/markup-compatibility/2006" xmlns:aink="http://schemas.microsoft.com/office/drawing/2016/ink" xmlns:am3d="http://schemas.microsoft.com/office/drawing/2017/model3d" xmlns:o="urn:schemas-microsoft-com:office:office" xmlns:r="http://schemas.openxmlformats.org/officeDocument/2006/relationships" xmlns:m="http://schemas.openxmlformats.org/officeDocument/2006/math" xmlns:v="urn:schemas-microsoft-com:vml" xmlns:wp14="http://schemas.microsoft.com/office/word/2010/wordprocessingDrawing" xmlns:wp="http://schemas.openxmlformats.org/drawingml/2006/wordprocessingDrawing" xmlns:w10="urn:schemas-microsoft-com:office:word" xmlns:w="http://schemas.openxmlformats.org/wordprocessingml/2006/main" xmlns:w14="http://schemas.microsoft.com/office/word/2010/wordml" xmlns:w15="http://schemas.microsoft.com/office/word/2012/wordml" xmlns:w16cid="http://schemas.microsoft.com/office/word/2016/wordml/cid" xmlns:w16se="http://schemas.microsoft.com/office/word/2015/wordml/symex" xmlns:wpg="http://schemas.microsoft.com/office/word/2010/wordprocessingGroup" xmlns:wpi="http://schemas.microsoft.com/office/word/2010/wordprocessingInk" xmlns:wne="http://schemas.microsoft.com/office/word/2006/wordml" xmlns:wps="http://schemas.microsoft.com/office/word/2010/wordprocessingShape" mc:Ignorable="w14 w15 w16se w16cid wp14">
+  <w:abstractNum w:abstractNumId="0" w15:restartNumberingAfterBreak="0">
+    <w:nsid w:val="053F6758"/>
+    <w:multiLevelType w:val="multilevel"/>
+    <w:tmpl w:val="B128FEC8"/>
+    <w:lvl w:ilvl="0">
+      <w:start w:val="1"/>
+      <w:numFmt w:val="bullet"/>
+      <w:lvlText w:val=""/>
+      <w:lvlJc w:val="left"/>
+      <w:pPr>
+        <w:tabs>
+          <w:tab w:val="num" w:pos="720"/>
+        </w:tabs>
+        <w:ind w:left="720" w:hanging="360"/>
+      </w:pPr>
+      <w:rPr>
+        <w:rFonts w:ascii="Symbol" w:hAnsi="Symbol" w:hint="default"/>
+        <w:sz w:val="20"/>
+      </w:rPr>
+    </w:lvl>
+    <w:lvl w:ilvl="1" w:tentative="1">
+      <w:start w:val="1"/>
+      <w:numFmt w:val="bullet"/>
+      <w:lvlText w:val="o"/>
+      <w:lvlJc w:val="left"/>
+      <w:pPr>
+        <w:tabs>
+          <w:tab w:val="num" w:pos="1440"/>
+        </w:tabs>
+        <w:ind w:left="1440" w:hanging="360"/>
+      </w:pPr>
+      <w:rPr>
+        <w:rFonts w:ascii="Courier New" w:hAnsi="Courier New" w:hint="default"/>
+        <w:sz w:val="20"/>
+      </w:rPr>
+    </w:lvl>
+    <w:lvl w:ilvl="2" w:tentative="1">
+      <w:start w:val="1"/>
+      <w:numFmt w:val="bullet"/>
+      <w:lvlText w:val=""/>
+      <w:lvlJc w:val="left"/>
+      <w:pPr>
+        <w:tabs>
+          <w:tab w:val="num" w:pos="2160"/>
+        </w:tabs>
+        <w:ind w:left="2160" w:hanging="360"/>
+      </w:pPr>
+      <w:rPr>
+        <w:rFonts w:ascii="Wingdings" w:hAnsi="Wingdings" w:hint="default"/>
+        <w:sz w:val="20"/>
+      </w:rPr>
+    </w:lvl>
+    <w:lvl w:ilvl="3" w:tentative="1">
+      <w:start w:val="1"/>
+      <w:numFmt w:val="bullet"/>
+      <w:lvlText w:val=""/>
+      <w:lvlJc w:val="left"/>
+      <w:pPr>
+        <w:tabs>
+          <w:tab w:val="num" w:pos="2880"/>
+        </w:tabs>
+        <w:ind w:left="2880" w:hanging="360"/>
+      </w:pPr>
+      <w:rPr>
+        <w:rFonts w:ascii="Wingdings" w:hAnsi="Wingdings" w:hint="default"/>
+        <w:sz w:val="20"/>
+      </w:rPr>
+    </w:lvl>
+    <w:lvl w:ilvl="4" w:tentative="1">
+      <w:start w:val="1"/>
+      <w:numFmt w:val="bullet"/>
+      <w:lvlText w:val=""/>
+      <w:lvlJc w:val="left"/>
+      <w:pPr>
+        <w:tabs>
+          <w:tab w:val="num" w:pos="3600"/>
+        </w:tabs>
+        <w:ind w:left="3600" w:hanging="360"/>
+      </w:pPr>
+      <w:rPr>
+        <w:rFonts w:ascii="Wingdings" w:hAnsi="Wingdings" w:hint="default"/>
+        <w:sz w:val="20"/>
+      </w:rPr>
+    </w:lvl>
+    <w:lvl w:ilvl="5" w:tentative="1">
+      <w:start w:val="1"/>
+      <w:numFmt w:val="bullet"/>
+      <w:lvlText w:val=""/>
+      <w:lvlJc w:val="left"/>
+      <w:pPr>
+        <w:tabs>
+          <w:tab w:val="num" w:pos="4320"/>
+        </w:tabs>
+        <w:ind w:left="4320" w:hanging="360"/>
+      </w:pPr>
+      <w:rPr>
+        <w:rFonts w:ascii="Wingdings" w:hAnsi="Wingdings" w:hint="default"/>
+        <w:sz w:val="20"/>
+      </w:rPr>
+    </w:lvl>
+    <w:lvl w:ilvl="6" w:tentative="1">
+      <w:start w:val="1"/>
+      <w:numFmt w:val="bullet"/>
+      <w:lvlText w:val=""/>
+      <w:lvlJc w:val="left"/>
+      <w:pPr>
+        <w:tabs>
+          <w:tab w:val="num" w:pos="5040"/>
+        </w:tabs>
+        <w:ind w:left="5040" w:hanging="360"/>
+      </w:pPr>
+      <w:rPr>
+        <w:rFonts w:ascii="Wingdings" w:hAnsi="Wingdings" w:hint="default"/>
+        <w:sz w:val="20"/>
+      </w:rPr>
+    </w:lvl>
+    <w:lvl w:ilvl="7" w:tentative="1">
+      <w:start w:val="1"/>
+      <w:numFmt w:val="bullet"/>
+      <w:lvlText w:val=""/>
+      <w:lvlJc w:val="left"/>
+      <w:pPr>
+        <w:tabs>
+          <w:tab w:val="num" w:pos="5760"/>
+        </w:tabs>
+        <w:ind w:left="5760" w:hanging="360"/>
+      </w:pPr>
+      <w:rPr>
+        <w:rFonts w:ascii="Wingdings" w:hAnsi="Wingdings" w:hint="default"/>
+        <w:sz w:val="20"/>
+      </w:rPr>
+    </w:lvl>
+    <w:lvl w:ilvl="8" w:tentative="1">
+      <w:start w:val="1"/>
+      <w:numFmt w:val="bullet"/>
+      <w:lvlText w:val=""/>
+      <w:lvlJc w:val="left"/>
+      <w:pPr>
+        <w:tabs>
+          <w:tab w:val="num" w:pos="6480"/>
+        </w:tabs>
+        <w:ind w:left="6480" w:hanging="360"/>
+      </w:pPr>
+      <w:rPr>
+        <w:rFonts w:ascii="Wingdings" w:hAnsi="Wingdings" w:hint="default"/>
+        <w:sz w:val="20"/>
+      </w:rPr>
+    </w:lvl>
+  </w:abstractNum>
+  <w:abstractNum w:abstractNumId="1" w15:restartNumberingAfterBreak="0">
+    <w:nsid w:val="0FCC470F"/>
+    <w:multiLevelType w:val="multilevel"/>
+    <w:tmpl w:val="BC62A2EC"/>
+    <w:lvl w:ilvl="0">
+      <w:start w:val="1"/>
+      <w:numFmt w:val="bullet"/>
+      <w:lvlText w:val=""/>
+      <w:lvlJc w:val="left"/>
+      <w:pPr>
+        <w:tabs>
+          <w:tab w:val="num" w:pos="720"/>
+        </w:tabs>
+        <w:ind w:left="720" w:hanging="360"/>
+      </w:pPr>
+      <w:rPr>
+        <w:rFonts w:ascii="Symbol" w:hAnsi="Symbol" w:hint="default"/>
+        <w:sz w:val="20"/>
+      </w:rPr>
+    </w:lvl>
+    <w:lvl w:ilvl="1" w:tentative="1">
+      <w:start w:val="1"/>
+      <w:numFmt w:val="bullet"/>
+      <w:lvlText w:val="o"/>
+      <w:lvlJc w:val="left"/>
+      <w:pPr>
+        <w:tabs>
+          <w:tab w:val="num" w:pos="1440"/>
+        </w:tabs>
+        <w:ind w:left="1440" w:hanging="360"/>
+      </w:pPr>
+      <w:rPr>
+        <w:rFonts w:ascii="Courier New" w:hAnsi="Courier New" w:hint="default"/>
+        <w:sz w:val="20"/>
+      </w:rPr>
+    </w:lvl>
+    <w:lvl w:ilvl="2" w:tentative="1">
+      <w:start w:val="1"/>
+      <w:numFmt w:val="bullet"/>
+      <w:lvlText w:val=""/>
+      <w:lvlJc w:val="left"/>
+      <w:pPr>
+        <w:tabs>
+          <w:tab w:val="num" w:pos="2160"/>
+        </w:tabs>
+        <w:ind w:left="2160" w:hanging="360"/>
+      </w:pPr>
+      <w:rPr>
+        <w:rFonts w:ascii="Wingdings" w:hAnsi="Wingdings" w:hint="default"/>
+        <w:sz w:val="20"/>
+      </w:rPr>
+    </w:lvl>
+    <w:lvl w:ilvl="3" w:tentative="1">
+      <w:start w:val="1"/>
+      <w:numFmt w:val="bullet"/>
+      <w:lvlText w:val=""/>
+      <w:lvlJc w:val="left"/>
+      <w:pPr>
+        <w:tabs>
+          <w:tab w:val="num" w:pos="2880"/>
+        </w:tabs>
+        <w:ind w:left="2880" w:hanging="360"/>
+      </w:pPr>
+      <w:rPr>
+        <w:rFonts w:ascii="Wingdings" w:hAnsi="Wingdings" w:hint="default"/>
+        <w:sz w:val="20"/>
+      </w:rPr>
+    </w:lvl>
+    <w:lvl w:ilvl="4" w:tentative="1">
+      <w:start w:val="1"/>
+      <w:numFmt w:val="bullet"/>
+      <w:lvlText w:val=""/>
+      <w:lvlJc w:val="left"/>
+      <w:pPr>
+        <w:tabs>
+          <w:tab w:val="num" w:pos="3600"/>
+        </w:tabs>
+        <w:ind w:left="3600" w:hanging="360"/>
+      </w:pPr>
+      <w:rPr>
+        <w:rFonts w:ascii="Wingdings" w:hAnsi="Wingdings" w:hint="default"/>
+        <w:sz w:val="20"/>
+      </w:rPr>
+    </w:lvl>
+    <w:lvl w:ilvl="5" w:tentative="1">
+      <w:start w:val="1"/>
+      <w:numFmt w:val="bullet"/>
+      <w:lvlText w:val=""/>
+      <w:lvlJc w:val="left"/>
+      <w:pPr>
+        <w:tabs>
+          <w:tab w:val="num" w:pos="4320"/>
+        </w:tabs>
+        <w:ind w:left="4320" w:hanging="360"/>
+      </w:pPr>
+      <w:rPr>
+        <w:rFonts w:ascii="Wingdings" w:hAnsi="Wingdings" w:hint="default"/>
+        <w:sz w:val="20"/>
+      </w:rPr>
+    </w:lvl>
+    <w:lvl w:ilvl="6" w:tentative="1">
+      <w:start w:val="1"/>
+      <w:numFmt w:val="bullet"/>
+      <w:lvlText w:val=""/>
+      <w:lvlJc w:val="left"/>
+      <w:pPr>
+        <w:tabs>
+          <w:tab w:val="num" w:pos="5040"/>
+        </w:tabs>
+        <w:ind w:left="5040" w:hanging="360"/>
+      </w:pPr>
+      <w:rPr>
+        <w:rFonts w:ascii="Wingdings" w:hAnsi="Wingdings" w:hint="default"/>
+        <w:sz w:val="20"/>
+      </w:rPr>
+    </w:lvl>
+    <w:lvl w:ilvl="7" w:tentative="1">
+      <w:start w:val="1"/>
+      <w:numFmt w:val="bullet"/>
+      <w:lvlText w:val=""/>
+      <w:lvlJc w:val="left"/>
+      <w:pPr>
+        <w:tabs>
+          <w:tab w:val="num" w:pos="5760"/>
+        </w:tabs>
+        <w:ind w:left="5760" w:hanging="360"/>
+      </w:pPr>
+      <w:rPr>
+        <w:rFonts w:ascii="Wingdings" w:hAnsi="Wingdings" w:hint="default"/>
+        <w:sz w:val="20"/>
+      </w:rPr>
+    </w:lvl>
+    <w:lvl w:ilvl="8" w:tentative="1">
+      <w:start w:val="1"/>
+      <w:numFmt w:val="bullet"/>
+      <w:lvlText w:val=""/>
+      <w:lvlJc w:val="left"/>
+      <w:pPr>
+        <w:tabs>
+          <w:tab w:val="num" w:pos="6480"/>
+        </w:tabs>
+        <w:ind w:left="6480" w:hanging="360"/>
+      </w:pPr>
+      <w:rPr>
+        <w:rFonts w:ascii="Wingdings" w:hAnsi="Wingdings" w:hint="default"/>
+        <w:sz w:val="20"/>
+      </w:rPr>
+    </w:lvl>
+  </w:abstractNum>
+  <w:abstractNum w:abstractNumId="2" w15:restartNumberingAfterBreak="0">
+    <w:nsid w:val="14985001"/>
+    <w:multiLevelType w:val="multilevel"/>
+    <w:tmpl w:val="EB081AD4"/>
+    <w:lvl w:ilvl="0">
+      <w:start w:val="1"/>
+      <w:numFmt w:val="bullet"/>
+      <w:lvlText w:val=""/>
+      <w:lvlJc w:val="left"/>
+      <w:pPr>
+        <w:tabs>
+          <w:tab w:val="num" w:pos="720"/>
+        </w:tabs>
+        <w:ind w:left="720" w:hanging="360"/>
+      </w:pPr>
+      <w:rPr>
+        <w:rFonts w:ascii="Symbol" w:hAnsi="Symbol" w:hint="default"/>
+        <w:sz w:val="20"/>
+      </w:rPr>
+    </w:lvl>
+    <w:lvl w:ilvl="1" w:tentative="1">
+      <w:start w:val="1"/>
+      <w:numFmt w:val="bullet"/>
+      <w:lvlText w:val="o"/>
+      <w:lvlJc w:val="left"/>
+      <w:pPr>
+        <w:tabs>
+          <w:tab w:val="num" w:pos="1440"/>
+        </w:tabs>
+        <w:ind w:left="1440" w:hanging="360"/>
+      </w:pPr>
+      <w:rPr>
+        <w:rFonts w:ascii="Courier New" w:hAnsi="Courier New" w:hint="default"/>
+        <w:sz w:val="20"/>
+      </w:rPr>
+    </w:lvl>
+    <w:lvl w:ilvl="2" w:tentative="1">
+      <w:start w:val="1"/>
+      <w:numFmt w:val="bullet"/>
+      <w:lvlText w:val=""/>
+      <w:lvlJc w:val="left"/>
+      <w:pPr>
+        <w:tabs>
+          <w:tab w:val="num" w:pos="2160"/>
+        </w:tabs>
+        <w:ind w:left="2160" w:hanging="360"/>
+      </w:pPr>
+      <w:rPr>
+        <w:rFonts w:ascii="Wingdings" w:hAnsi="Wingdings" w:hint="default"/>
+        <w:sz w:val="20"/>
+      </w:rPr>
+    </w:lvl>
+    <w:lvl w:ilvl="3" w:tentative="1">
+      <w:start w:val="1"/>
+      <w:numFmt w:val="bullet"/>
+      <w:lvlText w:val=""/>
+      <w:lvlJc w:val="left"/>
+      <w:pPr>
+        <w:tabs>
+          <w:tab w:val="num" w:pos="2880"/>
+        </w:tabs>
+        <w:ind w:left="2880" w:hanging="360"/>
+      </w:pPr>
+      <w:rPr>
+        <w:rFonts w:ascii="Wingdings" w:hAnsi="Wingdings" w:hint="default"/>
+        <w:sz w:val="20"/>
+      </w:rPr>
+    </w:lvl>
+    <w:lvl w:ilvl="4" w:tentative="1">
+      <w:start w:val="1"/>
+      <w:numFmt w:val="bullet"/>
+      <w:lvlText w:val=""/>
+      <w:lvlJc w:val="left"/>
+      <w:pPr>
+        <w:tabs>
+          <w:tab w:val="num" w:pos="3600"/>
+        </w:tabs>
+        <w:ind w:left="3600" w:hanging="360"/>
+      </w:pPr>
+      <w:rPr>
+        <w:rFonts w:ascii="Wingdings" w:hAnsi="Wingdings" w:hint="default"/>
+        <w:sz w:val="20"/>
+      </w:rPr>
+    </w:lvl>
+    <w:lvl w:ilvl="5" w:tentative="1">
+      <w:start w:val="1"/>
+      <w:numFmt w:val="bullet"/>
+      <w:lvlText w:val=""/>
+      <w:lvlJc w:val="left"/>
+      <w:pPr>
+        <w:tabs>
+          <w:tab w:val="num" w:pos="4320"/>
+        </w:tabs>
+        <w:ind w:left="4320" w:hanging="360"/>
+      </w:pPr>
+      <w:rPr>
+        <w:rFonts w:ascii="Wingdings" w:hAnsi="Wingdings" w:hint="default"/>
+        <w:sz w:val="20"/>
+      </w:rPr>
+    </w:lvl>
+    <w:lvl w:ilvl="6" w:tentative="1">
+      <w:start w:val="1"/>
+      <w:numFmt w:val="bullet"/>
+      <w:lvlText w:val=""/>
+      <w:lvlJc w:val="left"/>
+      <w:pPr>
+        <w:tabs>
+          <w:tab w:val="num" w:pos="5040"/>
+        </w:tabs>
+        <w:ind w:left="5040" w:hanging="360"/>
+      </w:pPr>
+      <w:rPr>
+        <w:rFonts w:ascii="Wingdings" w:hAnsi="Wingdings" w:hint="default"/>
+        <w:sz w:val="20"/>
+      </w:rPr>
+    </w:lvl>
+    <w:lvl w:ilvl="7" w:tentative="1">
+      <w:start w:val="1"/>
+      <w:numFmt w:val="bullet"/>
+      <w:lvlText w:val=""/>
+      <w:lvlJc w:val="left"/>
+      <w:pPr>
+        <w:tabs>
+          <w:tab w:val="num" w:pos="5760"/>
+        </w:tabs>
+        <w:ind w:left="5760" w:hanging="360"/>
+      </w:pPr>
+      <w:rPr>
+        <w:rFonts w:ascii="Wingdings" w:hAnsi="Wingdings" w:hint="default"/>
+        <w:sz w:val="20"/>
+      </w:rPr>
+    </w:lvl>
+    <w:lvl w:ilvl="8" w:tentative="1">
+      <w:start w:val="1"/>
+      <w:numFmt w:val="bullet"/>
+      <w:lvlText w:val=""/>
+      <w:lvlJc w:val="left"/>
+      <w:pPr>
+        <w:tabs>
+          <w:tab w:val="num" w:pos="6480"/>
+        </w:tabs>
+        <w:ind w:left="6480" w:hanging="360"/>
+      </w:pPr>
+      <w:rPr>
+        <w:rFonts w:ascii="Wingdings" w:hAnsi="Wingdings" w:hint="default"/>
+        <w:sz w:val="20"/>
+      </w:rPr>
+    </w:lvl>
+  </w:abstractNum>
+  <w:abstractNum w:abstractNumId="3" w15:restartNumberingAfterBreak="0">
+    <w:nsid w:val="519C0BBC"/>
+    <w:multiLevelType w:val="multilevel"/>
+    <w:tmpl w:val="DE2245C2"/>
+    <w:lvl w:ilvl="0">
+      <w:start w:val="1"/>
+      <w:numFmt w:val="bullet"/>
+      <w:lvlText w:val=""/>
+      <w:lvlJc w:val="left"/>
+      <w:pPr>
+        <w:tabs>
+          <w:tab w:val="num" w:pos="720"/>
+        </w:tabs>
+        <w:ind w:left="720" w:hanging="360"/>
+      </w:pPr>
+      <w:rPr>
+        <w:rFonts w:ascii="Symbol" w:hAnsi="Symbol" w:hint="default"/>
+        <w:sz w:val="20"/>
+      </w:rPr>
+    </w:lvl>
+    <w:lvl w:ilvl="1" w:tentative="1">
+      <w:start w:val="1"/>
+      <w:numFmt w:val="bullet"/>
+      <w:lvlText w:val="o"/>
+      <w:lvlJc w:val="left"/>
+      <w:pPr>
+        <w:tabs>
+          <w:tab w:val="num" w:pos="1440"/>
+        </w:tabs>
+        <w:ind w:left="1440" w:hanging="360"/>
+      </w:pPr>
+      <w:rPr>
+        <w:rFonts w:ascii="Courier New" w:hAnsi="Courier New" w:hint="default"/>
+        <w:sz w:val="20"/>
+      </w:rPr>
+    </w:lvl>
+    <w:lvl w:ilvl="2" w:tentative="1">
+      <w:start w:val="1"/>
+      <w:numFmt w:val="bullet"/>
+      <w:lvlText w:val=""/>
+      <w:lvlJc w:val="left"/>
+      <w:pPr>
+        <w:tabs>
+          <w:tab w:val="num" w:pos="2160"/>
+        </w:tabs>
+        <w:ind w:left="2160" w:hanging="360"/>
+      </w:pPr>
+      <w:rPr>
+        <w:rFonts w:ascii="Wingdings" w:hAnsi="Wingdings" w:hint="default"/>
+        <w:sz w:val="20"/>
+      </w:rPr>
+    </w:lvl>
+    <w:lvl w:ilvl="3" w:tentative="1">
+      <w:start w:val="1"/>
+      <w:numFmt w:val="bullet"/>
+      <w:lvlText w:val=""/>
+      <w:lvlJc w:val="left"/>
+      <w:pPr>
+        <w:tabs>
+          <w:tab w:val="num" w:pos="2880"/>
+        </w:tabs>
+        <w:ind w:left="2880" w:hanging="360"/>
+      </w:pPr>
+      <w:rPr>
+        <w:rFonts w:ascii="Wingdings" w:hAnsi="Wingdings" w:hint="default"/>
+        <w:sz w:val="20"/>
+      </w:rPr>
+    </w:lvl>
+    <w:lvl w:ilvl="4" w:tentative="1">
+      <w:start w:val="1"/>
+      <w:numFmt w:val="bullet"/>
+      <w:lvlText w:val=""/>
+      <w:lvlJc w:val="left"/>
+      <w:pPr>
+        <w:tabs>
+          <w:tab w:val="num" w:pos="3600"/>
+        </w:tabs>
+        <w:ind w:left="3600" w:hanging="360"/>
+      </w:pPr>
+      <w:rPr>
+        <w:rFonts w:ascii="Wingdings" w:hAnsi="Wingdings" w:hint="default"/>
+        <w:sz w:val="20"/>
+      </w:rPr>
+    </w:lvl>
+    <w:lvl w:ilvl="5" w:tentative="1">
+      <w:start w:val="1"/>
+      <w:numFmt w:val="bullet"/>
+      <w:lvlText w:val=""/>
+      <w:lvlJc w:val="left"/>
+      <w:pPr>
+        <w:tabs>
+          <w:tab w:val="num" w:pos="4320"/>
+        </w:tabs>
+        <w:ind w:left="4320" w:hanging="360"/>
+      </w:pPr>
+      <w:rPr>
+        <w:rFonts w:ascii="Wingdings" w:hAnsi="Wingdings" w:hint="default"/>
+        <w:sz w:val="20"/>
+      </w:rPr>
+    </w:lvl>
+    <w:lvl w:ilvl="6" w:tentative="1">
+      <w:start w:val="1"/>
+      <w:numFmt w:val="bullet"/>
+      <w:lvlText w:val=""/>
+      <w:lvlJc w:val="left"/>
+      <w:pPr>
+        <w:tabs>
+          <w:tab w:val="num" w:pos="5040"/>
+        </w:tabs>
+        <w:ind w:left="5040" w:hanging="360"/>
+      </w:pPr>
+      <w:rPr>
+        <w:rFonts w:ascii="Wingdings" w:hAnsi="Wingdings" w:hint="default"/>
+        <w:sz w:val="20"/>
+      </w:rPr>
+    </w:lvl>
+    <w:lvl w:ilvl="7" w:tentative="1">
+      <w:start w:val="1"/>
+      <w:numFmt w:val="bullet"/>
+      <w:lvlText w:val=""/>
+      <w:lvlJc w:val="left"/>
+      <w:pPr>
+        <w:tabs>
+          <w:tab w:val="num" w:pos="5760"/>
+        </w:tabs>
+        <w:ind w:left="5760" w:hanging="360"/>
+      </w:pPr>
+      <w:rPr>
+        <w:rFonts w:ascii="Wingdings" w:hAnsi="Wingdings" w:hint="default"/>
+        <w:sz w:val="20"/>
+      </w:rPr>
+    </w:lvl>
+    <w:lvl w:ilvl="8" w:tentative="1">
+      <w:start w:val="1"/>
+      <w:numFmt w:val="bullet"/>
+      <w:lvlText w:val=""/>
+      <w:lvlJc w:val="left"/>
+      <w:pPr>
+        <w:tabs>
+          <w:tab w:val="num" w:pos="6480"/>
+        </w:tabs>
+        <w:ind w:left="6480" w:hanging="360"/>
+      </w:pPr>
+      <w:rPr>
+        <w:rFonts w:ascii="Wingdings" w:hAnsi="Wingdings" w:hint="default"/>
+        <w:sz w:val="20"/>
+      </w:rPr>
+    </w:lvl>
+  </w:abstractNum>
+  <w:abstractNum w:abstractNumId="4" w15:restartNumberingAfterBreak="0">
+    <w:nsid w:val="7A5145E1"/>
+    <w:multiLevelType w:val="multilevel"/>
+    <w:tmpl w:val="F71213DC"/>
+    <w:lvl w:ilvl="0">
+      <w:start w:val="1"/>
+      <w:numFmt w:val="bullet"/>
+      <w:lvlText w:val=""/>
+      <w:lvlJc w:val="left"/>
+      <w:pPr>
+        <w:tabs>
+          <w:tab w:val="num" w:pos="720"/>
+        </w:tabs>
+        <w:ind w:left="720" w:hanging="360"/>
+      </w:pPr>
+      <w:rPr>
+        <w:rFonts w:ascii="Symbol" w:hAnsi="Symbol" w:hint="default"/>
+        <w:sz w:val="20"/>
+      </w:rPr>
+    </w:lvl>
+    <w:lvl w:ilvl="1" w:tentative="1">
+      <w:start w:val="1"/>
+      <w:numFmt w:val="bullet"/>
+      <w:lvlText w:val="o"/>
+      <w:lvlJc w:val="left"/>
+      <w:pPr>
+        <w:tabs>
+          <w:tab w:val="num" w:pos="1440"/>
+        </w:tabs>
+        <w:ind w:left="1440" w:hanging="360"/>
+      </w:pPr>
+      <w:rPr>
+        <w:rFonts w:ascii="Courier New" w:hAnsi="Courier New" w:hint="default"/>
+        <w:sz w:val="20"/>
+      </w:rPr>
+    </w:lvl>
+    <w:lvl w:ilvl="2" w:tentative="1">
+      <w:start w:val="1"/>
+      <w:numFmt w:val="bullet"/>
+      <w:lvlText w:val=""/>
+      <w:lvlJc w:val="left"/>
+      <w:pPr>
+        <w:tabs>
+          <w:tab w:val="num" w:pos="2160"/>
+        </w:tabs>
+        <w:ind w:left="2160" w:hanging="360"/>
+      </w:pPr>
+      <w:rPr>
+        <w:rFonts w:ascii="Wingdings" w:hAnsi="Wingdings" w:hint="default"/>
+        <w:sz w:val="20"/>
+      </w:rPr>
+    </w:lvl>
+    <w:lvl w:ilvl="3" w:tentative="1">
+      <w:start w:val="1"/>
+      <w:numFmt w:val="bullet"/>
+      <w:lvlText w:val=""/>
+      <w:lvlJc w:val="left"/>
+      <w:pPr>
+        <w:tabs>
+          <w:tab w:val="num" w:pos="2880"/>
+        </w:tabs>
+        <w:ind w:left="2880" w:hanging="360"/>
+      </w:pPr>
+      <w:rPr>
+        <w:rFonts w:ascii="Wingdings" w:hAnsi="Wingdings" w:hint="default"/>
+        <w:sz w:val="20"/>
+      </w:rPr>
+    </w:lvl>
+    <w:lvl w:ilvl="4" w:tentative="1">
+      <w:start w:val="1"/>
+      <w:numFmt w:val="bullet"/>
+      <w:lvlText w:val=""/>
+      <w:lvlJc w:val="left"/>
+      <w:pPr>
+        <w:tabs>
+          <w:tab w:val="num" w:pos="3600"/>
+        </w:tabs>
+        <w:ind w:left="3600" w:hanging="360"/>
+      </w:pPr>
+      <w:rPr>
+        <w:rFonts w:ascii="Wingdings" w:hAnsi="Wingdings" w:hint="default"/>
+        <w:sz w:val="20"/>
+      </w:rPr>
+    </w:lvl>
+    <w:lvl w:ilvl="5" w:tentative="1">
+      <w:start w:val="1"/>
+      <w:numFmt w:val="bullet"/>
+      <w:lvlText w:val=""/>
+      <w:lvlJc w:val="left"/>
+      <w:pPr>
+        <w:tabs>
+          <w:tab w:val="num" w:pos="4320"/>
+        </w:tabs>
+        <w:ind w:left="4320" w:hanging="360"/>
+      </w:pPr>
+      <w:rPr>
+        <w:rFonts w:ascii="Wingdings" w:hAnsi="Wingdings" w:hint="default"/>
+        <w:sz w:val="20"/>
+      </w:rPr>
+    </w:lvl>
+    <w:lvl w:ilvl="6" w:tentative="1">
+      <w:start w:val="1"/>
+      <w:numFmt w:val="bullet"/>
+      <w:lvlText w:val=""/>
+      <w:lvlJc w:val="left"/>
+      <w:pPr>
+        <w:tabs>
+          <w:tab w:val="num" w:pos="5040"/>
+        </w:tabs>
+        <w:ind w:left="5040" w:hanging="360"/>
+      </w:pPr>
+      <w:rPr>
+        <w:rFonts w:ascii="Wingdings" w:hAnsi="Wingdings" w:hint="default"/>
+        <w:sz w:val="20"/>
+      </w:rPr>
+    </w:lvl>
+    <w:lvl w:ilvl="7" w:tentative="1">
+      <w:start w:val="1"/>
+      <w:numFmt w:val="bullet"/>
+      <w:lvlText w:val=""/>
+      <w:lvlJc w:val="left"/>
+      <w:pPr>
+        <w:tabs>
+          <w:tab w:val="num" w:pos="5760"/>
+        </w:tabs>
+        <w:ind w:left="5760" w:hanging="360"/>
+      </w:pPr>
+      <w:rPr>
+        <w:rFonts w:ascii="Wingdings" w:hAnsi="Wingdings" w:hint="default"/>
+        <w:sz w:val="20"/>
+      </w:rPr>
+    </w:lvl>
+    <w:lvl w:ilvl="8" w:tentative="1">
+      <w:start w:val="1"/>
+      <w:numFmt w:val="bullet"/>
+      <w:lvlText w:val=""/>
+      <w:lvlJc w:val="left"/>
+      <w:pPr>
+        <w:tabs>
+          <w:tab w:val="num" w:pos="6480"/>
+        </w:tabs>
+        <w:ind w:left="6480" w:hanging="360"/>
+      </w:pPr>
+      <w:rPr>
+        <w:rFonts w:ascii="Wingdings" w:hAnsi="Wingdings" w:hint="default"/>
+        <w:sz w:val="20"/>
+      </w:rPr>
+    </w:lvl>
+  </w:abstractNum>
+  <w:num w:numId="1">
+    <w:abstractNumId w:val="0"/>
+  </w:num>
+  <w:num w:numId="2">
+    <w:abstractNumId w:val="4"/>
+  </w:num>
+  <w:num w:numId="3">
+    <w:abstractNumId w:val="2"/>
+  </w:num>
+  <w:num w:numId="4">
+    <w:abstractNumId w:val="1"/>
+  </w:num>
+  <w:num w:numId="5">
+    <w:abstractNumId w:val="3"/>
+  </w:num>
+</w:numbering>
 </file>
 
 <file path=word/styles.xml><?xml version="1.0" encoding="utf-8"?>
@@ -1164,6 +5119,27 @@
   <w:style w:type="paragraph" w:default="1" w:styleId="Normal">
     <w:name w:val="Normal"/>
     <w:qFormat/>
+    <w:rsid w:val="001F35E7"/>
+  </w:style>
+  <w:style w:type="paragraph" w:styleId="Ttulo3">
+    <w:name w:val="heading 3"/>
+    <w:basedOn w:val="Normal"/>
+    <w:link w:val="Ttulo3Char"/>
+    <w:uiPriority w:val="9"/>
+    <w:qFormat/>
+    <w:rsid w:val="00986269"/>
+    <w:pPr>
+      <w:spacing w:before="100" w:beforeAutospacing="1" w:after="100" w:afterAutospacing="1" w:line="240" w:lineRule="auto"/>
+      <w:outlineLvl w:val="2"/>
+    </w:pPr>
+    <w:rPr>
+      <w:rFonts w:ascii="Times New Roman" w:eastAsia="Times New Roman" w:hAnsi="Times New Roman" w:cs="Times New Roman"/>
+      <w:b/>
+      <w:bCs/>
+      <w:sz w:val="27"/>
+      <w:szCs w:val="27"/>
+      <w:lang w:eastAsia="pt-BR"/>
+    </w:rPr>
   </w:style>
   <w:style w:type="character" w:default="1" w:styleId="Fontepargpadro">
     <w:name w:val="Default Paragraph Font"/>
@@ -1225,6 +5201,73 @@
       <w:sz w:val="56"/>
       <w:szCs w:val="56"/>
     </w:rPr>
+  </w:style>
+  <w:style w:type="character" w:customStyle="1" w:styleId="Ttulo3Char">
+    <w:name w:val="Título 3 Char"/>
+    <w:basedOn w:val="Fontepargpadro"/>
+    <w:link w:val="Ttulo3"/>
+    <w:uiPriority w:val="9"/>
+    <w:rsid w:val="00986269"/>
+    <w:rPr>
+      <w:rFonts w:ascii="Times New Roman" w:eastAsia="Times New Roman" w:hAnsi="Times New Roman" w:cs="Times New Roman"/>
+      <w:b/>
+      <w:bCs/>
+      <w:sz w:val="27"/>
+      <w:szCs w:val="27"/>
+      <w:lang w:eastAsia="pt-BR"/>
+    </w:rPr>
+  </w:style>
+  <w:style w:type="paragraph" w:styleId="NormalWeb">
+    <w:name w:val="Normal (Web)"/>
+    <w:basedOn w:val="Normal"/>
+    <w:uiPriority w:val="99"/>
+    <w:semiHidden/>
+    <w:unhideWhenUsed/>
+    <w:rsid w:val="00986269"/>
+    <w:pPr>
+      <w:spacing w:before="100" w:beforeAutospacing="1" w:after="100" w:afterAutospacing="1" w:line="240" w:lineRule="auto"/>
+    </w:pPr>
+    <w:rPr>
+      <w:rFonts w:ascii="Times New Roman" w:eastAsia="Times New Roman" w:hAnsi="Times New Roman" w:cs="Times New Roman"/>
+      <w:sz w:val="24"/>
+      <w:szCs w:val="24"/>
+      <w:lang w:eastAsia="pt-BR"/>
+    </w:rPr>
+  </w:style>
+  <w:style w:type="character" w:styleId="Forte">
+    <w:name w:val="Strong"/>
+    <w:basedOn w:val="Fontepargpadro"/>
+    <w:uiPriority w:val="22"/>
+    <w:qFormat/>
+    <w:rsid w:val="00986269"/>
+    <w:rPr>
+      <w:b/>
+      <w:bCs/>
+    </w:rPr>
+  </w:style>
+  <w:style w:type="character" w:styleId="CdigoHTML">
+    <w:name w:val="HTML Code"/>
+    <w:basedOn w:val="Fontepargpadro"/>
+    <w:uiPriority w:val="99"/>
+    <w:semiHidden/>
+    <w:unhideWhenUsed/>
+    <w:rsid w:val="00986269"/>
+    <w:rPr>
+      <w:rFonts w:ascii="Courier New" w:eastAsia="Times New Roman" w:hAnsi="Courier New" w:cs="Courier New"/>
+      <w:sz w:val="20"/>
+      <w:szCs w:val="20"/>
+    </w:rPr>
+  </w:style>
+  <w:style w:type="paragraph" w:styleId="PargrafodaLista">
+    <w:name w:val="List Paragraph"/>
+    <w:basedOn w:val="Normal"/>
+    <w:uiPriority w:val="34"/>
+    <w:qFormat/>
+    <w:rsid w:val="0041026B"/>
+    <w:pPr>
+      <w:ind w:left="720"/>
+      <w:contextualSpacing/>
+    </w:pPr>
   </w:style>
 </w:styles>
 </file>

</xml_diff>

<commit_message>
Feito uma alteração no nome em cada pasta para melhor organização
</commit_message>
<xml_diff>
--- a/Javascript.docx
+++ b/Javascript.docx
@@ -3877,7 +3877,6 @@
           <w:color w:val="FF0000"/>
           <w:sz w:val="36"/>
           <w:szCs w:val="36"/>
-          <w:lang w:val="en-US"/>
         </w:rPr>
       </w:pPr>
       <w:r>
@@ -3885,66 +3884,2898 @@
           <w:color w:val="FF0000"/>
           <w:sz w:val="36"/>
           <w:szCs w:val="36"/>
-          <w:lang w:val="en-US"/>
-        </w:rPr>
-        <w:t>Video</w:t>
+        </w:rPr>
+        <w:t>Vídeo</w:t>
       </w:r>
       <w:r>
         <w:rPr>
           <w:color w:val="FF0000"/>
           <w:sz w:val="36"/>
           <w:szCs w:val="36"/>
-          <w:lang w:val="en-US"/>
-        </w:rPr>
-        <w:t xml:space="preserve"> 1</w:t>
-      </w:r>
-      <w:r>
+        </w:rPr>
+        <w:t xml:space="preserve"> 13.</w:t>
+      </w:r>
+    </w:p>
+    <w:p>
+      <w:pPr>
+        <w:rPr>
+          <w:rFonts w:cstheme="minorHAnsi"/>
+          <w:b/>
+          <w:bCs/>
+          <w:sz w:val="28"/>
+          <w:szCs w:val="36"/>
+        </w:rPr>
+      </w:pPr>
+      <w:r>
+        <w:rPr>
+          <w:rFonts w:cstheme="minorHAnsi"/>
+          <w:b/>
+          <w:bCs/>
+          <w:sz w:val="28"/>
+          <w:szCs w:val="36"/>
+        </w:rPr>
+        <w:t xml:space="preserve">Estrutura </w:t>
+      </w:r>
+      <w:proofErr w:type="spellStart"/>
+      <w:r>
+        <w:rPr>
+          <w:rFonts w:cstheme="minorHAnsi"/>
+          <w:b/>
+          <w:bCs/>
+          <w:sz w:val="28"/>
+          <w:szCs w:val="36"/>
+        </w:rPr>
+        <w:t>If</w:t>
+      </w:r>
+      <w:proofErr w:type="spellEnd"/>
+    </w:p>
+    <w:p>
+      <w:pPr>
         <w:rPr>
           <w:color w:val="FF0000"/>
           <w:sz w:val="36"/>
           <w:szCs w:val="36"/>
-          <w:lang w:val="en-US"/>
-        </w:rPr>
-        <w:t>3</w:t>
-      </w:r>
+        </w:rPr>
+      </w:pPr>
       <w:r>
         <w:rPr>
           <w:color w:val="FF0000"/>
           <w:sz w:val="36"/>
           <w:szCs w:val="36"/>
+        </w:rPr>
+        <w:t>Vídeo</w:t>
+      </w:r>
+      <w:r>
+        <w:rPr>
+          <w:color w:val="FF0000"/>
+          <w:sz w:val="36"/>
+          <w:szCs w:val="36"/>
+        </w:rPr>
+        <w:t xml:space="preserve"> 14.</w:t>
+      </w:r>
+    </w:p>
+    <w:p>
+      <w:pPr>
+        <w:rPr>
+          <w:rFonts w:cstheme="minorHAnsi"/>
+          <w:sz w:val="28"/>
+          <w:szCs w:val="36"/>
+        </w:rPr>
+      </w:pPr>
+      <w:r>
+        <w:rPr>
+          <w:rFonts w:cstheme="minorHAnsi"/>
+          <w:b/>
+          <w:bCs/>
+          <w:sz w:val="28"/>
+          <w:szCs w:val="36"/>
+        </w:rPr>
+        <w:t>Switch Case:</w:t>
+      </w:r>
+      <w:r>
+        <w:rPr>
+          <w:rFonts w:cstheme="minorHAnsi"/>
+          <w:sz w:val="28"/>
+          <w:szCs w:val="36"/>
+        </w:rPr>
+        <w:t xml:space="preserve"> Caso uma condição for tal condição, ele entra no bloco</w:t>
+      </w:r>
+    </w:p>
+    <w:p>
+      <w:pPr>
+        <w:rPr>
+          <w:color w:val="FF0000"/>
+          <w:sz w:val="36"/>
+          <w:szCs w:val="36"/>
+        </w:rPr>
+      </w:pPr>
+      <w:r>
+        <w:rPr>
+          <w:color w:val="FF0000"/>
+          <w:sz w:val="36"/>
+          <w:szCs w:val="36"/>
+        </w:rPr>
+        <w:t>Vídeo</w:t>
+      </w:r>
+      <w:r>
+        <w:rPr>
+          <w:color w:val="FF0000"/>
+          <w:sz w:val="36"/>
+          <w:szCs w:val="36"/>
+        </w:rPr>
+        <w:t xml:space="preserve"> 1</w:t>
+      </w:r>
+      <w:r>
+        <w:rPr>
+          <w:color w:val="FF0000"/>
+          <w:sz w:val="36"/>
+          <w:szCs w:val="36"/>
+        </w:rPr>
+        <w:t>5</w:t>
+      </w:r>
+      <w:r>
+        <w:rPr>
+          <w:color w:val="FF0000"/>
+          <w:sz w:val="36"/>
+          <w:szCs w:val="36"/>
+        </w:rPr>
+        <w:t>.</w:t>
+      </w:r>
+    </w:p>
+    <w:p>
+      <w:pPr>
+        <w:rPr>
+          <w:rFonts w:cstheme="minorHAnsi"/>
+          <w:sz w:val="28"/>
+          <w:szCs w:val="36"/>
+        </w:rPr>
+      </w:pPr>
+      <w:r>
+        <w:rPr>
+          <w:rFonts w:cstheme="minorHAnsi"/>
+          <w:b/>
+          <w:bCs/>
+          <w:sz w:val="28"/>
+          <w:szCs w:val="36"/>
+        </w:rPr>
+        <w:t xml:space="preserve">Definidos: </w:t>
+      </w:r>
+      <w:r>
+        <w:rPr>
+          <w:rFonts w:cstheme="minorHAnsi"/>
+          <w:sz w:val="28"/>
+          <w:szCs w:val="36"/>
+        </w:rPr>
+        <w:t>Quando eu sei a quantidade de vezes em que vou rodar.</w:t>
+      </w:r>
+    </w:p>
+    <w:p>
+      <w:pPr>
+        <w:rPr>
+          <w:rFonts w:cstheme="minorHAnsi"/>
+          <w:sz w:val="28"/>
+          <w:szCs w:val="36"/>
+        </w:rPr>
+      </w:pPr>
+      <w:proofErr w:type="spellStart"/>
+      <w:r>
+        <w:rPr>
+          <w:rFonts w:cstheme="minorHAnsi"/>
+          <w:sz w:val="28"/>
+          <w:szCs w:val="36"/>
+        </w:rPr>
+        <w:t>Ex</w:t>
+      </w:r>
+      <w:proofErr w:type="spellEnd"/>
+      <w:r>
+        <w:rPr>
+          <w:rFonts w:cstheme="minorHAnsi"/>
+          <w:sz w:val="28"/>
+          <w:szCs w:val="36"/>
+        </w:rPr>
+        <w:t>: For</w:t>
+      </w:r>
+    </w:p>
+    <w:p>
+      <w:pPr>
+        <w:rPr>
+          <w:rFonts w:cstheme="minorHAnsi"/>
+          <w:sz w:val="28"/>
+          <w:szCs w:val="36"/>
+        </w:rPr>
+      </w:pPr>
+      <w:r>
+        <w:rPr>
+          <w:rFonts w:cstheme="minorHAnsi"/>
+          <w:b/>
+          <w:bCs/>
+          <w:sz w:val="28"/>
+          <w:szCs w:val="36"/>
+        </w:rPr>
+        <w:t>Indefinidos:</w:t>
+      </w:r>
+      <w:r>
+        <w:rPr>
+          <w:rFonts w:cstheme="minorHAnsi"/>
+          <w:sz w:val="28"/>
+          <w:szCs w:val="36"/>
+        </w:rPr>
+        <w:t xml:space="preserve"> Não sabe ao certo quantas vezes vai se repetir. </w:t>
+      </w:r>
+    </w:p>
+    <w:p>
+      <w:pPr>
+        <w:rPr>
+          <w:rFonts w:cstheme="minorHAnsi"/>
+          <w:sz w:val="28"/>
+          <w:szCs w:val="36"/>
           <w:lang w:val="en-US"/>
         </w:rPr>
+      </w:pPr>
+      <w:r>
+        <w:rPr>
+          <w:rFonts w:cstheme="minorHAnsi"/>
+          <w:sz w:val="28"/>
+          <w:szCs w:val="36"/>
+          <w:lang w:val="en-US"/>
+        </w:rPr>
+        <w:t>Ex: While, do While</w:t>
+      </w:r>
+    </w:p>
+    <w:p>
+      <w:pPr>
+        <w:rPr>
+          <w:rFonts w:cstheme="minorHAnsi"/>
+          <w:sz w:val="28"/>
+          <w:szCs w:val="36"/>
+          <w:lang w:val="en-US"/>
+        </w:rPr>
+      </w:pPr>
+    </w:p>
+    <w:p>
+      <w:pPr>
+        <w:rPr>
+          <w:color w:val="FF0000"/>
+          <w:sz w:val="36"/>
+          <w:szCs w:val="36"/>
+          <w:lang w:val="en-US"/>
+        </w:rPr>
+      </w:pPr>
+      <w:proofErr w:type="spellStart"/>
+      <w:r>
+        <w:rPr>
+          <w:color w:val="FF0000"/>
+          <w:sz w:val="36"/>
+          <w:szCs w:val="36"/>
+          <w:lang w:val="en-US"/>
+        </w:rPr>
+        <w:t>Vídeo</w:t>
+      </w:r>
+      <w:proofErr w:type="spellEnd"/>
+      <w:r>
+        <w:rPr>
+          <w:color w:val="FF0000"/>
+          <w:sz w:val="36"/>
+          <w:szCs w:val="36"/>
+          <w:lang w:val="en-US"/>
+        </w:rPr>
+        <w:t xml:space="preserve"> 16.</w:t>
+      </w:r>
+    </w:p>
+    <w:p>
+      <w:pPr>
+        <w:rPr>
+          <w:rFonts w:cstheme="minorHAnsi"/>
+          <w:sz w:val="28"/>
+          <w:szCs w:val="36"/>
+        </w:rPr>
+      </w:pPr>
+      <w:r>
+        <w:rPr>
+          <w:rFonts w:cstheme="minorHAnsi"/>
+          <w:b/>
+          <w:bCs/>
+          <w:sz w:val="28"/>
+          <w:szCs w:val="36"/>
+        </w:rPr>
+        <w:t xml:space="preserve">For in </w:t>
+      </w:r>
+      <w:r>
+        <w:rPr>
+          <w:rFonts w:cstheme="minorHAnsi"/>
+          <w:sz w:val="28"/>
+          <w:szCs w:val="36"/>
+        </w:rPr>
+        <w:t>= Mesma coisa s</w:t>
+      </w:r>
+      <w:r>
+        <w:rPr>
+          <w:rFonts w:cstheme="minorHAnsi"/>
+          <w:sz w:val="28"/>
+          <w:szCs w:val="36"/>
+        </w:rPr>
+        <w:t xml:space="preserve">e fosse para imprimir a posição do elemento no </w:t>
+      </w:r>
+      <w:proofErr w:type="spellStart"/>
+      <w:r>
+        <w:rPr>
+          <w:rFonts w:cstheme="minorHAnsi"/>
+          <w:sz w:val="28"/>
+          <w:szCs w:val="36"/>
+        </w:rPr>
+        <w:t>array</w:t>
+      </w:r>
+      <w:proofErr w:type="spellEnd"/>
+    </w:p>
+    <w:p>
+      <w:pPr>
+        <w:shd w:val="clear" w:color="auto" w:fill="282A36"/>
+        <w:spacing w:after="0" w:line="300" w:lineRule="atLeast"/>
+        <w:rPr>
+          <w:rFonts w:ascii="Consolas" w:eastAsia="Times New Roman" w:hAnsi="Consolas" w:cs="Times New Roman"/>
+          <w:color w:val="F8F8F2"/>
+          <w:sz w:val="23"/>
+          <w:szCs w:val="23"/>
+          <w:lang w:eastAsia="pt-BR"/>
+        </w:rPr>
+      </w:pPr>
+      <w:r>
+        <w:rPr>
+          <w:rFonts w:ascii="Consolas" w:eastAsia="Times New Roman" w:hAnsi="Consolas" w:cs="Times New Roman"/>
+          <w:color w:val="FF79C6"/>
+          <w:sz w:val="23"/>
+          <w:szCs w:val="23"/>
+          <w:lang w:eastAsia="pt-BR"/>
+        </w:rPr>
+        <w:t>for</w:t>
+      </w:r>
+      <w:r>
+        <w:rPr>
+          <w:rFonts w:ascii="Consolas" w:eastAsia="Times New Roman" w:hAnsi="Consolas" w:cs="Times New Roman"/>
+          <w:color w:val="F8F8F2"/>
+          <w:sz w:val="23"/>
+          <w:szCs w:val="23"/>
+          <w:lang w:eastAsia="pt-BR"/>
+        </w:rPr>
+        <w:t xml:space="preserve"> (n </w:t>
+      </w:r>
+      <w:r>
+        <w:rPr>
+          <w:rFonts w:ascii="Consolas" w:eastAsia="Times New Roman" w:hAnsi="Consolas" w:cs="Times New Roman"/>
+          <w:color w:val="FF79C6"/>
+          <w:sz w:val="23"/>
+          <w:szCs w:val="23"/>
+          <w:lang w:eastAsia="pt-BR"/>
+        </w:rPr>
+        <w:t>in</w:t>
+      </w:r>
+      <w:r>
+        <w:rPr>
+          <w:rFonts w:ascii="Consolas" w:eastAsia="Times New Roman" w:hAnsi="Consolas" w:cs="Times New Roman"/>
+          <w:color w:val="F8F8F2"/>
+          <w:sz w:val="23"/>
+          <w:szCs w:val="23"/>
+          <w:lang w:eastAsia="pt-BR"/>
+        </w:rPr>
+        <w:t xml:space="preserve"> num) {</w:t>
+      </w:r>
+    </w:p>
+    <w:p>
+      <w:pPr>
+        <w:shd w:val="clear" w:color="auto" w:fill="282A36"/>
+        <w:spacing w:after="0" w:line="300" w:lineRule="atLeast"/>
+        <w:rPr>
+          <w:rFonts w:ascii="Consolas" w:eastAsia="Times New Roman" w:hAnsi="Consolas" w:cs="Times New Roman"/>
+          <w:color w:val="F8F8F2"/>
+          <w:sz w:val="23"/>
+          <w:szCs w:val="23"/>
+          <w:lang w:eastAsia="pt-BR"/>
+        </w:rPr>
+      </w:pPr>
+      <w:r>
+        <w:rPr>
+          <w:rFonts w:ascii="Consolas" w:eastAsia="Times New Roman" w:hAnsi="Consolas" w:cs="Times New Roman"/>
+          <w:color w:val="F8F8F2"/>
+          <w:sz w:val="23"/>
+          <w:szCs w:val="23"/>
+          <w:lang w:eastAsia="pt-BR"/>
+        </w:rPr>
+        <w:t xml:space="preserve">    </w:t>
+      </w:r>
+      <w:r>
+        <w:rPr>
+          <w:rFonts w:ascii="Consolas" w:eastAsia="Times New Roman" w:hAnsi="Consolas" w:cs="Times New Roman"/>
+          <w:color w:val="BD93F9"/>
+          <w:sz w:val="23"/>
+          <w:szCs w:val="23"/>
+          <w:lang w:eastAsia="pt-BR"/>
+        </w:rPr>
+        <w:t>console</w:t>
+      </w:r>
+      <w:r>
+        <w:rPr>
+          <w:rFonts w:ascii="Consolas" w:eastAsia="Times New Roman" w:hAnsi="Consolas" w:cs="Times New Roman"/>
+          <w:color w:val="F8F8F2"/>
+          <w:sz w:val="23"/>
+          <w:szCs w:val="23"/>
+          <w:lang w:eastAsia="pt-BR"/>
+        </w:rPr>
         <w:t>.</w:t>
       </w:r>
-    </w:p>
-    <w:p>
-      <w:pPr>
-        <w:rPr>
-          <w:rFonts w:cstheme="minorHAnsi"/>
-          <w:sz w:val="28"/>
-          <w:szCs w:val="36"/>
-        </w:rPr>
-      </w:pPr>
-      <w:r>
-        <w:rPr>
-          <w:rFonts w:cstheme="minorHAnsi"/>
-          <w:sz w:val="28"/>
-          <w:szCs w:val="36"/>
-        </w:rPr>
-        <w:t xml:space="preserve">Estrutura </w:t>
-      </w:r>
-      <w:proofErr w:type="spellStart"/>
-      <w:r>
-        <w:rPr>
-          <w:rFonts w:cstheme="minorHAnsi"/>
-          <w:sz w:val="28"/>
-          <w:szCs w:val="36"/>
-        </w:rPr>
-        <w:t>If</w:t>
-      </w:r>
+      <w:r>
+        <w:rPr>
+          <w:rFonts w:ascii="Consolas" w:eastAsia="Times New Roman" w:hAnsi="Consolas" w:cs="Times New Roman"/>
+          <w:color w:val="50FA7B"/>
+          <w:sz w:val="23"/>
+          <w:szCs w:val="23"/>
+          <w:lang w:eastAsia="pt-BR"/>
+        </w:rPr>
+        <w:t>log</w:t>
+      </w:r>
+      <w:r>
+        <w:rPr>
+          <w:rFonts w:ascii="Consolas" w:eastAsia="Times New Roman" w:hAnsi="Consolas" w:cs="Times New Roman"/>
+          <w:color w:val="F8F8F2"/>
+          <w:sz w:val="23"/>
+          <w:szCs w:val="23"/>
+          <w:lang w:eastAsia="pt-BR"/>
+        </w:rPr>
+        <w:t>(</w:t>
+      </w:r>
+      <w:r>
+        <w:rPr>
+          <w:rFonts w:ascii="Consolas" w:eastAsia="Times New Roman" w:hAnsi="Consolas" w:cs="Times New Roman"/>
+          <w:color w:val="F8F8F2"/>
+          <w:sz w:val="23"/>
+          <w:szCs w:val="23"/>
+          <w:lang w:eastAsia="pt-BR"/>
+        </w:rPr>
+        <w:t>n</w:t>
+      </w:r>
+      <w:r>
+        <w:rPr>
+          <w:rFonts w:ascii="Consolas" w:eastAsia="Times New Roman" w:hAnsi="Consolas" w:cs="Times New Roman"/>
+          <w:color w:val="F8F8F2"/>
+          <w:sz w:val="23"/>
+          <w:szCs w:val="23"/>
+          <w:lang w:eastAsia="pt-BR"/>
+        </w:rPr>
+        <w:t xml:space="preserve">)     </w:t>
+      </w:r>
+    </w:p>
+    <w:p>
+      <w:pPr>
+        <w:shd w:val="clear" w:color="auto" w:fill="282A36"/>
+        <w:spacing w:after="0" w:line="300" w:lineRule="atLeast"/>
+        <w:rPr>
+          <w:rFonts w:ascii="Consolas" w:eastAsia="Times New Roman" w:hAnsi="Consolas" w:cs="Times New Roman"/>
+          <w:color w:val="F8F8F2"/>
+          <w:sz w:val="23"/>
+          <w:szCs w:val="23"/>
+          <w:lang w:eastAsia="pt-BR"/>
+        </w:rPr>
+      </w:pPr>
+      <w:r>
+        <w:rPr>
+          <w:rFonts w:ascii="Consolas" w:eastAsia="Times New Roman" w:hAnsi="Consolas" w:cs="Times New Roman"/>
+          <w:color w:val="F8F8F2"/>
+          <w:sz w:val="23"/>
+          <w:szCs w:val="23"/>
+          <w:lang w:eastAsia="pt-BR"/>
+        </w:rPr>
+        <w:t>}</w:t>
+      </w:r>
+    </w:p>
+    <w:p>
+      <w:pPr>
+        <w:rPr>
+          <w:rFonts w:cstheme="minorHAnsi"/>
+          <w:sz w:val="28"/>
+          <w:szCs w:val="36"/>
+        </w:rPr>
+      </w:pPr>
       <w:bookmarkStart w:id="0" w:name="_GoBack"/>
       <w:bookmarkEnd w:id="0"/>
+    </w:p>
+    <w:p>
+      <w:pPr>
+        <w:rPr>
+          <w:rFonts w:cstheme="minorHAnsi"/>
+          <w:b/>
+          <w:bCs/>
+          <w:sz w:val="28"/>
+          <w:szCs w:val="36"/>
+        </w:rPr>
+      </w:pPr>
+      <w:r>
+        <w:rPr>
+          <w:rFonts w:cstheme="minorHAnsi"/>
+          <w:b/>
+          <w:bCs/>
+          <w:sz w:val="28"/>
+          <w:szCs w:val="36"/>
+        </w:rPr>
+        <w:t>Exemplo de for para for in:</w:t>
+      </w:r>
+    </w:p>
+    <w:p>
+      <w:pPr>
+        <w:shd w:val="clear" w:color="auto" w:fill="282A36"/>
+        <w:spacing w:after="0" w:line="300" w:lineRule="atLeast"/>
+        <w:rPr>
+          <w:rFonts w:ascii="Consolas" w:eastAsia="Times New Roman" w:hAnsi="Consolas" w:cs="Times New Roman"/>
+          <w:color w:val="F8F8F2"/>
+          <w:sz w:val="23"/>
+          <w:szCs w:val="23"/>
+          <w:lang w:val="en-US" w:eastAsia="pt-BR"/>
+        </w:rPr>
+      </w:pPr>
+      <w:r>
+        <w:rPr>
+          <w:rFonts w:ascii="Consolas" w:eastAsia="Times New Roman" w:hAnsi="Consolas" w:cs="Times New Roman"/>
+          <w:color w:val="FF79C6"/>
+          <w:sz w:val="23"/>
+          <w:szCs w:val="23"/>
+          <w:lang w:val="en-US" w:eastAsia="pt-BR"/>
+        </w:rPr>
+        <w:t>for</w:t>
+      </w:r>
+      <w:r>
+        <w:rPr>
+          <w:rFonts w:ascii="Consolas" w:eastAsia="Times New Roman" w:hAnsi="Consolas" w:cs="Times New Roman"/>
+          <w:color w:val="F8F8F2"/>
+          <w:sz w:val="23"/>
+          <w:szCs w:val="23"/>
+          <w:lang w:val="en-US" w:eastAsia="pt-BR"/>
+        </w:rPr>
+        <w:t xml:space="preserve"> (</w:t>
+      </w:r>
+      <w:r>
+        <w:rPr>
+          <w:rFonts w:ascii="Consolas" w:eastAsia="Times New Roman" w:hAnsi="Consolas" w:cs="Times New Roman"/>
+          <w:color w:val="FF79C6"/>
+          <w:sz w:val="23"/>
+          <w:szCs w:val="23"/>
+          <w:lang w:val="en-US" w:eastAsia="pt-BR"/>
+        </w:rPr>
+        <w:t>let</w:t>
+      </w:r>
+      <w:r>
+        <w:rPr>
+          <w:rFonts w:ascii="Consolas" w:eastAsia="Times New Roman" w:hAnsi="Consolas" w:cs="Times New Roman"/>
+          <w:color w:val="F8F8F2"/>
+          <w:sz w:val="23"/>
+          <w:szCs w:val="23"/>
+          <w:lang w:val="en-US" w:eastAsia="pt-BR"/>
+        </w:rPr>
+        <w:t xml:space="preserve"> </w:t>
+      </w:r>
+      <w:proofErr w:type="spellStart"/>
+      <w:r>
+        <w:rPr>
+          <w:rFonts w:ascii="Consolas" w:eastAsia="Times New Roman" w:hAnsi="Consolas" w:cs="Times New Roman"/>
+          <w:color w:val="F8F8F2"/>
+          <w:sz w:val="23"/>
+          <w:szCs w:val="23"/>
+          <w:lang w:val="en-US" w:eastAsia="pt-BR"/>
+        </w:rPr>
+        <w:t>i</w:t>
+      </w:r>
       <w:proofErr w:type="spellEnd"/>
+      <w:r>
+        <w:rPr>
+          <w:rFonts w:ascii="Consolas" w:eastAsia="Times New Roman" w:hAnsi="Consolas" w:cs="Times New Roman"/>
+          <w:color w:val="F8F8F2"/>
+          <w:sz w:val="23"/>
+          <w:szCs w:val="23"/>
+          <w:lang w:val="en-US" w:eastAsia="pt-BR"/>
+        </w:rPr>
+        <w:t xml:space="preserve"> </w:t>
+      </w:r>
+      <w:r>
+        <w:rPr>
+          <w:rFonts w:ascii="Consolas" w:eastAsia="Times New Roman" w:hAnsi="Consolas" w:cs="Times New Roman"/>
+          <w:color w:val="FF79C6"/>
+          <w:sz w:val="23"/>
+          <w:szCs w:val="23"/>
+          <w:lang w:val="en-US" w:eastAsia="pt-BR"/>
+        </w:rPr>
+        <w:t>=</w:t>
+      </w:r>
+      <w:r>
+        <w:rPr>
+          <w:rFonts w:ascii="Consolas" w:eastAsia="Times New Roman" w:hAnsi="Consolas" w:cs="Times New Roman"/>
+          <w:color w:val="F8F8F2"/>
+          <w:sz w:val="23"/>
+          <w:szCs w:val="23"/>
+          <w:lang w:val="en-US" w:eastAsia="pt-BR"/>
+        </w:rPr>
+        <w:t xml:space="preserve"> </w:t>
+      </w:r>
+      <w:r>
+        <w:rPr>
+          <w:rFonts w:ascii="Consolas" w:eastAsia="Times New Roman" w:hAnsi="Consolas" w:cs="Times New Roman"/>
+          <w:color w:val="BD93F9"/>
+          <w:sz w:val="23"/>
+          <w:szCs w:val="23"/>
+          <w:lang w:val="en-US" w:eastAsia="pt-BR"/>
+        </w:rPr>
+        <w:t>0</w:t>
+      </w:r>
+      <w:r>
+        <w:rPr>
+          <w:rFonts w:ascii="Consolas" w:eastAsia="Times New Roman" w:hAnsi="Consolas" w:cs="Times New Roman"/>
+          <w:color w:val="F8F8F2"/>
+          <w:sz w:val="23"/>
+          <w:szCs w:val="23"/>
+          <w:lang w:val="en-US" w:eastAsia="pt-BR"/>
+        </w:rPr>
+        <w:t xml:space="preserve">; </w:t>
+      </w:r>
+      <w:proofErr w:type="spellStart"/>
+      <w:r>
+        <w:rPr>
+          <w:rFonts w:ascii="Consolas" w:eastAsia="Times New Roman" w:hAnsi="Consolas" w:cs="Times New Roman"/>
+          <w:color w:val="F8F8F2"/>
+          <w:sz w:val="23"/>
+          <w:szCs w:val="23"/>
+          <w:lang w:val="en-US" w:eastAsia="pt-BR"/>
+        </w:rPr>
+        <w:t>i</w:t>
+      </w:r>
+      <w:proofErr w:type="spellEnd"/>
+      <w:r>
+        <w:rPr>
+          <w:rFonts w:ascii="Consolas" w:eastAsia="Times New Roman" w:hAnsi="Consolas" w:cs="Times New Roman"/>
+          <w:color w:val="F8F8F2"/>
+          <w:sz w:val="23"/>
+          <w:szCs w:val="23"/>
+          <w:lang w:val="en-US" w:eastAsia="pt-BR"/>
+        </w:rPr>
+        <w:t xml:space="preserve"> </w:t>
+      </w:r>
+      <w:r>
+        <w:rPr>
+          <w:rFonts w:ascii="Consolas" w:eastAsia="Times New Roman" w:hAnsi="Consolas" w:cs="Times New Roman"/>
+          <w:color w:val="FF79C6"/>
+          <w:sz w:val="23"/>
+          <w:szCs w:val="23"/>
+          <w:lang w:val="en-US" w:eastAsia="pt-BR"/>
+        </w:rPr>
+        <w:t>&lt;</w:t>
+      </w:r>
+      <w:r>
+        <w:rPr>
+          <w:rFonts w:ascii="Consolas" w:eastAsia="Times New Roman" w:hAnsi="Consolas" w:cs="Times New Roman"/>
+          <w:color w:val="F8F8F2"/>
+          <w:sz w:val="23"/>
+          <w:szCs w:val="23"/>
+          <w:lang w:val="en-US" w:eastAsia="pt-BR"/>
+        </w:rPr>
+        <w:t xml:space="preserve"> </w:t>
+      </w:r>
+      <w:proofErr w:type="spellStart"/>
+      <w:proofErr w:type="gramStart"/>
+      <w:r>
+        <w:rPr>
+          <w:rFonts w:ascii="Consolas" w:eastAsia="Times New Roman" w:hAnsi="Consolas" w:cs="Times New Roman"/>
+          <w:color w:val="F8F8F2"/>
+          <w:sz w:val="23"/>
+          <w:szCs w:val="23"/>
+          <w:lang w:val="en-US" w:eastAsia="pt-BR"/>
+        </w:rPr>
+        <w:t>num.length</w:t>
+      </w:r>
+      <w:proofErr w:type="spellEnd"/>
+      <w:proofErr w:type="gramEnd"/>
+      <w:r>
+        <w:rPr>
+          <w:rFonts w:ascii="Consolas" w:eastAsia="Times New Roman" w:hAnsi="Consolas" w:cs="Times New Roman"/>
+          <w:color w:val="F8F8F2"/>
+          <w:sz w:val="23"/>
+          <w:szCs w:val="23"/>
+          <w:lang w:val="en-US" w:eastAsia="pt-BR"/>
+        </w:rPr>
+        <w:t xml:space="preserve">; </w:t>
+      </w:r>
+      <w:proofErr w:type="spellStart"/>
+      <w:r>
+        <w:rPr>
+          <w:rFonts w:ascii="Consolas" w:eastAsia="Times New Roman" w:hAnsi="Consolas" w:cs="Times New Roman"/>
+          <w:color w:val="F8F8F2"/>
+          <w:sz w:val="23"/>
+          <w:szCs w:val="23"/>
+          <w:lang w:val="en-US" w:eastAsia="pt-BR"/>
+        </w:rPr>
+        <w:t>i</w:t>
+      </w:r>
+      <w:proofErr w:type="spellEnd"/>
+      <w:r>
+        <w:rPr>
+          <w:rFonts w:ascii="Consolas" w:eastAsia="Times New Roman" w:hAnsi="Consolas" w:cs="Times New Roman"/>
+          <w:color w:val="FF79C6"/>
+          <w:sz w:val="23"/>
+          <w:szCs w:val="23"/>
+          <w:lang w:val="en-US" w:eastAsia="pt-BR"/>
+        </w:rPr>
+        <w:t>++</w:t>
+      </w:r>
+      <w:r>
+        <w:rPr>
+          <w:rFonts w:ascii="Consolas" w:eastAsia="Times New Roman" w:hAnsi="Consolas" w:cs="Times New Roman"/>
+          <w:color w:val="F8F8F2"/>
+          <w:sz w:val="23"/>
+          <w:szCs w:val="23"/>
+          <w:lang w:val="en-US" w:eastAsia="pt-BR"/>
+        </w:rPr>
+        <w:t>) {</w:t>
+      </w:r>
+    </w:p>
+    <w:p>
+      <w:pPr>
+        <w:shd w:val="clear" w:color="auto" w:fill="282A36"/>
+        <w:spacing w:after="0" w:line="300" w:lineRule="atLeast"/>
+        <w:rPr>
+          <w:rFonts w:ascii="Consolas" w:eastAsia="Times New Roman" w:hAnsi="Consolas" w:cs="Times New Roman"/>
+          <w:color w:val="F8F8F2"/>
+          <w:sz w:val="23"/>
+          <w:szCs w:val="23"/>
+          <w:lang w:eastAsia="pt-BR"/>
+        </w:rPr>
+      </w:pPr>
+      <w:r>
+        <w:rPr>
+          <w:rFonts w:ascii="Consolas" w:eastAsia="Times New Roman" w:hAnsi="Consolas" w:cs="Times New Roman"/>
+          <w:color w:val="F8F8F2"/>
+          <w:sz w:val="23"/>
+          <w:szCs w:val="23"/>
+          <w:lang w:val="en-US" w:eastAsia="pt-BR"/>
+        </w:rPr>
+        <w:t xml:space="preserve">    </w:t>
+      </w:r>
+      <w:r>
+        <w:rPr>
+          <w:rFonts w:ascii="Consolas" w:eastAsia="Times New Roman" w:hAnsi="Consolas" w:cs="Times New Roman"/>
+          <w:color w:val="BD93F9"/>
+          <w:sz w:val="23"/>
+          <w:szCs w:val="23"/>
+          <w:lang w:eastAsia="pt-BR"/>
+        </w:rPr>
+        <w:t>console</w:t>
+      </w:r>
+      <w:r>
+        <w:rPr>
+          <w:rFonts w:ascii="Consolas" w:eastAsia="Times New Roman" w:hAnsi="Consolas" w:cs="Times New Roman"/>
+          <w:color w:val="F8F8F2"/>
+          <w:sz w:val="23"/>
+          <w:szCs w:val="23"/>
+          <w:lang w:eastAsia="pt-BR"/>
+        </w:rPr>
+        <w:t>.</w:t>
+      </w:r>
+      <w:r>
+        <w:rPr>
+          <w:rFonts w:ascii="Consolas" w:eastAsia="Times New Roman" w:hAnsi="Consolas" w:cs="Times New Roman"/>
+          <w:color w:val="50FA7B"/>
+          <w:sz w:val="23"/>
+          <w:szCs w:val="23"/>
+          <w:lang w:eastAsia="pt-BR"/>
+        </w:rPr>
+        <w:t>log</w:t>
+      </w:r>
+      <w:r>
+        <w:rPr>
+          <w:rFonts w:ascii="Consolas" w:eastAsia="Times New Roman" w:hAnsi="Consolas" w:cs="Times New Roman"/>
+          <w:color w:val="F8F8F2"/>
+          <w:sz w:val="23"/>
+          <w:szCs w:val="23"/>
+          <w:lang w:eastAsia="pt-BR"/>
+        </w:rPr>
+        <w:t>(</w:t>
+      </w:r>
+      <w:r>
+        <w:rPr>
+          <w:rFonts w:ascii="Consolas" w:eastAsia="Times New Roman" w:hAnsi="Consolas" w:cs="Times New Roman"/>
+          <w:color w:val="F8F8F2"/>
+          <w:sz w:val="23"/>
+          <w:szCs w:val="23"/>
+          <w:lang w:eastAsia="pt-BR"/>
+        </w:rPr>
+        <w:t>i</w:t>
+      </w:r>
+      <w:r>
+        <w:rPr>
+          <w:rFonts w:ascii="Consolas" w:eastAsia="Times New Roman" w:hAnsi="Consolas" w:cs="Times New Roman"/>
+          <w:color w:val="F8F8F2"/>
+          <w:sz w:val="23"/>
+          <w:szCs w:val="23"/>
+          <w:lang w:eastAsia="pt-BR"/>
+        </w:rPr>
+        <w:t>)</w:t>
+      </w:r>
+      <w:r>
+        <w:rPr>
+          <w:rFonts w:ascii="Consolas" w:eastAsia="Times New Roman" w:hAnsi="Consolas" w:cs="Times New Roman"/>
+          <w:color w:val="F8F8F2"/>
+          <w:sz w:val="23"/>
+          <w:szCs w:val="23"/>
+          <w:lang w:eastAsia="pt-BR"/>
+        </w:rPr>
+        <w:t xml:space="preserve"> Retorna somente a posição do elemento</w:t>
+      </w:r>
+    </w:p>
+    <w:p>
+      <w:pPr>
+        <w:shd w:val="clear" w:color="auto" w:fill="282A36"/>
+        <w:spacing w:after="0" w:line="300" w:lineRule="atLeast"/>
+        <w:rPr>
+          <w:rFonts w:ascii="Consolas" w:eastAsia="Times New Roman" w:hAnsi="Consolas" w:cs="Times New Roman"/>
+          <w:color w:val="F8F8F2"/>
+          <w:sz w:val="23"/>
+          <w:szCs w:val="23"/>
+          <w:lang w:eastAsia="pt-BR"/>
+        </w:rPr>
+      </w:pPr>
+      <w:r>
+        <w:rPr>
+          <w:rFonts w:ascii="Consolas" w:eastAsia="Times New Roman" w:hAnsi="Consolas" w:cs="Times New Roman"/>
+          <w:color w:val="F8F8F2"/>
+          <w:sz w:val="23"/>
+          <w:szCs w:val="23"/>
+          <w:lang w:eastAsia="pt-BR"/>
+        </w:rPr>
+        <w:t>}</w:t>
+      </w:r>
+    </w:p>
+    <w:p>
+      <w:pPr>
+        <w:rPr>
+          <w:rFonts w:cstheme="minorHAnsi"/>
+          <w:sz w:val="28"/>
+          <w:szCs w:val="36"/>
+        </w:rPr>
+      </w:pPr>
+    </w:p>
+    <w:p>
+      <w:pPr>
+        <w:rPr>
+          <w:rFonts w:cstheme="minorHAnsi"/>
+          <w:sz w:val="28"/>
+          <w:szCs w:val="36"/>
+        </w:rPr>
+      </w:pPr>
+      <w:r>
+        <w:rPr>
+          <w:rFonts w:cstheme="minorHAnsi"/>
+          <w:b/>
+          <w:bCs/>
+          <w:sz w:val="28"/>
+          <w:szCs w:val="36"/>
+        </w:rPr>
+        <w:t xml:space="preserve">For </w:t>
+      </w:r>
+      <w:proofErr w:type="spellStart"/>
+      <w:r>
+        <w:rPr>
+          <w:rFonts w:cstheme="minorHAnsi"/>
+          <w:b/>
+          <w:bCs/>
+          <w:sz w:val="28"/>
+          <w:szCs w:val="36"/>
+        </w:rPr>
+        <w:t>of</w:t>
+      </w:r>
+      <w:proofErr w:type="spellEnd"/>
+      <w:r>
+        <w:rPr>
+          <w:rFonts w:cstheme="minorHAnsi"/>
+          <w:b/>
+          <w:bCs/>
+          <w:sz w:val="28"/>
+          <w:szCs w:val="36"/>
+        </w:rPr>
+        <w:t xml:space="preserve"> = </w:t>
+      </w:r>
+      <w:r>
+        <w:rPr>
+          <w:rFonts w:cstheme="minorHAnsi"/>
+          <w:sz w:val="28"/>
+          <w:szCs w:val="36"/>
+        </w:rPr>
+        <w:t xml:space="preserve">Mesma coisa de você imprimir os </w:t>
+      </w:r>
+      <w:r>
+        <w:rPr>
+          <w:rFonts w:cstheme="minorHAnsi"/>
+          <w:b/>
+          <w:bCs/>
+          <w:i/>
+          <w:iCs/>
+          <w:sz w:val="28"/>
+          <w:szCs w:val="36"/>
+        </w:rPr>
+        <w:t>VALORES</w:t>
+      </w:r>
+      <w:r>
+        <w:rPr>
+          <w:rFonts w:cstheme="minorHAnsi"/>
+          <w:sz w:val="28"/>
+          <w:szCs w:val="36"/>
+        </w:rPr>
+        <w:t xml:space="preserve"> dos elementos dentro do </w:t>
+      </w:r>
+      <w:proofErr w:type="spellStart"/>
+      <w:r>
+        <w:rPr>
+          <w:rFonts w:cstheme="minorHAnsi"/>
+          <w:sz w:val="28"/>
+          <w:szCs w:val="36"/>
+        </w:rPr>
+        <w:t>array</w:t>
+      </w:r>
+      <w:proofErr w:type="spellEnd"/>
+    </w:p>
+    <w:p>
+      <w:pPr>
+        <w:shd w:val="clear" w:color="auto" w:fill="282A36"/>
+        <w:spacing w:after="0" w:line="300" w:lineRule="atLeast"/>
+        <w:rPr>
+          <w:rFonts w:ascii="Consolas" w:eastAsia="Times New Roman" w:hAnsi="Consolas" w:cs="Times New Roman"/>
+          <w:color w:val="F8F8F2"/>
+          <w:sz w:val="23"/>
+          <w:szCs w:val="23"/>
+          <w:lang w:eastAsia="pt-BR"/>
+        </w:rPr>
+      </w:pPr>
+      <w:r>
+        <w:rPr>
+          <w:rFonts w:ascii="Consolas" w:eastAsia="Times New Roman" w:hAnsi="Consolas" w:cs="Times New Roman"/>
+          <w:color w:val="FF79C6"/>
+          <w:sz w:val="23"/>
+          <w:szCs w:val="23"/>
+          <w:lang w:eastAsia="pt-BR"/>
+        </w:rPr>
+        <w:lastRenderedPageBreak/>
+        <w:t>for</w:t>
+      </w:r>
+      <w:r>
+        <w:rPr>
+          <w:rFonts w:ascii="Consolas" w:eastAsia="Times New Roman" w:hAnsi="Consolas" w:cs="Times New Roman"/>
+          <w:color w:val="F8F8F2"/>
+          <w:sz w:val="23"/>
+          <w:szCs w:val="23"/>
+          <w:lang w:eastAsia="pt-BR"/>
+        </w:rPr>
+        <w:t xml:space="preserve"> (n </w:t>
+      </w:r>
+      <w:proofErr w:type="spellStart"/>
+      <w:r>
+        <w:rPr>
+          <w:rFonts w:ascii="Consolas" w:eastAsia="Times New Roman" w:hAnsi="Consolas" w:cs="Times New Roman"/>
+          <w:color w:val="FF79C6"/>
+          <w:sz w:val="23"/>
+          <w:szCs w:val="23"/>
+          <w:lang w:eastAsia="pt-BR"/>
+        </w:rPr>
+        <w:t>of</w:t>
+      </w:r>
+      <w:proofErr w:type="spellEnd"/>
+      <w:r>
+        <w:rPr>
+          <w:rFonts w:ascii="Consolas" w:eastAsia="Times New Roman" w:hAnsi="Consolas" w:cs="Times New Roman"/>
+          <w:color w:val="F8F8F2"/>
+          <w:sz w:val="23"/>
+          <w:szCs w:val="23"/>
+          <w:lang w:eastAsia="pt-BR"/>
+        </w:rPr>
+        <w:t xml:space="preserve"> num) {</w:t>
+      </w:r>
+    </w:p>
+    <w:p>
+      <w:pPr>
+        <w:shd w:val="clear" w:color="auto" w:fill="282A36"/>
+        <w:spacing w:after="0" w:line="300" w:lineRule="atLeast"/>
+        <w:rPr>
+          <w:rFonts w:ascii="Consolas" w:eastAsia="Times New Roman" w:hAnsi="Consolas" w:cs="Times New Roman"/>
+          <w:color w:val="F8F8F2"/>
+          <w:sz w:val="23"/>
+          <w:szCs w:val="23"/>
+          <w:lang w:eastAsia="pt-BR"/>
+        </w:rPr>
+      </w:pPr>
+      <w:r>
+        <w:rPr>
+          <w:rFonts w:ascii="Consolas" w:eastAsia="Times New Roman" w:hAnsi="Consolas" w:cs="Times New Roman"/>
+          <w:color w:val="F8F8F2"/>
+          <w:sz w:val="23"/>
+          <w:szCs w:val="23"/>
+          <w:lang w:eastAsia="pt-BR"/>
+        </w:rPr>
+        <w:t xml:space="preserve">    </w:t>
+      </w:r>
+      <w:r>
+        <w:rPr>
+          <w:rFonts w:ascii="Consolas" w:eastAsia="Times New Roman" w:hAnsi="Consolas" w:cs="Times New Roman"/>
+          <w:color w:val="BD93F9"/>
+          <w:sz w:val="23"/>
+          <w:szCs w:val="23"/>
+          <w:lang w:eastAsia="pt-BR"/>
+        </w:rPr>
+        <w:t>console</w:t>
+      </w:r>
+      <w:r>
+        <w:rPr>
+          <w:rFonts w:ascii="Consolas" w:eastAsia="Times New Roman" w:hAnsi="Consolas" w:cs="Times New Roman"/>
+          <w:color w:val="F8F8F2"/>
+          <w:sz w:val="23"/>
+          <w:szCs w:val="23"/>
+          <w:lang w:eastAsia="pt-BR"/>
+        </w:rPr>
+        <w:t>.</w:t>
+      </w:r>
+      <w:r>
+        <w:rPr>
+          <w:rFonts w:ascii="Consolas" w:eastAsia="Times New Roman" w:hAnsi="Consolas" w:cs="Times New Roman"/>
+          <w:color w:val="50FA7B"/>
+          <w:sz w:val="23"/>
+          <w:szCs w:val="23"/>
+          <w:lang w:eastAsia="pt-BR"/>
+        </w:rPr>
+        <w:t>log</w:t>
+      </w:r>
+      <w:r>
+        <w:rPr>
+          <w:rFonts w:ascii="Consolas" w:eastAsia="Times New Roman" w:hAnsi="Consolas" w:cs="Times New Roman"/>
+          <w:color w:val="F8F8F2"/>
+          <w:sz w:val="23"/>
+          <w:szCs w:val="23"/>
+          <w:lang w:eastAsia="pt-BR"/>
+        </w:rPr>
+        <w:t>(n)</w:t>
+      </w:r>
+    </w:p>
+    <w:p>
+      <w:pPr>
+        <w:shd w:val="clear" w:color="auto" w:fill="282A36"/>
+        <w:spacing w:after="0" w:line="300" w:lineRule="atLeast"/>
+        <w:rPr>
+          <w:rFonts w:ascii="Consolas" w:eastAsia="Times New Roman" w:hAnsi="Consolas" w:cs="Times New Roman"/>
+          <w:color w:val="F8F8F2"/>
+          <w:sz w:val="23"/>
+          <w:szCs w:val="23"/>
+          <w:lang w:eastAsia="pt-BR"/>
+        </w:rPr>
+      </w:pPr>
+      <w:r>
+        <w:rPr>
+          <w:rFonts w:ascii="Consolas" w:eastAsia="Times New Roman" w:hAnsi="Consolas" w:cs="Times New Roman"/>
+          <w:color w:val="F8F8F2"/>
+          <w:sz w:val="23"/>
+          <w:szCs w:val="23"/>
+          <w:lang w:eastAsia="pt-BR"/>
+        </w:rPr>
+        <w:t>}</w:t>
+      </w:r>
+    </w:p>
+    <w:p>
+      <w:pPr>
+        <w:rPr>
+          <w:rFonts w:cstheme="minorHAnsi"/>
+          <w:sz w:val="28"/>
+          <w:szCs w:val="36"/>
+        </w:rPr>
+      </w:pPr>
+    </w:p>
+    <w:p>
+      <w:pPr>
+        <w:rPr>
+          <w:rFonts w:cstheme="minorHAnsi"/>
+          <w:b/>
+          <w:bCs/>
+          <w:sz w:val="28"/>
+          <w:szCs w:val="36"/>
+        </w:rPr>
+      </w:pPr>
+      <w:r>
+        <w:rPr>
+          <w:rFonts w:cstheme="minorHAnsi"/>
+          <w:b/>
+          <w:bCs/>
+          <w:sz w:val="28"/>
+          <w:szCs w:val="36"/>
+        </w:rPr>
+        <w:t xml:space="preserve">Exemplo de for para for </w:t>
+      </w:r>
+      <w:proofErr w:type="spellStart"/>
+      <w:r>
+        <w:rPr>
+          <w:rFonts w:cstheme="minorHAnsi"/>
+          <w:b/>
+          <w:bCs/>
+          <w:sz w:val="28"/>
+          <w:szCs w:val="36"/>
+        </w:rPr>
+        <w:t>of</w:t>
+      </w:r>
+      <w:proofErr w:type="spellEnd"/>
+      <w:r>
+        <w:rPr>
+          <w:rFonts w:cstheme="minorHAnsi"/>
+          <w:b/>
+          <w:bCs/>
+          <w:sz w:val="28"/>
+          <w:szCs w:val="36"/>
+        </w:rPr>
+        <w:t>:</w:t>
+      </w:r>
+    </w:p>
+    <w:p>
+      <w:pPr>
+        <w:shd w:val="clear" w:color="auto" w:fill="282A36"/>
+        <w:spacing w:after="0" w:line="300" w:lineRule="atLeast"/>
+        <w:rPr>
+          <w:rFonts w:ascii="Consolas" w:eastAsia="Times New Roman" w:hAnsi="Consolas" w:cs="Times New Roman"/>
+          <w:color w:val="F8F8F2"/>
+          <w:sz w:val="23"/>
+          <w:szCs w:val="23"/>
+          <w:lang w:val="en-US" w:eastAsia="pt-BR"/>
+        </w:rPr>
+      </w:pPr>
+      <w:r>
+        <w:rPr>
+          <w:rFonts w:ascii="Consolas" w:eastAsia="Times New Roman" w:hAnsi="Consolas" w:cs="Times New Roman"/>
+          <w:color w:val="FF79C6"/>
+          <w:sz w:val="23"/>
+          <w:szCs w:val="23"/>
+          <w:lang w:val="en-US" w:eastAsia="pt-BR"/>
+        </w:rPr>
+        <w:t>for</w:t>
+      </w:r>
+      <w:r>
+        <w:rPr>
+          <w:rFonts w:ascii="Consolas" w:eastAsia="Times New Roman" w:hAnsi="Consolas" w:cs="Times New Roman"/>
+          <w:color w:val="F8F8F2"/>
+          <w:sz w:val="23"/>
+          <w:szCs w:val="23"/>
+          <w:lang w:val="en-US" w:eastAsia="pt-BR"/>
+        </w:rPr>
+        <w:t xml:space="preserve"> (</w:t>
+      </w:r>
+      <w:r>
+        <w:rPr>
+          <w:rFonts w:ascii="Consolas" w:eastAsia="Times New Roman" w:hAnsi="Consolas" w:cs="Times New Roman"/>
+          <w:color w:val="FF79C6"/>
+          <w:sz w:val="23"/>
+          <w:szCs w:val="23"/>
+          <w:lang w:val="en-US" w:eastAsia="pt-BR"/>
+        </w:rPr>
+        <w:t>let</w:t>
+      </w:r>
+      <w:r>
+        <w:rPr>
+          <w:rFonts w:ascii="Consolas" w:eastAsia="Times New Roman" w:hAnsi="Consolas" w:cs="Times New Roman"/>
+          <w:color w:val="F8F8F2"/>
+          <w:sz w:val="23"/>
+          <w:szCs w:val="23"/>
+          <w:lang w:val="en-US" w:eastAsia="pt-BR"/>
+        </w:rPr>
+        <w:t xml:space="preserve"> i </w:t>
+      </w:r>
+      <w:r>
+        <w:rPr>
+          <w:rFonts w:ascii="Consolas" w:eastAsia="Times New Roman" w:hAnsi="Consolas" w:cs="Times New Roman"/>
+          <w:color w:val="FF79C6"/>
+          <w:sz w:val="23"/>
+          <w:szCs w:val="23"/>
+          <w:lang w:val="en-US" w:eastAsia="pt-BR"/>
+        </w:rPr>
+        <w:t>=</w:t>
+      </w:r>
+      <w:r>
+        <w:rPr>
+          <w:rFonts w:ascii="Consolas" w:eastAsia="Times New Roman" w:hAnsi="Consolas" w:cs="Times New Roman"/>
+          <w:color w:val="F8F8F2"/>
+          <w:sz w:val="23"/>
+          <w:szCs w:val="23"/>
+          <w:lang w:val="en-US" w:eastAsia="pt-BR"/>
+        </w:rPr>
+        <w:t xml:space="preserve"> </w:t>
+      </w:r>
+      <w:r>
+        <w:rPr>
+          <w:rFonts w:ascii="Consolas" w:eastAsia="Times New Roman" w:hAnsi="Consolas" w:cs="Times New Roman"/>
+          <w:color w:val="BD93F9"/>
+          <w:sz w:val="23"/>
+          <w:szCs w:val="23"/>
+          <w:lang w:val="en-US" w:eastAsia="pt-BR"/>
+        </w:rPr>
+        <w:t>0</w:t>
+      </w:r>
+      <w:r>
+        <w:rPr>
+          <w:rFonts w:ascii="Consolas" w:eastAsia="Times New Roman" w:hAnsi="Consolas" w:cs="Times New Roman"/>
+          <w:color w:val="F8F8F2"/>
+          <w:sz w:val="23"/>
+          <w:szCs w:val="23"/>
+          <w:lang w:val="en-US" w:eastAsia="pt-BR"/>
+        </w:rPr>
+        <w:t xml:space="preserve">; i </w:t>
+      </w:r>
+      <w:r>
+        <w:rPr>
+          <w:rFonts w:ascii="Consolas" w:eastAsia="Times New Roman" w:hAnsi="Consolas" w:cs="Times New Roman"/>
+          <w:color w:val="FF79C6"/>
+          <w:sz w:val="23"/>
+          <w:szCs w:val="23"/>
+          <w:lang w:val="en-US" w:eastAsia="pt-BR"/>
+        </w:rPr>
+        <w:t>&lt;</w:t>
+      </w:r>
+      <w:r>
+        <w:rPr>
+          <w:rFonts w:ascii="Consolas" w:eastAsia="Times New Roman" w:hAnsi="Consolas" w:cs="Times New Roman"/>
+          <w:color w:val="F8F8F2"/>
+          <w:sz w:val="23"/>
+          <w:szCs w:val="23"/>
+          <w:lang w:val="en-US" w:eastAsia="pt-BR"/>
+        </w:rPr>
+        <w:t xml:space="preserve"> num.length; i</w:t>
+      </w:r>
+      <w:r>
+        <w:rPr>
+          <w:rFonts w:ascii="Consolas" w:eastAsia="Times New Roman" w:hAnsi="Consolas" w:cs="Times New Roman"/>
+          <w:color w:val="FF79C6"/>
+          <w:sz w:val="23"/>
+          <w:szCs w:val="23"/>
+          <w:lang w:val="en-US" w:eastAsia="pt-BR"/>
+        </w:rPr>
+        <w:t>++</w:t>
+      </w:r>
+      <w:r>
+        <w:rPr>
+          <w:rFonts w:ascii="Consolas" w:eastAsia="Times New Roman" w:hAnsi="Consolas" w:cs="Times New Roman"/>
+          <w:color w:val="F8F8F2"/>
+          <w:sz w:val="23"/>
+          <w:szCs w:val="23"/>
+          <w:lang w:val="en-US" w:eastAsia="pt-BR"/>
+        </w:rPr>
+        <w:t>) {</w:t>
+      </w:r>
+    </w:p>
+    <w:p>
+      <w:pPr>
+        <w:shd w:val="clear" w:color="auto" w:fill="282A36"/>
+        <w:spacing w:after="0" w:line="300" w:lineRule="atLeast"/>
+        <w:rPr>
+          <w:rFonts w:ascii="Consolas" w:eastAsia="Times New Roman" w:hAnsi="Consolas" w:cs="Times New Roman"/>
+          <w:color w:val="F8F8F2"/>
+          <w:sz w:val="23"/>
+          <w:szCs w:val="23"/>
+          <w:lang w:eastAsia="pt-BR"/>
+        </w:rPr>
+      </w:pPr>
+      <w:r>
+        <w:rPr>
+          <w:rFonts w:ascii="Consolas" w:eastAsia="Times New Roman" w:hAnsi="Consolas" w:cs="Times New Roman"/>
+          <w:color w:val="F8F8F2"/>
+          <w:sz w:val="23"/>
+          <w:szCs w:val="23"/>
+          <w:lang w:val="en-US" w:eastAsia="pt-BR"/>
+        </w:rPr>
+        <w:t xml:space="preserve">    </w:t>
+      </w:r>
+      <w:r>
+        <w:rPr>
+          <w:rFonts w:ascii="Consolas" w:eastAsia="Times New Roman" w:hAnsi="Consolas" w:cs="Times New Roman"/>
+          <w:color w:val="BD93F9"/>
+          <w:sz w:val="23"/>
+          <w:szCs w:val="23"/>
+          <w:lang w:eastAsia="pt-BR"/>
+        </w:rPr>
+        <w:t>console</w:t>
+      </w:r>
+      <w:r>
+        <w:rPr>
+          <w:rFonts w:ascii="Consolas" w:eastAsia="Times New Roman" w:hAnsi="Consolas" w:cs="Times New Roman"/>
+          <w:color w:val="F8F8F2"/>
+          <w:sz w:val="23"/>
+          <w:szCs w:val="23"/>
+          <w:lang w:eastAsia="pt-BR"/>
+        </w:rPr>
+        <w:t>.</w:t>
+      </w:r>
+      <w:r>
+        <w:rPr>
+          <w:rFonts w:ascii="Consolas" w:eastAsia="Times New Roman" w:hAnsi="Consolas" w:cs="Times New Roman"/>
+          <w:color w:val="50FA7B"/>
+          <w:sz w:val="23"/>
+          <w:szCs w:val="23"/>
+          <w:lang w:eastAsia="pt-BR"/>
+        </w:rPr>
+        <w:t>log</w:t>
+      </w:r>
+      <w:r>
+        <w:rPr>
+          <w:rFonts w:ascii="Consolas" w:eastAsia="Times New Roman" w:hAnsi="Consolas" w:cs="Times New Roman"/>
+          <w:color w:val="F8F8F2"/>
+          <w:sz w:val="23"/>
+          <w:szCs w:val="23"/>
+          <w:lang w:eastAsia="pt-BR"/>
+        </w:rPr>
+        <w:t>(num[i])</w:t>
+      </w:r>
+    </w:p>
+    <w:p>
+      <w:pPr>
+        <w:shd w:val="clear" w:color="auto" w:fill="282A36"/>
+        <w:spacing w:after="0" w:line="300" w:lineRule="atLeast"/>
+        <w:rPr>
+          <w:rFonts w:ascii="Consolas" w:eastAsia="Times New Roman" w:hAnsi="Consolas" w:cs="Times New Roman"/>
+          <w:color w:val="F8F8F2"/>
+          <w:sz w:val="23"/>
+          <w:szCs w:val="23"/>
+          <w:lang w:eastAsia="pt-BR"/>
+        </w:rPr>
+      </w:pPr>
+      <w:r>
+        <w:rPr>
+          <w:rFonts w:ascii="Consolas" w:eastAsia="Times New Roman" w:hAnsi="Consolas" w:cs="Times New Roman"/>
+          <w:color w:val="F8F8F2"/>
+          <w:sz w:val="23"/>
+          <w:szCs w:val="23"/>
+          <w:lang w:eastAsia="pt-BR"/>
+        </w:rPr>
+        <w:t>}</w:t>
+      </w:r>
+    </w:p>
+    <w:p>
+      <w:pPr>
+        <w:rPr>
+          <w:rFonts w:cstheme="minorHAnsi"/>
+          <w:sz w:val="28"/>
+          <w:szCs w:val="36"/>
+        </w:rPr>
+      </w:pPr>
+    </w:p>
+    <w:p>
+      <w:pPr>
+        <w:rPr>
+          <w:color w:val="FF0000"/>
+          <w:sz w:val="36"/>
+          <w:szCs w:val="36"/>
+          <w:lang w:val="en-US"/>
+        </w:rPr>
+      </w:pPr>
+      <w:proofErr w:type="spellStart"/>
+      <w:r>
+        <w:rPr>
+          <w:color w:val="FF0000"/>
+          <w:sz w:val="36"/>
+          <w:szCs w:val="36"/>
+          <w:lang w:val="en-US"/>
+        </w:rPr>
+        <w:t>Vídeo</w:t>
+      </w:r>
+      <w:proofErr w:type="spellEnd"/>
+      <w:r>
+        <w:rPr>
+          <w:color w:val="FF0000"/>
+          <w:sz w:val="36"/>
+          <w:szCs w:val="36"/>
+          <w:lang w:val="en-US"/>
+        </w:rPr>
+        <w:t xml:space="preserve"> 1</w:t>
+      </w:r>
+      <w:r>
+        <w:rPr>
+          <w:color w:val="FF0000"/>
+          <w:sz w:val="36"/>
+          <w:szCs w:val="36"/>
+          <w:lang w:val="en-US"/>
+        </w:rPr>
+        <w:t>7</w:t>
+      </w:r>
+      <w:r>
+        <w:rPr>
+          <w:color w:val="FF0000"/>
+          <w:sz w:val="36"/>
+          <w:szCs w:val="36"/>
+          <w:lang w:val="en-US"/>
+        </w:rPr>
+        <w:t xml:space="preserve"> e 18</w:t>
+      </w:r>
+      <w:r>
+        <w:rPr>
+          <w:color w:val="FF0000"/>
+          <w:sz w:val="36"/>
+          <w:szCs w:val="36"/>
+          <w:lang w:val="en-US"/>
+        </w:rPr>
+        <w:t>.</w:t>
+      </w:r>
+    </w:p>
+    <w:p>
+      <w:pPr>
+        <w:rPr>
+          <w:rFonts w:cstheme="minorHAnsi"/>
+          <w:sz w:val="28"/>
+          <w:szCs w:val="36"/>
+        </w:rPr>
+      </w:pPr>
+      <w:r>
+        <w:rPr>
+          <w:rFonts w:cstheme="minorHAnsi"/>
+          <w:sz w:val="28"/>
+          <w:szCs w:val="36"/>
+        </w:rPr>
+        <w:t xml:space="preserve">O </w:t>
+      </w:r>
+      <w:proofErr w:type="spellStart"/>
+      <w:r>
+        <w:rPr>
+          <w:rFonts w:cstheme="minorHAnsi"/>
+          <w:b/>
+          <w:bCs/>
+          <w:sz w:val="28"/>
+          <w:szCs w:val="36"/>
+        </w:rPr>
+        <w:t>While</w:t>
+      </w:r>
+      <w:proofErr w:type="spellEnd"/>
+      <w:r>
+        <w:rPr>
+          <w:rFonts w:cstheme="minorHAnsi"/>
+          <w:b/>
+          <w:bCs/>
+          <w:sz w:val="28"/>
+          <w:szCs w:val="36"/>
+        </w:rPr>
+        <w:t xml:space="preserve"> </w:t>
+      </w:r>
+      <w:r>
+        <w:rPr>
+          <w:rFonts w:cstheme="minorHAnsi"/>
+          <w:sz w:val="28"/>
+          <w:szCs w:val="36"/>
+        </w:rPr>
+        <w:t xml:space="preserve">testa a expressão lógica no início, antes de executar o bloco, se a expressão for falsa desde o início, ela nunca </w:t>
+      </w:r>
+      <w:proofErr w:type="gramStart"/>
+      <w:r>
+        <w:rPr>
+          <w:rFonts w:cstheme="minorHAnsi"/>
+          <w:sz w:val="28"/>
+          <w:szCs w:val="36"/>
+        </w:rPr>
+        <w:t>ira</w:t>
+      </w:r>
+      <w:proofErr w:type="gramEnd"/>
+      <w:r>
+        <w:rPr>
+          <w:rFonts w:cstheme="minorHAnsi"/>
+          <w:sz w:val="28"/>
+          <w:szCs w:val="36"/>
+        </w:rPr>
+        <w:t xml:space="preserve"> ser executada.</w:t>
+      </w:r>
+      <w:r>
+        <w:rPr>
+          <w:rFonts w:cstheme="minorHAnsi"/>
+          <w:sz w:val="28"/>
+          <w:szCs w:val="36"/>
+        </w:rPr>
+        <w:br/>
+      </w:r>
+      <w:r>
+        <w:rPr>
+          <w:rFonts w:cstheme="minorHAnsi"/>
+          <w:sz w:val="28"/>
+          <w:szCs w:val="36"/>
+        </w:rPr>
+        <w:br/>
+        <w:t xml:space="preserve">O </w:t>
+      </w:r>
+      <w:r>
+        <w:rPr>
+          <w:rFonts w:cstheme="minorHAnsi"/>
+          <w:b/>
+          <w:bCs/>
+          <w:sz w:val="28"/>
+          <w:szCs w:val="36"/>
+        </w:rPr>
+        <w:t xml:space="preserve">Do </w:t>
+      </w:r>
+      <w:proofErr w:type="spellStart"/>
+      <w:r>
+        <w:rPr>
+          <w:rFonts w:cstheme="minorHAnsi"/>
+          <w:b/>
+          <w:bCs/>
+          <w:sz w:val="28"/>
+          <w:szCs w:val="36"/>
+        </w:rPr>
+        <w:t>While</w:t>
+      </w:r>
+      <w:proofErr w:type="spellEnd"/>
+      <w:r>
+        <w:rPr>
+          <w:rFonts w:cstheme="minorHAnsi"/>
+          <w:sz w:val="28"/>
+          <w:szCs w:val="36"/>
+        </w:rPr>
+        <w:t xml:space="preserve"> executa o bloco de comando inteiro e depois faz a verificação.</w:t>
+      </w:r>
+    </w:p>
+    <w:p>
+      <w:pPr>
+        <w:rPr>
+          <w:color w:val="FF0000"/>
+          <w:sz w:val="36"/>
+          <w:szCs w:val="36"/>
+        </w:rPr>
+      </w:pPr>
+      <w:r>
+        <w:rPr>
+          <w:color w:val="FF0000"/>
+          <w:sz w:val="36"/>
+          <w:szCs w:val="36"/>
+        </w:rPr>
+        <w:t>Vídeo 1</w:t>
+      </w:r>
+      <w:r>
+        <w:rPr>
+          <w:color w:val="FF0000"/>
+          <w:sz w:val="36"/>
+          <w:szCs w:val="36"/>
+        </w:rPr>
+        <w:t>9.</w:t>
+      </w:r>
+    </w:p>
+    <w:p>
+      <w:pPr>
+        <w:rPr>
+          <w:sz w:val="28"/>
+          <w:szCs w:val="28"/>
+        </w:rPr>
+      </w:pPr>
+      <w:r>
+        <w:rPr>
+          <w:sz w:val="28"/>
+          <w:szCs w:val="28"/>
+        </w:rPr>
+        <w:t xml:space="preserve">O </w:t>
+      </w:r>
+      <w:r>
+        <w:rPr>
+          <w:b/>
+          <w:bCs/>
+          <w:sz w:val="28"/>
+          <w:szCs w:val="28"/>
+        </w:rPr>
+        <w:t xml:space="preserve">Break </w:t>
+      </w:r>
+      <w:r>
+        <w:rPr>
+          <w:sz w:val="28"/>
+          <w:szCs w:val="28"/>
+        </w:rPr>
+        <w:t xml:space="preserve">quando colocado em </w:t>
+      </w:r>
+      <w:r>
+        <w:rPr>
+          <w:sz w:val="28"/>
+          <w:szCs w:val="28"/>
+        </w:rPr>
+        <w:t>um bloco, ele quebra ela inteiro e sai do mesmo.</w:t>
+      </w:r>
+    </w:p>
+    <w:p>
+      <w:pPr>
+        <w:rPr>
+          <w:sz w:val="28"/>
+          <w:szCs w:val="28"/>
+        </w:rPr>
+      </w:pPr>
+      <w:r>
+        <w:rPr>
+          <w:sz w:val="28"/>
+          <w:szCs w:val="28"/>
+        </w:rPr>
+        <w:t xml:space="preserve">O </w:t>
+      </w:r>
+      <w:r>
+        <w:rPr>
+          <w:b/>
+          <w:bCs/>
+          <w:sz w:val="28"/>
+          <w:szCs w:val="28"/>
+        </w:rPr>
+        <w:t>continue</w:t>
+      </w:r>
+      <w:r>
+        <w:rPr>
+          <w:b/>
+          <w:bCs/>
+          <w:sz w:val="28"/>
+          <w:szCs w:val="28"/>
+        </w:rPr>
+        <w:t xml:space="preserve"> </w:t>
+      </w:r>
+      <w:r>
+        <w:rPr>
+          <w:sz w:val="28"/>
+          <w:szCs w:val="28"/>
+        </w:rPr>
+        <w:t>não quebra o bloco e continua a execução.</w:t>
+      </w:r>
+    </w:p>
+    <w:p>
+      <w:pPr>
+        <w:rPr>
+          <w:color w:val="FF0000"/>
+          <w:sz w:val="36"/>
+          <w:szCs w:val="36"/>
+          <w:lang w:val="en-US"/>
+        </w:rPr>
+      </w:pPr>
+      <w:proofErr w:type="spellStart"/>
+      <w:r>
+        <w:rPr>
+          <w:color w:val="FF0000"/>
+          <w:sz w:val="36"/>
+          <w:szCs w:val="36"/>
+          <w:lang w:val="en-US"/>
+        </w:rPr>
+        <w:t>Vídeo</w:t>
+      </w:r>
+      <w:proofErr w:type="spellEnd"/>
+      <w:r>
+        <w:rPr>
+          <w:color w:val="FF0000"/>
+          <w:sz w:val="36"/>
+          <w:szCs w:val="36"/>
+          <w:lang w:val="en-US"/>
+        </w:rPr>
+        <w:t xml:space="preserve"> </w:t>
+      </w:r>
+      <w:r>
+        <w:rPr>
+          <w:color w:val="FF0000"/>
+          <w:sz w:val="36"/>
+          <w:szCs w:val="36"/>
+          <w:lang w:val="en-US"/>
+        </w:rPr>
+        <w:t>20.</w:t>
+      </w:r>
+    </w:p>
+    <w:p>
+      <w:pPr>
+        <w:rPr>
+          <w:sz w:val="28"/>
+          <w:szCs w:val="28"/>
+        </w:rPr>
+      </w:pPr>
+      <w:r>
+        <w:rPr>
+          <w:sz w:val="28"/>
+          <w:szCs w:val="28"/>
+        </w:rPr>
+        <w:t xml:space="preserve">As </w:t>
+      </w:r>
+      <w:r>
+        <w:rPr>
+          <w:b/>
+          <w:bCs/>
+          <w:sz w:val="28"/>
+          <w:szCs w:val="28"/>
+        </w:rPr>
+        <w:t>Funções</w:t>
+      </w:r>
+      <w:r>
+        <w:rPr>
+          <w:b/>
+          <w:bCs/>
+          <w:sz w:val="28"/>
+          <w:szCs w:val="28"/>
+        </w:rPr>
+        <w:t xml:space="preserve"> </w:t>
+      </w:r>
+      <w:r>
+        <w:rPr>
+          <w:sz w:val="28"/>
+          <w:szCs w:val="28"/>
+        </w:rPr>
+        <w:t xml:space="preserve">são blocos aonde é só chamar que o bloco inteiro vai ser executado. </w:t>
+      </w:r>
+    </w:p>
+    <w:p>
+      <w:pPr>
+        <w:rPr>
+          <w:sz w:val="28"/>
+          <w:szCs w:val="28"/>
+        </w:rPr>
+      </w:pPr>
+      <w:r>
+        <w:rPr>
+          <w:sz w:val="28"/>
+          <w:szCs w:val="28"/>
+        </w:rPr>
+        <w:t xml:space="preserve">Esta função serve para mudar o texto quando apertar o botão </w:t>
+      </w:r>
+    </w:p>
+    <w:p>
+      <w:pPr>
+        <w:shd w:val="clear" w:color="auto" w:fill="282A36"/>
+        <w:spacing w:after="0" w:line="300" w:lineRule="atLeast"/>
+        <w:rPr>
+          <w:rFonts w:ascii="Consolas" w:eastAsia="Times New Roman" w:hAnsi="Consolas" w:cs="Times New Roman"/>
+          <w:color w:val="F8F8F2"/>
+          <w:sz w:val="23"/>
+          <w:szCs w:val="23"/>
+          <w:lang w:eastAsia="pt-BR"/>
+        </w:rPr>
+      </w:pPr>
+      <w:proofErr w:type="spellStart"/>
+      <w:r>
+        <w:rPr>
+          <w:rFonts w:ascii="Consolas" w:eastAsia="Times New Roman" w:hAnsi="Consolas" w:cs="Times New Roman"/>
+          <w:color w:val="FF79C6"/>
+          <w:sz w:val="23"/>
+          <w:szCs w:val="23"/>
+          <w:lang w:eastAsia="pt-BR"/>
+        </w:rPr>
+        <w:t>function</w:t>
+      </w:r>
+      <w:proofErr w:type="spellEnd"/>
+      <w:r>
+        <w:rPr>
+          <w:rFonts w:ascii="Consolas" w:eastAsia="Times New Roman" w:hAnsi="Consolas" w:cs="Times New Roman"/>
+          <w:color w:val="F8F8F2"/>
+          <w:sz w:val="23"/>
+          <w:szCs w:val="23"/>
+          <w:lang w:eastAsia="pt-BR"/>
+        </w:rPr>
+        <w:t xml:space="preserve"> </w:t>
+      </w:r>
+      <w:proofErr w:type="spellStart"/>
+      <w:proofErr w:type="gramStart"/>
+      <w:r>
+        <w:rPr>
+          <w:rFonts w:ascii="Consolas" w:eastAsia="Times New Roman" w:hAnsi="Consolas" w:cs="Times New Roman"/>
+          <w:color w:val="50FA7B"/>
+          <w:sz w:val="23"/>
+          <w:szCs w:val="23"/>
+          <w:lang w:eastAsia="pt-BR"/>
+        </w:rPr>
+        <w:t>mudarTexto</w:t>
+      </w:r>
+      <w:proofErr w:type="spellEnd"/>
+      <w:r>
+        <w:rPr>
+          <w:rFonts w:ascii="Consolas" w:eastAsia="Times New Roman" w:hAnsi="Consolas" w:cs="Times New Roman"/>
+          <w:color w:val="F8F8F2"/>
+          <w:sz w:val="23"/>
+          <w:szCs w:val="23"/>
+          <w:lang w:eastAsia="pt-BR"/>
+        </w:rPr>
+        <w:t>(</w:t>
+      </w:r>
+      <w:proofErr w:type="gramEnd"/>
+      <w:r>
+        <w:rPr>
+          <w:rFonts w:ascii="Consolas" w:eastAsia="Times New Roman" w:hAnsi="Consolas" w:cs="Times New Roman"/>
+          <w:color w:val="F8F8F2"/>
+          <w:sz w:val="23"/>
+          <w:szCs w:val="23"/>
+          <w:lang w:eastAsia="pt-BR"/>
+        </w:rPr>
+        <w:t>) {</w:t>
+      </w:r>
+    </w:p>
+    <w:p>
+      <w:pPr>
+        <w:shd w:val="clear" w:color="auto" w:fill="282A36"/>
+        <w:spacing w:after="0" w:line="300" w:lineRule="atLeast"/>
+        <w:rPr>
+          <w:rFonts w:ascii="Consolas" w:eastAsia="Times New Roman" w:hAnsi="Consolas" w:cs="Times New Roman"/>
+          <w:color w:val="F8F8F2"/>
+          <w:sz w:val="23"/>
+          <w:szCs w:val="23"/>
+          <w:lang w:val="en-US" w:eastAsia="pt-BR"/>
+        </w:rPr>
+      </w:pPr>
+      <w:r>
+        <w:rPr>
+          <w:rFonts w:ascii="Consolas" w:eastAsia="Times New Roman" w:hAnsi="Consolas" w:cs="Times New Roman"/>
+          <w:color w:val="F8F8F2"/>
+          <w:sz w:val="23"/>
+          <w:szCs w:val="23"/>
+          <w:lang w:eastAsia="pt-BR"/>
+        </w:rPr>
+        <w:t xml:space="preserve">    </w:t>
+      </w:r>
+      <w:r>
+        <w:rPr>
+          <w:rFonts w:ascii="Consolas" w:eastAsia="Times New Roman" w:hAnsi="Consolas" w:cs="Times New Roman"/>
+          <w:color w:val="FF79C6"/>
+          <w:sz w:val="23"/>
+          <w:szCs w:val="23"/>
+          <w:lang w:val="en-US" w:eastAsia="pt-BR"/>
+        </w:rPr>
+        <w:t>let</w:t>
+      </w:r>
+      <w:r>
+        <w:rPr>
+          <w:rFonts w:ascii="Consolas" w:eastAsia="Times New Roman" w:hAnsi="Consolas" w:cs="Times New Roman"/>
+          <w:color w:val="F8F8F2"/>
+          <w:sz w:val="23"/>
+          <w:szCs w:val="23"/>
+          <w:lang w:val="en-US" w:eastAsia="pt-BR"/>
+        </w:rPr>
+        <w:t xml:space="preserve"> d1 </w:t>
+      </w:r>
+      <w:r>
+        <w:rPr>
+          <w:rFonts w:ascii="Consolas" w:eastAsia="Times New Roman" w:hAnsi="Consolas" w:cs="Times New Roman"/>
+          <w:color w:val="FF79C6"/>
+          <w:sz w:val="23"/>
+          <w:szCs w:val="23"/>
+          <w:lang w:val="en-US" w:eastAsia="pt-BR"/>
+        </w:rPr>
+        <w:t>=</w:t>
+      </w:r>
+      <w:r>
+        <w:rPr>
+          <w:rFonts w:ascii="Consolas" w:eastAsia="Times New Roman" w:hAnsi="Consolas" w:cs="Times New Roman"/>
+          <w:color w:val="F8F8F2"/>
+          <w:sz w:val="23"/>
+          <w:szCs w:val="23"/>
+          <w:lang w:val="en-US" w:eastAsia="pt-BR"/>
+        </w:rPr>
+        <w:t xml:space="preserve"> </w:t>
+      </w:r>
+      <w:proofErr w:type="spellStart"/>
+      <w:proofErr w:type="gramStart"/>
+      <w:r>
+        <w:rPr>
+          <w:rFonts w:ascii="Consolas" w:eastAsia="Times New Roman" w:hAnsi="Consolas" w:cs="Times New Roman"/>
+          <w:color w:val="BD93F9"/>
+          <w:sz w:val="23"/>
+          <w:szCs w:val="23"/>
+          <w:lang w:val="en-US" w:eastAsia="pt-BR"/>
+        </w:rPr>
+        <w:t>document</w:t>
+      </w:r>
+      <w:r>
+        <w:rPr>
+          <w:rFonts w:ascii="Consolas" w:eastAsia="Times New Roman" w:hAnsi="Consolas" w:cs="Times New Roman"/>
+          <w:color w:val="F8F8F2"/>
+          <w:sz w:val="23"/>
+          <w:szCs w:val="23"/>
+          <w:lang w:val="en-US" w:eastAsia="pt-BR"/>
+        </w:rPr>
+        <w:t>.</w:t>
+      </w:r>
+      <w:r>
+        <w:rPr>
+          <w:rFonts w:ascii="Consolas" w:eastAsia="Times New Roman" w:hAnsi="Consolas" w:cs="Times New Roman"/>
+          <w:color w:val="50FA7B"/>
+          <w:sz w:val="23"/>
+          <w:szCs w:val="23"/>
+          <w:lang w:val="en-US" w:eastAsia="pt-BR"/>
+        </w:rPr>
+        <w:t>getElementById</w:t>
+      </w:r>
+      <w:proofErr w:type="spellEnd"/>
+      <w:proofErr w:type="gramEnd"/>
+      <w:r>
+        <w:rPr>
+          <w:rFonts w:ascii="Consolas" w:eastAsia="Times New Roman" w:hAnsi="Consolas" w:cs="Times New Roman"/>
+          <w:color w:val="F8F8F2"/>
+          <w:sz w:val="23"/>
+          <w:szCs w:val="23"/>
+          <w:lang w:val="en-US" w:eastAsia="pt-BR"/>
+        </w:rPr>
+        <w:t>(</w:t>
+      </w:r>
+      <w:r>
+        <w:rPr>
+          <w:rFonts w:ascii="Consolas" w:eastAsia="Times New Roman" w:hAnsi="Consolas" w:cs="Times New Roman"/>
+          <w:color w:val="E9F284"/>
+          <w:sz w:val="23"/>
+          <w:szCs w:val="23"/>
+          <w:lang w:val="en-US" w:eastAsia="pt-BR"/>
+        </w:rPr>
+        <w:t>"</w:t>
+      </w:r>
+      <w:r>
+        <w:rPr>
+          <w:rFonts w:ascii="Consolas" w:eastAsia="Times New Roman" w:hAnsi="Consolas" w:cs="Times New Roman"/>
+          <w:color w:val="F1FA8C"/>
+          <w:sz w:val="23"/>
+          <w:szCs w:val="23"/>
+          <w:lang w:val="en-US" w:eastAsia="pt-BR"/>
+        </w:rPr>
+        <w:t>d1</w:t>
+      </w:r>
+      <w:r>
+        <w:rPr>
+          <w:rFonts w:ascii="Consolas" w:eastAsia="Times New Roman" w:hAnsi="Consolas" w:cs="Times New Roman"/>
+          <w:color w:val="E9F284"/>
+          <w:sz w:val="23"/>
+          <w:szCs w:val="23"/>
+          <w:lang w:val="en-US" w:eastAsia="pt-BR"/>
+        </w:rPr>
+        <w:t>"</w:t>
+      </w:r>
+      <w:r>
+        <w:rPr>
+          <w:rFonts w:ascii="Consolas" w:eastAsia="Times New Roman" w:hAnsi="Consolas" w:cs="Times New Roman"/>
+          <w:color w:val="F8F8F2"/>
+          <w:sz w:val="23"/>
+          <w:szCs w:val="23"/>
+          <w:lang w:val="en-US" w:eastAsia="pt-BR"/>
+        </w:rPr>
+        <w:t>)</w:t>
+      </w:r>
+    </w:p>
+    <w:p>
+      <w:pPr>
+        <w:shd w:val="clear" w:color="auto" w:fill="282A36"/>
+        <w:spacing w:after="0" w:line="300" w:lineRule="atLeast"/>
+        <w:rPr>
+          <w:rFonts w:ascii="Consolas" w:eastAsia="Times New Roman" w:hAnsi="Consolas" w:cs="Times New Roman"/>
+          <w:color w:val="F8F8F2"/>
+          <w:sz w:val="23"/>
+          <w:szCs w:val="23"/>
+          <w:lang w:val="en-US" w:eastAsia="pt-BR"/>
+        </w:rPr>
+      </w:pPr>
+      <w:r>
+        <w:rPr>
+          <w:rFonts w:ascii="Consolas" w:eastAsia="Times New Roman" w:hAnsi="Consolas" w:cs="Times New Roman"/>
+          <w:color w:val="F8F8F2"/>
+          <w:sz w:val="23"/>
+          <w:szCs w:val="23"/>
+          <w:lang w:val="en-US" w:eastAsia="pt-BR"/>
+        </w:rPr>
+        <w:t xml:space="preserve">    </w:t>
+      </w:r>
+      <w:r>
+        <w:rPr>
+          <w:rFonts w:ascii="Consolas" w:eastAsia="Times New Roman" w:hAnsi="Consolas" w:cs="Times New Roman"/>
+          <w:color w:val="FF79C6"/>
+          <w:sz w:val="23"/>
+          <w:szCs w:val="23"/>
+          <w:lang w:val="en-US" w:eastAsia="pt-BR"/>
+        </w:rPr>
+        <w:t>let</w:t>
+      </w:r>
+      <w:r>
+        <w:rPr>
+          <w:rFonts w:ascii="Consolas" w:eastAsia="Times New Roman" w:hAnsi="Consolas" w:cs="Times New Roman"/>
+          <w:color w:val="F8F8F2"/>
+          <w:sz w:val="23"/>
+          <w:szCs w:val="23"/>
+          <w:lang w:val="en-US" w:eastAsia="pt-BR"/>
+        </w:rPr>
+        <w:t xml:space="preserve"> d2 </w:t>
+      </w:r>
+      <w:r>
+        <w:rPr>
+          <w:rFonts w:ascii="Consolas" w:eastAsia="Times New Roman" w:hAnsi="Consolas" w:cs="Times New Roman"/>
+          <w:color w:val="FF79C6"/>
+          <w:sz w:val="23"/>
+          <w:szCs w:val="23"/>
+          <w:lang w:val="en-US" w:eastAsia="pt-BR"/>
+        </w:rPr>
+        <w:t>=</w:t>
+      </w:r>
+      <w:r>
+        <w:rPr>
+          <w:rFonts w:ascii="Consolas" w:eastAsia="Times New Roman" w:hAnsi="Consolas" w:cs="Times New Roman"/>
+          <w:color w:val="F8F8F2"/>
+          <w:sz w:val="23"/>
+          <w:szCs w:val="23"/>
+          <w:lang w:val="en-US" w:eastAsia="pt-BR"/>
+        </w:rPr>
+        <w:t xml:space="preserve"> </w:t>
+      </w:r>
+      <w:proofErr w:type="spellStart"/>
+      <w:proofErr w:type="gramStart"/>
+      <w:r>
+        <w:rPr>
+          <w:rFonts w:ascii="Consolas" w:eastAsia="Times New Roman" w:hAnsi="Consolas" w:cs="Times New Roman"/>
+          <w:color w:val="BD93F9"/>
+          <w:sz w:val="23"/>
+          <w:szCs w:val="23"/>
+          <w:lang w:val="en-US" w:eastAsia="pt-BR"/>
+        </w:rPr>
+        <w:t>document</w:t>
+      </w:r>
+      <w:r>
+        <w:rPr>
+          <w:rFonts w:ascii="Consolas" w:eastAsia="Times New Roman" w:hAnsi="Consolas" w:cs="Times New Roman"/>
+          <w:color w:val="F8F8F2"/>
+          <w:sz w:val="23"/>
+          <w:szCs w:val="23"/>
+          <w:lang w:val="en-US" w:eastAsia="pt-BR"/>
+        </w:rPr>
+        <w:t>.</w:t>
+      </w:r>
+      <w:r>
+        <w:rPr>
+          <w:rFonts w:ascii="Consolas" w:eastAsia="Times New Roman" w:hAnsi="Consolas" w:cs="Times New Roman"/>
+          <w:color w:val="50FA7B"/>
+          <w:sz w:val="23"/>
+          <w:szCs w:val="23"/>
+          <w:lang w:val="en-US" w:eastAsia="pt-BR"/>
+        </w:rPr>
+        <w:t>getElementById</w:t>
+      </w:r>
+      <w:proofErr w:type="spellEnd"/>
+      <w:proofErr w:type="gramEnd"/>
+      <w:r>
+        <w:rPr>
+          <w:rFonts w:ascii="Consolas" w:eastAsia="Times New Roman" w:hAnsi="Consolas" w:cs="Times New Roman"/>
+          <w:color w:val="F8F8F2"/>
+          <w:sz w:val="23"/>
+          <w:szCs w:val="23"/>
+          <w:lang w:val="en-US" w:eastAsia="pt-BR"/>
+        </w:rPr>
+        <w:t>(</w:t>
+      </w:r>
+      <w:r>
+        <w:rPr>
+          <w:rFonts w:ascii="Consolas" w:eastAsia="Times New Roman" w:hAnsi="Consolas" w:cs="Times New Roman"/>
+          <w:color w:val="E9F284"/>
+          <w:sz w:val="23"/>
+          <w:szCs w:val="23"/>
+          <w:lang w:val="en-US" w:eastAsia="pt-BR"/>
+        </w:rPr>
+        <w:t>"</w:t>
+      </w:r>
+      <w:r>
+        <w:rPr>
+          <w:rFonts w:ascii="Consolas" w:eastAsia="Times New Roman" w:hAnsi="Consolas" w:cs="Times New Roman"/>
+          <w:color w:val="F1FA8C"/>
+          <w:sz w:val="23"/>
+          <w:szCs w:val="23"/>
+          <w:lang w:val="en-US" w:eastAsia="pt-BR"/>
+        </w:rPr>
+        <w:t>d2</w:t>
+      </w:r>
+      <w:r>
+        <w:rPr>
+          <w:rFonts w:ascii="Consolas" w:eastAsia="Times New Roman" w:hAnsi="Consolas" w:cs="Times New Roman"/>
+          <w:color w:val="E9F284"/>
+          <w:sz w:val="23"/>
+          <w:szCs w:val="23"/>
+          <w:lang w:val="en-US" w:eastAsia="pt-BR"/>
+        </w:rPr>
+        <w:t>"</w:t>
+      </w:r>
+      <w:r>
+        <w:rPr>
+          <w:rFonts w:ascii="Consolas" w:eastAsia="Times New Roman" w:hAnsi="Consolas" w:cs="Times New Roman"/>
+          <w:color w:val="F8F8F2"/>
+          <w:sz w:val="23"/>
+          <w:szCs w:val="23"/>
+          <w:lang w:val="en-US" w:eastAsia="pt-BR"/>
+        </w:rPr>
+        <w:t>)</w:t>
+      </w:r>
+    </w:p>
+    <w:p>
+      <w:pPr>
+        <w:shd w:val="clear" w:color="auto" w:fill="282A36"/>
+        <w:spacing w:after="0" w:line="300" w:lineRule="atLeast"/>
+        <w:rPr>
+          <w:rFonts w:ascii="Consolas" w:eastAsia="Times New Roman" w:hAnsi="Consolas" w:cs="Times New Roman"/>
+          <w:color w:val="F8F8F2"/>
+          <w:sz w:val="23"/>
+          <w:szCs w:val="23"/>
+          <w:lang w:val="en-US" w:eastAsia="pt-BR"/>
+        </w:rPr>
+      </w:pPr>
+      <w:r>
+        <w:rPr>
+          <w:rFonts w:ascii="Consolas" w:eastAsia="Times New Roman" w:hAnsi="Consolas" w:cs="Times New Roman"/>
+          <w:color w:val="F8F8F2"/>
+          <w:sz w:val="23"/>
+          <w:szCs w:val="23"/>
+          <w:lang w:val="en-US" w:eastAsia="pt-BR"/>
+        </w:rPr>
+        <w:t xml:space="preserve">    </w:t>
+      </w:r>
+      <w:r>
+        <w:rPr>
+          <w:rFonts w:ascii="Consolas" w:eastAsia="Times New Roman" w:hAnsi="Consolas" w:cs="Times New Roman"/>
+          <w:color w:val="FF79C6"/>
+          <w:sz w:val="23"/>
+          <w:szCs w:val="23"/>
+          <w:lang w:val="en-US" w:eastAsia="pt-BR"/>
+        </w:rPr>
+        <w:t>let</w:t>
+      </w:r>
+      <w:r>
+        <w:rPr>
+          <w:rFonts w:ascii="Consolas" w:eastAsia="Times New Roman" w:hAnsi="Consolas" w:cs="Times New Roman"/>
+          <w:color w:val="F8F8F2"/>
+          <w:sz w:val="23"/>
+          <w:szCs w:val="23"/>
+          <w:lang w:val="en-US" w:eastAsia="pt-BR"/>
+        </w:rPr>
+        <w:t xml:space="preserve"> d3 </w:t>
+      </w:r>
+      <w:r>
+        <w:rPr>
+          <w:rFonts w:ascii="Consolas" w:eastAsia="Times New Roman" w:hAnsi="Consolas" w:cs="Times New Roman"/>
+          <w:color w:val="FF79C6"/>
+          <w:sz w:val="23"/>
+          <w:szCs w:val="23"/>
+          <w:lang w:val="en-US" w:eastAsia="pt-BR"/>
+        </w:rPr>
+        <w:t>=</w:t>
+      </w:r>
+      <w:r>
+        <w:rPr>
+          <w:rFonts w:ascii="Consolas" w:eastAsia="Times New Roman" w:hAnsi="Consolas" w:cs="Times New Roman"/>
+          <w:color w:val="F8F8F2"/>
+          <w:sz w:val="23"/>
+          <w:szCs w:val="23"/>
+          <w:lang w:val="en-US" w:eastAsia="pt-BR"/>
+        </w:rPr>
+        <w:t xml:space="preserve"> </w:t>
+      </w:r>
+      <w:proofErr w:type="spellStart"/>
+      <w:proofErr w:type="gramStart"/>
+      <w:r>
+        <w:rPr>
+          <w:rFonts w:ascii="Consolas" w:eastAsia="Times New Roman" w:hAnsi="Consolas" w:cs="Times New Roman"/>
+          <w:color w:val="BD93F9"/>
+          <w:sz w:val="23"/>
+          <w:szCs w:val="23"/>
+          <w:lang w:val="en-US" w:eastAsia="pt-BR"/>
+        </w:rPr>
+        <w:t>document</w:t>
+      </w:r>
+      <w:r>
+        <w:rPr>
+          <w:rFonts w:ascii="Consolas" w:eastAsia="Times New Roman" w:hAnsi="Consolas" w:cs="Times New Roman"/>
+          <w:color w:val="F8F8F2"/>
+          <w:sz w:val="23"/>
+          <w:szCs w:val="23"/>
+          <w:lang w:val="en-US" w:eastAsia="pt-BR"/>
+        </w:rPr>
+        <w:t>.</w:t>
+      </w:r>
+      <w:r>
+        <w:rPr>
+          <w:rFonts w:ascii="Consolas" w:eastAsia="Times New Roman" w:hAnsi="Consolas" w:cs="Times New Roman"/>
+          <w:color w:val="50FA7B"/>
+          <w:sz w:val="23"/>
+          <w:szCs w:val="23"/>
+          <w:lang w:val="en-US" w:eastAsia="pt-BR"/>
+        </w:rPr>
+        <w:t>getElementById</w:t>
+      </w:r>
+      <w:proofErr w:type="spellEnd"/>
+      <w:proofErr w:type="gramEnd"/>
+      <w:r>
+        <w:rPr>
+          <w:rFonts w:ascii="Consolas" w:eastAsia="Times New Roman" w:hAnsi="Consolas" w:cs="Times New Roman"/>
+          <w:color w:val="F8F8F2"/>
+          <w:sz w:val="23"/>
+          <w:szCs w:val="23"/>
+          <w:lang w:val="en-US" w:eastAsia="pt-BR"/>
+        </w:rPr>
+        <w:t>(</w:t>
+      </w:r>
+      <w:r>
+        <w:rPr>
+          <w:rFonts w:ascii="Consolas" w:eastAsia="Times New Roman" w:hAnsi="Consolas" w:cs="Times New Roman"/>
+          <w:color w:val="E9F284"/>
+          <w:sz w:val="23"/>
+          <w:szCs w:val="23"/>
+          <w:lang w:val="en-US" w:eastAsia="pt-BR"/>
+        </w:rPr>
+        <w:t>"</w:t>
+      </w:r>
+      <w:r>
+        <w:rPr>
+          <w:rFonts w:ascii="Consolas" w:eastAsia="Times New Roman" w:hAnsi="Consolas" w:cs="Times New Roman"/>
+          <w:color w:val="F1FA8C"/>
+          <w:sz w:val="23"/>
+          <w:szCs w:val="23"/>
+          <w:lang w:val="en-US" w:eastAsia="pt-BR"/>
+        </w:rPr>
+        <w:t>d3</w:t>
+      </w:r>
+      <w:r>
+        <w:rPr>
+          <w:rFonts w:ascii="Consolas" w:eastAsia="Times New Roman" w:hAnsi="Consolas" w:cs="Times New Roman"/>
+          <w:color w:val="E9F284"/>
+          <w:sz w:val="23"/>
+          <w:szCs w:val="23"/>
+          <w:lang w:val="en-US" w:eastAsia="pt-BR"/>
+        </w:rPr>
+        <w:t>"</w:t>
+      </w:r>
+      <w:r>
+        <w:rPr>
+          <w:rFonts w:ascii="Consolas" w:eastAsia="Times New Roman" w:hAnsi="Consolas" w:cs="Times New Roman"/>
+          <w:color w:val="F8F8F2"/>
+          <w:sz w:val="23"/>
+          <w:szCs w:val="23"/>
+          <w:lang w:val="en-US" w:eastAsia="pt-BR"/>
+        </w:rPr>
+        <w:t>)</w:t>
+      </w:r>
+    </w:p>
+    <w:p>
+      <w:pPr>
+        <w:shd w:val="clear" w:color="auto" w:fill="282A36"/>
+        <w:spacing w:after="0" w:line="300" w:lineRule="atLeast"/>
+        <w:rPr>
+          <w:rFonts w:ascii="Consolas" w:eastAsia="Times New Roman" w:hAnsi="Consolas" w:cs="Times New Roman"/>
+          <w:color w:val="F8F8F2"/>
+          <w:sz w:val="23"/>
+          <w:szCs w:val="23"/>
+          <w:lang w:val="en-US" w:eastAsia="pt-BR"/>
+        </w:rPr>
+      </w:pPr>
+      <w:r>
+        <w:rPr>
+          <w:rFonts w:ascii="Consolas" w:eastAsia="Times New Roman" w:hAnsi="Consolas" w:cs="Times New Roman"/>
+          <w:color w:val="F8F8F2"/>
+          <w:sz w:val="23"/>
+          <w:szCs w:val="23"/>
+          <w:lang w:val="en-US" w:eastAsia="pt-BR"/>
+        </w:rPr>
+        <w:t>    d</w:t>
+      </w:r>
+      <w:proofErr w:type="gramStart"/>
+      <w:r>
+        <w:rPr>
+          <w:rFonts w:ascii="Consolas" w:eastAsia="Times New Roman" w:hAnsi="Consolas" w:cs="Times New Roman"/>
+          <w:color w:val="F8F8F2"/>
+          <w:sz w:val="23"/>
+          <w:szCs w:val="23"/>
+          <w:lang w:val="en-US" w:eastAsia="pt-BR"/>
+        </w:rPr>
+        <w:t>1.innerHTML</w:t>
+      </w:r>
+      <w:proofErr w:type="gramEnd"/>
+      <w:r>
+        <w:rPr>
+          <w:rFonts w:ascii="Consolas" w:eastAsia="Times New Roman" w:hAnsi="Consolas" w:cs="Times New Roman"/>
+          <w:color w:val="F8F8F2"/>
+          <w:sz w:val="23"/>
+          <w:szCs w:val="23"/>
+          <w:lang w:val="en-US" w:eastAsia="pt-BR"/>
+        </w:rPr>
+        <w:t xml:space="preserve"> </w:t>
+      </w:r>
+      <w:r>
+        <w:rPr>
+          <w:rFonts w:ascii="Consolas" w:eastAsia="Times New Roman" w:hAnsi="Consolas" w:cs="Times New Roman"/>
+          <w:color w:val="FF79C6"/>
+          <w:sz w:val="23"/>
+          <w:szCs w:val="23"/>
+          <w:lang w:val="en-US" w:eastAsia="pt-BR"/>
+        </w:rPr>
+        <w:t>=</w:t>
+      </w:r>
+      <w:r>
+        <w:rPr>
+          <w:rFonts w:ascii="Consolas" w:eastAsia="Times New Roman" w:hAnsi="Consolas" w:cs="Times New Roman"/>
+          <w:color w:val="F8F8F2"/>
+          <w:sz w:val="23"/>
+          <w:szCs w:val="23"/>
+          <w:lang w:val="en-US" w:eastAsia="pt-BR"/>
+        </w:rPr>
+        <w:t xml:space="preserve"> (</w:t>
+      </w:r>
+      <w:r>
+        <w:rPr>
+          <w:rFonts w:ascii="Consolas" w:eastAsia="Times New Roman" w:hAnsi="Consolas" w:cs="Times New Roman"/>
+          <w:color w:val="E9F284"/>
+          <w:sz w:val="23"/>
+          <w:szCs w:val="23"/>
+          <w:lang w:val="en-US" w:eastAsia="pt-BR"/>
+        </w:rPr>
+        <w:t>"</w:t>
+      </w:r>
+      <w:r>
+        <w:rPr>
+          <w:rFonts w:ascii="Consolas" w:eastAsia="Times New Roman" w:hAnsi="Consolas" w:cs="Times New Roman"/>
+          <w:color w:val="F1FA8C"/>
+          <w:sz w:val="23"/>
+          <w:szCs w:val="23"/>
+          <w:lang w:val="en-US" w:eastAsia="pt-BR"/>
+        </w:rPr>
+        <w:t xml:space="preserve">Henrique </w:t>
+      </w:r>
+      <w:proofErr w:type="spellStart"/>
+      <w:r>
+        <w:rPr>
+          <w:rFonts w:ascii="Consolas" w:eastAsia="Times New Roman" w:hAnsi="Consolas" w:cs="Times New Roman"/>
+          <w:color w:val="F1FA8C"/>
+          <w:sz w:val="23"/>
+          <w:szCs w:val="23"/>
+          <w:lang w:val="en-US" w:eastAsia="pt-BR"/>
+        </w:rPr>
+        <w:t>Pedrozo</w:t>
+      </w:r>
+      <w:proofErr w:type="spellEnd"/>
+      <w:r>
+        <w:rPr>
+          <w:rFonts w:ascii="Consolas" w:eastAsia="Times New Roman" w:hAnsi="Consolas" w:cs="Times New Roman"/>
+          <w:color w:val="E9F284"/>
+          <w:sz w:val="23"/>
+          <w:szCs w:val="23"/>
+          <w:lang w:val="en-US" w:eastAsia="pt-BR"/>
+        </w:rPr>
+        <w:t>"</w:t>
+      </w:r>
+      <w:r>
+        <w:rPr>
+          <w:rFonts w:ascii="Consolas" w:eastAsia="Times New Roman" w:hAnsi="Consolas" w:cs="Times New Roman"/>
+          <w:color w:val="F8F8F2"/>
+          <w:sz w:val="23"/>
+          <w:szCs w:val="23"/>
+          <w:lang w:val="en-US" w:eastAsia="pt-BR"/>
+        </w:rPr>
+        <w:t>)</w:t>
+      </w:r>
+    </w:p>
+    <w:p>
+      <w:pPr>
+        <w:shd w:val="clear" w:color="auto" w:fill="282A36"/>
+        <w:spacing w:after="0" w:line="300" w:lineRule="atLeast"/>
+        <w:rPr>
+          <w:rFonts w:ascii="Consolas" w:eastAsia="Times New Roman" w:hAnsi="Consolas" w:cs="Times New Roman"/>
+          <w:color w:val="F8F8F2"/>
+          <w:sz w:val="23"/>
+          <w:szCs w:val="23"/>
+          <w:lang w:val="en-US" w:eastAsia="pt-BR"/>
+        </w:rPr>
+      </w:pPr>
+      <w:r>
+        <w:rPr>
+          <w:rFonts w:ascii="Consolas" w:eastAsia="Times New Roman" w:hAnsi="Consolas" w:cs="Times New Roman"/>
+          <w:color w:val="F8F8F2"/>
+          <w:sz w:val="23"/>
+          <w:szCs w:val="23"/>
+          <w:lang w:val="en-US" w:eastAsia="pt-BR"/>
+        </w:rPr>
+        <w:t>    d</w:t>
+      </w:r>
+      <w:proofErr w:type="gramStart"/>
+      <w:r>
+        <w:rPr>
+          <w:rFonts w:ascii="Consolas" w:eastAsia="Times New Roman" w:hAnsi="Consolas" w:cs="Times New Roman"/>
+          <w:color w:val="F8F8F2"/>
+          <w:sz w:val="23"/>
+          <w:szCs w:val="23"/>
+          <w:lang w:val="en-US" w:eastAsia="pt-BR"/>
+        </w:rPr>
+        <w:t>2.innerHTML</w:t>
+      </w:r>
+      <w:proofErr w:type="gramEnd"/>
+      <w:r>
+        <w:rPr>
+          <w:rFonts w:ascii="Consolas" w:eastAsia="Times New Roman" w:hAnsi="Consolas" w:cs="Times New Roman"/>
+          <w:color w:val="F8F8F2"/>
+          <w:sz w:val="23"/>
+          <w:szCs w:val="23"/>
+          <w:lang w:val="en-US" w:eastAsia="pt-BR"/>
+        </w:rPr>
+        <w:t xml:space="preserve"> </w:t>
+      </w:r>
+      <w:r>
+        <w:rPr>
+          <w:rFonts w:ascii="Consolas" w:eastAsia="Times New Roman" w:hAnsi="Consolas" w:cs="Times New Roman"/>
+          <w:color w:val="FF79C6"/>
+          <w:sz w:val="23"/>
+          <w:szCs w:val="23"/>
+          <w:lang w:val="en-US" w:eastAsia="pt-BR"/>
+        </w:rPr>
+        <w:t>=</w:t>
+      </w:r>
+      <w:r>
+        <w:rPr>
+          <w:rFonts w:ascii="Consolas" w:eastAsia="Times New Roman" w:hAnsi="Consolas" w:cs="Times New Roman"/>
+          <w:color w:val="F8F8F2"/>
+          <w:sz w:val="23"/>
+          <w:szCs w:val="23"/>
+          <w:lang w:val="en-US" w:eastAsia="pt-BR"/>
+        </w:rPr>
+        <w:t xml:space="preserve"> (</w:t>
+      </w:r>
+      <w:r>
+        <w:rPr>
+          <w:rFonts w:ascii="Consolas" w:eastAsia="Times New Roman" w:hAnsi="Consolas" w:cs="Times New Roman"/>
+          <w:color w:val="E9F284"/>
+          <w:sz w:val="23"/>
+          <w:szCs w:val="23"/>
+          <w:lang w:val="en-US" w:eastAsia="pt-BR"/>
+        </w:rPr>
+        <w:t>"</w:t>
+      </w:r>
+      <w:proofErr w:type="spellStart"/>
+      <w:r>
+        <w:rPr>
+          <w:rFonts w:ascii="Consolas" w:eastAsia="Times New Roman" w:hAnsi="Consolas" w:cs="Times New Roman"/>
+          <w:color w:val="F1FA8C"/>
+          <w:sz w:val="23"/>
+          <w:szCs w:val="23"/>
+          <w:lang w:val="en-US" w:eastAsia="pt-BR"/>
+        </w:rPr>
+        <w:t>Giugiu</w:t>
+      </w:r>
+      <w:proofErr w:type="spellEnd"/>
+      <w:r>
+        <w:rPr>
+          <w:rFonts w:ascii="Consolas" w:eastAsia="Times New Roman" w:hAnsi="Consolas" w:cs="Times New Roman"/>
+          <w:color w:val="F1FA8C"/>
+          <w:sz w:val="23"/>
+          <w:szCs w:val="23"/>
+          <w:lang w:val="en-US" w:eastAsia="pt-BR"/>
+        </w:rPr>
+        <w:t xml:space="preserve"> </w:t>
+      </w:r>
+      <w:proofErr w:type="spellStart"/>
+      <w:r>
+        <w:rPr>
+          <w:rFonts w:ascii="Consolas" w:eastAsia="Times New Roman" w:hAnsi="Consolas" w:cs="Times New Roman"/>
+          <w:color w:val="F1FA8C"/>
+          <w:sz w:val="23"/>
+          <w:szCs w:val="23"/>
+          <w:lang w:val="en-US" w:eastAsia="pt-BR"/>
+        </w:rPr>
+        <w:t>Gomide</w:t>
+      </w:r>
+      <w:proofErr w:type="spellEnd"/>
+      <w:r>
+        <w:rPr>
+          <w:rFonts w:ascii="Consolas" w:eastAsia="Times New Roman" w:hAnsi="Consolas" w:cs="Times New Roman"/>
+          <w:color w:val="E9F284"/>
+          <w:sz w:val="23"/>
+          <w:szCs w:val="23"/>
+          <w:lang w:val="en-US" w:eastAsia="pt-BR"/>
+        </w:rPr>
+        <w:t>"</w:t>
+      </w:r>
+      <w:r>
+        <w:rPr>
+          <w:rFonts w:ascii="Consolas" w:eastAsia="Times New Roman" w:hAnsi="Consolas" w:cs="Times New Roman"/>
+          <w:color w:val="F8F8F2"/>
+          <w:sz w:val="23"/>
+          <w:szCs w:val="23"/>
+          <w:lang w:val="en-US" w:eastAsia="pt-BR"/>
+        </w:rPr>
+        <w:t>)</w:t>
+      </w:r>
+    </w:p>
+    <w:p>
+      <w:pPr>
+        <w:shd w:val="clear" w:color="auto" w:fill="282A36"/>
+        <w:spacing w:after="0" w:line="300" w:lineRule="atLeast"/>
+        <w:rPr>
+          <w:rFonts w:ascii="Consolas" w:eastAsia="Times New Roman" w:hAnsi="Consolas" w:cs="Times New Roman"/>
+          <w:color w:val="F8F8F2"/>
+          <w:sz w:val="23"/>
+          <w:szCs w:val="23"/>
+          <w:lang w:val="en-US" w:eastAsia="pt-BR"/>
+        </w:rPr>
+      </w:pPr>
+      <w:r>
+        <w:rPr>
+          <w:rFonts w:ascii="Consolas" w:eastAsia="Times New Roman" w:hAnsi="Consolas" w:cs="Times New Roman"/>
+          <w:color w:val="F8F8F2"/>
+          <w:sz w:val="23"/>
+          <w:szCs w:val="23"/>
+          <w:lang w:val="en-US" w:eastAsia="pt-BR"/>
+        </w:rPr>
+        <w:t>    d</w:t>
+      </w:r>
+      <w:proofErr w:type="gramStart"/>
+      <w:r>
+        <w:rPr>
+          <w:rFonts w:ascii="Consolas" w:eastAsia="Times New Roman" w:hAnsi="Consolas" w:cs="Times New Roman"/>
+          <w:color w:val="F8F8F2"/>
+          <w:sz w:val="23"/>
+          <w:szCs w:val="23"/>
+          <w:lang w:val="en-US" w:eastAsia="pt-BR"/>
+        </w:rPr>
+        <w:t>3.innerHTML</w:t>
+      </w:r>
+      <w:proofErr w:type="gramEnd"/>
+      <w:r>
+        <w:rPr>
+          <w:rFonts w:ascii="Consolas" w:eastAsia="Times New Roman" w:hAnsi="Consolas" w:cs="Times New Roman"/>
+          <w:color w:val="F8F8F2"/>
+          <w:sz w:val="23"/>
+          <w:szCs w:val="23"/>
+          <w:lang w:val="en-US" w:eastAsia="pt-BR"/>
+        </w:rPr>
+        <w:t xml:space="preserve"> </w:t>
+      </w:r>
+      <w:r>
+        <w:rPr>
+          <w:rFonts w:ascii="Consolas" w:eastAsia="Times New Roman" w:hAnsi="Consolas" w:cs="Times New Roman"/>
+          <w:color w:val="FF79C6"/>
+          <w:sz w:val="23"/>
+          <w:szCs w:val="23"/>
+          <w:lang w:val="en-US" w:eastAsia="pt-BR"/>
+        </w:rPr>
+        <w:t>=</w:t>
+      </w:r>
+      <w:r>
+        <w:rPr>
+          <w:rFonts w:ascii="Consolas" w:eastAsia="Times New Roman" w:hAnsi="Consolas" w:cs="Times New Roman"/>
+          <w:color w:val="F8F8F2"/>
+          <w:sz w:val="23"/>
+          <w:szCs w:val="23"/>
+          <w:lang w:val="en-US" w:eastAsia="pt-BR"/>
+        </w:rPr>
+        <w:t xml:space="preserve"> (</w:t>
+      </w:r>
+      <w:r>
+        <w:rPr>
+          <w:rFonts w:ascii="Consolas" w:eastAsia="Times New Roman" w:hAnsi="Consolas" w:cs="Times New Roman"/>
+          <w:color w:val="E9F284"/>
+          <w:sz w:val="23"/>
+          <w:szCs w:val="23"/>
+          <w:lang w:val="en-US" w:eastAsia="pt-BR"/>
+        </w:rPr>
+        <w:t>"</w:t>
+      </w:r>
+      <w:proofErr w:type="spellStart"/>
+      <w:r>
+        <w:rPr>
+          <w:rFonts w:ascii="Consolas" w:eastAsia="Times New Roman" w:hAnsi="Consolas" w:cs="Times New Roman"/>
+          <w:color w:val="F1FA8C"/>
+          <w:sz w:val="23"/>
+          <w:szCs w:val="23"/>
+          <w:lang w:val="en-US" w:eastAsia="pt-BR"/>
+        </w:rPr>
+        <w:t>Rafina</w:t>
+      </w:r>
+      <w:proofErr w:type="spellEnd"/>
+      <w:r>
+        <w:rPr>
+          <w:rFonts w:ascii="Consolas" w:eastAsia="Times New Roman" w:hAnsi="Consolas" w:cs="Times New Roman"/>
+          <w:color w:val="F1FA8C"/>
+          <w:sz w:val="23"/>
+          <w:szCs w:val="23"/>
+          <w:lang w:val="en-US" w:eastAsia="pt-BR"/>
+        </w:rPr>
+        <w:t xml:space="preserve"> </w:t>
+      </w:r>
+      <w:proofErr w:type="spellStart"/>
+      <w:r>
+        <w:rPr>
+          <w:rFonts w:ascii="Consolas" w:eastAsia="Times New Roman" w:hAnsi="Consolas" w:cs="Times New Roman"/>
+          <w:color w:val="F1FA8C"/>
+          <w:sz w:val="23"/>
+          <w:szCs w:val="23"/>
+          <w:lang w:val="en-US" w:eastAsia="pt-BR"/>
+        </w:rPr>
+        <w:t>Pierangele</w:t>
+      </w:r>
+      <w:proofErr w:type="spellEnd"/>
+      <w:r>
+        <w:rPr>
+          <w:rFonts w:ascii="Consolas" w:eastAsia="Times New Roman" w:hAnsi="Consolas" w:cs="Times New Roman"/>
+          <w:color w:val="E9F284"/>
+          <w:sz w:val="23"/>
+          <w:szCs w:val="23"/>
+          <w:lang w:val="en-US" w:eastAsia="pt-BR"/>
+        </w:rPr>
+        <w:t>"</w:t>
+      </w:r>
+      <w:r>
+        <w:rPr>
+          <w:rFonts w:ascii="Consolas" w:eastAsia="Times New Roman" w:hAnsi="Consolas" w:cs="Times New Roman"/>
+          <w:color w:val="F8F8F2"/>
+          <w:sz w:val="23"/>
+          <w:szCs w:val="23"/>
+          <w:lang w:val="en-US" w:eastAsia="pt-BR"/>
+        </w:rPr>
+        <w:t>)</w:t>
+      </w:r>
+    </w:p>
+    <w:p>
+      <w:pPr>
+        <w:shd w:val="clear" w:color="auto" w:fill="282A36"/>
+        <w:spacing w:after="0" w:line="300" w:lineRule="atLeast"/>
+        <w:rPr>
+          <w:rFonts w:ascii="Consolas" w:eastAsia="Times New Roman" w:hAnsi="Consolas" w:cs="Times New Roman"/>
+          <w:color w:val="F8F8F2"/>
+          <w:sz w:val="23"/>
+          <w:szCs w:val="23"/>
+          <w:lang w:eastAsia="pt-BR"/>
+        </w:rPr>
+      </w:pPr>
+      <w:r>
+        <w:rPr>
+          <w:rFonts w:ascii="Consolas" w:eastAsia="Times New Roman" w:hAnsi="Consolas" w:cs="Times New Roman"/>
+          <w:color w:val="F8F8F2"/>
+          <w:sz w:val="23"/>
+          <w:szCs w:val="23"/>
+          <w:lang w:eastAsia="pt-BR"/>
+        </w:rPr>
+        <w:t>}</w:t>
+      </w:r>
+    </w:p>
+    <w:p>
+      <w:pPr>
+        <w:rPr>
+          <w:sz w:val="28"/>
+          <w:szCs w:val="28"/>
+        </w:rPr>
+      </w:pPr>
+      <w:r>
+        <w:rPr>
+          <w:sz w:val="28"/>
+          <w:szCs w:val="28"/>
+        </w:rPr>
+        <w:t xml:space="preserve"> </w:t>
+      </w:r>
+      <w:r>
+        <w:rPr>
+          <w:sz w:val="28"/>
+          <w:szCs w:val="28"/>
+        </w:rPr>
+        <w:t xml:space="preserve">O que colocar no </w:t>
+      </w:r>
+      <w:proofErr w:type="spellStart"/>
+      <w:r>
+        <w:rPr>
+          <w:sz w:val="28"/>
+          <w:szCs w:val="28"/>
+        </w:rPr>
+        <w:t>html</w:t>
+      </w:r>
+      <w:proofErr w:type="spellEnd"/>
+      <w:r>
+        <w:rPr>
+          <w:sz w:val="28"/>
+          <w:szCs w:val="28"/>
+        </w:rPr>
+        <w:t xml:space="preserve">: </w:t>
+      </w:r>
+    </w:p>
+    <w:p>
+      <w:pPr>
+        <w:shd w:val="clear" w:color="auto" w:fill="282A36"/>
+        <w:spacing w:after="0" w:line="300" w:lineRule="atLeast"/>
+        <w:rPr>
+          <w:rFonts w:ascii="Consolas" w:eastAsia="Times New Roman" w:hAnsi="Consolas" w:cs="Times New Roman"/>
+          <w:color w:val="F8F8F2"/>
+          <w:sz w:val="23"/>
+          <w:szCs w:val="23"/>
+          <w:lang w:eastAsia="pt-BR"/>
+        </w:rPr>
+      </w:pPr>
+      <w:r>
+        <w:rPr>
+          <w:rFonts w:ascii="Consolas" w:eastAsia="Times New Roman" w:hAnsi="Consolas" w:cs="Times New Roman"/>
+          <w:color w:val="F8F8F2"/>
+          <w:sz w:val="23"/>
+          <w:szCs w:val="23"/>
+          <w:lang w:eastAsia="pt-BR"/>
+        </w:rPr>
+        <w:t>&lt;</w:t>
+      </w:r>
+      <w:proofErr w:type="spellStart"/>
+      <w:r>
+        <w:rPr>
+          <w:rFonts w:ascii="Consolas" w:eastAsia="Times New Roman" w:hAnsi="Consolas" w:cs="Times New Roman"/>
+          <w:color w:val="FF79C6"/>
+          <w:sz w:val="23"/>
+          <w:szCs w:val="23"/>
+          <w:lang w:eastAsia="pt-BR"/>
+        </w:rPr>
+        <w:t>button</w:t>
+      </w:r>
+      <w:proofErr w:type="spellEnd"/>
+      <w:r>
+        <w:rPr>
+          <w:rFonts w:ascii="Consolas" w:eastAsia="Times New Roman" w:hAnsi="Consolas" w:cs="Times New Roman"/>
+          <w:color w:val="F8F8F2"/>
+          <w:sz w:val="23"/>
+          <w:szCs w:val="23"/>
+          <w:lang w:eastAsia="pt-BR"/>
+        </w:rPr>
+        <w:t xml:space="preserve"> </w:t>
+      </w:r>
+      <w:r>
+        <w:rPr>
+          <w:rFonts w:ascii="Consolas" w:eastAsia="Times New Roman" w:hAnsi="Consolas" w:cs="Times New Roman"/>
+          <w:i/>
+          <w:iCs/>
+          <w:color w:val="50FA7B"/>
+          <w:sz w:val="23"/>
+          <w:szCs w:val="23"/>
+          <w:lang w:eastAsia="pt-BR"/>
+        </w:rPr>
+        <w:t>id</w:t>
+      </w:r>
+      <w:r>
+        <w:rPr>
+          <w:rFonts w:ascii="Consolas" w:eastAsia="Times New Roman" w:hAnsi="Consolas" w:cs="Times New Roman"/>
+          <w:color w:val="FF79C6"/>
+          <w:sz w:val="23"/>
+          <w:szCs w:val="23"/>
+          <w:lang w:eastAsia="pt-BR"/>
+        </w:rPr>
+        <w:t>=</w:t>
+      </w:r>
+      <w:r>
+        <w:rPr>
+          <w:rFonts w:ascii="Consolas" w:eastAsia="Times New Roman" w:hAnsi="Consolas" w:cs="Times New Roman"/>
+          <w:color w:val="E9F284"/>
+          <w:sz w:val="23"/>
+          <w:szCs w:val="23"/>
+          <w:lang w:eastAsia="pt-BR"/>
+        </w:rPr>
+        <w:t>"</w:t>
+      </w:r>
+      <w:proofErr w:type="spellStart"/>
+      <w:r>
+        <w:rPr>
+          <w:rFonts w:ascii="Consolas" w:eastAsia="Times New Roman" w:hAnsi="Consolas" w:cs="Times New Roman"/>
+          <w:color w:val="F1FA8C"/>
+          <w:sz w:val="23"/>
+          <w:szCs w:val="23"/>
+          <w:lang w:eastAsia="pt-BR"/>
+        </w:rPr>
+        <w:t>btn</w:t>
+      </w:r>
+      <w:proofErr w:type="spellEnd"/>
+      <w:r>
+        <w:rPr>
+          <w:rFonts w:ascii="Consolas" w:eastAsia="Times New Roman" w:hAnsi="Consolas" w:cs="Times New Roman"/>
+          <w:color w:val="E9F284"/>
+          <w:sz w:val="23"/>
+          <w:szCs w:val="23"/>
+          <w:lang w:eastAsia="pt-BR"/>
+        </w:rPr>
+        <w:t>"</w:t>
+      </w:r>
+      <w:r>
+        <w:rPr>
+          <w:rFonts w:ascii="Consolas" w:eastAsia="Times New Roman" w:hAnsi="Consolas" w:cs="Times New Roman"/>
+          <w:color w:val="F8F8F2"/>
+          <w:sz w:val="23"/>
+          <w:szCs w:val="23"/>
+          <w:lang w:eastAsia="pt-BR"/>
+        </w:rPr>
+        <w:t xml:space="preserve"> </w:t>
+      </w:r>
+      <w:proofErr w:type="spellStart"/>
+      <w:r>
+        <w:rPr>
+          <w:rFonts w:ascii="Consolas" w:eastAsia="Times New Roman" w:hAnsi="Consolas" w:cs="Times New Roman"/>
+          <w:i/>
+          <w:iCs/>
+          <w:color w:val="50FA7B"/>
+          <w:sz w:val="23"/>
+          <w:szCs w:val="23"/>
+          <w:lang w:eastAsia="pt-BR"/>
+        </w:rPr>
+        <w:t>onclick</w:t>
+      </w:r>
+      <w:proofErr w:type="spellEnd"/>
+      <w:r>
+        <w:rPr>
+          <w:rFonts w:ascii="Consolas" w:eastAsia="Times New Roman" w:hAnsi="Consolas" w:cs="Times New Roman"/>
+          <w:color w:val="FF79C6"/>
+          <w:sz w:val="23"/>
+          <w:szCs w:val="23"/>
+          <w:lang w:eastAsia="pt-BR"/>
+        </w:rPr>
+        <w:t>=</w:t>
+      </w:r>
+      <w:r>
+        <w:rPr>
+          <w:rFonts w:ascii="Consolas" w:eastAsia="Times New Roman" w:hAnsi="Consolas" w:cs="Times New Roman"/>
+          <w:color w:val="E9F284"/>
+          <w:sz w:val="23"/>
+          <w:szCs w:val="23"/>
+          <w:lang w:eastAsia="pt-BR"/>
+        </w:rPr>
+        <w:t>"</w:t>
+      </w:r>
+      <w:proofErr w:type="spellStart"/>
+      <w:proofErr w:type="gramStart"/>
+      <w:r>
+        <w:rPr>
+          <w:rFonts w:ascii="Consolas" w:eastAsia="Times New Roman" w:hAnsi="Consolas" w:cs="Times New Roman"/>
+          <w:color w:val="50FA7B"/>
+          <w:sz w:val="23"/>
+          <w:szCs w:val="23"/>
+          <w:lang w:eastAsia="pt-BR"/>
+        </w:rPr>
+        <w:t>mudarTexto</w:t>
+      </w:r>
+      <w:proofErr w:type="spellEnd"/>
+      <w:r>
+        <w:rPr>
+          <w:rFonts w:ascii="Consolas" w:eastAsia="Times New Roman" w:hAnsi="Consolas" w:cs="Times New Roman"/>
+          <w:color w:val="F8F8F2"/>
+          <w:sz w:val="23"/>
+          <w:szCs w:val="23"/>
+          <w:lang w:eastAsia="pt-BR"/>
+        </w:rPr>
+        <w:t>(</w:t>
+      </w:r>
+      <w:proofErr w:type="gramEnd"/>
+      <w:r>
+        <w:rPr>
+          <w:rFonts w:ascii="Consolas" w:eastAsia="Times New Roman" w:hAnsi="Consolas" w:cs="Times New Roman"/>
+          <w:color w:val="F8F8F2"/>
+          <w:sz w:val="23"/>
+          <w:szCs w:val="23"/>
+          <w:lang w:eastAsia="pt-BR"/>
+        </w:rPr>
+        <w:t>)</w:t>
+      </w:r>
+      <w:r>
+        <w:rPr>
+          <w:rFonts w:ascii="Consolas" w:eastAsia="Times New Roman" w:hAnsi="Consolas" w:cs="Times New Roman"/>
+          <w:color w:val="E9F284"/>
+          <w:sz w:val="23"/>
+          <w:szCs w:val="23"/>
+          <w:lang w:eastAsia="pt-BR"/>
+        </w:rPr>
+        <w:t>"</w:t>
+      </w:r>
+      <w:r>
+        <w:rPr>
+          <w:rFonts w:ascii="Consolas" w:eastAsia="Times New Roman" w:hAnsi="Consolas" w:cs="Times New Roman"/>
+          <w:color w:val="F8F8F2"/>
+          <w:sz w:val="23"/>
+          <w:szCs w:val="23"/>
+          <w:lang w:eastAsia="pt-BR"/>
+        </w:rPr>
+        <w:t>&gt; Aperte aqui! &lt;/</w:t>
+      </w:r>
+      <w:proofErr w:type="spellStart"/>
+      <w:r>
+        <w:rPr>
+          <w:rFonts w:ascii="Consolas" w:eastAsia="Times New Roman" w:hAnsi="Consolas" w:cs="Times New Roman"/>
+          <w:color w:val="FF79C6"/>
+          <w:sz w:val="23"/>
+          <w:szCs w:val="23"/>
+          <w:lang w:eastAsia="pt-BR"/>
+        </w:rPr>
+        <w:t>button</w:t>
+      </w:r>
+      <w:proofErr w:type="spellEnd"/>
+      <w:r>
+        <w:rPr>
+          <w:rFonts w:ascii="Consolas" w:eastAsia="Times New Roman" w:hAnsi="Consolas" w:cs="Times New Roman"/>
+          <w:color w:val="F8F8F2"/>
+          <w:sz w:val="23"/>
+          <w:szCs w:val="23"/>
+          <w:lang w:eastAsia="pt-BR"/>
+        </w:rPr>
+        <w:t>&gt;</w:t>
+      </w:r>
+    </w:p>
+    <w:p>
+      <w:pPr>
+        <w:rPr>
+          <w:color w:val="FF0000"/>
+          <w:sz w:val="36"/>
+          <w:szCs w:val="36"/>
+        </w:rPr>
+      </w:pPr>
     </w:p>
     <w:sectPr>
       <w:pgSz w:w="11906" w:h="16838"/>
@@ -5119,7 +7950,7 @@
   <w:style w:type="paragraph" w:default="1" w:styleId="Normal">
     <w:name w:val="Normal"/>
     <w:qFormat/>
-    <w:rsid w:val="001F35E7"/>
+    <w:rsid w:val="006A0EB9"/>
   </w:style>
   <w:style w:type="paragraph" w:styleId="Ttulo3">
     <w:name w:val="heading 3"/>

</xml_diff>

<commit_message>
Feito toda a parte de funções em JavaScript
</commit_message>
<xml_diff>
--- a/Javascript.docx
+++ b/Javascript.docx
@@ -289,33 +289,11 @@
           <w:sz w:val="28"/>
         </w:rPr>
       </w:pPr>
-      <w:proofErr w:type="spellStart"/>
-      <w:r>
-        <w:rPr>
-          <w:sz w:val="28"/>
-        </w:rPr>
-        <w:t>Const</w:t>
-      </w:r>
-      <w:proofErr w:type="spellEnd"/>
-      <w:r>
-        <w:rPr>
-          <w:sz w:val="28"/>
-        </w:rPr>
-        <w:t xml:space="preserve"> = A variável declarada por </w:t>
-      </w:r>
-      <w:proofErr w:type="spellStart"/>
-      <w:r>
-        <w:rPr>
-          <w:sz w:val="28"/>
-        </w:rPr>
-        <w:t>const</w:t>
-      </w:r>
-      <w:proofErr w:type="spellEnd"/>
-      <w:r>
-        <w:rPr>
-          <w:sz w:val="28"/>
-        </w:rPr>
-        <w:t xml:space="preserve"> não pode ser alterada durante o código</w:t>
+      <w:r>
+        <w:rPr>
+          <w:sz w:val="28"/>
+        </w:rPr>
+        <w:t>Const = A variável declarada por const não pode ser alterada durante o código</w:t>
       </w:r>
     </w:p>
     <w:p>
@@ -4374,8 +4352,6 @@
           <w:szCs w:val="36"/>
         </w:rPr>
       </w:pPr>
-      <w:bookmarkStart w:id="0" w:name="_GoBack"/>
-      <w:bookmarkEnd w:id="0"/>
     </w:p>
     <w:p>
       <w:pPr>
@@ -5243,53 +5219,29 @@
           <w:color w:val="FF0000"/>
           <w:sz w:val="36"/>
           <w:szCs w:val="36"/>
-          <w:lang w:val="en-US"/>
-        </w:rPr>
-      </w:pPr>
-      <w:proofErr w:type="spellStart"/>
+        </w:rPr>
+      </w:pPr>
       <w:r>
         <w:rPr>
           <w:color w:val="FF0000"/>
           <w:sz w:val="36"/>
           <w:szCs w:val="36"/>
-          <w:lang w:val="en-US"/>
-        </w:rPr>
-        <w:t>Vídeo</w:t>
-      </w:r>
-      <w:proofErr w:type="spellEnd"/>
+        </w:rPr>
+        <w:t>Vídeo 17</w:t>
+      </w:r>
       <w:r>
         <w:rPr>
           <w:color w:val="FF0000"/>
           <w:sz w:val="36"/>
           <w:szCs w:val="36"/>
-          <w:lang w:val="en-US"/>
-        </w:rPr>
-        <w:t xml:space="preserve"> 1</w:t>
+        </w:rPr>
+        <w:t xml:space="preserve"> e 18</w:t>
       </w:r>
       <w:r>
         <w:rPr>
           <w:color w:val="FF0000"/>
           <w:sz w:val="36"/>
           <w:szCs w:val="36"/>
-          <w:lang w:val="en-US"/>
-        </w:rPr>
-        <w:t>7</w:t>
-      </w:r>
-      <w:r>
-        <w:rPr>
-          <w:color w:val="FF0000"/>
-          <w:sz w:val="36"/>
-          <w:szCs w:val="36"/>
-          <w:lang w:val="en-US"/>
-        </w:rPr>
-        <w:t xml:space="preserve"> e 18</w:t>
-      </w:r>
-      <w:r>
-        <w:rPr>
-          <w:color w:val="FF0000"/>
-          <w:sz w:val="36"/>
-          <w:szCs w:val="36"/>
-          <w:lang w:val="en-US"/>
         </w:rPr>
         <w:t>.</w:t>
       </w:r>
@@ -5420,15 +5372,102 @@
           <w:sz w:val="36"/>
           <w:szCs w:val="36"/>
         </w:rPr>
-        <w:t>Vídeo 1</w:t>
-      </w:r>
-      <w:r>
+        <w:t>Vídeo 19.</w:t>
+      </w:r>
+    </w:p>
+    <w:p>
+      <w:pPr>
+        <w:rPr>
+          <w:sz w:val="28"/>
+          <w:szCs w:val="28"/>
+        </w:rPr>
+      </w:pPr>
+      <w:r>
+        <w:rPr>
+          <w:sz w:val="28"/>
+          <w:szCs w:val="28"/>
+        </w:rPr>
+        <w:t xml:space="preserve">O </w:t>
+      </w:r>
+      <w:r>
+        <w:rPr>
+          <w:b/>
+          <w:bCs/>
+          <w:sz w:val="28"/>
+          <w:szCs w:val="28"/>
+        </w:rPr>
+        <w:t xml:space="preserve">Break </w:t>
+      </w:r>
+      <w:r>
+        <w:rPr>
+          <w:sz w:val="28"/>
+          <w:szCs w:val="28"/>
+        </w:rPr>
+        <w:t xml:space="preserve">quando colocado em </w:t>
+      </w:r>
+      <w:r>
+        <w:rPr>
+          <w:sz w:val="28"/>
+          <w:szCs w:val="28"/>
+        </w:rPr>
+        <w:t>um bloco, ele quebra ela inteiro e sai do mesmo.</w:t>
+      </w:r>
+    </w:p>
+    <w:p>
+      <w:pPr>
+        <w:rPr>
+          <w:sz w:val="28"/>
+          <w:szCs w:val="28"/>
+        </w:rPr>
+      </w:pPr>
+      <w:r>
+        <w:rPr>
+          <w:sz w:val="28"/>
+          <w:szCs w:val="28"/>
+        </w:rPr>
+        <w:t xml:space="preserve">O </w:t>
+      </w:r>
+      <w:r>
+        <w:rPr>
+          <w:b/>
+          <w:bCs/>
+          <w:sz w:val="28"/>
+          <w:szCs w:val="28"/>
+        </w:rPr>
+        <w:t>continue</w:t>
+      </w:r>
+      <w:r>
+        <w:rPr>
+          <w:b/>
+          <w:bCs/>
+          <w:sz w:val="28"/>
+          <w:szCs w:val="28"/>
+        </w:rPr>
+        <w:t xml:space="preserve"> </w:t>
+      </w:r>
+      <w:r>
+        <w:rPr>
+          <w:sz w:val="28"/>
+          <w:szCs w:val="28"/>
+        </w:rPr>
+        <w:t>não quebra o bloco e continua a execução.</w:t>
+      </w:r>
+    </w:p>
+    <w:p>
+      <w:pPr>
         <w:rPr>
           <w:color w:val="FF0000"/>
           <w:sz w:val="36"/>
           <w:szCs w:val="36"/>
         </w:rPr>
-        <w:t>9.</w:t>
+      </w:pPr>
+      <w:r>
+        <w:rPr>
+          <w:color w:val="FF0000"/>
+          <w:sz w:val="36"/>
+          <w:szCs w:val="36"/>
+        </w:rPr>
+        <w:t>Vídeo 20.</w:t>
       </w:r>
     </w:p>
     <w:p>
@@ -5443,7 +5482,7 @@
           <w:sz w:val="28"/>
           <w:szCs w:val="28"/>
         </w:rPr>
-        <w:t xml:space="preserve">O </w:t>
+        <w:t xml:space="preserve">As </w:t>
       </w:r>
       <w:r>
         <w:rPr>
@@ -5452,36 +5491,7 @@
           <w:sz w:val="28"/>
           <w:szCs w:val="28"/>
         </w:rPr>
-        <w:t xml:space="preserve">Break </w:t>
-      </w:r>
-      <w:r>
-        <w:rPr>
-          <w:sz w:val="28"/>
-          <w:szCs w:val="28"/>
-        </w:rPr>
-        <w:t xml:space="preserve">quando colocado em </w:t>
-      </w:r>
-      <w:r>
-        <w:rPr>
-          <w:sz w:val="28"/>
-          <w:szCs w:val="28"/>
-        </w:rPr>
-        <w:t>um bloco, ele quebra ela inteiro e sai do mesmo.</w:t>
-      </w:r>
-    </w:p>
-    <w:p>
-      <w:pPr>
-        <w:rPr>
-          <w:sz w:val="28"/>
-          <w:szCs w:val="28"/>
-        </w:rPr>
-      </w:pPr>
-      <w:r>
-        <w:rPr>
-          <w:sz w:val="28"/>
-          <w:szCs w:val="28"/>
-        </w:rPr>
-        <w:t xml:space="preserve">O </w:t>
+        <w:t>Funções</w:t>
       </w:r>
       <w:r>
         <w:rPr>
@@ -5490,94 +5500,6 @@
           <w:sz w:val="28"/>
           <w:szCs w:val="28"/>
         </w:rPr>
-        <w:t>continue</w:t>
-      </w:r>
-      <w:r>
-        <w:rPr>
-          <w:b/>
-          <w:bCs/>
-          <w:sz w:val="28"/>
-          <w:szCs w:val="28"/>
-        </w:rPr>
-        <w:t xml:space="preserve"> </w:t>
-      </w:r>
-      <w:r>
-        <w:rPr>
-          <w:sz w:val="28"/>
-          <w:szCs w:val="28"/>
-        </w:rPr>
-        <w:t>não quebra o bloco e continua a execução.</w:t>
-      </w:r>
-    </w:p>
-    <w:p>
-      <w:pPr>
-        <w:rPr>
-          <w:color w:val="FF0000"/>
-          <w:sz w:val="36"/>
-          <w:szCs w:val="36"/>
-          <w:lang w:val="en-US"/>
-        </w:rPr>
-      </w:pPr>
-      <w:proofErr w:type="spellStart"/>
-      <w:r>
-        <w:rPr>
-          <w:color w:val="FF0000"/>
-          <w:sz w:val="36"/>
-          <w:szCs w:val="36"/>
-          <w:lang w:val="en-US"/>
-        </w:rPr>
-        <w:t>Vídeo</w:t>
-      </w:r>
-      <w:proofErr w:type="spellEnd"/>
-      <w:r>
-        <w:rPr>
-          <w:color w:val="FF0000"/>
-          <w:sz w:val="36"/>
-          <w:szCs w:val="36"/>
-          <w:lang w:val="en-US"/>
-        </w:rPr>
-        <w:t xml:space="preserve"> </w:t>
-      </w:r>
-      <w:r>
-        <w:rPr>
-          <w:color w:val="FF0000"/>
-          <w:sz w:val="36"/>
-          <w:szCs w:val="36"/>
-          <w:lang w:val="en-US"/>
-        </w:rPr>
-        <w:t>20.</w:t>
-      </w:r>
-    </w:p>
-    <w:p>
-      <w:pPr>
-        <w:rPr>
-          <w:sz w:val="28"/>
-          <w:szCs w:val="28"/>
-        </w:rPr>
-      </w:pPr>
-      <w:r>
-        <w:rPr>
-          <w:sz w:val="28"/>
-          <w:szCs w:val="28"/>
-        </w:rPr>
-        <w:t xml:space="preserve">As </w:t>
-      </w:r>
-      <w:r>
-        <w:rPr>
-          <w:b/>
-          <w:bCs/>
-          <w:sz w:val="28"/>
-          <w:szCs w:val="28"/>
-        </w:rPr>
-        <w:t>Funções</w:t>
-      </w:r>
-      <w:r>
-        <w:rPr>
-          <w:b/>
-          <w:bCs/>
-          <w:sz w:val="28"/>
-          <w:szCs w:val="28"/>
-        </w:rPr>
         <w:t xml:space="preserve"> </w:t>
       </w:r>
       <w:r>
@@ -5612,28 +5534,26 @@
           <w:color w:val="F8F8F2"/>
           <w:sz w:val="23"/>
           <w:szCs w:val="23"/>
-          <w:lang w:eastAsia="pt-BR"/>
-        </w:rPr>
-      </w:pPr>
-      <w:proofErr w:type="spellStart"/>
+          <w:lang w:val="en-US" w:eastAsia="pt-BR"/>
+        </w:rPr>
+      </w:pPr>
       <w:r>
         <w:rPr>
           <w:rFonts w:ascii="Consolas" w:eastAsia="Times New Roman" w:hAnsi="Consolas" w:cs="Times New Roman"/>
           <w:color w:val="FF79C6"/>
           <w:sz w:val="23"/>
           <w:szCs w:val="23"/>
-          <w:lang w:eastAsia="pt-BR"/>
+          <w:lang w:val="en-US" w:eastAsia="pt-BR"/>
         </w:rPr>
         <w:t>function</w:t>
       </w:r>
-      <w:proofErr w:type="spellEnd"/>
-      <w:r>
-        <w:rPr>
-          <w:rFonts w:ascii="Consolas" w:eastAsia="Times New Roman" w:hAnsi="Consolas" w:cs="Times New Roman"/>
-          <w:color w:val="F8F8F2"/>
-          <w:sz w:val="23"/>
-          <w:szCs w:val="23"/>
-          <w:lang w:eastAsia="pt-BR"/>
+      <w:r>
+        <w:rPr>
+          <w:rFonts w:ascii="Consolas" w:eastAsia="Times New Roman" w:hAnsi="Consolas" w:cs="Times New Roman"/>
+          <w:color w:val="F8F8F2"/>
+          <w:sz w:val="23"/>
+          <w:szCs w:val="23"/>
+          <w:lang w:val="en-US" w:eastAsia="pt-BR"/>
         </w:rPr>
         <w:t xml:space="preserve"> </w:t>
       </w:r>
@@ -5645,7 +5565,7 @@
           <w:color w:val="50FA7B"/>
           <w:sz w:val="23"/>
           <w:szCs w:val="23"/>
-          <w:lang w:eastAsia="pt-BR"/>
+          <w:lang w:val="en-US" w:eastAsia="pt-BR"/>
         </w:rPr>
         <w:t>mudarTexto</w:t>
       </w:r>
@@ -5656,7 +5576,7 @@
           <w:color w:val="F8F8F2"/>
           <w:sz w:val="23"/>
           <w:szCs w:val="23"/>
-          <w:lang w:eastAsia="pt-BR"/>
+          <w:lang w:val="en-US" w:eastAsia="pt-BR"/>
         </w:rPr>
         <w:t>(</w:t>
       </w:r>
@@ -5667,7 +5587,7 @@
           <w:color w:val="F8F8F2"/>
           <w:sz w:val="23"/>
           <w:szCs w:val="23"/>
-          <w:lang w:eastAsia="pt-BR"/>
+          <w:lang w:val="en-US" w:eastAsia="pt-BR"/>
         </w:rPr>
         <w:t>) {</w:t>
       </w:r>
@@ -5690,7 +5610,7 @@
           <w:color w:val="F8F8F2"/>
           <w:sz w:val="23"/>
           <w:szCs w:val="23"/>
-          <w:lang w:eastAsia="pt-BR"/>
+          <w:lang w:val="en-US" w:eastAsia="pt-BR"/>
         </w:rPr>
         <w:t xml:space="preserve">    </w:t>
       </w:r>
@@ -6774,6 +6694,3696 @@
           <w:color w:val="FF0000"/>
           <w:sz w:val="36"/>
           <w:szCs w:val="36"/>
+        </w:rPr>
+      </w:pPr>
+    </w:p>
+    <w:p>
+      <w:pPr>
+        <w:rPr>
+          <w:color w:val="FF0000"/>
+          <w:sz w:val="36"/>
+          <w:szCs w:val="36"/>
+        </w:rPr>
+      </w:pPr>
+      <w:r>
+        <w:rPr>
+          <w:color w:val="FF0000"/>
+          <w:sz w:val="36"/>
+          <w:szCs w:val="36"/>
+        </w:rPr>
+        <w:lastRenderedPageBreak/>
+        <w:t>Vídeo 21.</w:t>
+      </w:r>
+    </w:p>
+    <w:p>
+      <w:pPr>
+        <w:rPr>
+          <w:sz w:val="28"/>
+          <w:szCs w:val="28"/>
+        </w:rPr>
+      </w:pPr>
+      <w:r>
+        <w:rPr>
+          <w:sz w:val="28"/>
+          <w:szCs w:val="28"/>
+        </w:rPr>
+        <w:t xml:space="preserve">O Return serve para que a função retorne um valor. </w:t>
+      </w:r>
+    </w:p>
+    <w:p>
+      <w:pPr>
+        <w:rPr>
+          <w:color w:val="FF0000"/>
+          <w:sz w:val="36"/>
+          <w:szCs w:val="36"/>
+        </w:rPr>
+      </w:pPr>
+      <w:r>
+        <w:rPr>
+          <w:color w:val="FF0000"/>
+          <w:sz w:val="36"/>
+          <w:szCs w:val="36"/>
+        </w:rPr>
+        <w:t>Vídeo 22.</w:t>
+      </w:r>
+    </w:p>
+    <w:p>
+      <w:pPr>
+        <w:rPr>
+          <w:sz w:val="28"/>
+          <w:szCs w:val="28"/>
+        </w:rPr>
+      </w:pPr>
+      <w:r>
+        <w:rPr>
+          <w:sz w:val="28"/>
+          <w:szCs w:val="28"/>
+        </w:rPr>
+        <w:t>Funções Parametrizadas: Basicamente, a função ela vai receber alguns parâmetros, e quando ela for chamada, esses parâmetros vão ter que estar preenchidos.</w:t>
+      </w:r>
+    </w:p>
+    <w:p>
+      <w:pPr>
+        <w:shd w:val="clear" w:color="auto" w:fill="282A36"/>
+        <w:spacing w:after="0" w:line="300" w:lineRule="atLeast"/>
+        <w:rPr>
+          <w:rFonts w:ascii="Consolas" w:eastAsia="Times New Roman" w:hAnsi="Consolas" w:cs="Times New Roman"/>
+          <w:color w:val="F8F8F2"/>
+          <w:sz w:val="23"/>
+          <w:szCs w:val="23"/>
+          <w:lang w:eastAsia="pt-BR"/>
+        </w:rPr>
+      </w:pPr>
+      <w:r>
+        <w:rPr>
+          <w:rFonts w:ascii="Consolas" w:eastAsia="Times New Roman" w:hAnsi="Consolas" w:cs="Times New Roman"/>
+          <w:color w:val="FF79C6"/>
+          <w:sz w:val="23"/>
+          <w:szCs w:val="23"/>
+          <w:lang w:eastAsia="pt-BR"/>
+        </w:rPr>
+        <w:t>function</w:t>
+      </w:r>
+      <w:r>
+        <w:rPr>
+          <w:rFonts w:ascii="Consolas" w:eastAsia="Times New Roman" w:hAnsi="Consolas" w:cs="Times New Roman"/>
+          <w:color w:val="F8F8F2"/>
+          <w:sz w:val="23"/>
+          <w:szCs w:val="23"/>
+          <w:lang w:eastAsia="pt-BR"/>
+        </w:rPr>
+        <w:t xml:space="preserve"> </w:t>
+      </w:r>
+      <w:proofErr w:type="gramStart"/>
+      <w:r>
+        <w:rPr>
+          <w:rFonts w:ascii="Consolas" w:eastAsia="Times New Roman" w:hAnsi="Consolas" w:cs="Times New Roman"/>
+          <w:color w:val="50FA7B"/>
+          <w:sz w:val="23"/>
+          <w:szCs w:val="23"/>
+          <w:lang w:eastAsia="pt-BR"/>
+        </w:rPr>
+        <w:t>soma</w:t>
+      </w:r>
+      <w:r>
+        <w:rPr>
+          <w:rFonts w:ascii="Consolas" w:eastAsia="Times New Roman" w:hAnsi="Consolas" w:cs="Times New Roman"/>
+          <w:color w:val="F8F8F2"/>
+          <w:sz w:val="23"/>
+          <w:szCs w:val="23"/>
+          <w:lang w:eastAsia="pt-BR"/>
+        </w:rPr>
+        <w:t>(</w:t>
+      </w:r>
+      <w:proofErr w:type="gramEnd"/>
+      <w:r>
+        <w:rPr>
+          <w:rFonts w:ascii="Consolas" w:eastAsia="Times New Roman" w:hAnsi="Consolas" w:cs="Times New Roman"/>
+          <w:i/>
+          <w:iCs/>
+          <w:color w:val="FFB86C"/>
+          <w:sz w:val="23"/>
+          <w:szCs w:val="23"/>
+          <w:lang w:eastAsia="pt-BR"/>
+        </w:rPr>
+        <w:t>n1</w:t>
+      </w:r>
+      <w:r>
+        <w:rPr>
+          <w:rFonts w:ascii="Consolas" w:eastAsia="Times New Roman" w:hAnsi="Consolas" w:cs="Times New Roman"/>
+          <w:color w:val="F8F8F2"/>
+          <w:sz w:val="23"/>
+          <w:szCs w:val="23"/>
+          <w:lang w:eastAsia="pt-BR"/>
+        </w:rPr>
+        <w:t xml:space="preserve">, </w:t>
+      </w:r>
+      <w:r>
+        <w:rPr>
+          <w:rFonts w:ascii="Consolas" w:eastAsia="Times New Roman" w:hAnsi="Consolas" w:cs="Times New Roman"/>
+          <w:i/>
+          <w:iCs/>
+          <w:color w:val="FFB86C"/>
+          <w:sz w:val="23"/>
+          <w:szCs w:val="23"/>
+          <w:lang w:eastAsia="pt-BR"/>
+        </w:rPr>
+        <w:t>n2</w:t>
+      </w:r>
+      <w:r>
+        <w:rPr>
+          <w:rFonts w:ascii="Consolas" w:eastAsia="Times New Roman" w:hAnsi="Consolas" w:cs="Times New Roman"/>
+          <w:color w:val="F8F8F2"/>
+          <w:sz w:val="23"/>
+          <w:szCs w:val="23"/>
+          <w:lang w:eastAsia="pt-BR"/>
+        </w:rPr>
+        <w:t>) {</w:t>
+      </w:r>
+    </w:p>
+    <w:p>
+      <w:pPr>
+        <w:shd w:val="clear" w:color="auto" w:fill="282A36"/>
+        <w:spacing w:after="0" w:line="300" w:lineRule="atLeast"/>
+        <w:rPr>
+          <w:rFonts w:ascii="Consolas" w:eastAsia="Times New Roman" w:hAnsi="Consolas" w:cs="Times New Roman"/>
+          <w:color w:val="F8F8F2"/>
+          <w:sz w:val="23"/>
+          <w:szCs w:val="23"/>
+          <w:lang w:eastAsia="pt-BR"/>
+        </w:rPr>
+      </w:pPr>
+      <w:r>
+        <w:rPr>
+          <w:rFonts w:ascii="Consolas" w:eastAsia="Times New Roman" w:hAnsi="Consolas" w:cs="Times New Roman"/>
+          <w:color w:val="F8F8F2"/>
+          <w:sz w:val="23"/>
+          <w:szCs w:val="23"/>
+          <w:lang w:eastAsia="pt-BR"/>
+        </w:rPr>
+        <w:t xml:space="preserve">    </w:t>
+      </w:r>
+      <w:proofErr w:type="gramStart"/>
+      <w:r>
+        <w:rPr>
+          <w:rFonts w:ascii="Consolas" w:eastAsia="Times New Roman" w:hAnsi="Consolas" w:cs="Times New Roman"/>
+          <w:color w:val="BD93F9"/>
+          <w:sz w:val="23"/>
+          <w:szCs w:val="23"/>
+          <w:lang w:eastAsia="pt-BR"/>
+        </w:rPr>
+        <w:t>console</w:t>
+      </w:r>
+      <w:r>
+        <w:rPr>
+          <w:rFonts w:ascii="Consolas" w:eastAsia="Times New Roman" w:hAnsi="Consolas" w:cs="Times New Roman"/>
+          <w:color w:val="F8F8F2"/>
+          <w:sz w:val="23"/>
+          <w:szCs w:val="23"/>
+          <w:lang w:eastAsia="pt-BR"/>
+        </w:rPr>
+        <w:t>.</w:t>
+      </w:r>
+      <w:r>
+        <w:rPr>
+          <w:rFonts w:ascii="Consolas" w:eastAsia="Times New Roman" w:hAnsi="Consolas" w:cs="Times New Roman"/>
+          <w:color w:val="50FA7B"/>
+          <w:sz w:val="23"/>
+          <w:szCs w:val="23"/>
+          <w:lang w:eastAsia="pt-BR"/>
+        </w:rPr>
+        <w:t>log</w:t>
+      </w:r>
+      <w:r>
+        <w:rPr>
+          <w:rFonts w:ascii="Consolas" w:eastAsia="Times New Roman" w:hAnsi="Consolas" w:cs="Times New Roman"/>
+          <w:color w:val="F8F8F2"/>
+          <w:sz w:val="23"/>
+          <w:szCs w:val="23"/>
+          <w:lang w:eastAsia="pt-BR"/>
+        </w:rPr>
+        <w:t>(</w:t>
+      </w:r>
+      <w:proofErr w:type="gramEnd"/>
+      <w:r>
+        <w:rPr>
+          <w:rFonts w:ascii="Consolas" w:eastAsia="Times New Roman" w:hAnsi="Consolas" w:cs="Times New Roman"/>
+          <w:i/>
+          <w:iCs/>
+          <w:color w:val="FFB86C"/>
+          <w:sz w:val="23"/>
+          <w:szCs w:val="23"/>
+          <w:lang w:eastAsia="pt-BR"/>
+        </w:rPr>
+        <w:t>n1</w:t>
+      </w:r>
+      <w:r>
+        <w:rPr>
+          <w:rFonts w:ascii="Consolas" w:eastAsia="Times New Roman" w:hAnsi="Consolas" w:cs="Times New Roman"/>
+          <w:color w:val="F8F8F2"/>
+          <w:sz w:val="23"/>
+          <w:szCs w:val="23"/>
+          <w:lang w:eastAsia="pt-BR"/>
+        </w:rPr>
+        <w:t xml:space="preserve"> </w:t>
+      </w:r>
+      <w:r>
+        <w:rPr>
+          <w:rFonts w:ascii="Consolas" w:eastAsia="Times New Roman" w:hAnsi="Consolas" w:cs="Times New Roman"/>
+          <w:color w:val="FF79C6"/>
+          <w:sz w:val="23"/>
+          <w:szCs w:val="23"/>
+          <w:lang w:eastAsia="pt-BR"/>
+        </w:rPr>
+        <w:t>+</w:t>
+      </w:r>
+      <w:r>
+        <w:rPr>
+          <w:rFonts w:ascii="Consolas" w:eastAsia="Times New Roman" w:hAnsi="Consolas" w:cs="Times New Roman"/>
+          <w:color w:val="F8F8F2"/>
+          <w:sz w:val="23"/>
+          <w:szCs w:val="23"/>
+          <w:lang w:eastAsia="pt-BR"/>
+        </w:rPr>
+        <w:t xml:space="preserve"> </w:t>
+      </w:r>
+      <w:r>
+        <w:rPr>
+          <w:rFonts w:ascii="Consolas" w:eastAsia="Times New Roman" w:hAnsi="Consolas" w:cs="Times New Roman"/>
+          <w:i/>
+          <w:iCs/>
+          <w:color w:val="FFB86C"/>
+          <w:sz w:val="23"/>
+          <w:szCs w:val="23"/>
+          <w:lang w:eastAsia="pt-BR"/>
+        </w:rPr>
+        <w:t>n2</w:t>
+      </w:r>
+      <w:r>
+        <w:rPr>
+          <w:rFonts w:ascii="Consolas" w:eastAsia="Times New Roman" w:hAnsi="Consolas" w:cs="Times New Roman"/>
+          <w:color w:val="F8F8F2"/>
+          <w:sz w:val="23"/>
+          <w:szCs w:val="23"/>
+          <w:lang w:eastAsia="pt-BR"/>
+        </w:rPr>
+        <w:t>)</w:t>
+      </w:r>
+    </w:p>
+    <w:p>
+      <w:pPr>
+        <w:shd w:val="clear" w:color="auto" w:fill="282A36"/>
+        <w:spacing w:after="0" w:line="300" w:lineRule="atLeast"/>
+        <w:rPr>
+          <w:rFonts w:ascii="Consolas" w:eastAsia="Times New Roman" w:hAnsi="Consolas" w:cs="Times New Roman"/>
+          <w:color w:val="F8F8F2"/>
+          <w:sz w:val="23"/>
+          <w:szCs w:val="23"/>
+          <w:lang w:eastAsia="pt-BR"/>
+        </w:rPr>
+      </w:pPr>
+      <w:r>
+        <w:rPr>
+          <w:rFonts w:ascii="Consolas" w:eastAsia="Times New Roman" w:hAnsi="Consolas" w:cs="Times New Roman"/>
+          <w:color w:val="F8F8F2"/>
+          <w:sz w:val="23"/>
+          <w:szCs w:val="23"/>
+          <w:lang w:eastAsia="pt-BR"/>
+        </w:rPr>
+        <w:t>}</w:t>
+      </w:r>
+    </w:p>
+    <w:p>
+      <w:pPr>
+        <w:shd w:val="clear" w:color="auto" w:fill="282A36"/>
+        <w:spacing w:after="0" w:line="300" w:lineRule="atLeast"/>
+        <w:rPr>
+          <w:rFonts w:ascii="Consolas" w:eastAsia="Times New Roman" w:hAnsi="Consolas" w:cs="Times New Roman"/>
+          <w:color w:val="F8F8F2"/>
+          <w:sz w:val="23"/>
+          <w:szCs w:val="23"/>
+          <w:lang w:eastAsia="pt-BR"/>
+        </w:rPr>
+      </w:pPr>
+      <w:proofErr w:type="gramStart"/>
+      <w:r>
+        <w:rPr>
+          <w:rFonts w:ascii="Consolas" w:eastAsia="Times New Roman" w:hAnsi="Consolas" w:cs="Times New Roman"/>
+          <w:color w:val="50FA7B"/>
+          <w:sz w:val="23"/>
+          <w:szCs w:val="23"/>
+          <w:lang w:eastAsia="pt-BR"/>
+        </w:rPr>
+        <w:t>soma</w:t>
+      </w:r>
+      <w:r>
+        <w:rPr>
+          <w:rFonts w:ascii="Consolas" w:eastAsia="Times New Roman" w:hAnsi="Consolas" w:cs="Times New Roman"/>
+          <w:color w:val="F8F8F2"/>
+          <w:sz w:val="23"/>
+          <w:szCs w:val="23"/>
+          <w:lang w:eastAsia="pt-BR"/>
+        </w:rPr>
+        <w:t>(</w:t>
+      </w:r>
+      <w:proofErr w:type="gramEnd"/>
+      <w:r>
+        <w:rPr>
+          <w:rFonts w:ascii="Consolas" w:eastAsia="Times New Roman" w:hAnsi="Consolas" w:cs="Times New Roman"/>
+          <w:color w:val="BD93F9"/>
+          <w:sz w:val="23"/>
+          <w:szCs w:val="23"/>
+          <w:lang w:eastAsia="pt-BR"/>
+        </w:rPr>
+        <w:t>10</w:t>
+      </w:r>
+      <w:r>
+        <w:rPr>
+          <w:rFonts w:ascii="Consolas" w:eastAsia="Times New Roman" w:hAnsi="Consolas" w:cs="Times New Roman"/>
+          <w:color w:val="F8F8F2"/>
+          <w:sz w:val="23"/>
+          <w:szCs w:val="23"/>
+          <w:lang w:eastAsia="pt-BR"/>
+        </w:rPr>
+        <w:t xml:space="preserve">, </w:t>
+      </w:r>
+      <w:r>
+        <w:rPr>
+          <w:rFonts w:ascii="Consolas" w:eastAsia="Times New Roman" w:hAnsi="Consolas" w:cs="Times New Roman"/>
+          <w:color w:val="BD93F9"/>
+          <w:sz w:val="23"/>
+          <w:szCs w:val="23"/>
+          <w:lang w:eastAsia="pt-BR"/>
+        </w:rPr>
+        <w:t>10</w:t>
+      </w:r>
+      <w:r>
+        <w:rPr>
+          <w:rFonts w:ascii="Consolas" w:eastAsia="Times New Roman" w:hAnsi="Consolas" w:cs="Times New Roman"/>
+          <w:color w:val="F8F8F2"/>
+          <w:sz w:val="23"/>
+          <w:szCs w:val="23"/>
+          <w:lang w:eastAsia="pt-BR"/>
+        </w:rPr>
+        <w:t>)</w:t>
+      </w:r>
+    </w:p>
+    <w:p>
+      <w:pPr>
+        <w:rPr>
+          <w:sz w:val="28"/>
+          <w:szCs w:val="28"/>
+        </w:rPr>
+      </w:pPr>
+    </w:p>
+    <w:p>
+      <w:pPr>
+        <w:rPr>
+          <w:color w:val="FF0000"/>
+          <w:sz w:val="36"/>
+          <w:szCs w:val="36"/>
+        </w:rPr>
+      </w:pPr>
+      <w:r>
+        <w:rPr>
+          <w:color w:val="FF0000"/>
+          <w:sz w:val="36"/>
+          <w:szCs w:val="36"/>
+        </w:rPr>
+        <w:t>Vídeo 2</w:t>
+      </w:r>
+      <w:r>
+        <w:rPr>
+          <w:color w:val="FF0000"/>
+          <w:sz w:val="36"/>
+          <w:szCs w:val="36"/>
+        </w:rPr>
+        <w:t>3</w:t>
+      </w:r>
+      <w:r>
+        <w:rPr>
+          <w:color w:val="FF0000"/>
+          <w:sz w:val="36"/>
+          <w:szCs w:val="36"/>
+        </w:rPr>
+        <w:t>.</w:t>
+      </w:r>
+    </w:p>
+    <w:p>
+      <w:pPr>
+        <w:rPr>
+          <w:sz w:val="28"/>
+          <w:szCs w:val="28"/>
+        </w:rPr>
+      </w:pPr>
+      <w:r>
+        <w:rPr>
+          <w:sz w:val="28"/>
+          <w:szCs w:val="28"/>
+        </w:rPr>
+        <w:t xml:space="preserve">Parâmetros REST: </w:t>
+      </w:r>
+      <w:r>
+        <w:rPr>
+          <w:sz w:val="28"/>
+          <w:szCs w:val="28"/>
+        </w:rPr>
+        <w:t xml:space="preserve">Em uma função soma, você não sabe quantos números exatamente a pessoa vai querer somar, é </w:t>
+      </w:r>
+      <w:proofErr w:type="gramStart"/>
+      <w:r>
+        <w:rPr>
+          <w:sz w:val="28"/>
+          <w:szCs w:val="28"/>
+        </w:rPr>
+        <w:t>ai</w:t>
+      </w:r>
+      <w:proofErr w:type="gramEnd"/>
+      <w:r>
+        <w:rPr>
+          <w:sz w:val="28"/>
+          <w:szCs w:val="28"/>
+        </w:rPr>
+        <w:t xml:space="preserve"> que entra o REST. Colocando esse parâmetro, você não precisa especificar quantos parâmetros a função vai ter.</w:t>
+      </w:r>
+    </w:p>
+    <w:p>
+      <w:pPr>
+        <w:shd w:val="clear" w:color="auto" w:fill="282A36"/>
+        <w:spacing w:after="0" w:line="300" w:lineRule="atLeast"/>
+        <w:rPr>
+          <w:rFonts w:ascii="Consolas" w:eastAsia="Times New Roman" w:hAnsi="Consolas" w:cs="Times New Roman"/>
+          <w:color w:val="F8F8F2"/>
+          <w:sz w:val="23"/>
+          <w:szCs w:val="23"/>
+          <w:lang w:val="en-US" w:eastAsia="pt-BR"/>
+        </w:rPr>
+      </w:pPr>
+      <w:r>
+        <w:rPr>
+          <w:rFonts w:ascii="Consolas" w:eastAsia="Times New Roman" w:hAnsi="Consolas" w:cs="Times New Roman"/>
+          <w:color w:val="FF79C6"/>
+          <w:sz w:val="23"/>
+          <w:szCs w:val="23"/>
+          <w:lang w:val="en-US" w:eastAsia="pt-BR"/>
+        </w:rPr>
+        <w:t>function</w:t>
+      </w:r>
+      <w:r>
+        <w:rPr>
+          <w:rFonts w:ascii="Consolas" w:eastAsia="Times New Roman" w:hAnsi="Consolas" w:cs="Times New Roman"/>
+          <w:color w:val="F8F8F2"/>
+          <w:sz w:val="23"/>
+          <w:szCs w:val="23"/>
+          <w:lang w:val="en-US" w:eastAsia="pt-BR"/>
+        </w:rPr>
+        <w:t xml:space="preserve"> </w:t>
+      </w:r>
+      <w:proofErr w:type="gramStart"/>
+      <w:r>
+        <w:rPr>
+          <w:rFonts w:ascii="Consolas" w:eastAsia="Times New Roman" w:hAnsi="Consolas" w:cs="Times New Roman"/>
+          <w:color w:val="50FA7B"/>
+          <w:sz w:val="23"/>
+          <w:szCs w:val="23"/>
+          <w:lang w:val="en-US" w:eastAsia="pt-BR"/>
+        </w:rPr>
+        <w:t>spread</w:t>
+      </w:r>
+      <w:r>
+        <w:rPr>
+          <w:rFonts w:ascii="Consolas" w:eastAsia="Times New Roman" w:hAnsi="Consolas" w:cs="Times New Roman"/>
+          <w:color w:val="F8F8F2"/>
+          <w:sz w:val="23"/>
+          <w:szCs w:val="23"/>
+          <w:lang w:val="en-US" w:eastAsia="pt-BR"/>
+        </w:rPr>
+        <w:t>(</w:t>
+      </w:r>
+      <w:proofErr w:type="gramEnd"/>
+      <w:r>
+        <w:rPr>
+          <w:rFonts w:ascii="Consolas" w:eastAsia="Times New Roman" w:hAnsi="Consolas" w:cs="Times New Roman"/>
+          <w:color w:val="FF79C6"/>
+          <w:sz w:val="23"/>
+          <w:szCs w:val="23"/>
+          <w:lang w:val="en-US" w:eastAsia="pt-BR"/>
+        </w:rPr>
+        <w:t>...</w:t>
+      </w:r>
+      <w:proofErr w:type="spellStart"/>
+      <w:r>
+        <w:rPr>
+          <w:rFonts w:ascii="Consolas" w:eastAsia="Times New Roman" w:hAnsi="Consolas" w:cs="Times New Roman"/>
+          <w:i/>
+          <w:iCs/>
+          <w:color w:val="FFB86C"/>
+          <w:sz w:val="23"/>
+          <w:szCs w:val="23"/>
+          <w:lang w:val="en-US" w:eastAsia="pt-BR"/>
+        </w:rPr>
+        <w:t>valores</w:t>
+      </w:r>
+      <w:proofErr w:type="spellEnd"/>
+      <w:r>
+        <w:rPr>
+          <w:rFonts w:ascii="Consolas" w:eastAsia="Times New Roman" w:hAnsi="Consolas" w:cs="Times New Roman"/>
+          <w:color w:val="F8F8F2"/>
+          <w:sz w:val="23"/>
+          <w:szCs w:val="23"/>
+          <w:lang w:val="en-US" w:eastAsia="pt-BR"/>
+        </w:rPr>
+        <w:t>) {</w:t>
+      </w:r>
+    </w:p>
+    <w:p>
+      <w:pPr>
+        <w:shd w:val="clear" w:color="auto" w:fill="282A36"/>
+        <w:spacing w:after="0" w:line="300" w:lineRule="atLeast"/>
+        <w:rPr>
+          <w:rFonts w:ascii="Consolas" w:eastAsia="Times New Roman" w:hAnsi="Consolas" w:cs="Times New Roman"/>
+          <w:color w:val="F8F8F2"/>
+          <w:sz w:val="23"/>
+          <w:szCs w:val="23"/>
+          <w:lang w:val="en-US" w:eastAsia="pt-BR"/>
+        </w:rPr>
+      </w:pPr>
+      <w:r>
+        <w:rPr>
+          <w:rFonts w:ascii="Consolas" w:eastAsia="Times New Roman" w:hAnsi="Consolas" w:cs="Times New Roman"/>
+          <w:color w:val="F8F8F2"/>
+          <w:sz w:val="23"/>
+          <w:szCs w:val="23"/>
+          <w:lang w:val="en-US" w:eastAsia="pt-BR"/>
+        </w:rPr>
+        <w:t xml:space="preserve">    </w:t>
+      </w:r>
+      <w:r>
+        <w:rPr>
+          <w:rFonts w:ascii="Consolas" w:eastAsia="Times New Roman" w:hAnsi="Consolas" w:cs="Times New Roman"/>
+          <w:color w:val="FF79C6"/>
+          <w:sz w:val="23"/>
+          <w:szCs w:val="23"/>
+          <w:lang w:val="en-US" w:eastAsia="pt-BR"/>
+        </w:rPr>
+        <w:t>let</w:t>
+      </w:r>
+      <w:r>
+        <w:rPr>
+          <w:rFonts w:ascii="Consolas" w:eastAsia="Times New Roman" w:hAnsi="Consolas" w:cs="Times New Roman"/>
+          <w:color w:val="F8F8F2"/>
+          <w:sz w:val="23"/>
+          <w:szCs w:val="23"/>
+          <w:lang w:val="en-US" w:eastAsia="pt-BR"/>
+        </w:rPr>
+        <w:t xml:space="preserve"> tam </w:t>
+      </w:r>
+      <w:r>
+        <w:rPr>
+          <w:rFonts w:ascii="Consolas" w:eastAsia="Times New Roman" w:hAnsi="Consolas" w:cs="Times New Roman"/>
+          <w:color w:val="FF79C6"/>
+          <w:sz w:val="23"/>
+          <w:szCs w:val="23"/>
+          <w:lang w:val="en-US" w:eastAsia="pt-BR"/>
+        </w:rPr>
+        <w:t>=</w:t>
+      </w:r>
+      <w:r>
+        <w:rPr>
+          <w:rFonts w:ascii="Consolas" w:eastAsia="Times New Roman" w:hAnsi="Consolas" w:cs="Times New Roman"/>
+          <w:color w:val="F8F8F2"/>
+          <w:sz w:val="23"/>
+          <w:szCs w:val="23"/>
+          <w:lang w:val="en-US" w:eastAsia="pt-BR"/>
+        </w:rPr>
+        <w:t xml:space="preserve"> </w:t>
+      </w:r>
+      <w:proofErr w:type="spellStart"/>
+      <w:proofErr w:type="gramStart"/>
+      <w:r>
+        <w:rPr>
+          <w:rFonts w:ascii="Consolas" w:eastAsia="Times New Roman" w:hAnsi="Consolas" w:cs="Times New Roman"/>
+          <w:i/>
+          <w:iCs/>
+          <w:color w:val="FFB86C"/>
+          <w:sz w:val="23"/>
+          <w:szCs w:val="23"/>
+          <w:lang w:val="en-US" w:eastAsia="pt-BR"/>
+        </w:rPr>
+        <w:t>valores</w:t>
+      </w:r>
+      <w:r>
+        <w:rPr>
+          <w:rFonts w:ascii="Consolas" w:eastAsia="Times New Roman" w:hAnsi="Consolas" w:cs="Times New Roman"/>
+          <w:color w:val="F8F8F2"/>
+          <w:sz w:val="23"/>
+          <w:szCs w:val="23"/>
+          <w:lang w:val="en-US" w:eastAsia="pt-BR"/>
+        </w:rPr>
+        <w:t>.length</w:t>
+      </w:r>
+      <w:proofErr w:type="spellEnd"/>
+      <w:proofErr w:type="gramEnd"/>
+    </w:p>
+    <w:p>
+      <w:pPr>
+        <w:shd w:val="clear" w:color="auto" w:fill="282A36"/>
+        <w:spacing w:after="0" w:line="300" w:lineRule="atLeast"/>
+        <w:rPr>
+          <w:rFonts w:ascii="Consolas" w:eastAsia="Times New Roman" w:hAnsi="Consolas" w:cs="Times New Roman"/>
+          <w:color w:val="F8F8F2"/>
+          <w:sz w:val="23"/>
+          <w:szCs w:val="23"/>
+          <w:lang w:eastAsia="pt-BR"/>
+        </w:rPr>
+      </w:pPr>
+      <w:r>
+        <w:rPr>
+          <w:rFonts w:ascii="Consolas" w:eastAsia="Times New Roman" w:hAnsi="Consolas" w:cs="Times New Roman"/>
+          <w:color w:val="F8F8F2"/>
+          <w:sz w:val="23"/>
+          <w:szCs w:val="23"/>
+          <w:lang w:val="en-US" w:eastAsia="pt-BR"/>
+        </w:rPr>
+        <w:t xml:space="preserve">    </w:t>
+      </w:r>
+      <w:proofErr w:type="spellStart"/>
+      <w:r>
+        <w:rPr>
+          <w:rFonts w:ascii="Consolas" w:eastAsia="Times New Roman" w:hAnsi="Consolas" w:cs="Times New Roman"/>
+          <w:color w:val="FF79C6"/>
+          <w:sz w:val="23"/>
+          <w:szCs w:val="23"/>
+          <w:lang w:eastAsia="pt-BR"/>
+        </w:rPr>
+        <w:t>let</w:t>
+      </w:r>
+      <w:proofErr w:type="spellEnd"/>
+      <w:r>
+        <w:rPr>
+          <w:rFonts w:ascii="Consolas" w:eastAsia="Times New Roman" w:hAnsi="Consolas" w:cs="Times New Roman"/>
+          <w:color w:val="F8F8F2"/>
+          <w:sz w:val="23"/>
+          <w:szCs w:val="23"/>
+          <w:lang w:eastAsia="pt-BR"/>
+        </w:rPr>
+        <w:t xml:space="preserve"> soma </w:t>
+      </w:r>
+      <w:r>
+        <w:rPr>
+          <w:rFonts w:ascii="Consolas" w:eastAsia="Times New Roman" w:hAnsi="Consolas" w:cs="Times New Roman"/>
+          <w:color w:val="FF79C6"/>
+          <w:sz w:val="23"/>
+          <w:szCs w:val="23"/>
+          <w:lang w:eastAsia="pt-BR"/>
+        </w:rPr>
+        <w:t>=</w:t>
+      </w:r>
+      <w:r>
+        <w:rPr>
+          <w:rFonts w:ascii="Consolas" w:eastAsia="Times New Roman" w:hAnsi="Consolas" w:cs="Times New Roman"/>
+          <w:color w:val="F8F8F2"/>
+          <w:sz w:val="23"/>
+          <w:szCs w:val="23"/>
+          <w:lang w:eastAsia="pt-BR"/>
+        </w:rPr>
+        <w:t xml:space="preserve"> </w:t>
+      </w:r>
+      <w:r>
+        <w:rPr>
+          <w:rFonts w:ascii="Consolas" w:eastAsia="Times New Roman" w:hAnsi="Consolas" w:cs="Times New Roman"/>
+          <w:color w:val="BD93F9"/>
+          <w:sz w:val="23"/>
+          <w:szCs w:val="23"/>
+          <w:lang w:eastAsia="pt-BR"/>
+        </w:rPr>
+        <w:t>0</w:t>
+      </w:r>
+    </w:p>
+    <w:p>
+      <w:pPr>
+        <w:shd w:val="clear" w:color="auto" w:fill="282A36"/>
+        <w:spacing w:after="0" w:line="300" w:lineRule="atLeast"/>
+        <w:rPr>
+          <w:rFonts w:ascii="Consolas" w:eastAsia="Times New Roman" w:hAnsi="Consolas" w:cs="Times New Roman"/>
+          <w:color w:val="F8F8F2"/>
+          <w:sz w:val="23"/>
+          <w:szCs w:val="23"/>
+          <w:lang w:eastAsia="pt-BR"/>
+        </w:rPr>
+      </w:pPr>
+      <w:r>
+        <w:rPr>
+          <w:rFonts w:ascii="Consolas" w:eastAsia="Times New Roman" w:hAnsi="Consolas" w:cs="Times New Roman"/>
+          <w:color w:val="F8F8F2"/>
+          <w:sz w:val="23"/>
+          <w:szCs w:val="23"/>
+          <w:lang w:eastAsia="pt-BR"/>
+        </w:rPr>
+        <w:t xml:space="preserve">    </w:t>
+      </w:r>
+      <w:r>
+        <w:rPr>
+          <w:rFonts w:ascii="Consolas" w:eastAsia="Times New Roman" w:hAnsi="Consolas" w:cs="Times New Roman"/>
+          <w:color w:val="FF79C6"/>
+          <w:sz w:val="23"/>
+          <w:szCs w:val="23"/>
+          <w:lang w:eastAsia="pt-BR"/>
+        </w:rPr>
+        <w:t>for</w:t>
+      </w:r>
+      <w:r>
+        <w:rPr>
+          <w:rFonts w:ascii="Consolas" w:eastAsia="Times New Roman" w:hAnsi="Consolas" w:cs="Times New Roman"/>
+          <w:color w:val="F8F8F2"/>
+          <w:sz w:val="23"/>
+          <w:szCs w:val="23"/>
+          <w:lang w:eastAsia="pt-BR"/>
+        </w:rPr>
+        <w:t xml:space="preserve"> (</w:t>
+      </w:r>
+      <w:proofErr w:type="spellStart"/>
+      <w:r>
+        <w:rPr>
+          <w:rFonts w:ascii="Consolas" w:eastAsia="Times New Roman" w:hAnsi="Consolas" w:cs="Times New Roman"/>
+          <w:color w:val="FF79C6"/>
+          <w:sz w:val="23"/>
+          <w:szCs w:val="23"/>
+          <w:lang w:eastAsia="pt-BR"/>
+        </w:rPr>
+        <w:t>let</w:t>
+      </w:r>
+      <w:proofErr w:type="spellEnd"/>
+      <w:r>
+        <w:rPr>
+          <w:rFonts w:ascii="Consolas" w:eastAsia="Times New Roman" w:hAnsi="Consolas" w:cs="Times New Roman"/>
+          <w:color w:val="F8F8F2"/>
+          <w:sz w:val="23"/>
+          <w:szCs w:val="23"/>
+          <w:lang w:eastAsia="pt-BR"/>
+        </w:rPr>
+        <w:t xml:space="preserve"> i </w:t>
+      </w:r>
+      <w:r>
+        <w:rPr>
+          <w:rFonts w:ascii="Consolas" w:eastAsia="Times New Roman" w:hAnsi="Consolas" w:cs="Times New Roman"/>
+          <w:color w:val="FF79C6"/>
+          <w:sz w:val="23"/>
+          <w:szCs w:val="23"/>
+          <w:lang w:eastAsia="pt-BR"/>
+        </w:rPr>
+        <w:t>=</w:t>
+      </w:r>
+      <w:r>
+        <w:rPr>
+          <w:rFonts w:ascii="Consolas" w:eastAsia="Times New Roman" w:hAnsi="Consolas" w:cs="Times New Roman"/>
+          <w:color w:val="F8F8F2"/>
+          <w:sz w:val="23"/>
+          <w:szCs w:val="23"/>
+          <w:lang w:eastAsia="pt-BR"/>
+        </w:rPr>
+        <w:t xml:space="preserve"> </w:t>
+      </w:r>
+      <w:proofErr w:type="gramStart"/>
+      <w:r>
+        <w:rPr>
+          <w:rFonts w:ascii="Consolas" w:eastAsia="Times New Roman" w:hAnsi="Consolas" w:cs="Times New Roman"/>
+          <w:color w:val="BD93F9"/>
+          <w:sz w:val="23"/>
+          <w:szCs w:val="23"/>
+          <w:lang w:eastAsia="pt-BR"/>
+        </w:rPr>
+        <w:t>0</w:t>
+      </w:r>
+      <w:r>
+        <w:rPr>
+          <w:rFonts w:ascii="Consolas" w:eastAsia="Times New Roman" w:hAnsi="Consolas" w:cs="Times New Roman"/>
+          <w:color w:val="F8F8F2"/>
+          <w:sz w:val="23"/>
+          <w:szCs w:val="23"/>
+          <w:lang w:eastAsia="pt-BR"/>
+        </w:rPr>
+        <w:t xml:space="preserve"> ;</w:t>
+      </w:r>
+      <w:proofErr w:type="gramEnd"/>
+      <w:r>
+        <w:rPr>
+          <w:rFonts w:ascii="Consolas" w:eastAsia="Times New Roman" w:hAnsi="Consolas" w:cs="Times New Roman"/>
+          <w:color w:val="F8F8F2"/>
+          <w:sz w:val="23"/>
+          <w:szCs w:val="23"/>
+          <w:lang w:eastAsia="pt-BR"/>
+        </w:rPr>
+        <w:t xml:space="preserve"> i </w:t>
+      </w:r>
+      <w:r>
+        <w:rPr>
+          <w:rFonts w:ascii="Consolas" w:eastAsia="Times New Roman" w:hAnsi="Consolas" w:cs="Times New Roman"/>
+          <w:color w:val="FF79C6"/>
+          <w:sz w:val="23"/>
+          <w:szCs w:val="23"/>
+          <w:lang w:eastAsia="pt-BR"/>
+        </w:rPr>
+        <w:t>&lt;</w:t>
+      </w:r>
+      <w:r>
+        <w:rPr>
+          <w:rFonts w:ascii="Consolas" w:eastAsia="Times New Roman" w:hAnsi="Consolas" w:cs="Times New Roman"/>
+          <w:color w:val="F8F8F2"/>
+          <w:sz w:val="23"/>
+          <w:szCs w:val="23"/>
+          <w:lang w:eastAsia="pt-BR"/>
+        </w:rPr>
+        <w:t xml:space="preserve"> </w:t>
+      </w:r>
+      <w:proofErr w:type="spellStart"/>
+      <w:r>
+        <w:rPr>
+          <w:rFonts w:ascii="Consolas" w:eastAsia="Times New Roman" w:hAnsi="Consolas" w:cs="Times New Roman"/>
+          <w:color w:val="F8F8F2"/>
+          <w:sz w:val="23"/>
+          <w:szCs w:val="23"/>
+          <w:lang w:eastAsia="pt-BR"/>
+        </w:rPr>
+        <w:t>tam</w:t>
+      </w:r>
+      <w:proofErr w:type="spellEnd"/>
+      <w:r>
+        <w:rPr>
+          <w:rFonts w:ascii="Consolas" w:eastAsia="Times New Roman" w:hAnsi="Consolas" w:cs="Times New Roman"/>
+          <w:color w:val="F8F8F2"/>
+          <w:sz w:val="23"/>
+          <w:szCs w:val="23"/>
+          <w:lang w:eastAsia="pt-BR"/>
+        </w:rPr>
+        <w:t>; i</w:t>
+      </w:r>
+      <w:r>
+        <w:rPr>
+          <w:rFonts w:ascii="Consolas" w:eastAsia="Times New Roman" w:hAnsi="Consolas" w:cs="Times New Roman"/>
+          <w:color w:val="FF79C6"/>
+          <w:sz w:val="23"/>
+          <w:szCs w:val="23"/>
+          <w:lang w:eastAsia="pt-BR"/>
+        </w:rPr>
+        <w:t>++</w:t>
+      </w:r>
+      <w:r>
+        <w:rPr>
+          <w:rFonts w:ascii="Consolas" w:eastAsia="Times New Roman" w:hAnsi="Consolas" w:cs="Times New Roman"/>
+          <w:color w:val="F8F8F2"/>
+          <w:sz w:val="23"/>
+          <w:szCs w:val="23"/>
+          <w:lang w:eastAsia="pt-BR"/>
+        </w:rPr>
+        <w:t>) {</w:t>
+      </w:r>
+    </w:p>
+    <w:p>
+      <w:pPr>
+        <w:shd w:val="clear" w:color="auto" w:fill="282A36"/>
+        <w:spacing w:after="0" w:line="300" w:lineRule="atLeast"/>
+        <w:rPr>
+          <w:rFonts w:ascii="Consolas" w:eastAsia="Times New Roman" w:hAnsi="Consolas" w:cs="Times New Roman"/>
+          <w:color w:val="F8F8F2"/>
+          <w:sz w:val="23"/>
+          <w:szCs w:val="23"/>
+          <w:lang w:eastAsia="pt-BR"/>
+        </w:rPr>
+      </w:pPr>
+      <w:r>
+        <w:rPr>
+          <w:rFonts w:ascii="Consolas" w:eastAsia="Times New Roman" w:hAnsi="Consolas" w:cs="Times New Roman"/>
+          <w:color w:val="F8F8F2"/>
+          <w:sz w:val="23"/>
+          <w:szCs w:val="23"/>
+          <w:lang w:eastAsia="pt-BR"/>
+        </w:rPr>
+        <w:t xml:space="preserve">        </w:t>
+      </w:r>
+      <w:r>
+        <w:rPr>
+          <w:rFonts w:ascii="Consolas" w:eastAsia="Times New Roman" w:hAnsi="Consolas" w:cs="Times New Roman"/>
+          <w:color w:val="F8F8F2"/>
+          <w:sz w:val="23"/>
+          <w:szCs w:val="23"/>
+          <w:lang w:eastAsia="pt-BR"/>
+        </w:rPr>
+        <w:t xml:space="preserve">soma </w:t>
+      </w:r>
+      <w:r>
+        <w:rPr>
+          <w:rFonts w:ascii="Consolas" w:eastAsia="Times New Roman" w:hAnsi="Consolas" w:cs="Times New Roman"/>
+          <w:color w:val="FF79C6"/>
+          <w:sz w:val="23"/>
+          <w:szCs w:val="23"/>
+          <w:lang w:eastAsia="pt-BR"/>
+        </w:rPr>
+        <w:t>+=</w:t>
+      </w:r>
+      <w:r>
+        <w:rPr>
+          <w:rFonts w:ascii="Consolas" w:eastAsia="Times New Roman" w:hAnsi="Consolas" w:cs="Times New Roman"/>
+          <w:color w:val="F8F8F2"/>
+          <w:sz w:val="23"/>
+          <w:szCs w:val="23"/>
+          <w:lang w:eastAsia="pt-BR"/>
+        </w:rPr>
+        <w:t xml:space="preserve"> </w:t>
+      </w:r>
+      <w:r>
+        <w:rPr>
+          <w:rFonts w:ascii="Consolas" w:eastAsia="Times New Roman" w:hAnsi="Consolas" w:cs="Times New Roman"/>
+          <w:i/>
+          <w:iCs/>
+          <w:color w:val="FFB86C"/>
+          <w:sz w:val="23"/>
+          <w:szCs w:val="23"/>
+          <w:lang w:eastAsia="pt-BR"/>
+        </w:rPr>
+        <w:t>valores</w:t>
+      </w:r>
+      <w:r>
+        <w:rPr>
+          <w:rFonts w:ascii="Consolas" w:eastAsia="Times New Roman" w:hAnsi="Consolas" w:cs="Times New Roman"/>
+          <w:color w:val="F8F8F2"/>
+          <w:sz w:val="23"/>
+          <w:szCs w:val="23"/>
+          <w:lang w:eastAsia="pt-BR"/>
+        </w:rPr>
+        <w:t>[i]</w:t>
+      </w:r>
+    </w:p>
+    <w:p>
+      <w:pPr>
+        <w:shd w:val="clear" w:color="auto" w:fill="282A36"/>
+        <w:spacing w:after="0" w:line="300" w:lineRule="atLeast"/>
+        <w:rPr>
+          <w:rFonts w:ascii="Consolas" w:eastAsia="Times New Roman" w:hAnsi="Consolas" w:cs="Times New Roman"/>
+          <w:color w:val="F8F8F2"/>
+          <w:sz w:val="23"/>
+          <w:szCs w:val="23"/>
+          <w:lang w:eastAsia="pt-BR"/>
+        </w:rPr>
+      </w:pPr>
+      <w:r>
+        <w:rPr>
+          <w:rFonts w:ascii="Consolas" w:eastAsia="Times New Roman" w:hAnsi="Consolas" w:cs="Times New Roman"/>
+          <w:color w:val="F8F8F2"/>
+          <w:sz w:val="23"/>
+          <w:szCs w:val="23"/>
+          <w:lang w:eastAsia="pt-BR"/>
+        </w:rPr>
+        <w:t>    }</w:t>
+      </w:r>
+    </w:p>
+    <w:p>
+      <w:pPr>
+        <w:shd w:val="clear" w:color="auto" w:fill="282A36"/>
+        <w:spacing w:after="0" w:line="300" w:lineRule="atLeast"/>
+        <w:rPr>
+          <w:rFonts w:ascii="Consolas" w:eastAsia="Times New Roman" w:hAnsi="Consolas" w:cs="Times New Roman"/>
+          <w:color w:val="F8F8F2"/>
+          <w:sz w:val="23"/>
+          <w:szCs w:val="23"/>
+          <w:lang w:eastAsia="pt-BR"/>
+        </w:rPr>
+      </w:pPr>
+      <w:r>
+        <w:rPr>
+          <w:rFonts w:ascii="Consolas" w:eastAsia="Times New Roman" w:hAnsi="Consolas" w:cs="Times New Roman"/>
+          <w:color w:val="F8F8F2"/>
+          <w:sz w:val="23"/>
+          <w:szCs w:val="23"/>
+          <w:lang w:eastAsia="pt-BR"/>
+        </w:rPr>
+        <w:t xml:space="preserve">    </w:t>
+      </w:r>
+      <w:r>
+        <w:rPr>
+          <w:rFonts w:ascii="Consolas" w:eastAsia="Times New Roman" w:hAnsi="Consolas" w:cs="Times New Roman"/>
+          <w:color w:val="FF79C6"/>
+          <w:sz w:val="23"/>
+          <w:szCs w:val="23"/>
+          <w:lang w:eastAsia="pt-BR"/>
+        </w:rPr>
+        <w:t>return</w:t>
+      </w:r>
+      <w:r>
+        <w:rPr>
+          <w:rFonts w:ascii="Consolas" w:eastAsia="Times New Roman" w:hAnsi="Consolas" w:cs="Times New Roman"/>
+          <w:color w:val="F8F8F2"/>
+          <w:sz w:val="23"/>
+          <w:szCs w:val="23"/>
+          <w:lang w:eastAsia="pt-BR"/>
+        </w:rPr>
+        <w:t xml:space="preserve"> soma</w:t>
+      </w:r>
+    </w:p>
+    <w:p>
+      <w:pPr>
+        <w:shd w:val="clear" w:color="auto" w:fill="282A36"/>
+        <w:spacing w:after="0" w:line="300" w:lineRule="atLeast"/>
+        <w:rPr>
+          <w:rFonts w:ascii="Consolas" w:eastAsia="Times New Roman" w:hAnsi="Consolas" w:cs="Times New Roman"/>
+          <w:color w:val="F8F8F2"/>
+          <w:sz w:val="23"/>
+          <w:szCs w:val="23"/>
+          <w:lang w:eastAsia="pt-BR"/>
+        </w:rPr>
+      </w:pPr>
+      <w:r>
+        <w:rPr>
+          <w:rFonts w:ascii="Consolas" w:eastAsia="Times New Roman" w:hAnsi="Consolas" w:cs="Times New Roman"/>
+          <w:color w:val="F8F8F2"/>
+          <w:sz w:val="23"/>
+          <w:szCs w:val="23"/>
+          <w:lang w:eastAsia="pt-BR"/>
+        </w:rPr>
+        <w:t>}</w:t>
+      </w:r>
+    </w:p>
+    <w:p>
+      <w:pPr>
+        <w:rPr>
+          <w:sz w:val="28"/>
+          <w:szCs w:val="28"/>
+        </w:rPr>
+      </w:pPr>
+    </w:p>
+    <w:p>
+      <w:pPr>
+        <w:rPr>
+          <w:color w:val="FF0000"/>
+          <w:sz w:val="36"/>
+          <w:szCs w:val="36"/>
+        </w:rPr>
+      </w:pPr>
+      <w:r>
+        <w:rPr>
+          <w:color w:val="FF0000"/>
+          <w:sz w:val="36"/>
+          <w:szCs w:val="36"/>
+        </w:rPr>
+        <w:t>Vídeo 2</w:t>
+      </w:r>
+      <w:r>
+        <w:rPr>
+          <w:color w:val="FF0000"/>
+          <w:sz w:val="36"/>
+          <w:szCs w:val="36"/>
+        </w:rPr>
+        <w:t>4</w:t>
+      </w:r>
+      <w:r>
+        <w:rPr>
+          <w:color w:val="FF0000"/>
+          <w:sz w:val="36"/>
+          <w:szCs w:val="36"/>
+        </w:rPr>
+        <w:t>.</w:t>
+      </w:r>
+    </w:p>
+    <w:p>
+      <w:pPr>
+        <w:rPr>
+          <w:sz w:val="28"/>
+          <w:szCs w:val="28"/>
+        </w:rPr>
+      </w:pPr>
+      <w:r>
+        <w:rPr>
+          <w:sz w:val="28"/>
+          <w:szCs w:val="28"/>
+        </w:rPr>
+        <w:t xml:space="preserve">Funções </w:t>
+      </w:r>
+      <w:proofErr w:type="gramStart"/>
+      <w:r>
+        <w:rPr>
+          <w:sz w:val="28"/>
+          <w:szCs w:val="28"/>
+        </w:rPr>
+        <w:t>Anônimas :</w:t>
+      </w:r>
+      <w:proofErr w:type="gramEnd"/>
+      <w:r>
+        <w:rPr>
+          <w:sz w:val="28"/>
+          <w:szCs w:val="28"/>
+        </w:rPr>
+        <w:t xml:space="preserve"> São funções que n</w:t>
+      </w:r>
+      <w:r>
+        <w:rPr>
+          <w:sz w:val="28"/>
+          <w:szCs w:val="28"/>
+        </w:rPr>
+        <w:t>ão</w:t>
+      </w:r>
+      <w:r>
+        <w:rPr>
+          <w:sz w:val="28"/>
+          <w:szCs w:val="28"/>
+        </w:rPr>
+        <w:t xml:space="preserve"> tem nome associado ao seu conteúdo. São funções chamadas a tempo de execução. Só sendo criada neste momento. Ela é igual uma função normal.</w:t>
+      </w:r>
+      <w:r>
+        <w:rPr>
+          <w:sz w:val="28"/>
+          <w:szCs w:val="28"/>
+        </w:rPr>
+        <w:t xml:space="preserve"> </w:t>
+      </w:r>
+    </w:p>
+    <w:p>
+      <w:pPr>
+        <w:rPr>
+          <w:sz w:val="28"/>
+          <w:szCs w:val="28"/>
+        </w:rPr>
+      </w:pPr>
+      <w:r>
+        <w:rPr>
+          <w:sz w:val="28"/>
+          <w:szCs w:val="28"/>
+        </w:rPr>
+        <w:t xml:space="preserve">E já que ela não tem nome, ela precisa estar associada a uma variável: </w:t>
+      </w:r>
+    </w:p>
+    <w:p>
+      <w:pPr>
+        <w:shd w:val="clear" w:color="auto" w:fill="282A36"/>
+        <w:spacing w:after="0" w:line="300" w:lineRule="atLeast"/>
+        <w:rPr>
+          <w:rFonts w:ascii="Consolas" w:eastAsia="Times New Roman" w:hAnsi="Consolas" w:cs="Times New Roman"/>
+          <w:color w:val="F8F8F2"/>
+          <w:sz w:val="23"/>
+          <w:szCs w:val="23"/>
+          <w:lang w:val="en-US" w:eastAsia="pt-BR"/>
+        </w:rPr>
+      </w:pPr>
+      <w:r>
+        <w:rPr>
+          <w:rFonts w:ascii="Consolas" w:eastAsia="Times New Roman" w:hAnsi="Consolas" w:cs="Times New Roman"/>
+          <w:color w:val="FF79C6"/>
+          <w:sz w:val="23"/>
+          <w:szCs w:val="23"/>
+          <w:lang w:val="en-US" w:eastAsia="pt-BR"/>
+        </w:rPr>
+        <w:t>let</w:t>
+      </w:r>
+      <w:r>
+        <w:rPr>
+          <w:rFonts w:ascii="Consolas" w:eastAsia="Times New Roman" w:hAnsi="Consolas" w:cs="Times New Roman"/>
+          <w:color w:val="F8F8F2"/>
+          <w:sz w:val="23"/>
+          <w:szCs w:val="23"/>
+          <w:lang w:val="en-US" w:eastAsia="pt-BR"/>
+        </w:rPr>
+        <w:t xml:space="preserve"> </w:t>
+      </w:r>
+      <w:r>
+        <w:rPr>
+          <w:rFonts w:ascii="Consolas" w:eastAsia="Times New Roman" w:hAnsi="Consolas" w:cs="Times New Roman"/>
+          <w:color w:val="50FA7B"/>
+          <w:sz w:val="23"/>
+          <w:szCs w:val="23"/>
+          <w:lang w:val="en-US" w:eastAsia="pt-BR"/>
+        </w:rPr>
+        <w:t>f</w:t>
+      </w:r>
+      <w:r>
+        <w:rPr>
+          <w:rFonts w:ascii="Consolas" w:eastAsia="Times New Roman" w:hAnsi="Consolas" w:cs="Times New Roman"/>
+          <w:color w:val="F8F8F2"/>
+          <w:sz w:val="23"/>
+          <w:szCs w:val="23"/>
+          <w:lang w:val="en-US" w:eastAsia="pt-BR"/>
+        </w:rPr>
+        <w:t xml:space="preserve"> </w:t>
+      </w:r>
+      <w:r>
+        <w:rPr>
+          <w:rFonts w:ascii="Consolas" w:eastAsia="Times New Roman" w:hAnsi="Consolas" w:cs="Times New Roman"/>
+          <w:color w:val="FF79C6"/>
+          <w:sz w:val="23"/>
+          <w:szCs w:val="23"/>
+          <w:lang w:val="en-US" w:eastAsia="pt-BR"/>
+        </w:rPr>
+        <w:t>=</w:t>
+      </w:r>
+      <w:r>
+        <w:rPr>
+          <w:rFonts w:ascii="Consolas" w:eastAsia="Times New Roman" w:hAnsi="Consolas" w:cs="Times New Roman"/>
+          <w:color w:val="F8F8F2"/>
+          <w:sz w:val="23"/>
+          <w:szCs w:val="23"/>
+          <w:lang w:val="en-US" w:eastAsia="pt-BR"/>
+        </w:rPr>
+        <w:t xml:space="preserve"> </w:t>
+      </w:r>
+      <w:r>
+        <w:rPr>
+          <w:rFonts w:ascii="Consolas" w:eastAsia="Times New Roman" w:hAnsi="Consolas" w:cs="Times New Roman"/>
+          <w:color w:val="FF79C6"/>
+          <w:sz w:val="23"/>
+          <w:szCs w:val="23"/>
+          <w:lang w:val="en-US" w:eastAsia="pt-BR"/>
+        </w:rPr>
+        <w:t>function</w:t>
+      </w:r>
+      <w:r>
+        <w:rPr>
+          <w:rFonts w:ascii="Consolas" w:eastAsia="Times New Roman" w:hAnsi="Consolas" w:cs="Times New Roman"/>
+          <w:color w:val="F8F8F2"/>
+          <w:sz w:val="23"/>
+          <w:szCs w:val="23"/>
+          <w:lang w:val="en-US" w:eastAsia="pt-BR"/>
+        </w:rPr>
+        <w:t xml:space="preserve"> (</w:t>
+      </w:r>
+      <w:r>
+        <w:rPr>
+          <w:rFonts w:ascii="Consolas" w:eastAsia="Times New Roman" w:hAnsi="Consolas" w:cs="Times New Roman"/>
+          <w:i/>
+          <w:iCs/>
+          <w:color w:val="FFB86C"/>
+          <w:sz w:val="23"/>
+          <w:szCs w:val="23"/>
+          <w:lang w:val="en-US" w:eastAsia="pt-BR"/>
+        </w:rPr>
+        <w:t>v1</w:t>
+      </w:r>
+      <w:r>
+        <w:rPr>
+          <w:rFonts w:ascii="Consolas" w:eastAsia="Times New Roman" w:hAnsi="Consolas" w:cs="Times New Roman"/>
+          <w:color w:val="F8F8F2"/>
+          <w:sz w:val="23"/>
+          <w:szCs w:val="23"/>
+          <w:lang w:val="en-US" w:eastAsia="pt-BR"/>
+        </w:rPr>
+        <w:t xml:space="preserve">, </w:t>
+      </w:r>
+      <w:r>
+        <w:rPr>
+          <w:rFonts w:ascii="Consolas" w:eastAsia="Times New Roman" w:hAnsi="Consolas" w:cs="Times New Roman"/>
+          <w:i/>
+          <w:iCs/>
+          <w:color w:val="FFB86C"/>
+          <w:sz w:val="23"/>
+          <w:szCs w:val="23"/>
+          <w:lang w:val="en-US" w:eastAsia="pt-BR"/>
+        </w:rPr>
+        <w:t>v2</w:t>
+      </w:r>
+      <w:r>
+        <w:rPr>
+          <w:rFonts w:ascii="Consolas" w:eastAsia="Times New Roman" w:hAnsi="Consolas" w:cs="Times New Roman"/>
+          <w:color w:val="F8F8F2"/>
+          <w:sz w:val="23"/>
+          <w:szCs w:val="23"/>
+          <w:lang w:val="en-US" w:eastAsia="pt-BR"/>
+        </w:rPr>
+        <w:t>) {</w:t>
+      </w:r>
+    </w:p>
+    <w:p>
+      <w:pPr>
+        <w:shd w:val="clear" w:color="auto" w:fill="282A36"/>
+        <w:spacing w:after="0" w:line="300" w:lineRule="atLeast"/>
+        <w:rPr>
+          <w:rFonts w:ascii="Consolas" w:eastAsia="Times New Roman" w:hAnsi="Consolas" w:cs="Times New Roman"/>
+          <w:color w:val="F8F8F2"/>
+          <w:sz w:val="23"/>
+          <w:szCs w:val="23"/>
+          <w:lang w:eastAsia="pt-BR"/>
+        </w:rPr>
+      </w:pPr>
+      <w:r>
+        <w:rPr>
+          <w:rFonts w:ascii="Consolas" w:eastAsia="Times New Roman" w:hAnsi="Consolas" w:cs="Times New Roman"/>
+          <w:color w:val="F8F8F2"/>
+          <w:sz w:val="23"/>
+          <w:szCs w:val="23"/>
+          <w:lang w:val="en-US" w:eastAsia="pt-BR"/>
+        </w:rPr>
+        <w:t xml:space="preserve">    </w:t>
+      </w:r>
+      <w:r>
+        <w:rPr>
+          <w:rFonts w:ascii="Consolas" w:eastAsia="Times New Roman" w:hAnsi="Consolas" w:cs="Times New Roman"/>
+          <w:color w:val="FF79C6"/>
+          <w:sz w:val="23"/>
+          <w:szCs w:val="23"/>
+          <w:lang w:eastAsia="pt-BR"/>
+        </w:rPr>
+        <w:t>return</w:t>
+      </w:r>
+      <w:r>
+        <w:rPr>
+          <w:rFonts w:ascii="Consolas" w:eastAsia="Times New Roman" w:hAnsi="Consolas" w:cs="Times New Roman"/>
+          <w:color w:val="F8F8F2"/>
+          <w:sz w:val="23"/>
+          <w:szCs w:val="23"/>
+          <w:lang w:eastAsia="pt-BR"/>
+        </w:rPr>
+        <w:t xml:space="preserve"> </w:t>
+      </w:r>
+      <w:r>
+        <w:rPr>
+          <w:rFonts w:ascii="Consolas" w:eastAsia="Times New Roman" w:hAnsi="Consolas" w:cs="Times New Roman"/>
+          <w:i/>
+          <w:iCs/>
+          <w:color w:val="FFB86C"/>
+          <w:sz w:val="23"/>
+          <w:szCs w:val="23"/>
+          <w:lang w:eastAsia="pt-BR"/>
+        </w:rPr>
+        <w:t>v1</w:t>
+      </w:r>
+      <w:r>
+        <w:rPr>
+          <w:rFonts w:ascii="Consolas" w:eastAsia="Times New Roman" w:hAnsi="Consolas" w:cs="Times New Roman"/>
+          <w:color w:val="F8F8F2"/>
+          <w:sz w:val="23"/>
+          <w:szCs w:val="23"/>
+          <w:lang w:eastAsia="pt-BR"/>
+        </w:rPr>
+        <w:t xml:space="preserve"> </w:t>
+      </w:r>
+      <w:r>
+        <w:rPr>
+          <w:rFonts w:ascii="Consolas" w:eastAsia="Times New Roman" w:hAnsi="Consolas" w:cs="Times New Roman"/>
+          <w:color w:val="FF79C6"/>
+          <w:sz w:val="23"/>
+          <w:szCs w:val="23"/>
+          <w:lang w:eastAsia="pt-BR"/>
+        </w:rPr>
+        <w:t>+</w:t>
+      </w:r>
+      <w:r>
+        <w:rPr>
+          <w:rFonts w:ascii="Consolas" w:eastAsia="Times New Roman" w:hAnsi="Consolas" w:cs="Times New Roman"/>
+          <w:color w:val="F8F8F2"/>
+          <w:sz w:val="23"/>
+          <w:szCs w:val="23"/>
+          <w:lang w:eastAsia="pt-BR"/>
+        </w:rPr>
+        <w:t xml:space="preserve"> </w:t>
+      </w:r>
+      <w:r>
+        <w:rPr>
+          <w:rFonts w:ascii="Consolas" w:eastAsia="Times New Roman" w:hAnsi="Consolas" w:cs="Times New Roman"/>
+          <w:i/>
+          <w:iCs/>
+          <w:color w:val="FFB86C"/>
+          <w:sz w:val="23"/>
+          <w:szCs w:val="23"/>
+          <w:lang w:eastAsia="pt-BR"/>
+        </w:rPr>
+        <w:t>v2</w:t>
+      </w:r>
+    </w:p>
+    <w:p>
+      <w:pPr>
+        <w:shd w:val="clear" w:color="auto" w:fill="282A36"/>
+        <w:spacing w:after="0" w:line="300" w:lineRule="atLeast"/>
+        <w:rPr>
+          <w:rFonts w:ascii="Consolas" w:eastAsia="Times New Roman" w:hAnsi="Consolas" w:cs="Times New Roman"/>
+          <w:color w:val="F8F8F2"/>
+          <w:sz w:val="23"/>
+          <w:szCs w:val="23"/>
+          <w:lang w:eastAsia="pt-BR"/>
+        </w:rPr>
+      </w:pPr>
+      <w:r>
+        <w:rPr>
+          <w:rFonts w:ascii="Consolas" w:eastAsia="Times New Roman" w:hAnsi="Consolas" w:cs="Times New Roman"/>
+          <w:color w:val="F8F8F2"/>
+          <w:sz w:val="23"/>
+          <w:szCs w:val="23"/>
+          <w:lang w:eastAsia="pt-BR"/>
+        </w:rPr>
+        <w:t>}</w:t>
+      </w:r>
+    </w:p>
+    <w:p>
+      <w:pPr>
+        <w:rPr>
+          <w:sz w:val="28"/>
+          <w:szCs w:val="28"/>
+        </w:rPr>
+      </w:pPr>
+    </w:p>
+    <w:p>
+      <w:pPr>
+        <w:rPr>
+          <w:sz w:val="28"/>
+          <w:szCs w:val="28"/>
+        </w:rPr>
+      </w:pPr>
+      <w:r>
+        <w:rPr>
+          <w:sz w:val="28"/>
+          <w:szCs w:val="28"/>
+        </w:rPr>
+        <w:lastRenderedPageBreak/>
+        <w:t xml:space="preserve">Função construtor: Serve para funções mais simples. Ela funciona como um construtor de classes, sendo instanciada com o operador new. </w:t>
+      </w:r>
+    </w:p>
+    <w:p>
+      <w:pPr>
+        <w:rPr>
+          <w:sz w:val="28"/>
+          <w:szCs w:val="28"/>
+        </w:rPr>
+      </w:pPr>
+      <w:r>
+        <w:rPr>
+          <w:sz w:val="28"/>
+          <w:szCs w:val="28"/>
+        </w:rPr>
+        <w:t xml:space="preserve">A palavra function precisa começar com a letra “F” maiúscula. </w:t>
+      </w:r>
+    </w:p>
+    <w:p>
+      <w:pPr>
+        <w:shd w:val="clear" w:color="auto" w:fill="282A36"/>
+        <w:spacing w:after="0" w:line="300" w:lineRule="atLeast"/>
+        <w:rPr>
+          <w:rFonts w:ascii="Consolas" w:eastAsia="Times New Roman" w:hAnsi="Consolas" w:cs="Times New Roman"/>
+          <w:color w:val="F8F8F2"/>
+          <w:sz w:val="23"/>
+          <w:szCs w:val="23"/>
+          <w:lang w:val="en-US" w:eastAsia="pt-BR"/>
+        </w:rPr>
+      </w:pPr>
+      <w:r>
+        <w:rPr>
+          <w:rFonts w:ascii="Consolas" w:eastAsia="Times New Roman" w:hAnsi="Consolas" w:cs="Times New Roman"/>
+          <w:color w:val="FF79C6"/>
+          <w:sz w:val="23"/>
+          <w:szCs w:val="23"/>
+          <w:lang w:val="en-US" w:eastAsia="pt-BR"/>
+        </w:rPr>
+        <w:t>let</w:t>
+      </w:r>
+      <w:r>
+        <w:rPr>
+          <w:rFonts w:ascii="Consolas" w:eastAsia="Times New Roman" w:hAnsi="Consolas" w:cs="Times New Roman"/>
+          <w:color w:val="F8F8F2"/>
+          <w:sz w:val="23"/>
+          <w:szCs w:val="23"/>
+          <w:lang w:val="en-US" w:eastAsia="pt-BR"/>
+        </w:rPr>
+        <w:t xml:space="preserve"> f2 </w:t>
+      </w:r>
+      <w:r>
+        <w:rPr>
+          <w:rFonts w:ascii="Consolas" w:eastAsia="Times New Roman" w:hAnsi="Consolas" w:cs="Times New Roman"/>
+          <w:color w:val="FF79C6"/>
+          <w:sz w:val="23"/>
+          <w:szCs w:val="23"/>
+          <w:lang w:val="en-US" w:eastAsia="pt-BR"/>
+        </w:rPr>
+        <w:t>=</w:t>
+      </w:r>
+      <w:r>
+        <w:rPr>
+          <w:rFonts w:ascii="Consolas" w:eastAsia="Times New Roman" w:hAnsi="Consolas" w:cs="Times New Roman"/>
+          <w:color w:val="F8F8F2"/>
+          <w:sz w:val="23"/>
+          <w:szCs w:val="23"/>
+          <w:lang w:val="en-US" w:eastAsia="pt-BR"/>
+        </w:rPr>
+        <w:t xml:space="preserve"> </w:t>
+      </w:r>
+      <w:r>
+        <w:rPr>
+          <w:rFonts w:ascii="Consolas" w:eastAsia="Times New Roman" w:hAnsi="Consolas" w:cs="Times New Roman"/>
+          <w:b/>
+          <w:bCs/>
+          <w:color w:val="FF79C6"/>
+          <w:sz w:val="23"/>
+          <w:szCs w:val="23"/>
+          <w:lang w:val="en-US" w:eastAsia="pt-BR"/>
+        </w:rPr>
+        <w:t>new</w:t>
+      </w:r>
+      <w:r>
+        <w:rPr>
+          <w:rFonts w:ascii="Consolas" w:eastAsia="Times New Roman" w:hAnsi="Consolas" w:cs="Times New Roman"/>
+          <w:color w:val="F8F8F2"/>
+          <w:sz w:val="23"/>
+          <w:szCs w:val="23"/>
+          <w:lang w:val="en-US" w:eastAsia="pt-BR"/>
+        </w:rPr>
+        <w:t xml:space="preserve"> </w:t>
+      </w:r>
+      <w:proofErr w:type="gramStart"/>
+      <w:r>
+        <w:rPr>
+          <w:rFonts w:ascii="Consolas" w:eastAsia="Times New Roman" w:hAnsi="Consolas" w:cs="Times New Roman"/>
+          <w:i/>
+          <w:iCs/>
+          <w:color w:val="8BE9FD"/>
+          <w:sz w:val="23"/>
+          <w:szCs w:val="23"/>
+          <w:lang w:val="en-US" w:eastAsia="pt-BR"/>
+        </w:rPr>
+        <w:t>Function</w:t>
+      </w:r>
+      <w:r>
+        <w:rPr>
+          <w:rFonts w:ascii="Consolas" w:eastAsia="Times New Roman" w:hAnsi="Consolas" w:cs="Times New Roman"/>
+          <w:color w:val="F8F8F2"/>
+          <w:sz w:val="23"/>
+          <w:szCs w:val="23"/>
+          <w:lang w:val="en-US" w:eastAsia="pt-BR"/>
+        </w:rPr>
+        <w:t>(</w:t>
+      </w:r>
+      <w:proofErr w:type="gramEnd"/>
+      <w:r>
+        <w:rPr>
+          <w:rFonts w:ascii="Consolas" w:eastAsia="Times New Roman" w:hAnsi="Consolas" w:cs="Times New Roman"/>
+          <w:color w:val="E9F284"/>
+          <w:sz w:val="23"/>
+          <w:szCs w:val="23"/>
+          <w:lang w:val="en-US" w:eastAsia="pt-BR"/>
+        </w:rPr>
+        <w:t>"</w:t>
+      </w:r>
+      <w:r>
+        <w:rPr>
+          <w:rFonts w:ascii="Consolas" w:eastAsia="Times New Roman" w:hAnsi="Consolas" w:cs="Times New Roman"/>
+          <w:color w:val="F1FA8C"/>
+          <w:sz w:val="23"/>
+          <w:szCs w:val="23"/>
+          <w:lang w:val="en-US" w:eastAsia="pt-BR"/>
+        </w:rPr>
+        <w:t>v1</w:t>
+      </w:r>
+      <w:r>
+        <w:rPr>
+          <w:rFonts w:ascii="Consolas" w:eastAsia="Times New Roman" w:hAnsi="Consolas" w:cs="Times New Roman"/>
+          <w:color w:val="E9F284"/>
+          <w:sz w:val="23"/>
+          <w:szCs w:val="23"/>
+          <w:lang w:val="en-US" w:eastAsia="pt-BR"/>
+        </w:rPr>
+        <w:t>"</w:t>
+      </w:r>
+      <w:r>
+        <w:rPr>
+          <w:rFonts w:ascii="Consolas" w:eastAsia="Times New Roman" w:hAnsi="Consolas" w:cs="Times New Roman"/>
+          <w:color w:val="F8F8F2"/>
+          <w:sz w:val="23"/>
+          <w:szCs w:val="23"/>
+          <w:lang w:val="en-US" w:eastAsia="pt-BR"/>
+        </w:rPr>
+        <w:t xml:space="preserve">, </w:t>
+      </w:r>
+      <w:r>
+        <w:rPr>
+          <w:rFonts w:ascii="Consolas" w:eastAsia="Times New Roman" w:hAnsi="Consolas" w:cs="Times New Roman"/>
+          <w:color w:val="E9F284"/>
+          <w:sz w:val="23"/>
+          <w:szCs w:val="23"/>
+          <w:lang w:val="en-US" w:eastAsia="pt-BR"/>
+        </w:rPr>
+        <w:t>"</w:t>
+      </w:r>
+      <w:r>
+        <w:rPr>
+          <w:rFonts w:ascii="Consolas" w:eastAsia="Times New Roman" w:hAnsi="Consolas" w:cs="Times New Roman"/>
+          <w:color w:val="F1FA8C"/>
+          <w:sz w:val="23"/>
+          <w:szCs w:val="23"/>
+          <w:lang w:val="en-US" w:eastAsia="pt-BR"/>
+        </w:rPr>
+        <w:t>v2</w:t>
+      </w:r>
+      <w:r>
+        <w:rPr>
+          <w:rFonts w:ascii="Consolas" w:eastAsia="Times New Roman" w:hAnsi="Consolas" w:cs="Times New Roman"/>
+          <w:color w:val="E9F284"/>
+          <w:sz w:val="23"/>
+          <w:szCs w:val="23"/>
+          <w:lang w:val="en-US" w:eastAsia="pt-BR"/>
+        </w:rPr>
+        <w:t>"</w:t>
+      </w:r>
+      <w:r>
+        <w:rPr>
+          <w:rFonts w:ascii="Consolas" w:eastAsia="Times New Roman" w:hAnsi="Consolas" w:cs="Times New Roman"/>
+          <w:color w:val="F8F8F2"/>
+          <w:sz w:val="23"/>
+          <w:szCs w:val="23"/>
+          <w:lang w:val="en-US" w:eastAsia="pt-BR"/>
+        </w:rPr>
+        <w:t xml:space="preserve">, </w:t>
+      </w:r>
+      <w:r>
+        <w:rPr>
+          <w:rFonts w:ascii="Consolas" w:eastAsia="Times New Roman" w:hAnsi="Consolas" w:cs="Times New Roman"/>
+          <w:color w:val="E9F284"/>
+          <w:sz w:val="23"/>
+          <w:szCs w:val="23"/>
+          <w:lang w:val="en-US" w:eastAsia="pt-BR"/>
+        </w:rPr>
+        <w:t>"</w:t>
+      </w:r>
+      <w:r>
+        <w:rPr>
+          <w:rFonts w:ascii="Consolas" w:eastAsia="Times New Roman" w:hAnsi="Consolas" w:cs="Times New Roman"/>
+          <w:color w:val="F1FA8C"/>
+          <w:sz w:val="23"/>
+          <w:szCs w:val="23"/>
+          <w:lang w:val="en-US" w:eastAsia="pt-BR"/>
+        </w:rPr>
+        <w:t>return v1 + v2</w:t>
+      </w:r>
+      <w:r>
+        <w:rPr>
+          <w:rFonts w:ascii="Consolas" w:eastAsia="Times New Roman" w:hAnsi="Consolas" w:cs="Times New Roman"/>
+          <w:color w:val="E9F284"/>
+          <w:sz w:val="23"/>
+          <w:szCs w:val="23"/>
+          <w:lang w:val="en-US" w:eastAsia="pt-BR"/>
+        </w:rPr>
+        <w:t>"</w:t>
+      </w:r>
+      <w:r>
+        <w:rPr>
+          <w:rFonts w:ascii="Consolas" w:eastAsia="Times New Roman" w:hAnsi="Consolas" w:cs="Times New Roman"/>
+          <w:color w:val="F8F8F2"/>
+          <w:sz w:val="23"/>
+          <w:szCs w:val="23"/>
+          <w:lang w:val="en-US" w:eastAsia="pt-BR"/>
+        </w:rPr>
+        <w:t>)</w:t>
+      </w:r>
+    </w:p>
+    <w:p>
+      <w:pPr>
+        <w:rPr>
+          <w:sz w:val="28"/>
+          <w:szCs w:val="28"/>
+          <w:lang w:val="en-US"/>
+        </w:rPr>
+      </w:pPr>
+    </w:p>
+    <w:p>
+      <w:pPr>
+        <w:rPr>
+          <w:color w:val="FF0000"/>
+          <w:sz w:val="36"/>
+          <w:szCs w:val="36"/>
+        </w:rPr>
+      </w:pPr>
+      <w:r>
+        <w:rPr>
+          <w:color w:val="FF0000"/>
+          <w:sz w:val="36"/>
+          <w:szCs w:val="36"/>
+        </w:rPr>
+        <w:t>Vídeo 2</w:t>
+      </w:r>
+      <w:r>
+        <w:rPr>
+          <w:color w:val="FF0000"/>
+          <w:sz w:val="36"/>
+          <w:szCs w:val="36"/>
+        </w:rPr>
+        <w:t>5</w:t>
+      </w:r>
+      <w:r>
+        <w:rPr>
+          <w:color w:val="FF0000"/>
+          <w:sz w:val="36"/>
+          <w:szCs w:val="36"/>
+        </w:rPr>
+        <w:t>.</w:t>
+      </w:r>
+    </w:p>
+    <w:p>
+      <w:pPr>
+        <w:rPr>
+          <w:color w:val="FF0000"/>
+          <w:sz w:val="36"/>
+          <w:szCs w:val="36"/>
+        </w:rPr>
+      </w:pPr>
+      <w:r>
+        <w:rPr>
+          <w:sz w:val="28"/>
+          <w:szCs w:val="28"/>
+        </w:rPr>
+        <w:t>Arrow Function =&gt; Nome técnico: Funções lambdas</w:t>
+      </w:r>
+      <w:r>
+        <w:rPr>
+          <w:sz w:val="28"/>
+          <w:szCs w:val="28"/>
+        </w:rPr>
+        <w:t xml:space="preserve">. </w:t>
+      </w:r>
+      <w:r>
+        <w:rPr>
+          <w:sz w:val="28"/>
+          <w:szCs w:val="28"/>
+        </w:rPr>
+        <w:t xml:space="preserve">É um tipo de declaram de função </w:t>
+      </w:r>
+      <w:proofErr w:type="gramStart"/>
+      <w:r>
+        <w:rPr>
+          <w:sz w:val="28"/>
+          <w:szCs w:val="28"/>
+        </w:rPr>
+        <w:t xml:space="preserve">anônima </w:t>
+      </w:r>
+      <w:r>
+        <w:rPr>
+          <w:sz w:val="28"/>
+          <w:szCs w:val="28"/>
+        </w:rPr>
+        <w:t>.</w:t>
+      </w:r>
+      <w:proofErr w:type="gramEnd"/>
+    </w:p>
+    <w:p>
+      <w:pPr>
+        <w:rPr>
+          <w:sz w:val="28"/>
+          <w:szCs w:val="28"/>
+        </w:rPr>
+      </w:pPr>
+    </w:p>
+    <w:p>
+      <w:pPr>
+        <w:rPr>
+          <w:color w:val="FF0000"/>
+          <w:sz w:val="36"/>
+          <w:szCs w:val="36"/>
+        </w:rPr>
+      </w:pPr>
+      <w:r>
+        <w:rPr>
+          <w:color w:val="FF0000"/>
+          <w:sz w:val="36"/>
+          <w:szCs w:val="36"/>
+        </w:rPr>
+        <w:t>Vídeo 2</w:t>
+      </w:r>
+      <w:r>
+        <w:rPr>
+          <w:color w:val="FF0000"/>
+          <w:sz w:val="36"/>
+          <w:szCs w:val="36"/>
+        </w:rPr>
+        <w:t>6</w:t>
+      </w:r>
+      <w:r>
+        <w:rPr>
+          <w:color w:val="FF0000"/>
+          <w:sz w:val="36"/>
+          <w:szCs w:val="36"/>
+        </w:rPr>
+        <w:t>.</w:t>
+      </w:r>
+    </w:p>
+    <w:p>
+      <w:pPr>
+        <w:rPr>
+          <w:sz w:val="28"/>
+          <w:szCs w:val="28"/>
+        </w:rPr>
+      </w:pPr>
+      <w:r>
+        <w:rPr>
+          <w:sz w:val="28"/>
+          <w:szCs w:val="28"/>
+        </w:rPr>
+        <w:t>Basicamente funções dentro de funções.</w:t>
+      </w:r>
+    </w:p>
+    <w:p>
+      <w:pPr>
+        <w:rPr>
+          <w:sz w:val="28"/>
+          <w:szCs w:val="28"/>
+        </w:rPr>
+      </w:pPr>
+    </w:p>
+    <w:p>
+      <w:pPr>
+        <w:rPr>
+          <w:color w:val="FF0000"/>
+          <w:sz w:val="36"/>
+          <w:szCs w:val="36"/>
+        </w:rPr>
+      </w:pPr>
+      <w:r>
+        <w:rPr>
+          <w:color w:val="FF0000"/>
+          <w:sz w:val="36"/>
+          <w:szCs w:val="36"/>
+        </w:rPr>
+        <w:t>Vídeo 27.</w:t>
+      </w:r>
+    </w:p>
+    <w:p>
+      <w:pPr>
+        <w:rPr>
+          <w:sz w:val="28"/>
+          <w:szCs w:val="28"/>
+        </w:rPr>
+      </w:pPr>
+      <w:r>
+        <w:rPr>
+          <w:sz w:val="28"/>
+          <w:szCs w:val="28"/>
+        </w:rPr>
+        <w:t xml:space="preserve">Funções geradoras: Tem o retorno adiado ate o momento que precisar dele. Elas são usadas muito em sistemas assíncronos. </w:t>
+      </w:r>
+    </w:p>
+    <w:p>
+      <w:pPr>
+        <w:rPr>
+          <w:color w:val="FF0000"/>
+          <w:sz w:val="36"/>
+          <w:szCs w:val="36"/>
+        </w:rPr>
+      </w:pPr>
+      <w:r>
+        <w:rPr>
+          <w:sz w:val="28"/>
+          <w:szCs w:val="28"/>
+        </w:rPr>
+        <w:br/>
+        <w:t xml:space="preserve">Para declarar uma função geradora: </w:t>
+      </w:r>
+    </w:p>
+    <w:p>
+      <w:pPr>
+        <w:shd w:val="clear" w:color="auto" w:fill="282A36"/>
+        <w:spacing w:after="0" w:line="300" w:lineRule="atLeast"/>
+        <w:rPr>
+          <w:rFonts w:ascii="Consolas" w:eastAsia="Times New Roman" w:hAnsi="Consolas" w:cs="Times New Roman"/>
+          <w:color w:val="F8F8F2"/>
+          <w:sz w:val="23"/>
+          <w:szCs w:val="23"/>
+          <w:lang w:val="en-US" w:eastAsia="pt-BR"/>
+        </w:rPr>
+      </w:pPr>
+      <w:r>
+        <w:rPr>
+          <w:rFonts w:ascii="Consolas" w:eastAsia="Times New Roman" w:hAnsi="Consolas" w:cs="Times New Roman"/>
+          <w:color w:val="FF79C6"/>
+          <w:sz w:val="23"/>
+          <w:szCs w:val="23"/>
+          <w:lang w:val="en-US" w:eastAsia="pt-BR"/>
+        </w:rPr>
+        <w:t>function*</w:t>
+      </w:r>
+      <w:r>
+        <w:rPr>
+          <w:rFonts w:ascii="Consolas" w:eastAsia="Times New Roman" w:hAnsi="Consolas" w:cs="Times New Roman"/>
+          <w:color w:val="F8F8F2"/>
+          <w:sz w:val="23"/>
+          <w:szCs w:val="23"/>
+          <w:lang w:val="en-US" w:eastAsia="pt-BR"/>
+        </w:rPr>
+        <w:t xml:space="preserve"> </w:t>
+      </w:r>
+      <w:proofErr w:type="gramStart"/>
+      <w:r>
+        <w:rPr>
+          <w:rFonts w:ascii="Consolas" w:eastAsia="Times New Roman" w:hAnsi="Consolas" w:cs="Times New Roman"/>
+          <w:color w:val="50FA7B"/>
+          <w:sz w:val="23"/>
+          <w:szCs w:val="23"/>
+          <w:lang w:val="en-US" w:eastAsia="pt-BR"/>
+        </w:rPr>
+        <w:t>cores</w:t>
+      </w:r>
+      <w:r>
+        <w:rPr>
+          <w:rFonts w:ascii="Consolas" w:eastAsia="Times New Roman" w:hAnsi="Consolas" w:cs="Times New Roman"/>
+          <w:color w:val="F8F8F2"/>
+          <w:sz w:val="23"/>
+          <w:szCs w:val="23"/>
+          <w:lang w:val="en-US" w:eastAsia="pt-BR"/>
+        </w:rPr>
+        <w:t>(</w:t>
+      </w:r>
+      <w:proofErr w:type="gramEnd"/>
+      <w:r>
+        <w:rPr>
+          <w:rFonts w:ascii="Consolas" w:eastAsia="Times New Roman" w:hAnsi="Consolas" w:cs="Times New Roman"/>
+          <w:color w:val="F8F8F2"/>
+          <w:sz w:val="23"/>
+          <w:szCs w:val="23"/>
+          <w:lang w:val="en-US" w:eastAsia="pt-BR"/>
+        </w:rPr>
+        <w:t>) {</w:t>
+      </w:r>
+    </w:p>
+    <w:p>
+      <w:pPr>
+        <w:shd w:val="clear" w:color="auto" w:fill="282A36"/>
+        <w:spacing w:after="0" w:line="300" w:lineRule="atLeast"/>
+        <w:ind w:firstLine="708"/>
+        <w:rPr>
+          <w:rFonts w:ascii="Consolas" w:eastAsia="Times New Roman" w:hAnsi="Consolas" w:cs="Times New Roman"/>
+          <w:color w:val="F8F8F2"/>
+          <w:sz w:val="23"/>
+          <w:szCs w:val="23"/>
+          <w:lang w:val="en-US" w:eastAsia="pt-BR"/>
+        </w:rPr>
+      </w:pPr>
+      <w:r>
+        <w:rPr>
+          <w:rFonts w:ascii="Consolas" w:eastAsia="Times New Roman" w:hAnsi="Consolas" w:cs="Times New Roman"/>
+          <w:color w:val="FF79C6"/>
+          <w:sz w:val="23"/>
+          <w:szCs w:val="23"/>
+          <w:lang w:val="en-US" w:eastAsia="pt-BR"/>
+        </w:rPr>
+        <w:t>yield</w:t>
+      </w:r>
+      <w:r>
+        <w:rPr>
+          <w:rFonts w:ascii="Consolas" w:eastAsia="Times New Roman" w:hAnsi="Consolas" w:cs="Times New Roman"/>
+          <w:color w:val="F8F8F2"/>
+          <w:sz w:val="23"/>
+          <w:szCs w:val="23"/>
+          <w:lang w:val="en-US" w:eastAsia="pt-BR"/>
+        </w:rPr>
+        <w:t xml:space="preserve"> </w:t>
+      </w:r>
+      <w:r>
+        <w:rPr>
+          <w:rFonts w:ascii="Consolas" w:eastAsia="Times New Roman" w:hAnsi="Consolas" w:cs="Times New Roman"/>
+          <w:color w:val="E9F284"/>
+          <w:sz w:val="23"/>
+          <w:szCs w:val="23"/>
+          <w:lang w:val="en-US" w:eastAsia="pt-BR"/>
+        </w:rPr>
+        <w:t>'</w:t>
+      </w:r>
+      <w:r>
+        <w:rPr>
+          <w:rFonts w:ascii="Consolas" w:eastAsia="Times New Roman" w:hAnsi="Consolas" w:cs="Times New Roman"/>
+          <w:color w:val="F1FA8C"/>
+          <w:sz w:val="23"/>
+          <w:szCs w:val="23"/>
+          <w:lang w:val="en-US" w:eastAsia="pt-BR"/>
+        </w:rPr>
+        <w:t>Vermelho</w:t>
+      </w:r>
+      <w:r>
+        <w:rPr>
+          <w:rFonts w:ascii="Consolas" w:eastAsia="Times New Roman" w:hAnsi="Consolas" w:cs="Times New Roman"/>
+          <w:color w:val="E9F284"/>
+          <w:sz w:val="23"/>
+          <w:szCs w:val="23"/>
+          <w:lang w:val="en-US" w:eastAsia="pt-BR"/>
+        </w:rPr>
+        <w:t>'</w:t>
+      </w:r>
+    </w:p>
+    <w:p>
+      <w:pPr>
+        <w:shd w:val="clear" w:color="auto" w:fill="282A36"/>
+        <w:spacing w:after="0" w:line="300" w:lineRule="atLeast"/>
+        <w:rPr>
+          <w:rFonts w:ascii="Consolas" w:eastAsia="Times New Roman" w:hAnsi="Consolas" w:cs="Times New Roman"/>
+          <w:color w:val="F8F8F2"/>
+          <w:sz w:val="23"/>
+          <w:szCs w:val="23"/>
+          <w:lang w:val="en-US" w:eastAsia="pt-BR"/>
+        </w:rPr>
+      </w:pPr>
+      <w:r>
+        <w:rPr>
+          <w:rFonts w:ascii="Consolas" w:eastAsia="Times New Roman" w:hAnsi="Consolas" w:cs="Times New Roman"/>
+          <w:color w:val="F8F8F2"/>
+          <w:sz w:val="23"/>
+          <w:szCs w:val="23"/>
+          <w:lang w:val="en-US" w:eastAsia="pt-BR"/>
+        </w:rPr>
+        <w:t xml:space="preserve">    </w:t>
+      </w:r>
+      <w:r>
+        <w:rPr>
+          <w:rFonts w:ascii="Consolas" w:eastAsia="Times New Roman" w:hAnsi="Consolas" w:cs="Times New Roman"/>
+          <w:color w:val="F8F8F2"/>
+          <w:sz w:val="23"/>
+          <w:szCs w:val="23"/>
+          <w:lang w:val="en-US" w:eastAsia="pt-BR"/>
+        </w:rPr>
+        <w:tab/>
+      </w:r>
+      <w:r>
+        <w:rPr>
+          <w:rFonts w:ascii="Consolas" w:eastAsia="Times New Roman" w:hAnsi="Consolas" w:cs="Times New Roman"/>
+          <w:color w:val="FF79C6"/>
+          <w:sz w:val="23"/>
+          <w:szCs w:val="23"/>
+          <w:lang w:val="en-US" w:eastAsia="pt-BR"/>
+        </w:rPr>
+        <w:t>yield</w:t>
+      </w:r>
+      <w:r>
+        <w:rPr>
+          <w:rFonts w:ascii="Consolas" w:eastAsia="Times New Roman" w:hAnsi="Consolas" w:cs="Times New Roman"/>
+          <w:color w:val="F8F8F2"/>
+          <w:sz w:val="23"/>
+          <w:szCs w:val="23"/>
+          <w:lang w:val="en-US" w:eastAsia="pt-BR"/>
+        </w:rPr>
+        <w:t xml:space="preserve"> </w:t>
+      </w:r>
+      <w:r>
+        <w:rPr>
+          <w:rFonts w:ascii="Consolas" w:eastAsia="Times New Roman" w:hAnsi="Consolas" w:cs="Times New Roman"/>
+          <w:color w:val="E9F284"/>
+          <w:sz w:val="23"/>
+          <w:szCs w:val="23"/>
+          <w:lang w:val="en-US" w:eastAsia="pt-BR"/>
+        </w:rPr>
+        <w:t>'</w:t>
+      </w:r>
+      <w:r>
+        <w:rPr>
+          <w:rFonts w:ascii="Consolas" w:eastAsia="Times New Roman" w:hAnsi="Consolas" w:cs="Times New Roman"/>
+          <w:color w:val="F1FA8C"/>
+          <w:sz w:val="23"/>
+          <w:szCs w:val="23"/>
+          <w:lang w:val="en-US" w:eastAsia="pt-BR"/>
+        </w:rPr>
+        <w:t>Verde</w:t>
+      </w:r>
+      <w:r>
+        <w:rPr>
+          <w:rFonts w:ascii="Consolas" w:eastAsia="Times New Roman" w:hAnsi="Consolas" w:cs="Times New Roman"/>
+          <w:color w:val="E9F284"/>
+          <w:sz w:val="23"/>
+          <w:szCs w:val="23"/>
+          <w:lang w:val="en-US" w:eastAsia="pt-BR"/>
+        </w:rPr>
+        <w:t>'</w:t>
+      </w:r>
+    </w:p>
+    <w:p>
+      <w:pPr>
+        <w:shd w:val="clear" w:color="auto" w:fill="282A36"/>
+        <w:spacing w:after="0" w:line="300" w:lineRule="atLeast"/>
+        <w:rPr>
+          <w:rFonts w:ascii="Consolas" w:eastAsia="Times New Roman" w:hAnsi="Consolas" w:cs="Times New Roman"/>
+          <w:color w:val="F8F8F2"/>
+          <w:sz w:val="23"/>
+          <w:szCs w:val="23"/>
+          <w:lang w:eastAsia="pt-BR"/>
+        </w:rPr>
+      </w:pPr>
+      <w:r>
+        <w:rPr>
+          <w:rFonts w:ascii="Consolas" w:eastAsia="Times New Roman" w:hAnsi="Consolas" w:cs="Times New Roman"/>
+          <w:color w:val="F8F8F2"/>
+          <w:sz w:val="23"/>
+          <w:szCs w:val="23"/>
+          <w:lang w:val="en-US" w:eastAsia="pt-BR"/>
+        </w:rPr>
+        <w:t xml:space="preserve">    </w:t>
+      </w:r>
+      <w:r>
+        <w:rPr>
+          <w:rFonts w:ascii="Consolas" w:eastAsia="Times New Roman" w:hAnsi="Consolas" w:cs="Times New Roman"/>
+          <w:color w:val="F8F8F2"/>
+          <w:sz w:val="23"/>
+          <w:szCs w:val="23"/>
+          <w:lang w:val="en-US" w:eastAsia="pt-BR"/>
+        </w:rPr>
+        <w:tab/>
+      </w:r>
+      <w:r>
+        <w:rPr>
+          <w:rFonts w:ascii="Consolas" w:eastAsia="Times New Roman" w:hAnsi="Consolas" w:cs="Times New Roman"/>
+          <w:color w:val="FF79C6"/>
+          <w:sz w:val="23"/>
+          <w:szCs w:val="23"/>
+          <w:lang w:eastAsia="pt-BR"/>
+        </w:rPr>
+        <w:t>yield</w:t>
+      </w:r>
+      <w:r>
+        <w:rPr>
+          <w:rFonts w:ascii="Consolas" w:eastAsia="Times New Roman" w:hAnsi="Consolas" w:cs="Times New Roman"/>
+          <w:color w:val="F8F8F2"/>
+          <w:sz w:val="23"/>
+          <w:szCs w:val="23"/>
+          <w:lang w:eastAsia="pt-BR"/>
+        </w:rPr>
+        <w:t xml:space="preserve"> </w:t>
+      </w:r>
+      <w:r>
+        <w:rPr>
+          <w:rFonts w:ascii="Consolas" w:eastAsia="Times New Roman" w:hAnsi="Consolas" w:cs="Times New Roman"/>
+          <w:color w:val="E9F284"/>
+          <w:sz w:val="23"/>
+          <w:szCs w:val="23"/>
+          <w:lang w:eastAsia="pt-BR"/>
+        </w:rPr>
+        <w:t>'</w:t>
+      </w:r>
+      <w:r>
+        <w:rPr>
+          <w:rFonts w:ascii="Consolas" w:eastAsia="Times New Roman" w:hAnsi="Consolas" w:cs="Times New Roman"/>
+          <w:color w:val="F1FA8C"/>
+          <w:sz w:val="23"/>
+          <w:szCs w:val="23"/>
+          <w:lang w:eastAsia="pt-BR"/>
+        </w:rPr>
+        <w:t>Azul</w:t>
+      </w:r>
+      <w:r>
+        <w:rPr>
+          <w:rFonts w:ascii="Consolas" w:eastAsia="Times New Roman" w:hAnsi="Consolas" w:cs="Times New Roman"/>
+          <w:color w:val="E9F284"/>
+          <w:sz w:val="23"/>
+          <w:szCs w:val="23"/>
+          <w:lang w:eastAsia="pt-BR"/>
+        </w:rPr>
+        <w:t>'</w:t>
+      </w:r>
+    </w:p>
+    <w:p>
+      <w:pPr>
+        <w:shd w:val="clear" w:color="auto" w:fill="282A36"/>
+        <w:spacing w:after="0" w:line="300" w:lineRule="atLeast"/>
+        <w:rPr>
+          <w:rFonts w:ascii="Consolas" w:eastAsia="Times New Roman" w:hAnsi="Consolas" w:cs="Times New Roman"/>
+          <w:color w:val="F8F8F2"/>
+          <w:sz w:val="23"/>
+          <w:szCs w:val="23"/>
+          <w:lang w:eastAsia="pt-BR"/>
+        </w:rPr>
+      </w:pPr>
+      <w:r>
+        <w:rPr>
+          <w:rFonts w:ascii="Consolas" w:eastAsia="Times New Roman" w:hAnsi="Consolas" w:cs="Times New Roman"/>
+          <w:color w:val="F8F8F2"/>
+          <w:sz w:val="23"/>
+          <w:szCs w:val="23"/>
+          <w:lang w:eastAsia="pt-BR"/>
+        </w:rPr>
+        <w:t>}</w:t>
+      </w:r>
+    </w:p>
+    <w:p>
+      <w:pPr>
+        <w:rPr>
+          <w:sz w:val="28"/>
+          <w:szCs w:val="28"/>
+        </w:rPr>
+      </w:pPr>
+      <w:r>
+        <w:rPr>
+          <w:sz w:val="28"/>
+          <w:szCs w:val="28"/>
+        </w:rPr>
+        <w:t xml:space="preserve">Só colocar um </w:t>
+      </w:r>
+      <w:r>
+        <w:rPr>
+          <w:sz w:val="28"/>
+          <w:szCs w:val="28"/>
+        </w:rPr>
+        <w:t>asterisco</w:t>
+      </w:r>
+      <w:r>
+        <w:rPr>
+          <w:sz w:val="28"/>
+          <w:szCs w:val="28"/>
+        </w:rPr>
+        <w:t xml:space="preserve"> * </w:t>
+      </w:r>
+    </w:p>
+    <w:p>
+      <w:pPr>
+        <w:rPr>
+          <w:sz w:val="28"/>
+          <w:szCs w:val="28"/>
+        </w:rPr>
+      </w:pPr>
+      <w:proofErr w:type="gramStart"/>
+      <w:r>
+        <w:rPr>
+          <w:sz w:val="28"/>
+          <w:szCs w:val="28"/>
+        </w:rPr>
+        <w:t>Yield :</w:t>
+      </w:r>
+      <w:proofErr w:type="gramEnd"/>
+      <w:r>
+        <w:rPr>
+          <w:sz w:val="28"/>
+          <w:szCs w:val="28"/>
+        </w:rPr>
+        <w:t xml:space="preserve"> É o retorno da função, então na PRIMEIRA vez que ele rodar ele vai retornar Vermelho, na segunda verde e assim sucessivamente </w:t>
+      </w:r>
+    </w:p>
+    <w:p>
+      <w:pPr>
+        <w:rPr>
+          <w:color w:val="FF0000"/>
+          <w:sz w:val="36"/>
+          <w:szCs w:val="36"/>
+          <w:lang w:val="en-US"/>
+        </w:rPr>
+      </w:pPr>
+      <w:r>
+        <w:rPr>
+          <w:sz w:val="28"/>
+          <w:szCs w:val="28"/>
+        </w:rPr>
+        <w:t xml:space="preserve">Exemplo de como chamar: </w:t>
+      </w:r>
+    </w:p>
+    <w:p>
+      <w:pPr>
+        <w:shd w:val="clear" w:color="auto" w:fill="282A36"/>
+        <w:spacing w:after="0" w:line="300" w:lineRule="atLeast"/>
+        <w:rPr>
+          <w:rFonts w:ascii="Consolas" w:eastAsia="Times New Roman" w:hAnsi="Consolas" w:cs="Times New Roman"/>
+          <w:color w:val="F8F8F2"/>
+          <w:sz w:val="23"/>
+          <w:szCs w:val="23"/>
+          <w:lang w:val="en-US" w:eastAsia="pt-BR"/>
+        </w:rPr>
+      </w:pPr>
+      <w:r>
+        <w:rPr>
+          <w:rFonts w:ascii="Consolas" w:eastAsia="Times New Roman" w:hAnsi="Consolas" w:cs="Times New Roman"/>
+          <w:color w:val="BD93F9"/>
+          <w:sz w:val="23"/>
+          <w:szCs w:val="23"/>
+          <w:lang w:val="en-US" w:eastAsia="pt-BR"/>
+        </w:rPr>
+        <w:t>console</w:t>
+      </w:r>
+      <w:r>
+        <w:rPr>
+          <w:rFonts w:ascii="Consolas" w:eastAsia="Times New Roman" w:hAnsi="Consolas" w:cs="Times New Roman"/>
+          <w:color w:val="F8F8F2"/>
+          <w:sz w:val="23"/>
+          <w:szCs w:val="23"/>
+          <w:lang w:val="en-US" w:eastAsia="pt-BR"/>
+        </w:rPr>
+        <w:t>.</w:t>
+      </w:r>
+      <w:r>
+        <w:rPr>
+          <w:rFonts w:ascii="Consolas" w:eastAsia="Times New Roman" w:hAnsi="Consolas" w:cs="Times New Roman"/>
+          <w:color w:val="50FA7B"/>
+          <w:sz w:val="23"/>
+          <w:szCs w:val="23"/>
+          <w:lang w:val="en-US" w:eastAsia="pt-BR"/>
+        </w:rPr>
+        <w:t>log</w:t>
+      </w:r>
+      <w:r>
+        <w:rPr>
+          <w:rFonts w:ascii="Consolas" w:eastAsia="Times New Roman" w:hAnsi="Consolas" w:cs="Times New Roman"/>
+          <w:color w:val="F8F8F2"/>
+          <w:sz w:val="23"/>
+          <w:szCs w:val="23"/>
+          <w:lang w:val="en-US" w:eastAsia="pt-BR"/>
+        </w:rPr>
+        <w:t>(</w:t>
+      </w:r>
+      <w:proofErr w:type="spellStart"/>
+      <w:proofErr w:type="gramStart"/>
+      <w:r>
+        <w:rPr>
+          <w:rFonts w:ascii="Consolas" w:eastAsia="Times New Roman" w:hAnsi="Consolas" w:cs="Times New Roman"/>
+          <w:color w:val="BD93F9"/>
+          <w:sz w:val="23"/>
+          <w:szCs w:val="23"/>
+          <w:lang w:val="en-US" w:eastAsia="pt-BR"/>
+        </w:rPr>
+        <w:t>itc</w:t>
+      </w:r>
+      <w:r>
+        <w:rPr>
+          <w:rFonts w:ascii="Consolas" w:eastAsia="Times New Roman" w:hAnsi="Consolas" w:cs="Times New Roman"/>
+          <w:color w:val="F8F8F2"/>
+          <w:sz w:val="23"/>
+          <w:szCs w:val="23"/>
+          <w:lang w:val="en-US" w:eastAsia="pt-BR"/>
+        </w:rPr>
+        <w:t>.</w:t>
+      </w:r>
+      <w:r>
+        <w:rPr>
+          <w:rFonts w:ascii="Consolas" w:eastAsia="Times New Roman" w:hAnsi="Consolas" w:cs="Times New Roman"/>
+          <w:color w:val="50FA7B"/>
+          <w:sz w:val="23"/>
+          <w:szCs w:val="23"/>
+          <w:lang w:val="en-US" w:eastAsia="pt-BR"/>
+        </w:rPr>
+        <w:t>next</w:t>
+      </w:r>
+      <w:proofErr w:type="spellEnd"/>
+      <w:proofErr w:type="gramEnd"/>
+      <w:r>
+        <w:rPr>
+          <w:rFonts w:ascii="Consolas" w:eastAsia="Times New Roman" w:hAnsi="Consolas" w:cs="Times New Roman"/>
+          <w:color w:val="F8F8F2"/>
+          <w:sz w:val="23"/>
+          <w:szCs w:val="23"/>
+          <w:lang w:val="en-US" w:eastAsia="pt-BR"/>
+        </w:rPr>
+        <w:t>().value)</w:t>
+      </w:r>
+    </w:p>
+    <w:p>
+      <w:pPr>
+        <w:shd w:val="clear" w:color="auto" w:fill="282A36"/>
+        <w:spacing w:after="0" w:line="300" w:lineRule="atLeast"/>
+        <w:rPr>
+          <w:rFonts w:ascii="Consolas" w:eastAsia="Times New Roman" w:hAnsi="Consolas" w:cs="Times New Roman"/>
+          <w:color w:val="F8F8F2"/>
+          <w:sz w:val="23"/>
+          <w:szCs w:val="23"/>
+          <w:lang w:val="en-US" w:eastAsia="pt-BR"/>
+        </w:rPr>
+      </w:pPr>
+      <w:r>
+        <w:rPr>
+          <w:rFonts w:ascii="Consolas" w:eastAsia="Times New Roman" w:hAnsi="Consolas" w:cs="Times New Roman"/>
+          <w:color w:val="BD93F9"/>
+          <w:sz w:val="23"/>
+          <w:szCs w:val="23"/>
+          <w:lang w:val="en-US" w:eastAsia="pt-BR"/>
+        </w:rPr>
+        <w:t>console</w:t>
+      </w:r>
+      <w:r>
+        <w:rPr>
+          <w:rFonts w:ascii="Consolas" w:eastAsia="Times New Roman" w:hAnsi="Consolas" w:cs="Times New Roman"/>
+          <w:color w:val="F8F8F2"/>
+          <w:sz w:val="23"/>
+          <w:szCs w:val="23"/>
+          <w:lang w:val="en-US" w:eastAsia="pt-BR"/>
+        </w:rPr>
+        <w:t>.</w:t>
+      </w:r>
+      <w:r>
+        <w:rPr>
+          <w:rFonts w:ascii="Consolas" w:eastAsia="Times New Roman" w:hAnsi="Consolas" w:cs="Times New Roman"/>
+          <w:color w:val="50FA7B"/>
+          <w:sz w:val="23"/>
+          <w:szCs w:val="23"/>
+          <w:lang w:val="en-US" w:eastAsia="pt-BR"/>
+        </w:rPr>
+        <w:t>log</w:t>
+      </w:r>
+      <w:r>
+        <w:rPr>
+          <w:rFonts w:ascii="Consolas" w:eastAsia="Times New Roman" w:hAnsi="Consolas" w:cs="Times New Roman"/>
+          <w:color w:val="F8F8F2"/>
+          <w:sz w:val="23"/>
+          <w:szCs w:val="23"/>
+          <w:lang w:val="en-US" w:eastAsia="pt-BR"/>
+        </w:rPr>
+        <w:t>(</w:t>
+      </w:r>
+      <w:proofErr w:type="spellStart"/>
+      <w:proofErr w:type="gramStart"/>
+      <w:r>
+        <w:rPr>
+          <w:rFonts w:ascii="Consolas" w:eastAsia="Times New Roman" w:hAnsi="Consolas" w:cs="Times New Roman"/>
+          <w:color w:val="BD93F9"/>
+          <w:sz w:val="23"/>
+          <w:szCs w:val="23"/>
+          <w:lang w:val="en-US" w:eastAsia="pt-BR"/>
+        </w:rPr>
+        <w:t>itc</w:t>
+      </w:r>
+      <w:r>
+        <w:rPr>
+          <w:rFonts w:ascii="Consolas" w:eastAsia="Times New Roman" w:hAnsi="Consolas" w:cs="Times New Roman"/>
+          <w:color w:val="F8F8F2"/>
+          <w:sz w:val="23"/>
+          <w:szCs w:val="23"/>
+          <w:lang w:val="en-US" w:eastAsia="pt-BR"/>
+        </w:rPr>
+        <w:t>.</w:t>
+      </w:r>
+      <w:r>
+        <w:rPr>
+          <w:rFonts w:ascii="Consolas" w:eastAsia="Times New Roman" w:hAnsi="Consolas" w:cs="Times New Roman"/>
+          <w:color w:val="50FA7B"/>
+          <w:sz w:val="23"/>
+          <w:szCs w:val="23"/>
+          <w:lang w:val="en-US" w:eastAsia="pt-BR"/>
+        </w:rPr>
+        <w:t>next</w:t>
+      </w:r>
+      <w:proofErr w:type="spellEnd"/>
+      <w:proofErr w:type="gramEnd"/>
+      <w:r>
+        <w:rPr>
+          <w:rFonts w:ascii="Consolas" w:eastAsia="Times New Roman" w:hAnsi="Consolas" w:cs="Times New Roman"/>
+          <w:color w:val="F8F8F2"/>
+          <w:sz w:val="23"/>
+          <w:szCs w:val="23"/>
+          <w:lang w:val="en-US" w:eastAsia="pt-BR"/>
+        </w:rPr>
+        <w:t>().value)</w:t>
+      </w:r>
+    </w:p>
+    <w:p>
+      <w:pPr>
+        <w:shd w:val="clear" w:color="auto" w:fill="282A36"/>
+        <w:spacing w:after="0" w:line="300" w:lineRule="atLeast"/>
+        <w:rPr>
+          <w:rFonts w:ascii="Consolas" w:eastAsia="Times New Roman" w:hAnsi="Consolas" w:cs="Times New Roman"/>
+          <w:color w:val="F8F8F2"/>
+          <w:sz w:val="23"/>
+          <w:szCs w:val="23"/>
+          <w:lang w:val="en-US" w:eastAsia="pt-BR"/>
+        </w:rPr>
+      </w:pPr>
+      <w:r>
+        <w:rPr>
+          <w:rFonts w:ascii="Consolas" w:eastAsia="Times New Roman" w:hAnsi="Consolas" w:cs="Times New Roman"/>
+          <w:color w:val="BD93F9"/>
+          <w:sz w:val="23"/>
+          <w:szCs w:val="23"/>
+          <w:lang w:val="en-US" w:eastAsia="pt-BR"/>
+        </w:rPr>
+        <w:t>console</w:t>
+      </w:r>
+      <w:r>
+        <w:rPr>
+          <w:rFonts w:ascii="Consolas" w:eastAsia="Times New Roman" w:hAnsi="Consolas" w:cs="Times New Roman"/>
+          <w:color w:val="F8F8F2"/>
+          <w:sz w:val="23"/>
+          <w:szCs w:val="23"/>
+          <w:lang w:val="en-US" w:eastAsia="pt-BR"/>
+        </w:rPr>
+        <w:t>.</w:t>
+      </w:r>
+      <w:r>
+        <w:rPr>
+          <w:rFonts w:ascii="Consolas" w:eastAsia="Times New Roman" w:hAnsi="Consolas" w:cs="Times New Roman"/>
+          <w:color w:val="50FA7B"/>
+          <w:sz w:val="23"/>
+          <w:szCs w:val="23"/>
+          <w:lang w:val="en-US" w:eastAsia="pt-BR"/>
+        </w:rPr>
+        <w:t>log</w:t>
+      </w:r>
+      <w:r>
+        <w:rPr>
+          <w:rFonts w:ascii="Consolas" w:eastAsia="Times New Roman" w:hAnsi="Consolas" w:cs="Times New Roman"/>
+          <w:color w:val="F8F8F2"/>
+          <w:sz w:val="23"/>
+          <w:szCs w:val="23"/>
+          <w:lang w:val="en-US" w:eastAsia="pt-BR"/>
+        </w:rPr>
+        <w:t>(</w:t>
+      </w:r>
+      <w:proofErr w:type="spellStart"/>
+      <w:proofErr w:type="gramStart"/>
+      <w:r>
+        <w:rPr>
+          <w:rFonts w:ascii="Consolas" w:eastAsia="Times New Roman" w:hAnsi="Consolas" w:cs="Times New Roman"/>
+          <w:color w:val="BD93F9"/>
+          <w:sz w:val="23"/>
+          <w:szCs w:val="23"/>
+          <w:lang w:val="en-US" w:eastAsia="pt-BR"/>
+        </w:rPr>
+        <w:t>itc</w:t>
+      </w:r>
+      <w:r>
+        <w:rPr>
+          <w:rFonts w:ascii="Consolas" w:eastAsia="Times New Roman" w:hAnsi="Consolas" w:cs="Times New Roman"/>
+          <w:color w:val="F8F8F2"/>
+          <w:sz w:val="23"/>
+          <w:szCs w:val="23"/>
+          <w:lang w:val="en-US" w:eastAsia="pt-BR"/>
+        </w:rPr>
+        <w:t>.</w:t>
+      </w:r>
+      <w:r>
+        <w:rPr>
+          <w:rFonts w:ascii="Consolas" w:eastAsia="Times New Roman" w:hAnsi="Consolas" w:cs="Times New Roman"/>
+          <w:color w:val="50FA7B"/>
+          <w:sz w:val="23"/>
+          <w:szCs w:val="23"/>
+          <w:lang w:val="en-US" w:eastAsia="pt-BR"/>
+        </w:rPr>
+        <w:t>next</w:t>
+      </w:r>
+      <w:proofErr w:type="spellEnd"/>
+      <w:proofErr w:type="gramEnd"/>
+      <w:r>
+        <w:rPr>
+          <w:rFonts w:ascii="Consolas" w:eastAsia="Times New Roman" w:hAnsi="Consolas" w:cs="Times New Roman"/>
+          <w:color w:val="F8F8F2"/>
+          <w:sz w:val="23"/>
+          <w:szCs w:val="23"/>
+          <w:lang w:val="en-US" w:eastAsia="pt-BR"/>
+        </w:rPr>
+        <w:t>().value)</w:t>
+      </w:r>
+    </w:p>
+    <w:p>
+      <w:pPr>
+        <w:rPr>
+          <w:color w:val="FF0000"/>
+          <w:sz w:val="36"/>
+          <w:szCs w:val="36"/>
+          <w:lang w:val="en-US"/>
+        </w:rPr>
+      </w:pPr>
+    </w:p>
+    <w:p>
+      <w:pPr>
+        <w:rPr>
+          <w:color w:val="FF0000"/>
+          <w:sz w:val="36"/>
+          <w:szCs w:val="36"/>
+          <w:lang w:val="en-US"/>
+        </w:rPr>
+      </w:pPr>
+    </w:p>
+    <w:p>
+      <w:pPr>
+        <w:shd w:val="clear" w:color="auto" w:fill="282A36"/>
+        <w:spacing w:after="0" w:line="300" w:lineRule="atLeast"/>
+        <w:rPr>
+          <w:rFonts w:ascii="Consolas" w:eastAsia="Times New Roman" w:hAnsi="Consolas" w:cs="Times New Roman"/>
+          <w:color w:val="F8F8F2"/>
+          <w:sz w:val="23"/>
+          <w:szCs w:val="23"/>
+          <w:lang w:eastAsia="pt-BR"/>
+        </w:rPr>
+      </w:pPr>
+      <w:r>
+        <w:rPr>
+          <w:rFonts w:ascii="Consolas" w:eastAsia="Times New Roman" w:hAnsi="Consolas" w:cs="Times New Roman"/>
+          <w:color w:val="FF79C6"/>
+          <w:sz w:val="23"/>
+          <w:szCs w:val="23"/>
+          <w:lang w:eastAsia="pt-BR"/>
+        </w:rPr>
+        <w:lastRenderedPageBreak/>
+        <w:t>function*</w:t>
+      </w:r>
+      <w:r>
+        <w:rPr>
+          <w:rFonts w:ascii="Consolas" w:eastAsia="Times New Roman" w:hAnsi="Consolas" w:cs="Times New Roman"/>
+          <w:color w:val="F8F8F2"/>
+          <w:sz w:val="23"/>
+          <w:szCs w:val="23"/>
+          <w:lang w:eastAsia="pt-BR"/>
+        </w:rPr>
+        <w:t xml:space="preserve"> </w:t>
+      </w:r>
+      <w:r>
+        <w:rPr>
+          <w:rFonts w:ascii="Consolas" w:eastAsia="Times New Roman" w:hAnsi="Consolas" w:cs="Times New Roman"/>
+          <w:color w:val="50FA7B"/>
+          <w:sz w:val="23"/>
+          <w:szCs w:val="23"/>
+          <w:lang w:eastAsia="pt-BR"/>
+        </w:rPr>
+        <w:t>pergun</w:t>
+      </w:r>
+      <w:bookmarkStart w:id="0" w:name="_GoBack"/>
+      <w:bookmarkEnd w:id="0"/>
+      <w:r>
+        <w:rPr>
+          <w:rFonts w:ascii="Consolas" w:eastAsia="Times New Roman" w:hAnsi="Consolas" w:cs="Times New Roman"/>
+          <w:color w:val="50FA7B"/>
+          <w:sz w:val="23"/>
+          <w:szCs w:val="23"/>
+          <w:lang w:eastAsia="pt-BR"/>
+        </w:rPr>
+        <w:t>ta</w:t>
+      </w:r>
+      <w:r>
+        <w:rPr>
+          <w:rFonts w:ascii="Consolas" w:eastAsia="Times New Roman" w:hAnsi="Consolas" w:cs="Times New Roman"/>
+          <w:color w:val="F8F8F2"/>
+          <w:sz w:val="23"/>
+          <w:szCs w:val="23"/>
+          <w:lang w:eastAsia="pt-BR"/>
+        </w:rPr>
+        <w:t>() {</w:t>
+      </w:r>
+    </w:p>
+    <w:p>
+      <w:pPr>
+        <w:shd w:val="clear" w:color="auto" w:fill="282A36"/>
+        <w:spacing w:after="0" w:line="300" w:lineRule="atLeast"/>
+        <w:rPr>
+          <w:rFonts w:ascii="Consolas" w:eastAsia="Times New Roman" w:hAnsi="Consolas" w:cs="Times New Roman"/>
+          <w:color w:val="F8F8F2"/>
+          <w:sz w:val="23"/>
+          <w:szCs w:val="23"/>
+          <w:lang w:eastAsia="pt-BR"/>
+        </w:rPr>
+      </w:pPr>
+      <w:r>
+        <w:rPr>
+          <w:rFonts w:ascii="Consolas" w:eastAsia="Times New Roman" w:hAnsi="Consolas" w:cs="Times New Roman"/>
+          <w:color w:val="F8F8F2"/>
+          <w:sz w:val="23"/>
+          <w:szCs w:val="23"/>
+          <w:lang w:eastAsia="pt-BR"/>
+        </w:rPr>
+        <w:t xml:space="preserve">    </w:t>
+      </w:r>
+      <w:r>
+        <w:rPr>
+          <w:rFonts w:ascii="Consolas" w:eastAsia="Times New Roman" w:hAnsi="Consolas" w:cs="Times New Roman"/>
+          <w:color w:val="FF79C6"/>
+          <w:sz w:val="23"/>
+          <w:szCs w:val="23"/>
+          <w:lang w:eastAsia="pt-BR"/>
+        </w:rPr>
+        <w:t>const</w:t>
+      </w:r>
+      <w:r>
+        <w:rPr>
+          <w:rFonts w:ascii="Consolas" w:eastAsia="Times New Roman" w:hAnsi="Consolas" w:cs="Times New Roman"/>
+          <w:color w:val="F8F8F2"/>
+          <w:sz w:val="23"/>
+          <w:szCs w:val="23"/>
+          <w:lang w:eastAsia="pt-BR"/>
+        </w:rPr>
+        <w:t xml:space="preserve"> </w:t>
+      </w:r>
+      <w:r>
+        <w:rPr>
+          <w:rFonts w:ascii="Consolas" w:eastAsia="Times New Roman" w:hAnsi="Consolas" w:cs="Times New Roman"/>
+          <w:color w:val="BD93F9"/>
+          <w:sz w:val="23"/>
+          <w:szCs w:val="23"/>
+          <w:lang w:eastAsia="pt-BR"/>
+        </w:rPr>
+        <w:t>nome</w:t>
+      </w:r>
+      <w:r>
+        <w:rPr>
+          <w:rFonts w:ascii="Consolas" w:eastAsia="Times New Roman" w:hAnsi="Consolas" w:cs="Times New Roman"/>
+          <w:color w:val="F8F8F2"/>
+          <w:sz w:val="23"/>
+          <w:szCs w:val="23"/>
+          <w:lang w:eastAsia="pt-BR"/>
+        </w:rPr>
+        <w:t xml:space="preserve"> </w:t>
+      </w:r>
+      <w:r>
+        <w:rPr>
+          <w:rFonts w:ascii="Consolas" w:eastAsia="Times New Roman" w:hAnsi="Consolas" w:cs="Times New Roman"/>
+          <w:color w:val="FF79C6"/>
+          <w:sz w:val="23"/>
+          <w:szCs w:val="23"/>
+          <w:lang w:eastAsia="pt-BR"/>
+        </w:rPr>
+        <w:t>=</w:t>
+      </w:r>
+      <w:r>
+        <w:rPr>
+          <w:rFonts w:ascii="Consolas" w:eastAsia="Times New Roman" w:hAnsi="Consolas" w:cs="Times New Roman"/>
+          <w:color w:val="F8F8F2"/>
+          <w:sz w:val="23"/>
+          <w:szCs w:val="23"/>
+          <w:lang w:eastAsia="pt-BR"/>
+        </w:rPr>
+        <w:t xml:space="preserve"> </w:t>
+      </w:r>
+      <w:r>
+        <w:rPr>
+          <w:rFonts w:ascii="Consolas" w:eastAsia="Times New Roman" w:hAnsi="Consolas" w:cs="Times New Roman"/>
+          <w:color w:val="FF79C6"/>
+          <w:sz w:val="23"/>
+          <w:szCs w:val="23"/>
+          <w:lang w:eastAsia="pt-BR"/>
+        </w:rPr>
+        <w:t>yield</w:t>
+      </w:r>
+      <w:r>
+        <w:rPr>
+          <w:rFonts w:ascii="Consolas" w:eastAsia="Times New Roman" w:hAnsi="Consolas" w:cs="Times New Roman"/>
+          <w:color w:val="F8F8F2"/>
+          <w:sz w:val="23"/>
+          <w:szCs w:val="23"/>
+          <w:lang w:eastAsia="pt-BR"/>
+        </w:rPr>
+        <w:t xml:space="preserve"> </w:t>
+      </w:r>
+      <w:r>
+        <w:rPr>
+          <w:rFonts w:ascii="Consolas" w:eastAsia="Times New Roman" w:hAnsi="Consolas" w:cs="Times New Roman"/>
+          <w:color w:val="E9F284"/>
+          <w:sz w:val="23"/>
+          <w:szCs w:val="23"/>
+          <w:lang w:eastAsia="pt-BR"/>
+        </w:rPr>
+        <w:t>'</w:t>
+      </w:r>
+      <w:r>
+        <w:rPr>
+          <w:rFonts w:ascii="Consolas" w:eastAsia="Times New Roman" w:hAnsi="Consolas" w:cs="Times New Roman"/>
+          <w:color w:val="F1FA8C"/>
+          <w:sz w:val="23"/>
+          <w:szCs w:val="23"/>
+          <w:lang w:eastAsia="pt-BR"/>
+        </w:rPr>
+        <w:t>Qual o seu nome?</w:t>
+      </w:r>
+      <w:r>
+        <w:rPr>
+          <w:rFonts w:ascii="Consolas" w:eastAsia="Times New Roman" w:hAnsi="Consolas" w:cs="Times New Roman"/>
+          <w:color w:val="E9F284"/>
+          <w:sz w:val="23"/>
+          <w:szCs w:val="23"/>
+          <w:lang w:eastAsia="pt-BR"/>
+        </w:rPr>
+        <w:t>'</w:t>
+      </w:r>
+    </w:p>
+    <w:p>
+      <w:pPr>
+        <w:shd w:val="clear" w:color="auto" w:fill="282A36"/>
+        <w:spacing w:after="0" w:line="300" w:lineRule="atLeast"/>
+        <w:rPr>
+          <w:rFonts w:ascii="Consolas" w:eastAsia="Times New Roman" w:hAnsi="Consolas" w:cs="Times New Roman"/>
+          <w:color w:val="F8F8F2"/>
+          <w:sz w:val="23"/>
+          <w:szCs w:val="23"/>
+          <w:lang w:eastAsia="pt-BR"/>
+        </w:rPr>
+      </w:pPr>
+      <w:r>
+        <w:rPr>
+          <w:rFonts w:ascii="Consolas" w:eastAsia="Times New Roman" w:hAnsi="Consolas" w:cs="Times New Roman"/>
+          <w:color w:val="F8F8F2"/>
+          <w:sz w:val="23"/>
+          <w:szCs w:val="23"/>
+          <w:lang w:eastAsia="pt-BR"/>
+        </w:rPr>
+        <w:t xml:space="preserve">    </w:t>
+      </w:r>
+      <w:r>
+        <w:rPr>
+          <w:rFonts w:ascii="Consolas" w:eastAsia="Times New Roman" w:hAnsi="Consolas" w:cs="Times New Roman"/>
+          <w:color w:val="FF79C6"/>
+          <w:sz w:val="23"/>
+          <w:szCs w:val="23"/>
+          <w:lang w:eastAsia="pt-BR"/>
+        </w:rPr>
+        <w:t>const</w:t>
+      </w:r>
+      <w:r>
+        <w:rPr>
+          <w:rFonts w:ascii="Consolas" w:eastAsia="Times New Roman" w:hAnsi="Consolas" w:cs="Times New Roman"/>
+          <w:color w:val="F8F8F2"/>
+          <w:sz w:val="23"/>
+          <w:szCs w:val="23"/>
+          <w:lang w:eastAsia="pt-BR"/>
+        </w:rPr>
+        <w:t xml:space="preserve"> </w:t>
+      </w:r>
+      <w:r>
+        <w:rPr>
+          <w:rFonts w:ascii="Consolas" w:eastAsia="Times New Roman" w:hAnsi="Consolas" w:cs="Times New Roman"/>
+          <w:color w:val="BD93F9"/>
+          <w:sz w:val="23"/>
+          <w:szCs w:val="23"/>
+          <w:lang w:eastAsia="pt-BR"/>
+        </w:rPr>
+        <w:t>cor</w:t>
+      </w:r>
+      <w:r>
+        <w:rPr>
+          <w:rFonts w:ascii="Consolas" w:eastAsia="Times New Roman" w:hAnsi="Consolas" w:cs="Times New Roman"/>
+          <w:color w:val="F8F8F2"/>
+          <w:sz w:val="23"/>
+          <w:szCs w:val="23"/>
+          <w:lang w:eastAsia="pt-BR"/>
+        </w:rPr>
+        <w:t xml:space="preserve"> </w:t>
+      </w:r>
+      <w:r>
+        <w:rPr>
+          <w:rFonts w:ascii="Consolas" w:eastAsia="Times New Roman" w:hAnsi="Consolas" w:cs="Times New Roman"/>
+          <w:color w:val="FF79C6"/>
+          <w:sz w:val="23"/>
+          <w:szCs w:val="23"/>
+          <w:lang w:eastAsia="pt-BR"/>
+        </w:rPr>
+        <w:t>=</w:t>
+      </w:r>
+      <w:r>
+        <w:rPr>
+          <w:rFonts w:ascii="Consolas" w:eastAsia="Times New Roman" w:hAnsi="Consolas" w:cs="Times New Roman"/>
+          <w:color w:val="F8F8F2"/>
+          <w:sz w:val="23"/>
+          <w:szCs w:val="23"/>
+          <w:lang w:eastAsia="pt-BR"/>
+        </w:rPr>
+        <w:t xml:space="preserve"> </w:t>
+      </w:r>
+      <w:r>
+        <w:rPr>
+          <w:rFonts w:ascii="Consolas" w:eastAsia="Times New Roman" w:hAnsi="Consolas" w:cs="Times New Roman"/>
+          <w:color w:val="FF79C6"/>
+          <w:sz w:val="23"/>
+          <w:szCs w:val="23"/>
+          <w:lang w:eastAsia="pt-BR"/>
+        </w:rPr>
+        <w:t>yield</w:t>
+      </w:r>
+      <w:r>
+        <w:rPr>
+          <w:rFonts w:ascii="Consolas" w:eastAsia="Times New Roman" w:hAnsi="Consolas" w:cs="Times New Roman"/>
+          <w:color w:val="F8F8F2"/>
+          <w:sz w:val="23"/>
+          <w:szCs w:val="23"/>
+          <w:lang w:eastAsia="pt-BR"/>
+        </w:rPr>
+        <w:t xml:space="preserve"> </w:t>
+      </w:r>
+      <w:r>
+        <w:rPr>
+          <w:rFonts w:ascii="Consolas" w:eastAsia="Times New Roman" w:hAnsi="Consolas" w:cs="Times New Roman"/>
+          <w:color w:val="E9F284"/>
+          <w:sz w:val="23"/>
+          <w:szCs w:val="23"/>
+          <w:lang w:eastAsia="pt-BR"/>
+        </w:rPr>
+        <w:t>'</w:t>
+      </w:r>
+      <w:r>
+        <w:rPr>
+          <w:rFonts w:ascii="Consolas" w:eastAsia="Times New Roman" w:hAnsi="Consolas" w:cs="Times New Roman"/>
+          <w:color w:val="F1FA8C"/>
+          <w:sz w:val="23"/>
+          <w:szCs w:val="23"/>
+          <w:lang w:eastAsia="pt-BR"/>
+        </w:rPr>
+        <w:t>Qual a sua cor favorita?</w:t>
+      </w:r>
+      <w:r>
+        <w:rPr>
+          <w:rFonts w:ascii="Consolas" w:eastAsia="Times New Roman" w:hAnsi="Consolas" w:cs="Times New Roman"/>
+          <w:color w:val="E9F284"/>
+          <w:sz w:val="23"/>
+          <w:szCs w:val="23"/>
+          <w:lang w:eastAsia="pt-BR"/>
+        </w:rPr>
+        <w:t>'</w:t>
+      </w:r>
+    </w:p>
+    <w:p>
+      <w:pPr>
+        <w:shd w:val="clear" w:color="auto" w:fill="282A36"/>
+        <w:spacing w:after="0" w:line="300" w:lineRule="atLeast"/>
+        <w:rPr>
+          <w:rFonts w:ascii="Consolas" w:eastAsia="Times New Roman" w:hAnsi="Consolas" w:cs="Times New Roman"/>
+          <w:color w:val="F8F8F2"/>
+          <w:sz w:val="23"/>
+          <w:szCs w:val="23"/>
+          <w:lang w:eastAsia="pt-BR"/>
+        </w:rPr>
+      </w:pPr>
+      <w:r>
+        <w:rPr>
+          <w:rFonts w:ascii="Consolas" w:eastAsia="Times New Roman" w:hAnsi="Consolas" w:cs="Times New Roman"/>
+          <w:color w:val="F8F8F2"/>
+          <w:sz w:val="23"/>
+          <w:szCs w:val="23"/>
+          <w:lang w:eastAsia="pt-BR"/>
+        </w:rPr>
+        <w:t xml:space="preserve">    </w:t>
+      </w:r>
+      <w:r>
+        <w:rPr>
+          <w:rFonts w:ascii="Consolas" w:eastAsia="Times New Roman" w:hAnsi="Consolas" w:cs="Times New Roman"/>
+          <w:color w:val="FF79C6"/>
+          <w:sz w:val="23"/>
+          <w:szCs w:val="23"/>
+          <w:lang w:eastAsia="pt-BR"/>
+        </w:rPr>
+        <w:t>return</w:t>
+      </w:r>
+      <w:r>
+        <w:rPr>
+          <w:rFonts w:ascii="Consolas" w:eastAsia="Times New Roman" w:hAnsi="Consolas" w:cs="Times New Roman"/>
+          <w:color w:val="F8F8F2"/>
+          <w:sz w:val="23"/>
+          <w:szCs w:val="23"/>
+          <w:lang w:eastAsia="pt-BR"/>
+        </w:rPr>
+        <w:t xml:space="preserve"> </w:t>
+      </w:r>
+      <w:r>
+        <w:rPr>
+          <w:rFonts w:ascii="Consolas" w:eastAsia="Times New Roman" w:hAnsi="Consolas" w:cs="Times New Roman"/>
+          <w:color w:val="E9F284"/>
+          <w:sz w:val="23"/>
+          <w:szCs w:val="23"/>
+          <w:lang w:eastAsia="pt-BR"/>
+        </w:rPr>
+        <w:t>'</w:t>
+      </w:r>
+      <w:r>
+        <w:rPr>
+          <w:rFonts w:ascii="Consolas" w:eastAsia="Times New Roman" w:hAnsi="Consolas" w:cs="Times New Roman"/>
+          <w:color w:val="F1FA8C"/>
+          <w:sz w:val="23"/>
+          <w:szCs w:val="23"/>
+          <w:lang w:eastAsia="pt-BR"/>
+        </w:rPr>
+        <w:t xml:space="preserve">Seu nome é </w:t>
+      </w:r>
+      <w:r>
+        <w:rPr>
+          <w:rFonts w:ascii="Consolas" w:eastAsia="Times New Roman" w:hAnsi="Consolas" w:cs="Times New Roman"/>
+          <w:color w:val="E9F284"/>
+          <w:sz w:val="23"/>
+          <w:szCs w:val="23"/>
+          <w:lang w:eastAsia="pt-BR"/>
+        </w:rPr>
+        <w:t>'</w:t>
+      </w:r>
+      <w:r>
+        <w:rPr>
+          <w:rFonts w:ascii="Consolas" w:eastAsia="Times New Roman" w:hAnsi="Consolas" w:cs="Times New Roman"/>
+          <w:color w:val="F8F8F2"/>
+          <w:sz w:val="23"/>
+          <w:szCs w:val="23"/>
+          <w:lang w:eastAsia="pt-BR"/>
+        </w:rPr>
+        <w:t xml:space="preserve"> </w:t>
+      </w:r>
+      <w:r>
+        <w:rPr>
+          <w:rFonts w:ascii="Consolas" w:eastAsia="Times New Roman" w:hAnsi="Consolas" w:cs="Times New Roman"/>
+          <w:color w:val="FF79C6"/>
+          <w:sz w:val="23"/>
+          <w:szCs w:val="23"/>
+          <w:lang w:eastAsia="pt-BR"/>
+        </w:rPr>
+        <w:t>+</w:t>
+      </w:r>
+      <w:r>
+        <w:rPr>
+          <w:rFonts w:ascii="Consolas" w:eastAsia="Times New Roman" w:hAnsi="Consolas" w:cs="Times New Roman"/>
+          <w:color w:val="F8F8F2"/>
+          <w:sz w:val="23"/>
+          <w:szCs w:val="23"/>
+          <w:lang w:eastAsia="pt-BR"/>
+        </w:rPr>
+        <w:t xml:space="preserve"> </w:t>
+      </w:r>
+      <w:r>
+        <w:rPr>
+          <w:rFonts w:ascii="Consolas" w:eastAsia="Times New Roman" w:hAnsi="Consolas" w:cs="Times New Roman"/>
+          <w:color w:val="BD93F9"/>
+          <w:sz w:val="23"/>
+          <w:szCs w:val="23"/>
+          <w:lang w:eastAsia="pt-BR"/>
+        </w:rPr>
+        <w:t>nome</w:t>
+      </w:r>
+      <w:r>
+        <w:rPr>
+          <w:rFonts w:ascii="Consolas" w:eastAsia="Times New Roman" w:hAnsi="Consolas" w:cs="Times New Roman"/>
+          <w:color w:val="F8F8F2"/>
+          <w:sz w:val="23"/>
+          <w:szCs w:val="23"/>
+          <w:lang w:eastAsia="pt-BR"/>
+        </w:rPr>
+        <w:t xml:space="preserve"> </w:t>
+      </w:r>
+      <w:r>
+        <w:rPr>
+          <w:rFonts w:ascii="Consolas" w:eastAsia="Times New Roman" w:hAnsi="Consolas" w:cs="Times New Roman"/>
+          <w:color w:val="FF79C6"/>
+          <w:sz w:val="23"/>
+          <w:szCs w:val="23"/>
+          <w:lang w:eastAsia="pt-BR"/>
+        </w:rPr>
+        <w:t>+</w:t>
+      </w:r>
+      <w:r>
+        <w:rPr>
+          <w:rFonts w:ascii="Consolas" w:eastAsia="Times New Roman" w:hAnsi="Consolas" w:cs="Times New Roman"/>
+          <w:color w:val="F8F8F2"/>
+          <w:sz w:val="23"/>
+          <w:szCs w:val="23"/>
+          <w:lang w:eastAsia="pt-BR"/>
+        </w:rPr>
+        <w:t xml:space="preserve"> </w:t>
+      </w:r>
+      <w:r>
+        <w:rPr>
+          <w:rFonts w:ascii="Consolas" w:eastAsia="Times New Roman" w:hAnsi="Consolas" w:cs="Times New Roman"/>
+          <w:color w:val="E9F284"/>
+          <w:sz w:val="23"/>
+          <w:szCs w:val="23"/>
+          <w:lang w:eastAsia="pt-BR"/>
+        </w:rPr>
+        <w:t>'</w:t>
+      </w:r>
+      <w:r>
+        <w:rPr>
+          <w:rFonts w:ascii="Consolas" w:eastAsia="Times New Roman" w:hAnsi="Consolas" w:cs="Times New Roman"/>
+          <w:color w:val="F1FA8C"/>
+          <w:sz w:val="23"/>
+          <w:szCs w:val="23"/>
+          <w:lang w:eastAsia="pt-BR"/>
+        </w:rPr>
+        <w:t xml:space="preserve"> e sua cor favorita é </w:t>
+      </w:r>
+      <w:r>
+        <w:rPr>
+          <w:rFonts w:ascii="Consolas" w:eastAsia="Times New Roman" w:hAnsi="Consolas" w:cs="Times New Roman"/>
+          <w:color w:val="E9F284"/>
+          <w:sz w:val="23"/>
+          <w:szCs w:val="23"/>
+          <w:lang w:eastAsia="pt-BR"/>
+        </w:rPr>
+        <w:t>'</w:t>
+      </w:r>
+      <w:r>
+        <w:rPr>
+          <w:rFonts w:ascii="Consolas" w:eastAsia="Times New Roman" w:hAnsi="Consolas" w:cs="Times New Roman"/>
+          <w:color w:val="F8F8F2"/>
+          <w:sz w:val="23"/>
+          <w:szCs w:val="23"/>
+          <w:lang w:eastAsia="pt-BR"/>
+        </w:rPr>
+        <w:t xml:space="preserve"> </w:t>
+      </w:r>
+      <w:r>
+        <w:rPr>
+          <w:rFonts w:ascii="Consolas" w:eastAsia="Times New Roman" w:hAnsi="Consolas" w:cs="Times New Roman"/>
+          <w:color w:val="FF79C6"/>
+          <w:sz w:val="23"/>
+          <w:szCs w:val="23"/>
+          <w:lang w:eastAsia="pt-BR"/>
+        </w:rPr>
+        <w:t>+</w:t>
+      </w:r>
+      <w:r>
+        <w:rPr>
+          <w:rFonts w:ascii="Consolas" w:eastAsia="Times New Roman" w:hAnsi="Consolas" w:cs="Times New Roman"/>
+          <w:color w:val="F8F8F2"/>
+          <w:sz w:val="23"/>
+          <w:szCs w:val="23"/>
+          <w:lang w:eastAsia="pt-BR"/>
+        </w:rPr>
+        <w:t xml:space="preserve"> </w:t>
+      </w:r>
+      <w:r>
+        <w:rPr>
+          <w:rFonts w:ascii="Consolas" w:eastAsia="Times New Roman" w:hAnsi="Consolas" w:cs="Times New Roman"/>
+          <w:color w:val="BD93F9"/>
+          <w:sz w:val="23"/>
+          <w:szCs w:val="23"/>
+          <w:lang w:eastAsia="pt-BR"/>
+        </w:rPr>
+        <w:t>cor</w:t>
+      </w:r>
+    </w:p>
+    <w:p>
+      <w:pPr>
+        <w:shd w:val="clear" w:color="auto" w:fill="282A36"/>
+        <w:spacing w:after="0" w:line="300" w:lineRule="atLeast"/>
+        <w:rPr>
+          <w:rFonts w:ascii="Consolas" w:eastAsia="Times New Roman" w:hAnsi="Consolas" w:cs="Times New Roman"/>
+          <w:color w:val="F8F8F2"/>
+          <w:sz w:val="23"/>
+          <w:szCs w:val="23"/>
+          <w:lang w:eastAsia="pt-BR"/>
+        </w:rPr>
+      </w:pPr>
+      <w:r>
+        <w:rPr>
+          <w:rFonts w:ascii="Consolas" w:eastAsia="Times New Roman" w:hAnsi="Consolas" w:cs="Times New Roman"/>
+          <w:color w:val="F8F8F2"/>
+          <w:sz w:val="23"/>
+          <w:szCs w:val="23"/>
+          <w:lang w:eastAsia="pt-BR"/>
+        </w:rPr>
+        <w:t>}</w:t>
+      </w:r>
+    </w:p>
+    <w:p>
+      <w:pPr>
+        <w:rPr>
+          <w:sz w:val="28"/>
+          <w:szCs w:val="28"/>
+        </w:rPr>
+      </w:pPr>
+      <w:r>
+        <w:rPr>
+          <w:sz w:val="28"/>
+          <w:szCs w:val="28"/>
+        </w:rPr>
+        <w:t xml:space="preserve">Para chamar essa função, temos que fazer isto: </w:t>
+      </w:r>
+    </w:p>
+    <w:p>
+      <w:pPr>
+        <w:shd w:val="clear" w:color="auto" w:fill="282A36"/>
+        <w:spacing w:after="0" w:line="300" w:lineRule="atLeast"/>
+        <w:rPr>
+          <w:rFonts w:ascii="Consolas" w:eastAsia="Times New Roman" w:hAnsi="Consolas" w:cs="Times New Roman"/>
+          <w:color w:val="F8F8F2"/>
+          <w:sz w:val="23"/>
+          <w:szCs w:val="23"/>
+          <w:lang w:val="en-US" w:eastAsia="pt-BR"/>
+        </w:rPr>
+      </w:pPr>
+      <w:r>
+        <w:rPr>
+          <w:rFonts w:ascii="Consolas" w:eastAsia="Times New Roman" w:hAnsi="Consolas" w:cs="Times New Roman"/>
+          <w:color w:val="FF79C6"/>
+          <w:sz w:val="23"/>
+          <w:szCs w:val="23"/>
+          <w:lang w:val="en-US" w:eastAsia="pt-BR"/>
+        </w:rPr>
+        <w:t>const</w:t>
+      </w:r>
+      <w:r>
+        <w:rPr>
+          <w:rFonts w:ascii="Consolas" w:eastAsia="Times New Roman" w:hAnsi="Consolas" w:cs="Times New Roman"/>
+          <w:color w:val="F8F8F2"/>
+          <w:sz w:val="23"/>
+          <w:szCs w:val="23"/>
+          <w:lang w:val="en-US" w:eastAsia="pt-BR"/>
+        </w:rPr>
+        <w:t xml:space="preserve"> </w:t>
+      </w:r>
+      <w:r>
+        <w:rPr>
+          <w:rFonts w:ascii="Consolas" w:eastAsia="Times New Roman" w:hAnsi="Consolas" w:cs="Times New Roman"/>
+          <w:color w:val="BD93F9"/>
+          <w:sz w:val="23"/>
+          <w:szCs w:val="23"/>
+          <w:lang w:val="en-US" w:eastAsia="pt-BR"/>
+        </w:rPr>
+        <w:t>itc2</w:t>
+      </w:r>
+      <w:r>
+        <w:rPr>
+          <w:rFonts w:ascii="Consolas" w:eastAsia="Times New Roman" w:hAnsi="Consolas" w:cs="Times New Roman"/>
+          <w:color w:val="F8F8F2"/>
+          <w:sz w:val="23"/>
+          <w:szCs w:val="23"/>
+          <w:lang w:val="en-US" w:eastAsia="pt-BR"/>
+        </w:rPr>
+        <w:t xml:space="preserve"> </w:t>
+      </w:r>
+      <w:r>
+        <w:rPr>
+          <w:rFonts w:ascii="Consolas" w:eastAsia="Times New Roman" w:hAnsi="Consolas" w:cs="Times New Roman"/>
+          <w:color w:val="FF79C6"/>
+          <w:sz w:val="23"/>
+          <w:szCs w:val="23"/>
+          <w:lang w:val="en-US" w:eastAsia="pt-BR"/>
+        </w:rPr>
+        <w:t>=</w:t>
+      </w:r>
+      <w:r>
+        <w:rPr>
+          <w:rFonts w:ascii="Consolas" w:eastAsia="Times New Roman" w:hAnsi="Consolas" w:cs="Times New Roman"/>
+          <w:color w:val="F8F8F2"/>
+          <w:sz w:val="23"/>
+          <w:szCs w:val="23"/>
+          <w:lang w:val="en-US" w:eastAsia="pt-BR"/>
+        </w:rPr>
+        <w:t xml:space="preserve"> </w:t>
+      </w:r>
+      <w:r>
+        <w:rPr>
+          <w:rFonts w:ascii="Consolas" w:eastAsia="Times New Roman" w:hAnsi="Consolas" w:cs="Times New Roman"/>
+          <w:color w:val="50FA7B"/>
+          <w:sz w:val="23"/>
+          <w:szCs w:val="23"/>
+          <w:lang w:val="en-US" w:eastAsia="pt-BR"/>
+        </w:rPr>
+        <w:t>pergunta</w:t>
+      </w:r>
+      <w:r>
+        <w:rPr>
+          <w:rFonts w:ascii="Consolas" w:eastAsia="Times New Roman" w:hAnsi="Consolas" w:cs="Times New Roman"/>
+          <w:color w:val="F8F8F2"/>
+          <w:sz w:val="23"/>
+          <w:szCs w:val="23"/>
+          <w:lang w:val="en-US" w:eastAsia="pt-BR"/>
+        </w:rPr>
+        <w:t>()</w:t>
+      </w:r>
+    </w:p>
+    <w:p>
+      <w:pPr>
+        <w:shd w:val="clear" w:color="auto" w:fill="282A36"/>
+        <w:spacing w:after="0" w:line="300" w:lineRule="atLeast"/>
+        <w:rPr>
+          <w:rFonts w:ascii="Consolas" w:eastAsia="Times New Roman" w:hAnsi="Consolas" w:cs="Times New Roman"/>
+          <w:color w:val="F8F8F2"/>
+          <w:sz w:val="23"/>
+          <w:szCs w:val="23"/>
+          <w:lang w:val="en-US" w:eastAsia="pt-BR"/>
+        </w:rPr>
+      </w:pPr>
+      <w:proofErr w:type="gramStart"/>
+      <w:r>
+        <w:rPr>
+          <w:rFonts w:ascii="Consolas" w:eastAsia="Times New Roman" w:hAnsi="Consolas" w:cs="Times New Roman"/>
+          <w:color w:val="BD93F9"/>
+          <w:sz w:val="23"/>
+          <w:szCs w:val="23"/>
+          <w:lang w:val="en-US" w:eastAsia="pt-BR"/>
+        </w:rPr>
+        <w:t>console</w:t>
+      </w:r>
+      <w:r>
+        <w:rPr>
+          <w:rFonts w:ascii="Consolas" w:eastAsia="Times New Roman" w:hAnsi="Consolas" w:cs="Times New Roman"/>
+          <w:color w:val="F8F8F2"/>
+          <w:sz w:val="23"/>
+          <w:szCs w:val="23"/>
+          <w:lang w:val="en-US" w:eastAsia="pt-BR"/>
+        </w:rPr>
+        <w:t>.</w:t>
+      </w:r>
+      <w:r>
+        <w:rPr>
+          <w:rFonts w:ascii="Consolas" w:eastAsia="Times New Roman" w:hAnsi="Consolas" w:cs="Times New Roman"/>
+          <w:color w:val="50FA7B"/>
+          <w:sz w:val="23"/>
+          <w:szCs w:val="23"/>
+          <w:lang w:val="en-US" w:eastAsia="pt-BR"/>
+        </w:rPr>
+        <w:t>log</w:t>
+      </w:r>
+      <w:r>
+        <w:rPr>
+          <w:rFonts w:ascii="Consolas" w:eastAsia="Times New Roman" w:hAnsi="Consolas" w:cs="Times New Roman"/>
+          <w:color w:val="F8F8F2"/>
+          <w:sz w:val="23"/>
+          <w:szCs w:val="23"/>
+          <w:lang w:val="en-US" w:eastAsia="pt-BR"/>
+        </w:rPr>
+        <w:t>(</w:t>
+      </w:r>
+      <w:proofErr w:type="gramEnd"/>
+      <w:r>
+        <w:rPr>
+          <w:rFonts w:ascii="Consolas" w:eastAsia="Times New Roman" w:hAnsi="Consolas" w:cs="Times New Roman"/>
+          <w:color w:val="BD93F9"/>
+          <w:sz w:val="23"/>
+          <w:szCs w:val="23"/>
+          <w:lang w:val="en-US" w:eastAsia="pt-BR"/>
+        </w:rPr>
+        <w:t>itc2</w:t>
+      </w:r>
+      <w:r>
+        <w:rPr>
+          <w:rFonts w:ascii="Consolas" w:eastAsia="Times New Roman" w:hAnsi="Consolas" w:cs="Times New Roman"/>
+          <w:color w:val="F8F8F2"/>
+          <w:sz w:val="23"/>
+          <w:szCs w:val="23"/>
+          <w:lang w:val="en-US" w:eastAsia="pt-BR"/>
+        </w:rPr>
+        <w:t>.</w:t>
+      </w:r>
+      <w:r>
+        <w:rPr>
+          <w:rFonts w:ascii="Consolas" w:eastAsia="Times New Roman" w:hAnsi="Consolas" w:cs="Times New Roman"/>
+          <w:color w:val="50FA7B"/>
+          <w:sz w:val="23"/>
+          <w:szCs w:val="23"/>
+          <w:lang w:val="en-US" w:eastAsia="pt-BR"/>
+        </w:rPr>
+        <w:t>next</w:t>
+      </w:r>
+      <w:r>
+        <w:rPr>
+          <w:rFonts w:ascii="Consolas" w:eastAsia="Times New Roman" w:hAnsi="Consolas" w:cs="Times New Roman"/>
+          <w:color w:val="F8F8F2"/>
+          <w:sz w:val="23"/>
+          <w:szCs w:val="23"/>
+          <w:lang w:val="en-US" w:eastAsia="pt-BR"/>
+        </w:rPr>
+        <w:t xml:space="preserve">().value) </w:t>
+      </w:r>
+    </w:p>
+    <w:p>
+      <w:pPr>
+        <w:shd w:val="clear" w:color="auto" w:fill="282A36"/>
+        <w:spacing w:after="0" w:line="300" w:lineRule="atLeast"/>
+        <w:rPr>
+          <w:rFonts w:ascii="Consolas" w:eastAsia="Times New Roman" w:hAnsi="Consolas" w:cs="Times New Roman"/>
+          <w:color w:val="F8F8F2"/>
+          <w:sz w:val="23"/>
+          <w:szCs w:val="23"/>
+          <w:lang w:eastAsia="pt-BR"/>
+        </w:rPr>
+      </w:pPr>
+      <w:proofErr w:type="gramStart"/>
+      <w:r>
+        <w:rPr>
+          <w:rFonts w:ascii="Consolas" w:eastAsia="Times New Roman" w:hAnsi="Consolas" w:cs="Times New Roman"/>
+          <w:color w:val="BD93F9"/>
+          <w:sz w:val="23"/>
+          <w:szCs w:val="23"/>
+          <w:lang w:eastAsia="pt-BR"/>
+        </w:rPr>
+        <w:t>console</w:t>
+      </w:r>
+      <w:r>
+        <w:rPr>
+          <w:rFonts w:ascii="Consolas" w:eastAsia="Times New Roman" w:hAnsi="Consolas" w:cs="Times New Roman"/>
+          <w:color w:val="F8F8F2"/>
+          <w:sz w:val="23"/>
+          <w:szCs w:val="23"/>
+          <w:lang w:eastAsia="pt-BR"/>
+        </w:rPr>
+        <w:t>.</w:t>
+      </w:r>
+      <w:r>
+        <w:rPr>
+          <w:rFonts w:ascii="Consolas" w:eastAsia="Times New Roman" w:hAnsi="Consolas" w:cs="Times New Roman"/>
+          <w:color w:val="50FA7B"/>
+          <w:sz w:val="23"/>
+          <w:szCs w:val="23"/>
+          <w:lang w:eastAsia="pt-BR"/>
+        </w:rPr>
+        <w:t>log</w:t>
+      </w:r>
+      <w:r>
+        <w:rPr>
+          <w:rFonts w:ascii="Consolas" w:eastAsia="Times New Roman" w:hAnsi="Consolas" w:cs="Times New Roman"/>
+          <w:color w:val="F8F8F2"/>
+          <w:sz w:val="23"/>
+          <w:szCs w:val="23"/>
+          <w:lang w:eastAsia="pt-BR"/>
+        </w:rPr>
+        <w:t>(</w:t>
+      </w:r>
+      <w:proofErr w:type="gramEnd"/>
+      <w:r>
+        <w:rPr>
+          <w:rFonts w:ascii="Consolas" w:eastAsia="Times New Roman" w:hAnsi="Consolas" w:cs="Times New Roman"/>
+          <w:color w:val="BD93F9"/>
+          <w:sz w:val="23"/>
+          <w:szCs w:val="23"/>
+          <w:lang w:eastAsia="pt-BR"/>
+        </w:rPr>
+        <w:t>itc2</w:t>
+      </w:r>
+      <w:r>
+        <w:rPr>
+          <w:rFonts w:ascii="Consolas" w:eastAsia="Times New Roman" w:hAnsi="Consolas" w:cs="Times New Roman"/>
+          <w:color w:val="F8F8F2"/>
+          <w:sz w:val="23"/>
+          <w:szCs w:val="23"/>
+          <w:lang w:eastAsia="pt-BR"/>
+        </w:rPr>
+        <w:t>.</w:t>
+      </w:r>
+      <w:r>
+        <w:rPr>
+          <w:rFonts w:ascii="Consolas" w:eastAsia="Times New Roman" w:hAnsi="Consolas" w:cs="Times New Roman"/>
+          <w:color w:val="50FA7B"/>
+          <w:sz w:val="23"/>
+          <w:szCs w:val="23"/>
+          <w:lang w:eastAsia="pt-BR"/>
+        </w:rPr>
+        <w:t>next</w:t>
+      </w:r>
+      <w:r>
+        <w:rPr>
+          <w:rFonts w:ascii="Consolas" w:eastAsia="Times New Roman" w:hAnsi="Consolas" w:cs="Times New Roman"/>
+          <w:color w:val="F8F8F2"/>
+          <w:sz w:val="23"/>
+          <w:szCs w:val="23"/>
+          <w:lang w:eastAsia="pt-BR"/>
+        </w:rPr>
+        <w:t>(</w:t>
+      </w:r>
+      <w:r>
+        <w:rPr>
+          <w:rFonts w:ascii="Consolas" w:eastAsia="Times New Roman" w:hAnsi="Consolas" w:cs="Times New Roman"/>
+          <w:color w:val="E9F284"/>
+          <w:sz w:val="23"/>
+          <w:szCs w:val="23"/>
+          <w:lang w:eastAsia="pt-BR"/>
+        </w:rPr>
+        <w:t>"</w:t>
+      </w:r>
+      <w:r>
+        <w:rPr>
+          <w:rFonts w:ascii="Consolas" w:eastAsia="Times New Roman" w:hAnsi="Consolas" w:cs="Times New Roman"/>
+          <w:color w:val="F1FA8C"/>
+          <w:sz w:val="23"/>
+          <w:szCs w:val="23"/>
+          <w:lang w:eastAsia="pt-BR"/>
+        </w:rPr>
+        <w:t>Henrique</w:t>
+      </w:r>
+      <w:r>
+        <w:rPr>
+          <w:rFonts w:ascii="Consolas" w:eastAsia="Times New Roman" w:hAnsi="Consolas" w:cs="Times New Roman"/>
+          <w:color w:val="E9F284"/>
+          <w:sz w:val="23"/>
+          <w:szCs w:val="23"/>
+          <w:lang w:eastAsia="pt-BR"/>
+        </w:rPr>
+        <w:t>"</w:t>
+      </w:r>
+      <w:r>
+        <w:rPr>
+          <w:rFonts w:ascii="Consolas" w:eastAsia="Times New Roman" w:hAnsi="Consolas" w:cs="Times New Roman"/>
+          <w:color w:val="F8F8F2"/>
+          <w:sz w:val="23"/>
+          <w:szCs w:val="23"/>
+          <w:lang w:eastAsia="pt-BR"/>
+        </w:rPr>
+        <w:t>).value)</w:t>
+      </w:r>
+    </w:p>
+    <w:p>
+      <w:pPr>
+        <w:shd w:val="clear" w:color="auto" w:fill="282A36"/>
+        <w:spacing w:after="0" w:line="300" w:lineRule="atLeast"/>
+        <w:rPr>
+          <w:rFonts w:ascii="Consolas" w:eastAsia="Times New Roman" w:hAnsi="Consolas" w:cs="Times New Roman"/>
+          <w:color w:val="F8F8F2"/>
+          <w:sz w:val="23"/>
+          <w:szCs w:val="23"/>
+          <w:lang w:eastAsia="pt-BR"/>
+        </w:rPr>
+      </w:pPr>
+      <w:proofErr w:type="gramStart"/>
+      <w:r>
+        <w:rPr>
+          <w:rFonts w:ascii="Consolas" w:eastAsia="Times New Roman" w:hAnsi="Consolas" w:cs="Times New Roman"/>
+          <w:color w:val="BD93F9"/>
+          <w:sz w:val="23"/>
+          <w:szCs w:val="23"/>
+          <w:lang w:eastAsia="pt-BR"/>
+        </w:rPr>
+        <w:t>console</w:t>
+      </w:r>
+      <w:r>
+        <w:rPr>
+          <w:rFonts w:ascii="Consolas" w:eastAsia="Times New Roman" w:hAnsi="Consolas" w:cs="Times New Roman"/>
+          <w:color w:val="F8F8F2"/>
+          <w:sz w:val="23"/>
+          <w:szCs w:val="23"/>
+          <w:lang w:eastAsia="pt-BR"/>
+        </w:rPr>
+        <w:t>.</w:t>
+      </w:r>
+      <w:r>
+        <w:rPr>
+          <w:rFonts w:ascii="Consolas" w:eastAsia="Times New Roman" w:hAnsi="Consolas" w:cs="Times New Roman"/>
+          <w:color w:val="50FA7B"/>
+          <w:sz w:val="23"/>
+          <w:szCs w:val="23"/>
+          <w:lang w:eastAsia="pt-BR"/>
+        </w:rPr>
+        <w:t>log</w:t>
+      </w:r>
+      <w:r>
+        <w:rPr>
+          <w:rFonts w:ascii="Consolas" w:eastAsia="Times New Roman" w:hAnsi="Consolas" w:cs="Times New Roman"/>
+          <w:color w:val="F8F8F2"/>
+          <w:sz w:val="23"/>
+          <w:szCs w:val="23"/>
+          <w:lang w:eastAsia="pt-BR"/>
+        </w:rPr>
+        <w:t>(</w:t>
+      </w:r>
+      <w:proofErr w:type="gramEnd"/>
+      <w:r>
+        <w:rPr>
+          <w:rFonts w:ascii="Consolas" w:eastAsia="Times New Roman" w:hAnsi="Consolas" w:cs="Times New Roman"/>
+          <w:color w:val="BD93F9"/>
+          <w:sz w:val="23"/>
+          <w:szCs w:val="23"/>
+          <w:lang w:eastAsia="pt-BR"/>
+        </w:rPr>
+        <w:t>itc2</w:t>
+      </w:r>
+      <w:r>
+        <w:rPr>
+          <w:rFonts w:ascii="Consolas" w:eastAsia="Times New Roman" w:hAnsi="Consolas" w:cs="Times New Roman"/>
+          <w:color w:val="F8F8F2"/>
+          <w:sz w:val="23"/>
+          <w:szCs w:val="23"/>
+          <w:lang w:eastAsia="pt-BR"/>
+        </w:rPr>
+        <w:t>.</w:t>
+      </w:r>
+      <w:r>
+        <w:rPr>
+          <w:rFonts w:ascii="Consolas" w:eastAsia="Times New Roman" w:hAnsi="Consolas" w:cs="Times New Roman"/>
+          <w:color w:val="50FA7B"/>
+          <w:sz w:val="23"/>
+          <w:szCs w:val="23"/>
+          <w:lang w:eastAsia="pt-BR"/>
+        </w:rPr>
+        <w:t>next</w:t>
+      </w:r>
+      <w:r>
+        <w:rPr>
+          <w:rFonts w:ascii="Consolas" w:eastAsia="Times New Roman" w:hAnsi="Consolas" w:cs="Times New Roman"/>
+          <w:color w:val="F8F8F2"/>
+          <w:sz w:val="23"/>
+          <w:szCs w:val="23"/>
+          <w:lang w:eastAsia="pt-BR"/>
+        </w:rPr>
+        <w:t>(</w:t>
+      </w:r>
+      <w:r>
+        <w:rPr>
+          <w:rFonts w:ascii="Consolas" w:eastAsia="Times New Roman" w:hAnsi="Consolas" w:cs="Times New Roman"/>
+          <w:color w:val="E9F284"/>
+          <w:sz w:val="23"/>
+          <w:szCs w:val="23"/>
+          <w:lang w:eastAsia="pt-BR"/>
+        </w:rPr>
+        <w:t>"</w:t>
+      </w:r>
+      <w:r>
+        <w:rPr>
+          <w:rFonts w:ascii="Consolas" w:eastAsia="Times New Roman" w:hAnsi="Consolas" w:cs="Times New Roman"/>
+          <w:color w:val="F1FA8C"/>
+          <w:sz w:val="23"/>
+          <w:szCs w:val="23"/>
+          <w:lang w:eastAsia="pt-BR"/>
+        </w:rPr>
+        <w:t>Azul</w:t>
+      </w:r>
+      <w:r>
+        <w:rPr>
+          <w:rFonts w:ascii="Consolas" w:eastAsia="Times New Roman" w:hAnsi="Consolas" w:cs="Times New Roman"/>
+          <w:color w:val="E9F284"/>
+          <w:sz w:val="23"/>
+          <w:szCs w:val="23"/>
+          <w:lang w:eastAsia="pt-BR"/>
+        </w:rPr>
+        <w:t>"</w:t>
+      </w:r>
+      <w:r>
+        <w:rPr>
+          <w:rFonts w:ascii="Consolas" w:eastAsia="Times New Roman" w:hAnsi="Consolas" w:cs="Times New Roman"/>
+          <w:color w:val="F8F8F2"/>
+          <w:sz w:val="23"/>
+          <w:szCs w:val="23"/>
+          <w:lang w:eastAsia="pt-BR"/>
+        </w:rPr>
+        <w:t>).value)</w:t>
+      </w:r>
+    </w:p>
+    <w:p>
+      <w:pPr>
+        <w:shd w:val="clear" w:color="auto" w:fill="282A36"/>
+        <w:spacing w:after="0" w:line="300" w:lineRule="atLeast"/>
+        <w:rPr>
+          <w:rFonts w:ascii="Consolas" w:eastAsia="Times New Roman" w:hAnsi="Consolas" w:cs="Times New Roman"/>
+          <w:color w:val="F8F8F2"/>
+          <w:sz w:val="23"/>
+          <w:szCs w:val="23"/>
+          <w:lang w:eastAsia="pt-BR"/>
+        </w:rPr>
+      </w:pPr>
+    </w:p>
+    <w:p>
+      <w:pPr>
+        <w:rPr>
+          <w:sz w:val="28"/>
+          <w:szCs w:val="36"/>
+        </w:rPr>
+      </w:pPr>
+      <w:r>
+        <w:rPr>
+          <w:sz w:val="28"/>
+          <w:szCs w:val="36"/>
+        </w:rPr>
+        <w:t xml:space="preserve">O primeiro next().value serve </w:t>
+      </w:r>
+    </w:p>
+    <w:p>
+      <w:pPr>
+        <w:rPr>
+          <w:sz w:val="28"/>
+          <w:szCs w:val="28"/>
+        </w:rPr>
+      </w:pPr>
+    </w:p>
+    <w:p>
+      <w:pPr>
+        <w:rPr>
+          <w:sz w:val="28"/>
+          <w:szCs w:val="28"/>
+        </w:rPr>
+      </w:pPr>
+    </w:p>
+    <w:p>
+      <w:pPr>
+        <w:rPr>
+          <w:sz w:val="28"/>
+          <w:szCs w:val="28"/>
+        </w:rPr>
+      </w:pPr>
+    </w:p>
+    <w:p>
+      <w:pPr>
+        <w:rPr>
+          <w:sz w:val="28"/>
+          <w:szCs w:val="28"/>
         </w:rPr>
       </w:pPr>
     </w:p>
@@ -7950,7 +11560,7 @@
   <w:style w:type="paragraph" w:default="1" w:styleId="Normal">
     <w:name w:val="Normal"/>
     <w:qFormat/>
-    <w:rsid w:val="006A0EB9"/>
+    <w:rsid w:val="00AF4DF1"/>
   </w:style>
   <w:style w:type="paragraph" w:styleId="Ttulo3">
     <w:name w:val="heading 3"/>

</xml_diff>

<commit_message>
Aprendido this, map, e começando DOM
</commit_message>
<xml_diff>
--- a/Javascript.docx
+++ b/Javascript.docx
@@ -3185,33 +3185,15 @@
           <w:sz w:val="28"/>
           <w:szCs w:val="36"/>
         </w:rPr>
-        <w:t xml:space="preserve"> = Ele quebra um </w:t>
-      </w:r>
-      <w:proofErr w:type="spellStart"/>
+        <w:t xml:space="preserve"> = Ele quebra um a</w:t>
+      </w:r>
       <w:r>
         <w:rPr>
           <w:rFonts w:cstheme="minorHAnsi"/>
           <w:sz w:val="28"/>
           <w:szCs w:val="36"/>
         </w:rPr>
-        <w:t>a</w:t>
-      </w:r>
-      <w:r>
-        <w:rPr>
-          <w:rFonts w:cstheme="minorHAnsi"/>
-          <w:sz w:val="28"/>
-          <w:szCs w:val="36"/>
-        </w:rPr>
-        <w:t>rray</w:t>
-      </w:r>
-      <w:proofErr w:type="spellEnd"/>
-      <w:r>
-        <w:rPr>
-          <w:rFonts w:cstheme="minorHAnsi"/>
-          <w:sz w:val="28"/>
-          <w:szCs w:val="36"/>
-        </w:rPr>
-        <w:t>, quebrando um conjunto de elementos e devolvendo elemento por elemento.</w:t>
+        <w:t>rray, quebrando um conjunto de elementos e devolvendo elemento por elemento.</w:t>
       </w:r>
     </w:p>
     <w:p>
@@ -3232,10 +3214,84 @@
           <w:sz w:val="28"/>
           <w:szCs w:val="36"/>
         </w:rPr>
-        <w:t xml:space="preserve">Se quiser copiar um </w:t>
-      </w:r>
-      <w:proofErr w:type="spellStart"/>
-      <w:r>
+        <w:t>Se quiser copiar um array para o outro:</w:t>
+      </w:r>
+    </w:p>
+    <w:p>
+      <w:pPr>
+        <w:shd w:val="clear" w:color="auto" w:fill="282A36"/>
+        <w:spacing w:after="0" w:line="300" w:lineRule="atLeast"/>
+        <w:rPr>
+          <w:rFonts w:ascii="Consolas" w:eastAsia="Times New Roman" w:hAnsi="Consolas" w:cs="Times New Roman"/>
+          <w:color w:val="F8F8F2"/>
+          <w:sz w:val="23"/>
+          <w:szCs w:val="23"/>
+          <w:lang w:eastAsia="pt-BR"/>
+        </w:rPr>
+      </w:pPr>
+      <w:r>
+        <w:rPr>
+          <w:rFonts w:ascii="Consolas" w:eastAsia="Times New Roman" w:hAnsi="Consolas" w:cs="Times New Roman"/>
+          <w:color w:val="FF79C6"/>
+          <w:sz w:val="23"/>
+          <w:szCs w:val="23"/>
+          <w:lang w:eastAsia="pt-BR"/>
+        </w:rPr>
+        <w:t>let</w:t>
+      </w:r>
+      <w:r>
+        <w:rPr>
+          <w:rFonts w:ascii="Consolas" w:eastAsia="Times New Roman" w:hAnsi="Consolas" w:cs="Times New Roman"/>
+          <w:color w:val="F8F8F2"/>
+          <w:sz w:val="23"/>
+          <w:szCs w:val="23"/>
+          <w:lang w:eastAsia="pt-BR"/>
+        </w:rPr>
+        <w:t xml:space="preserve"> n3 </w:t>
+      </w:r>
+      <w:r>
+        <w:rPr>
+          <w:rFonts w:ascii="Consolas" w:eastAsia="Times New Roman" w:hAnsi="Consolas" w:cs="Times New Roman"/>
+          <w:color w:val="FF79C6"/>
+          <w:sz w:val="23"/>
+          <w:szCs w:val="23"/>
+          <w:lang w:eastAsia="pt-BR"/>
+        </w:rPr>
+        <w:t>=</w:t>
+      </w:r>
+      <w:r>
+        <w:rPr>
+          <w:rFonts w:ascii="Consolas" w:eastAsia="Times New Roman" w:hAnsi="Consolas" w:cs="Times New Roman"/>
+          <w:color w:val="F8F8F2"/>
+          <w:sz w:val="23"/>
+          <w:szCs w:val="23"/>
+          <w:lang w:eastAsia="pt-BR"/>
+        </w:rPr>
+        <w:t xml:space="preserve"> [</w:t>
+      </w:r>
+      <w:r>
+        <w:rPr>
+          <w:rFonts w:ascii="Consolas" w:eastAsia="Times New Roman" w:hAnsi="Consolas" w:cs="Times New Roman"/>
+          <w:color w:val="FF79C6"/>
+          <w:sz w:val="23"/>
+          <w:szCs w:val="23"/>
+          <w:lang w:eastAsia="pt-BR"/>
+        </w:rPr>
+        <w:t>...</w:t>
+      </w:r>
+      <w:r>
+        <w:rPr>
+          <w:rFonts w:ascii="Consolas" w:eastAsia="Times New Roman" w:hAnsi="Consolas" w:cs="Times New Roman"/>
+          <w:color w:val="F8F8F2"/>
+          <w:sz w:val="23"/>
+          <w:szCs w:val="23"/>
+          <w:lang w:eastAsia="pt-BR"/>
+        </w:rPr>
+        <w:t>n1]</w:t>
+      </w:r>
+    </w:p>
+    <w:p>
+      <w:pPr>
         <w:rPr>
           <w:rFonts w:cstheme="minorHAnsi"/>
           <w:b/>
@@ -3243,9 +3299,7 @@
           <w:sz w:val="28"/>
           <w:szCs w:val="36"/>
         </w:rPr>
-        <w:t>array</w:t>
-      </w:r>
-      <w:proofErr w:type="spellEnd"/>
+      </w:pPr>
       <w:r>
         <w:rPr>
           <w:rFonts w:cstheme="minorHAnsi"/>
@@ -3254,84 +3308,10 @@
           <w:sz w:val="28"/>
           <w:szCs w:val="36"/>
         </w:rPr>
-        <w:t xml:space="preserve"> para o outro:</w:t>
-      </w:r>
-    </w:p>
-    <w:p>
-      <w:pPr>
-        <w:shd w:val="clear" w:color="auto" w:fill="282A36"/>
-        <w:spacing w:after="0" w:line="300" w:lineRule="atLeast"/>
-        <w:rPr>
-          <w:rFonts w:ascii="Consolas" w:eastAsia="Times New Roman" w:hAnsi="Consolas" w:cs="Times New Roman"/>
-          <w:color w:val="F8F8F2"/>
-          <w:sz w:val="23"/>
-          <w:szCs w:val="23"/>
-          <w:lang w:eastAsia="pt-BR"/>
-        </w:rPr>
-      </w:pPr>
-      <w:r>
-        <w:rPr>
-          <w:rFonts w:ascii="Consolas" w:eastAsia="Times New Roman" w:hAnsi="Consolas" w:cs="Times New Roman"/>
-          <w:color w:val="FF79C6"/>
-          <w:sz w:val="23"/>
-          <w:szCs w:val="23"/>
-          <w:lang w:eastAsia="pt-BR"/>
-        </w:rPr>
-        <w:t>let</w:t>
-      </w:r>
-      <w:r>
-        <w:rPr>
-          <w:rFonts w:ascii="Consolas" w:eastAsia="Times New Roman" w:hAnsi="Consolas" w:cs="Times New Roman"/>
-          <w:color w:val="F8F8F2"/>
-          <w:sz w:val="23"/>
-          <w:szCs w:val="23"/>
-          <w:lang w:eastAsia="pt-BR"/>
-        </w:rPr>
-        <w:t xml:space="preserve"> n3 </w:t>
-      </w:r>
-      <w:r>
-        <w:rPr>
-          <w:rFonts w:ascii="Consolas" w:eastAsia="Times New Roman" w:hAnsi="Consolas" w:cs="Times New Roman"/>
-          <w:color w:val="FF79C6"/>
-          <w:sz w:val="23"/>
-          <w:szCs w:val="23"/>
-          <w:lang w:eastAsia="pt-BR"/>
-        </w:rPr>
-        <w:t>=</w:t>
-      </w:r>
-      <w:r>
-        <w:rPr>
-          <w:rFonts w:ascii="Consolas" w:eastAsia="Times New Roman" w:hAnsi="Consolas" w:cs="Times New Roman"/>
-          <w:color w:val="F8F8F2"/>
-          <w:sz w:val="23"/>
-          <w:szCs w:val="23"/>
-          <w:lang w:eastAsia="pt-BR"/>
-        </w:rPr>
-        <w:t xml:space="preserve"> [</w:t>
-      </w:r>
-      <w:r>
-        <w:rPr>
-          <w:rFonts w:ascii="Consolas" w:eastAsia="Times New Roman" w:hAnsi="Consolas" w:cs="Times New Roman"/>
-          <w:color w:val="FF79C6"/>
-          <w:sz w:val="23"/>
-          <w:szCs w:val="23"/>
-          <w:lang w:eastAsia="pt-BR"/>
-        </w:rPr>
-        <w:t>...</w:t>
-      </w:r>
-      <w:r>
-        <w:rPr>
-          <w:rFonts w:ascii="Consolas" w:eastAsia="Times New Roman" w:hAnsi="Consolas" w:cs="Times New Roman"/>
-          <w:color w:val="F8F8F2"/>
-          <w:sz w:val="23"/>
-          <w:szCs w:val="23"/>
-          <w:lang w:eastAsia="pt-BR"/>
-        </w:rPr>
-        <w:t>n1]</w:t>
-      </w:r>
-    </w:p>
-    <w:p>
-      <w:pPr>
+        <w:t xml:space="preserve">Se quiser juntar dois </w:t>
+      </w:r>
+      <w:proofErr w:type="spellStart"/>
+      <w:r>
         <w:rPr>
           <w:rFonts w:cstheme="minorHAnsi"/>
           <w:b/>
@@ -3339,7 +3319,9 @@
           <w:sz w:val="28"/>
           <w:szCs w:val="36"/>
         </w:rPr>
-      </w:pPr>
+        <w:t>arrays</w:t>
+      </w:r>
+      <w:proofErr w:type="spellEnd"/>
       <w:r>
         <w:rPr>
           <w:rFonts w:cstheme="minorHAnsi"/>
@@ -3348,10 +3330,86 @@
           <w:sz w:val="28"/>
           <w:szCs w:val="36"/>
         </w:rPr>
-        <w:t xml:space="preserve">Se quiser juntar dois </w:t>
-      </w:r>
-      <w:proofErr w:type="spellStart"/>
-      <w:r>
+        <w:t xml:space="preserve">: </w:t>
+      </w:r>
+    </w:p>
+    <w:p>
+      <w:pPr>
+        <w:shd w:val="clear" w:color="auto" w:fill="282A36"/>
+        <w:spacing w:after="0" w:line="300" w:lineRule="atLeast"/>
+        <w:rPr>
+          <w:rFonts w:ascii="Consolas" w:eastAsia="Times New Roman" w:hAnsi="Consolas" w:cs="Times New Roman"/>
+          <w:color w:val="F8F8F2"/>
+          <w:sz w:val="23"/>
+          <w:szCs w:val="23"/>
+          <w:lang w:eastAsia="pt-BR"/>
+        </w:rPr>
+      </w:pPr>
+      <w:r>
+        <w:rPr>
+          <w:rFonts w:ascii="Consolas" w:eastAsia="Times New Roman" w:hAnsi="Consolas" w:cs="Times New Roman"/>
+          <w:color w:val="FF79C6"/>
+          <w:sz w:val="23"/>
+          <w:szCs w:val="23"/>
+          <w:lang w:eastAsia="pt-BR"/>
+        </w:rPr>
+        <w:t>let</w:t>
+      </w:r>
+      <w:r>
+        <w:rPr>
+          <w:rFonts w:ascii="Consolas" w:eastAsia="Times New Roman" w:hAnsi="Consolas" w:cs="Times New Roman"/>
+          <w:color w:val="F8F8F2"/>
+          <w:sz w:val="23"/>
+          <w:szCs w:val="23"/>
+          <w:lang w:eastAsia="pt-BR"/>
+        </w:rPr>
+        <w:t xml:space="preserve"> n3 </w:t>
+      </w:r>
+      <w:r>
+        <w:rPr>
+          <w:rFonts w:ascii="Consolas" w:eastAsia="Times New Roman" w:hAnsi="Consolas" w:cs="Times New Roman"/>
+          <w:color w:val="FF79C6"/>
+          <w:sz w:val="23"/>
+          <w:szCs w:val="23"/>
+          <w:lang w:eastAsia="pt-BR"/>
+        </w:rPr>
+        <w:t>=</w:t>
+      </w:r>
+      <w:r>
+        <w:rPr>
+          <w:rFonts w:ascii="Consolas" w:eastAsia="Times New Roman" w:hAnsi="Consolas" w:cs="Times New Roman"/>
+          <w:color w:val="F8F8F2"/>
+          <w:sz w:val="23"/>
+          <w:szCs w:val="23"/>
+          <w:lang w:eastAsia="pt-BR"/>
+        </w:rPr>
+        <w:t xml:space="preserve"> [n</w:t>
+      </w:r>
+      <w:proofErr w:type="gramStart"/>
+      <w:r>
+        <w:rPr>
+          <w:rFonts w:ascii="Consolas" w:eastAsia="Times New Roman" w:hAnsi="Consolas" w:cs="Times New Roman"/>
+          <w:color w:val="F8F8F2"/>
+          <w:sz w:val="23"/>
+          <w:szCs w:val="23"/>
+          <w:lang w:eastAsia="pt-BR"/>
+        </w:rPr>
+        <w:t>1,n</w:t>
+      </w:r>
+      <w:proofErr w:type="gramEnd"/>
+      <w:r>
+        <w:rPr>
+          <w:rFonts w:ascii="Consolas" w:eastAsia="Times New Roman" w:hAnsi="Consolas" w:cs="Times New Roman"/>
+          <w:color w:val="F8F8F2"/>
+          <w:sz w:val="23"/>
+          <w:szCs w:val="23"/>
+          <w:lang w:eastAsia="pt-BR"/>
+        </w:rPr>
+        <w:t>2]</w:t>
+      </w:r>
+    </w:p>
+    <w:p>
+      <w:pPr>
         <w:rPr>
           <w:rFonts w:cstheme="minorHAnsi"/>
           <w:b/>
@@ -3359,9 +3417,7 @@
           <w:sz w:val="28"/>
           <w:szCs w:val="36"/>
         </w:rPr>
-        <w:t>arrays</w:t>
-      </w:r>
-      <w:proofErr w:type="spellEnd"/>
+      </w:pPr>
       <w:r>
         <w:rPr>
           <w:rFonts w:cstheme="minorHAnsi"/>
@@ -3370,7 +3426,7 @@
           <w:sz w:val="28"/>
           <w:szCs w:val="36"/>
         </w:rPr>
-        <w:t xml:space="preserve">: </w:t>
+        <w:t>Usando Spread:</w:t>
       </w:r>
     </w:p>
     <w:p>
@@ -3423,7 +3479,27 @@
           <w:szCs w:val="23"/>
           <w:lang w:eastAsia="pt-BR"/>
         </w:rPr>
-        <w:t xml:space="preserve"> [n</w:t>
+        <w:t xml:space="preserve"> [</w:t>
+      </w:r>
+      <w:r>
+        <w:rPr>
+          <w:rFonts w:ascii="Consolas" w:eastAsia="Times New Roman" w:hAnsi="Consolas" w:cs="Times New Roman"/>
+          <w:color w:val="F8F8F2"/>
+          <w:sz w:val="23"/>
+          <w:szCs w:val="23"/>
+          <w:lang w:eastAsia="pt-BR"/>
+        </w:rPr>
+        <w:t>...</w:t>
+      </w:r>
+      <w:r>
+        <w:rPr>
+          <w:rFonts w:ascii="Consolas" w:eastAsia="Times New Roman" w:hAnsi="Consolas" w:cs="Times New Roman"/>
+          <w:color w:val="F8F8F2"/>
+          <w:sz w:val="23"/>
+          <w:szCs w:val="23"/>
+          <w:lang w:eastAsia="pt-BR"/>
+        </w:rPr>
+        <w:t>n</w:t>
       </w:r>
       <w:proofErr w:type="gramStart"/>
       <w:r>
@@ -3434,7 +3510,17 @@
           <w:szCs w:val="23"/>
           <w:lang w:eastAsia="pt-BR"/>
         </w:rPr>
-        <w:t>1,n</w:t>
+        <w:t>1,</w:t>
+      </w:r>
+      <w:r>
+        <w:rPr>
+          <w:rFonts w:ascii="Consolas" w:eastAsia="Times New Roman" w:hAnsi="Consolas" w:cs="Times New Roman"/>
+          <w:color w:val="F8F8F2"/>
+          <w:sz w:val="23"/>
+          <w:szCs w:val="23"/>
+          <w:lang w:eastAsia="pt-BR"/>
+        </w:rPr>
+        <w:t>...</w:t>
       </w:r>
       <w:proofErr w:type="gramEnd"/>
       <w:r>
@@ -3445,11 +3531,18 @@
           <w:szCs w:val="23"/>
           <w:lang w:eastAsia="pt-BR"/>
         </w:rPr>
-        <w:t>2]</w:t>
-      </w:r>
-    </w:p>
-    <w:p>
-      <w:pPr>
+        <w:t>n2]</w:t>
+      </w:r>
+    </w:p>
+    <w:p>
+      <w:pPr>
+        <w:rPr>
+          <w:rFonts w:cstheme="minorHAnsi"/>
+          <w:sz w:val="28"/>
+          <w:szCs w:val="36"/>
+        </w:rPr>
+      </w:pPr>
+      <w:r>
         <w:rPr>
           <w:rFonts w:cstheme="minorHAnsi"/>
           <w:b/>
@@ -3457,7 +3550,10 @@
           <w:sz w:val="28"/>
           <w:szCs w:val="36"/>
         </w:rPr>
-      </w:pPr>
+        <w:lastRenderedPageBreak/>
+        <w:t>Qual a diferença de usar [n</w:t>
+      </w:r>
+      <w:proofErr w:type="gramStart"/>
       <w:r>
         <w:rPr>
           <w:rFonts w:cstheme="minorHAnsi"/>
@@ -3466,122 +3562,9 @@
           <w:sz w:val="28"/>
           <w:szCs w:val="36"/>
         </w:rPr>
-        <w:t>Usando Spread:</w:t>
-      </w:r>
-    </w:p>
-    <w:p>
-      <w:pPr>
-        <w:shd w:val="clear" w:color="auto" w:fill="282A36"/>
-        <w:spacing w:after="0" w:line="300" w:lineRule="atLeast"/>
-        <w:rPr>
-          <w:rFonts w:ascii="Consolas" w:eastAsia="Times New Roman" w:hAnsi="Consolas" w:cs="Times New Roman"/>
-          <w:color w:val="F8F8F2"/>
-          <w:sz w:val="23"/>
-          <w:szCs w:val="23"/>
-          <w:lang w:eastAsia="pt-BR"/>
-        </w:rPr>
-      </w:pPr>
-      <w:r>
-        <w:rPr>
-          <w:rFonts w:ascii="Consolas" w:eastAsia="Times New Roman" w:hAnsi="Consolas" w:cs="Times New Roman"/>
-          <w:color w:val="FF79C6"/>
-          <w:sz w:val="23"/>
-          <w:szCs w:val="23"/>
-          <w:lang w:eastAsia="pt-BR"/>
-        </w:rPr>
-        <w:t>let</w:t>
-      </w:r>
-      <w:r>
-        <w:rPr>
-          <w:rFonts w:ascii="Consolas" w:eastAsia="Times New Roman" w:hAnsi="Consolas" w:cs="Times New Roman"/>
-          <w:color w:val="F8F8F2"/>
-          <w:sz w:val="23"/>
-          <w:szCs w:val="23"/>
-          <w:lang w:eastAsia="pt-BR"/>
-        </w:rPr>
-        <w:t xml:space="preserve"> n3 </w:t>
-      </w:r>
-      <w:r>
-        <w:rPr>
-          <w:rFonts w:ascii="Consolas" w:eastAsia="Times New Roman" w:hAnsi="Consolas" w:cs="Times New Roman"/>
-          <w:color w:val="FF79C6"/>
-          <w:sz w:val="23"/>
-          <w:szCs w:val="23"/>
-          <w:lang w:eastAsia="pt-BR"/>
-        </w:rPr>
-        <w:t>=</w:t>
-      </w:r>
-      <w:r>
-        <w:rPr>
-          <w:rFonts w:ascii="Consolas" w:eastAsia="Times New Roman" w:hAnsi="Consolas" w:cs="Times New Roman"/>
-          <w:color w:val="F8F8F2"/>
-          <w:sz w:val="23"/>
-          <w:szCs w:val="23"/>
-          <w:lang w:eastAsia="pt-BR"/>
-        </w:rPr>
-        <w:t xml:space="preserve"> [</w:t>
-      </w:r>
-      <w:r>
-        <w:rPr>
-          <w:rFonts w:ascii="Consolas" w:eastAsia="Times New Roman" w:hAnsi="Consolas" w:cs="Times New Roman"/>
-          <w:color w:val="F8F8F2"/>
-          <w:sz w:val="23"/>
-          <w:szCs w:val="23"/>
-          <w:lang w:eastAsia="pt-BR"/>
-        </w:rPr>
-        <w:t>...</w:t>
-      </w:r>
-      <w:r>
-        <w:rPr>
-          <w:rFonts w:ascii="Consolas" w:eastAsia="Times New Roman" w:hAnsi="Consolas" w:cs="Times New Roman"/>
-          <w:color w:val="F8F8F2"/>
-          <w:sz w:val="23"/>
-          <w:szCs w:val="23"/>
-          <w:lang w:eastAsia="pt-BR"/>
-        </w:rPr>
-        <w:t>n</w:t>
-      </w:r>
-      <w:proofErr w:type="gramStart"/>
-      <w:r>
-        <w:rPr>
-          <w:rFonts w:ascii="Consolas" w:eastAsia="Times New Roman" w:hAnsi="Consolas" w:cs="Times New Roman"/>
-          <w:color w:val="F8F8F2"/>
-          <w:sz w:val="23"/>
-          <w:szCs w:val="23"/>
-          <w:lang w:eastAsia="pt-BR"/>
-        </w:rPr>
-        <w:t>1,</w:t>
-      </w:r>
-      <w:r>
-        <w:rPr>
-          <w:rFonts w:ascii="Consolas" w:eastAsia="Times New Roman" w:hAnsi="Consolas" w:cs="Times New Roman"/>
-          <w:color w:val="F8F8F2"/>
-          <w:sz w:val="23"/>
-          <w:szCs w:val="23"/>
-          <w:lang w:eastAsia="pt-BR"/>
-        </w:rPr>
-        <w:t>...</w:t>
+        <w:t>1,n</w:t>
       </w:r>
       <w:proofErr w:type="gramEnd"/>
-      <w:r>
-        <w:rPr>
-          <w:rFonts w:ascii="Consolas" w:eastAsia="Times New Roman" w:hAnsi="Consolas" w:cs="Times New Roman"/>
-          <w:color w:val="F8F8F2"/>
-          <w:sz w:val="23"/>
-          <w:szCs w:val="23"/>
-          <w:lang w:eastAsia="pt-BR"/>
-        </w:rPr>
-        <w:t>n2]</w:t>
-      </w:r>
-    </w:p>
-    <w:p>
-      <w:pPr>
-        <w:rPr>
-          <w:rFonts w:cstheme="minorHAnsi"/>
-          <w:sz w:val="28"/>
-          <w:szCs w:val="36"/>
-        </w:rPr>
-      </w:pPr>
       <w:r>
         <w:rPr>
           <w:rFonts w:cstheme="minorHAnsi"/>
@@ -3590,10 +3573,8 @@
           <w:sz w:val="28"/>
           <w:szCs w:val="36"/>
         </w:rPr>
-        <w:lastRenderedPageBreak/>
-        <w:t>Qual a diferença de usar [n</w:t>
-      </w:r>
-      <w:proofErr w:type="gramStart"/>
+        <w:t>2] entre usar [...n1,...n2]?</w:t>
+      </w:r>
       <w:r>
         <w:rPr>
           <w:rFonts w:cstheme="minorHAnsi"/>
@@ -3602,10 +3583,37 @@
           <w:sz w:val="28"/>
           <w:szCs w:val="36"/>
         </w:rPr>
-        <w:t>1,n</w:t>
+        <w:t xml:space="preserve"> – </w:t>
+      </w:r>
+      <w:r>
+        <w:rPr>
+          <w:rFonts w:cstheme="minorHAnsi"/>
+          <w:sz w:val="28"/>
+          <w:szCs w:val="36"/>
+        </w:rPr>
+        <w:t xml:space="preserve">Se você usar o primeiro apresentado, ele cria uma lista com outras listas(matriz). Mas se usar o segundo apresentado, ele cria uma lista </w:t>
+      </w:r>
+      <w:proofErr w:type="gramStart"/>
+      <w:r>
+        <w:rPr>
+          <w:rFonts w:cstheme="minorHAnsi"/>
+          <w:sz w:val="28"/>
+          <w:szCs w:val="36"/>
+        </w:rPr>
+        <w:t>plana(</w:t>
       </w:r>
       <w:proofErr w:type="gramEnd"/>
       <w:r>
+        <w:rPr>
+          <w:rFonts w:cstheme="minorHAnsi"/>
+          <w:sz w:val="28"/>
+          <w:szCs w:val="36"/>
+        </w:rPr>
+        <w:t>um array normal).</w:t>
+      </w:r>
+    </w:p>
+    <w:p>
+      <w:pPr>
         <w:rPr>
           <w:rFonts w:cstheme="minorHAnsi"/>
           <w:b/>
@@ -3613,8 +3621,7 @@
           <w:sz w:val="28"/>
           <w:szCs w:val="36"/>
         </w:rPr>
-        <w:t>2] entre usar [...n1,...n2]?</w:t>
-      </w:r>
+      </w:pPr>
       <w:r>
         <w:rPr>
           <w:rFonts w:cstheme="minorHAnsi"/>
@@ -3623,51 +3630,212 @@
           <w:sz w:val="28"/>
           <w:szCs w:val="36"/>
         </w:rPr>
-        <w:t xml:space="preserve"> – </w:t>
-      </w:r>
-      <w:r>
+        <w:t>Usar funções usando spread:</w:t>
+      </w:r>
+    </w:p>
+    <w:p>
+      <w:pPr>
+        <w:shd w:val="clear" w:color="auto" w:fill="282A36"/>
+        <w:spacing w:after="0" w:line="300" w:lineRule="atLeast"/>
+        <w:rPr>
+          <w:rFonts w:ascii="Consolas" w:eastAsia="Times New Roman" w:hAnsi="Consolas" w:cs="Times New Roman"/>
+          <w:color w:val="F8F8F2"/>
+          <w:sz w:val="23"/>
+          <w:szCs w:val="23"/>
+          <w:lang w:eastAsia="pt-BR"/>
+        </w:rPr>
+      </w:pPr>
+      <w:proofErr w:type="gramStart"/>
+      <w:r>
+        <w:rPr>
+          <w:rFonts w:ascii="Consolas" w:eastAsia="Times New Roman" w:hAnsi="Consolas" w:cs="Times New Roman"/>
+          <w:color w:val="BD93F9"/>
+          <w:sz w:val="23"/>
+          <w:szCs w:val="23"/>
+          <w:lang w:eastAsia="pt-BR"/>
+        </w:rPr>
+        <w:t>console</w:t>
+      </w:r>
+      <w:r>
+        <w:rPr>
+          <w:rFonts w:ascii="Consolas" w:eastAsia="Times New Roman" w:hAnsi="Consolas" w:cs="Times New Roman"/>
+          <w:color w:val="F8F8F2"/>
+          <w:sz w:val="23"/>
+          <w:szCs w:val="23"/>
+          <w:lang w:eastAsia="pt-BR"/>
+        </w:rPr>
+        <w:t>.</w:t>
+      </w:r>
+      <w:r>
+        <w:rPr>
+          <w:rFonts w:ascii="Consolas" w:eastAsia="Times New Roman" w:hAnsi="Consolas" w:cs="Times New Roman"/>
+          <w:color w:val="50FA7B"/>
+          <w:sz w:val="23"/>
+          <w:szCs w:val="23"/>
+          <w:lang w:eastAsia="pt-BR"/>
+        </w:rPr>
+        <w:t>log</w:t>
+      </w:r>
+      <w:r>
+        <w:rPr>
+          <w:rFonts w:ascii="Consolas" w:eastAsia="Times New Roman" w:hAnsi="Consolas" w:cs="Times New Roman"/>
+          <w:color w:val="F8F8F2"/>
+          <w:sz w:val="23"/>
+          <w:szCs w:val="23"/>
+          <w:lang w:eastAsia="pt-BR"/>
+        </w:rPr>
+        <w:t>(</w:t>
+      </w:r>
+      <w:proofErr w:type="gramEnd"/>
+      <w:r>
+        <w:rPr>
+          <w:rFonts w:ascii="Consolas" w:eastAsia="Times New Roman" w:hAnsi="Consolas" w:cs="Times New Roman"/>
+          <w:color w:val="E9F284"/>
+          <w:sz w:val="23"/>
+          <w:szCs w:val="23"/>
+          <w:lang w:eastAsia="pt-BR"/>
+        </w:rPr>
+        <w:t>"</w:t>
+      </w:r>
+      <w:r>
+        <w:rPr>
+          <w:rFonts w:ascii="Consolas" w:eastAsia="Times New Roman" w:hAnsi="Consolas" w:cs="Times New Roman"/>
+          <w:color w:val="F1FA8C"/>
+          <w:sz w:val="23"/>
+          <w:szCs w:val="23"/>
+          <w:lang w:eastAsia="pt-BR"/>
+        </w:rPr>
+        <w:t xml:space="preserve">Soma: </w:t>
+      </w:r>
+      <w:r>
+        <w:rPr>
+          <w:rFonts w:ascii="Consolas" w:eastAsia="Times New Roman" w:hAnsi="Consolas" w:cs="Times New Roman"/>
+          <w:color w:val="E9F284"/>
+          <w:sz w:val="23"/>
+          <w:szCs w:val="23"/>
+          <w:lang w:eastAsia="pt-BR"/>
+        </w:rPr>
+        <w:t>"</w:t>
+      </w:r>
+      <w:r>
+        <w:rPr>
+          <w:rFonts w:ascii="Consolas" w:eastAsia="Times New Roman" w:hAnsi="Consolas" w:cs="Times New Roman"/>
+          <w:color w:val="F8F8F2"/>
+          <w:sz w:val="23"/>
+          <w:szCs w:val="23"/>
+          <w:lang w:eastAsia="pt-BR"/>
+        </w:rPr>
+        <w:t xml:space="preserve"> </w:t>
+      </w:r>
+      <w:r>
+        <w:rPr>
+          <w:rFonts w:ascii="Consolas" w:eastAsia="Times New Roman" w:hAnsi="Consolas" w:cs="Times New Roman"/>
+          <w:color w:val="FF79C6"/>
+          <w:sz w:val="23"/>
+          <w:szCs w:val="23"/>
+          <w:lang w:eastAsia="pt-BR"/>
+        </w:rPr>
+        <w:t>+</w:t>
+      </w:r>
+      <w:r>
+        <w:rPr>
+          <w:rFonts w:ascii="Consolas" w:eastAsia="Times New Roman" w:hAnsi="Consolas" w:cs="Times New Roman"/>
+          <w:color w:val="F8F8F2"/>
+          <w:sz w:val="23"/>
+          <w:szCs w:val="23"/>
+          <w:lang w:eastAsia="pt-BR"/>
+        </w:rPr>
+        <w:t xml:space="preserve"> </w:t>
+      </w:r>
+      <w:r>
+        <w:rPr>
+          <w:rFonts w:ascii="Consolas" w:eastAsia="Times New Roman" w:hAnsi="Consolas" w:cs="Times New Roman"/>
+          <w:color w:val="50FA7B"/>
+          <w:sz w:val="23"/>
+          <w:szCs w:val="23"/>
+          <w:lang w:eastAsia="pt-BR"/>
+        </w:rPr>
+        <w:t>soma</w:t>
+      </w:r>
+      <w:r>
+        <w:rPr>
+          <w:rFonts w:ascii="Consolas" w:eastAsia="Times New Roman" w:hAnsi="Consolas" w:cs="Times New Roman"/>
+          <w:color w:val="F8F8F2"/>
+          <w:sz w:val="23"/>
+          <w:szCs w:val="23"/>
+          <w:lang w:eastAsia="pt-BR"/>
+        </w:rPr>
+        <w:t>(</w:t>
+      </w:r>
+      <w:r>
+        <w:rPr>
+          <w:rFonts w:ascii="Consolas" w:eastAsia="Times New Roman" w:hAnsi="Consolas" w:cs="Times New Roman"/>
+          <w:color w:val="FF79C6"/>
+          <w:sz w:val="23"/>
+          <w:szCs w:val="23"/>
+          <w:lang w:eastAsia="pt-BR"/>
+        </w:rPr>
+        <w:t>...</w:t>
+      </w:r>
+      <w:r>
+        <w:rPr>
+          <w:rFonts w:ascii="Consolas" w:eastAsia="Times New Roman" w:hAnsi="Consolas" w:cs="Times New Roman"/>
+          <w:color w:val="F8F8F2"/>
+          <w:sz w:val="23"/>
+          <w:szCs w:val="23"/>
+          <w:lang w:eastAsia="pt-BR"/>
+        </w:rPr>
+        <w:t>valores))</w:t>
+      </w:r>
+    </w:p>
+    <w:p>
+      <w:pPr>
         <w:rPr>
           <w:rFonts w:cstheme="minorHAnsi"/>
           <w:sz w:val="28"/>
           <w:szCs w:val="36"/>
         </w:rPr>
-        <w:t xml:space="preserve">Se você usar o primeiro apresentado, ele cria uma lista com outras listas(matriz). Mas se usar o segundo apresentado, ele cria uma lista </w:t>
-      </w:r>
-      <w:proofErr w:type="gramStart"/>
-      <w:r>
-        <w:rPr>
-          <w:rFonts w:cstheme="minorHAnsi"/>
-          <w:sz w:val="28"/>
-          <w:szCs w:val="36"/>
-        </w:rPr>
-        <w:t>plana(</w:t>
-      </w:r>
-      <w:proofErr w:type="gramEnd"/>
-      <w:r>
-        <w:rPr>
-          <w:rFonts w:cstheme="minorHAnsi"/>
-          <w:sz w:val="28"/>
-          <w:szCs w:val="36"/>
-        </w:rPr>
-        <w:t xml:space="preserve">um </w:t>
-      </w:r>
-      <w:proofErr w:type="spellStart"/>
-      <w:r>
-        <w:rPr>
-          <w:rFonts w:cstheme="minorHAnsi"/>
-          <w:sz w:val="28"/>
-          <w:szCs w:val="36"/>
-        </w:rPr>
-        <w:t>array</w:t>
-      </w:r>
-      <w:proofErr w:type="spellEnd"/>
-      <w:r>
-        <w:rPr>
-          <w:rFonts w:cstheme="minorHAnsi"/>
-          <w:sz w:val="28"/>
-          <w:szCs w:val="36"/>
-        </w:rPr>
-        <w:t xml:space="preserve"> normal).</w:t>
+      </w:pPr>
+    </w:p>
+    <w:p>
+      <w:pPr>
+        <w:rPr>
+          <w:color w:val="FF0000"/>
+          <w:sz w:val="36"/>
+          <w:szCs w:val="36"/>
+        </w:rPr>
+      </w:pPr>
+      <w:r>
+        <w:rPr>
+          <w:color w:val="FF0000"/>
+          <w:sz w:val="36"/>
+          <w:szCs w:val="36"/>
+        </w:rPr>
+        <w:t>Vídeo</w:t>
+      </w:r>
+      <w:r>
+        <w:rPr>
+          <w:color w:val="FF0000"/>
+          <w:sz w:val="36"/>
+          <w:szCs w:val="36"/>
+        </w:rPr>
+        <w:t xml:space="preserve"> 1</w:t>
+      </w:r>
+      <w:r>
+        <w:rPr>
+          <w:color w:val="FF0000"/>
+          <w:sz w:val="36"/>
+          <w:szCs w:val="36"/>
+        </w:rPr>
+        <w:t>4</w:t>
+      </w:r>
+      <w:r>
+        <w:rPr>
+          <w:color w:val="FF0000"/>
+          <w:sz w:val="36"/>
+          <w:szCs w:val="36"/>
+        </w:rPr>
+        <w:t>.</w:t>
       </w:r>
     </w:p>
     <w:p>
@@ -3688,172 +3856,8 @@
           <w:sz w:val="28"/>
           <w:szCs w:val="36"/>
         </w:rPr>
-        <w:t>Usar funções usando spread:</w:t>
-      </w:r>
-    </w:p>
-    <w:p>
-      <w:pPr>
-        <w:shd w:val="clear" w:color="auto" w:fill="282A36"/>
-        <w:spacing w:after="0" w:line="300" w:lineRule="atLeast"/>
-        <w:rPr>
-          <w:rFonts w:ascii="Consolas" w:eastAsia="Times New Roman" w:hAnsi="Consolas" w:cs="Times New Roman"/>
-          <w:color w:val="F8F8F2"/>
-          <w:sz w:val="23"/>
-          <w:szCs w:val="23"/>
-          <w:lang w:eastAsia="pt-BR"/>
-        </w:rPr>
-      </w:pPr>
-      <w:proofErr w:type="gramStart"/>
-      <w:r>
-        <w:rPr>
-          <w:rFonts w:ascii="Consolas" w:eastAsia="Times New Roman" w:hAnsi="Consolas" w:cs="Times New Roman"/>
-          <w:color w:val="BD93F9"/>
-          <w:sz w:val="23"/>
-          <w:szCs w:val="23"/>
-          <w:lang w:eastAsia="pt-BR"/>
-        </w:rPr>
-        <w:t>console</w:t>
-      </w:r>
-      <w:r>
-        <w:rPr>
-          <w:rFonts w:ascii="Consolas" w:eastAsia="Times New Roman" w:hAnsi="Consolas" w:cs="Times New Roman"/>
-          <w:color w:val="F8F8F2"/>
-          <w:sz w:val="23"/>
-          <w:szCs w:val="23"/>
-          <w:lang w:eastAsia="pt-BR"/>
-        </w:rPr>
-        <w:t>.</w:t>
-      </w:r>
-      <w:r>
-        <w:rPr>
-          <w:rFonts w:ascii="Consolas" w:eastAsia="Times New Roman" w:hAnsi="Consolas" w:cs="Times New Roman"/>
-          <w:color w:val="50FA7B"/>
-          <w:sz w:val="23"/>
-          <w:szCs w:val="23"/>
-          <w:lang w:eastAsia="pt-BR"/>
-        </w:rPr>
-        <w:t>log</w:t>
-      </w:r>
-      <w:r>
-        <w:rPr>
-          <w:rFonts w:ascii="Consolas" w:eastAsia="Times New Roman" w:hAnsi="Consolas" w:cs="Times New Roman"/>
-          <w:color w:val="F8F8F2"/>
-          <w:sz w:val="23"/>
-          <w:szCs w:val="23"/>
-          <w:lang w:eastAsia="pt-BR"/>
-        </w:rPr>
-        <w:t>(</w:t>
-      </w:r>
-      <w:proofErr w:type="gramEnd"/>
-      <w:r>
-        <w:rPr>
-          <w:rFonts w:ascii="Consolas" w:eastAsia="Times New Roman" w:hAnsi="Consolas" w:cs="Times New Roman"/>
-          <w:color w:val="E9F284"/>
-          <w:sz w:val="23"/>
-          <w:szCs w:val="23"/>
-          <w:lang w:eastAsia="pt-BR"/>
-        </w:rPr>
-        <w:t>"</w:t>
-      </w:r>
-      <w:r>
-        <w:rPr>
-          <w:rFonts w:ascii="Consolas" w:eastAsia="Times New Roman" w:hAnsi="Consolas" w:cs="Times New Roman"/>
-          <w:color w:val="F1FA8C"/>
-          <w:sz w:val="23"/>
-          <w:szCs w:val="23"/>
-          <w:lang w:eastAsia="pt-BR"/>
-        </w:rPr>
-        <w:t xml:space="preserve">Soma: </w:t>
-      </w:r>
-      <w:r>
-        <w:rPr>
-          <w:rFonts w:ascii="Consolas" w:eastAsia="Times New Roman" w:hAnsi="Consolas" w:cs="Times New Roman"/>
-          <w:color w:val="E9F284"/>
-          <w:sz w:val="23"/>
-          <w:szCs w:val="23"/>
-          <w:lang w:eastAsia="pt-BR"/>
-        </w:rPr>
-        <w:t>"</w:t>
-      </w:r>
-      <w:r>
-        <w:rPr>
-          <w:rFonts w:ascii="Consolas" w:eastAsia="Times New Roman" w:hAnsi="Consolas" w:cs="Times New Roman"/>
-          <w:color w:val="F8F8F2"/>
-          <w:sz w:val="23"/>
-          <w:szCs w:val="23"/>
-          <w:lang w:eastAsia="pt-BR"/>
-        </w:rPr>
-        <w:t xml:space="preserve"> </w:t>
-      </w:r>
-      <w:r>
-        <w:rPr>
-          <w:rFonts w:ascii="Consolas" w:eastAsia="Times New Roman" w:hAnsi="Consolas" w:cs="Times New Roman"/>
-          <w:color w:val="FF79C6"/>
-          <w:sz w:val="23"/>
-          <w:szCs w:val="23"/>
-          <w:lang w:eastAsia="pt-BR"/>
-        </w:rPr>
-        <w:t>+</w:t>
-      </w:r>
-      <w:r>
-        <w:rPr>
-          <w:rFonts w:ascii="Consolas" w:eastAsia="Times New Roman" w:hAnsi="Consolas" w:cs="Times New Roman"/>
-          <w:color w:val="F8F8F2"/>
-          <w:sz w:val="23"/>
-          <w:szCs w:val="23"/>
-          <w:lang w:eastAsia="pt-BR"/>
-        </w:rPr>
-        <w:t xml:space="preserve"> </w:t>
-      </w:r>
-      <w:r>
-        <w:rPr>
-          <w:rFonts w:ascii="Consolas" w:eastAsia="Times New Roman" w:hAnsi="Consolas" w:cs="Times New Roman"/>
-          <w:color w:val="50FA7B"/>
-          <w:sz w:val="23"/>
-          <w:szCs w:val="23"/>
-          <w:lang w:eastAsia="pt-BR"/>
-        </w:rPr>
-        <w:t>soma</w:t>
-      </w:r>
-      <w:r>
-        <w:rPr>
-          <w:rFonts w:ascii="Consolas" w:eastAsia="Times New Roman" w:hAnsi="Consolas" w:cs="Times New Roman"/>
-          <w:color w:val="F8F8F2"/>
-          <w:sz w:val="23"/>
-          <w:szCs w:val="23"/>
-          <w:lang w:eastAsia="pt-BR"/>
-        </w:rPr>
-        <w:t>(</w:t>
-      </w:r>
-      <w:r>
-        <w:rPr>
-          <w:rFonts w:ascii="Consolas" w:eastAsia="Times New Roman" w:hAnsi="Consolas" w:cs="Times New Roman"/>
-          <w:color w:val="FF79C6"/>
-          <w:sz w:val="23"/>
-          <w:szCs w:val="23"/>
-          <w:lang w:eastAsia="pt-BR"/>
-        </w:rPr>
-        <w:t>...</w:t>
-      </w:r>
-      <w:r>
-        <w:rPr>
-          <w:rFonts w:ascii="Consolas" w:eastAsia="Times New Roman" w:hAnsi="Consolas" w:cs="Times New Roman"/>
-          <w:color w:val="F8F8F2"/>
-          <w:sz w:val="23"/>
-          <w:szCs w:val="23"/>
-          <w:lang w:eastAsia="pt-BR"/>
-        </w:rPr>
-        <w:t>valores))</w:t>
-      </w:r>
-    </w:p>
-    <w:p>
-      <w:pPr>
-        <w:rPr>
-          <w:rFonts w:cstheme="minorHAnsi"/>
-          <w:sz w:val="28"/>
-          <w:szCs w:val="36"/>
-        </w:rPr>
-      </w:pPr>
+        <w:t>Estrutura If</w:t>
+      </w:r>
     </w:p>
     <w:p>
       <w:pPr>
@@ -3885,7 +3889,7 @@
           <w:sz w:val="36"/>
           <w:szCs w:val="36"/>
         </w:rPr>
-        <w:t>4</w:t>
+        <w:t>5</w:t>
       </w:r>
       <w:r>
         <w:rPr>
@@ -3898,6 +3902,13 @@
     </w:p>
     <w:p>
       <w:pPr>
+        <w:rPr>
+          <w:rFonts w:cstheme="minorHAnsi"/>
+          <w:sz w:val="28"/>
+          <w:szCs w:val="36"/>
+        </w:rPr>
+      </w:pPr>
+      <w:r>
         <w:rPr>
           <w:rFonts w:cstheme="minorHAnsi"/>
           <w:b/>
@@ -3905,6 +3916,65 @@
           <w:sz w:val="28"/>
           <w:szCs w:val="36"/>
         </w:rPr>
+        <w:t>Switch Case:</w:t>
+      </w:r>
+      <w:r>
+        <w:rPr>
+          <w:rFonts w:cstheme="minorHAnsi"/>
+          <w:sz w:val="28"/>
+          <w:szCs w:val="36"/>
+        </w:rPr>
+        <w:t xml:space="preserve"> Caso uma condição for tal condição, ele entra no bloco</w:t>
+      </w:r>
+    </w:p>
+    <w:p>
+      <w:pPr>
+        <w:rPr>
+          <w:color w:val="FF0000"/>
+          <w:sz w:val="36"/>
+          <w:szCs w:val="36"/>
+        </w:rPr>
+      </w:pPr>
+      <w:r>
+        <w:rPr>
+          <w:color w:val="FF0000"/>
+          <w:sz w:val="36"/>
+          <w:szCs w:val="36"/>
+        </w:rPr>
+        <w:t>Vídeo</w:t>
+      </w:r>
+      <w:r>
+        <w:rPr>
+          <w:color w:val="FF0000"/>
+          <w:sz w:val="36"/>
+          <w:szCs w:val="36"/>
+        </w:rPr>
+        <w:t xml:space="preserve"> 1</w:t>
+      </w:r>
+      <w:r>
+        <w:rPr>
+          <w:color w:val="FF0000"/>
+          <w:sz w:val="36"/>
+          <w:szCs w:val="36"/>
+        </w:rPr>
+        <w:t>6</w:t>
+      </w:r>
+      <w:r>
+        <w:rPr>
+          <w:color w:val="FF0000"/>
+          <w:sz w:val="36"/>
+          <w:szCs w:val="36"/>
+        </w:rPr>
+        <w:t>.</w:t>
+      </w:r>
+    </w:p>
+    <w:p>
+      <w:pPr>
+        <w:rPr>
+          <w:rFonts w:cstheme="minorHAnsi"/>
+          <w:sz w:val="28"/>
+          <w:szCs w:val="36"/>
+        </w:rPr>
       </w:pPr>
       <w:r>
         <w:rPr>
@@ -3914,48 +3984,42 @@
           <w:sz w:val="28"/>
           <w:szCs w:val="36"/>
         </w:rPr>
-        <w:t>Estrutura If</w:t>
-      </w:r>
-    </w:p>
-    <w:p>
-      <w:pPr>
-        <w:rPr>
-          <w:color w:val="FF0000"/>
-          <w:sz w:val="36"/>
-          <w:szCs w:val="36"/>
-        </w:rPr>
-      </w:pPr>
-      <w:r>
-        <w:rPr>
-          <w:color w:val="FF0000"/>
-          <w:sz w:val="36"/>
-          <w:szCs w:val="36"/>
-        </w:rPr>
-        <w:t>Vídeo</w:t>
-      </w:r>
-      <w:r>
-        <w:rPr>
-          <w:color w:val="FF0000"/>
-          <w:sz w:val="36"/>
-          <w:szCs w:val="36"/>
-        </w:rPr>
-        <w:t xml:space="preserve"> 1</w:t>
-      </w:r>
-      <w:r>
-        <w:rPr>
-          <w:color w:val="FF0000"/>
-          <w:sz w:val="36"/>
-          <w:szCs w:val="36"/>
-        </w:rPr>
-        <w:t>5</w:t>
-      </w:r>
-      <w:r>
-        <w:rPr>
-          <w:color w:val="FF0000"/>
-          <w:sz w:val="36"/>
-          <w:szCs w:val="36"/>
-        </w:rPr>
-        <w:t>.</w:t>
+        <w:t xml:space="preserve">Definidos: </w:t>
+      </w:r>
+      <w:r>
+        <w:rPr>
+          <w:rFonts w:cstheme="minorHAnsi"/>
+          <w:sz w:val="28"/>
+          <w:szCs w:val="36"/>
+        </w:rPr>
+        <w:t>Quando eu sei a quantidade de vezes em que vou rodar.</w:t>
+      </w:r>
+    </w:p>
+    <w:p>
+      <w:pPr>
+        <w:rPr>
+          <w:rFonts w:cstheme="minorHAnsi"/>
+          <w:sz w:val="28"/>
+          <w:szCs w:val="36"/>
+        </w:rPr>
+      </w:pPr>
+      <w:proofErr w:type="spellStart"/>
+      <w:r>
+        <w:rPr>
+          <w:rFonts w:cstheme="minorHAnsi"/>
+          <w:sz w:val="28"/>
+          <w:szCs w:val="36"/>
+        </w:rPr>
+        <w:t>Ex</w:t>
+      </w:r>
+      <w:proofErr w:type="spellEnd"/>
+      <w:r>
+        <w:rPr>
+          <w:rFonts w:cstheme="minorHAnsi"/>
+          <w:sz w:val="28"/>
+          <w:szCs w:val="36"/>
+        </w:rPr>
+        <w:t>: For</w:t>
       </w:r>
     </w:p>
     <w:p>
@@ -3974,7 +4038,7 @@
           <w:sz w:val="28"/>
           <w:szCs w:val="36"/>
         </w:rPr>
-        <w:t>Switch Case:</w:t>
+        <w:t>Indefinidos:</w:t>
       </w:r>
       <w:r>
         <w:rPr>
@@ -3982,8 +4046,37 @@
           <w:sz w:val="28"/>
           <w:szCs w:val="36"/>
         </w:rPr>
-        <w:t xml:space="preserve"> Caso uma condição for tal condição, ele entra no bloco</w:t>
-      </w:r>
+        <w:t xml:space="preserve"> Não sabe ao certo quantas vezes vai se repetir. </w:t>
+      </w:r>
+    </w:p>
+    <w:p>
+      <w:pPr>
+        <w:rPr>
+          <w:rFonts w:cstheme="minorHAnsi"/>
+          <w:sz w:val="28"/>
+          <w:szCs w:val="36"/>
+          <w:lang w:val="en-US"/>
+        </w:rPr>
+      </w:pPr>
+      <w:r>
+        <w:rPr>
+          <w:rFonts w:cstheme="minorHAnsi"/>
+          <w:sz w:val="28"/>
+          <w:szCs w:val="36"/>
+          <w:lang w:val="en-US"/>
+        </w:rPr>
+        <w:t>Ex: While, do While</w:t>
+      </w:r>
+    </w:p>
+    <w:p>
+      <w:pPr>
+        <w:rPr>
+          <w:rFonts w:cstheme="minorHAnsi"/>
+          <w:sz w:val="28"/>
+          <w:szCs w:val="36"/>
+          <w:lang w:val="en-US"/>
+        </w:rPr>
+      </w:pPr>
     </w:p>
     <w:p>
       <w:pPr>
@@ -3991,21 +4084,26 @@
           <w:color w:val="FF0000"/>
           <w:sz w:val="36"/>
           <w:szCs w:val="36"/>
-        </w:rPr>
-      </w:pPr>
+          <w:lang w:val="en-US"/>
+        </w:rPr>
+      </w:pPr>
+      <w:proofErr w:type="spellStart"/>
       <w:r>
         <w:rPr>
           <w:color w:val="FF0000"/>
           <w:sz w:val="36"/>
           <w:szCs w:val="36"/>
+          <w:lang w:val="en-US"/>
         </w:rPr>
         <w:t>Vídeo</w:t>
       </w:r>
+      <w:proofErr w:type="spellEnd"/>
       <w:r>
         <w:rPr>
           <w:color w:val="FF0000"/>
           <w:sz w:val="36"/>
           <w:szCs w:val="36"/>
+          <w:lang w:val="en-US"/>
         </w:rPr>
         <w:t xml:space="preserve"> 1</w:t>
       </w:r>
@@ -4014,14 +4112,16 @@
           <w:color w:val="FF0000"/>
           <w:sz w:val="36"/>
           <w:szCs w:val="36"/>
-        </w:rPr>
-        <w:t>6</w:t>
+          <w:lang w:val="en-US"/>
+        </w:rPr>
+        <w:t>7</w:t>
       </w:r>
       <w:r>
         <w:rPr>
           <w:color w:val="FF0000"/>
           <w:sz w:val="36"/>
           <w:szCs w:val="36"/>
+          <w:lang w:val="en-US"/>
         </w:rPr>
         <w:t>.</w:t>
       </w:r>
@@ -4042,7 +4142,7 @@
           <w:sz w:val="28"/>
           <w:szCs w:val="36"/>
         </w:rPr>
-        <w:t xml:space="preserve">Definidos: </w:t>
+        <w:t xml:space="preserve">For in </w:t>
       </w:r>
       <w:r>
         <w:rPr>
@@ -4050,184 +4150,16 @@
           <w:sz w:val="28"/>
           <w:szCs w:val="36"/>
         </w:rPr>
-        <w:t>Quando eu sei a quantidade de vezes em que vou rodar.</w:t>
-      </w:r>
-    </w:p>
-    <w:p>
-      <w:pPr>
+        <w:t>= Mesma coisa s</w:t>
+      </w:r>
+      <w:r>
         <w:rPr>
           <w:rFonts w:cstheme="minorHAnsi"/>
           <w:sz w:val="28"/>
           <w:szCs w:val="36"/>
         </w:rPr>
-      </w:pPr>
-      <w:proofErr w:type="spellStart"/>
-      <w:r>
-        <w:rPr>
-          <w:rFonts w:cstheme="minorHAnsi"/>
-          <w:sz w:val="28"/>
-          <w:szCs w:val="36"/>
-        </w:rPr>
-        <w:t>Ex</w:t>
-      </w:r>
-      <w:proofErr w:type="spellEnd"/>
-      <w:r>
-        <w:rPr>
-          <w:rFonts w:cstheme="minorHAnsi"/>
-          <w:sz w:val="28"/>
-          <w:szCs w:val="36"/>
-        </w:rPr>
-        <w:t>: For</w:t>
-      </w:r>
-    </w:p>
-    <w:p>
-      <w:pPr>
-        <w:rPr>
-          <w:rFonts w:cstheme="minorHAnsi"/>
-          <w:sz w:val="28"/>
-          <w:szCs w:val="36"/>
-        </w:rPr>
-      </w:pPr>
-      <w:r>
-        <w:rPr>
-          <w:rFonts w:cstheme="minorHAnsi"/>
-          <w:b/>
-          <w:bCs/>
-          <w:sz w:val="28"/>
-          <w:szCs w:val="36"/>
-        </w:rPr>
-        <w:t>Indefinidos:</w:t>
-      </w:r>
-      <w:r>
-        <w:rPr>
-          <w:rFonts w:cstheme="minorHAnsi"/>
-          <w:sz w:val="28"/>
-          <w:szCs w:val="36"/>
-        </w:rPr>
-        <w:t xml:space="preserve"> Não sabe ao certo quantas vezes vai se repetir. </w:t>
-      </w:r>
-    </w:p>
-    <w:p>
-      <w:pPr>
-        <w:rPr>
-          <w:rFonts w:cstheme="minorHAnsi"/>
-          <w:sz w:val="28"/>
-          <w:szCs w:val="36"/>
-          <w:lang w:val="en-US"/>
-        </w:rPr>
-      </w:pPr>
-      <w:r>
-        <w:rPr>
-          <w:rFonts w:cstheme="minorHAnsi"/>
-          <w:sz w:val="28"/>
-          <w:szCs w:val="36"/>
-          <w:lang w:val="en-US"/>
-        </w:rPr>
-        <w:t>Ex: While, do While</w:t>
-      </w:r>
-    </w:p>
-    <w:p>
-      <w:pPr>
-        <w:rPr>
-          <w:rFonts w:cstheme="minorHAnsi"/>
-          <w:sz w:val="28"/>
-          <w:szCs w:val="36"/>
-          <w:lang w:val="en-US"/>
-        </w:rPr>
-      </w:pPr>
-    </w:p>
-    <w:p>
-      <w:pPr>
-        <w:rPr>
-          <w:color w:val="FF0000"/>
-          <w:sz w:val="36"/>
-          <w:szCs w:val="36"/>
-          <w:lang w:val="en-US"/>
-        </w:rPr>
-      </w:pPr>
-      <w:proofErr w:type="spellStart"/>
-      <w:r>
-        <w:rPr>
-          <w:color w:val="FF0000"/>
-          <w:sz w:val="36"/>
-          <w:szCs w:val="36"/>
-          <w:lang w:val="en-US"/>
-        </w:rPr>
-        <w:t>Vídeo</w:t>
-      </w:r>
-      <w:proofErr w:type="spellEnd"/>
-      <w:r>
-        <w:rPr>
-          <w:color w:val="FF0000"/>
-          <w:sz w:val="36"/>
-          <w:szCs w:val="36"/>
-          <w:lang w:val="en-US"/>
-        </w:rPr>
-        <w:t xml:space="preserve"> 1</w:t>
-      </w:r>
-      <w:r>
-        <w:rPr>
-          <w:color w:val="FF0000"/>
-          <w:sz w:val="36"/>
-          <w:szCs w:val="36"/>
-          <w:lang w:val="en-US"/>
-        </w:rPr>
-        <w:t>7</w:t>
-      </w:r>
-      <w:r>
-        <w:rPr>
-          <w:color w:val="FF0000"/>
-          <w:sz w:val="36"/>
-          <w:szCs w:val="36"/>
-          <w:lang w:val="en-US"/>
-        </w:rPr>
-        <w:t>.</w:t>
-      </w:r>
-    </w:p>
-    <w:p>
-      <w:pPr>
-        <w:rPr>
-          <w:rFonts w:cstheme="minorHAnsi"/>
-          <w:sz w:val="28"/>
-          <w:szCs w:val="36"/>
-        </w:rPr>
-      </w:pPr>
-      <w:r>
-        <w:rPr>
-          <w:rFonts w:cstheme="minorHAnsi"/>
-          <w:b/>
-          <w:bCs/>
-          <w:sz w:val="28"/>
-          <w:szCs w:val="36"/>
-        </w:rPr>
-        <w:t xml:space="preserve">For in </w:t>
-      </w:r>
-      <w:r>
-        <w:rPr>
-          <w:rFonts w:cstheme="minorHAnsi"/>
-          <w:sz w:val="28"/>
-          <w:szCs w:val="36"/>
-        </w:rPr>
-        <w:t>= Mesma coisa s</w:t>
-      </w:r>
-      <w:r>
-        <w:rPr>
-          <w:rFonts w:cstheme="minorHAnsi"/>
-          <w:sz w:val="28"/>
-          <w:szCs w:val="36"/>
-        </w:rPr>
-        <w:t xml:space="preserve">e fosse para imprimir a posição do elemento no </w:t>
-      </w:r>
-      <w:proofErr w:type="spellStart"/>
-      <w:r>
-        <w:rPr>
-          <w:rFonts w:cstheme="minorHAnsi"/>
-          <w:sz w:val="28"/>
-          <w:szCs w:val="36"/>
-        </w:rPr>
-        <w:t>array</w:t>
-      </w:r>
-      <w:proofErr w:type="spellEnd"/>
+        <w:t>e fosse para imprimir a posição do elemento no array</w:t>
+      </w:r>
     </w:p>
     <w:p>
       <w:pPr>
@@ -4730,18 +4662,8 @@
           <w:sz w:val="28"/>
           <w:szCs w:val="36"/>
         </w:rPr>
-        <w:t xml:space="preserve"> dos elementos dentro do </w:t>
-      </w:r>
-      <w:proofErr w:type="spellStart"/>
-      <w:r>
-        <w:rPr>
-          <w:rFonts w:cstheme="minorHAnsi"/>
-          <w:sz w:val="28"/>
-          <w:szCs w:val="36"/>
-        </w:rPr>
-        <w:t>array</w:t>
-      </w:r>
-      <w:proofErr w:type="spellEnd"/>
+        <w:t xml:space="preserve"> dos elementos dentro do array</w:t>
+      </w:r>
     </w:p>
     <w:p>
       <w:pPr>
@@ -8798,7 +8720,6 @@
           <w:color w:val="FF0000"/>
           <w:sz w:val="36"/>
           <w:szCs w:val="36"/>
-          <w:lang w:val="en-US"/>
         </w:rPr>
       </w:pPr>
       <w:r>
@@ -8818,7 +8739,7 @@
           <w:color w:val="F8F8F2"/>
           <w:sz w:val="23"/>
           <w:szCs w:val="23"/>
-          <w:lang w:val="en-US" w:eastAsia="pt-BR"/>
+          <w:lang w:eastAsia="pt-BR"/>
         </w:rPr>
       </w:pPr>
       <w:r>
@@ -8827,7 +8748,7 @@
           <w:color w:val="BD93F9"/>
           <w:sz w:val="23"/>
           <w:szCs w:val="23"/>
-          <w:lang w:val="en-US" w:eastAsia="pt-BR"/>
+          <w:lang w:eastAsia="pt-BR"/>
         </w:rPr>
         <w:t>console</w:t>
       </w:r>
@@ -8837,7 +8758,7 @@
           <w:color w:val="F8F8F2"/>
           <w:sz w:val="23"/>
           <w:szCs w:val="23"/>
-          <w:lang w:val="en-US" w:eastAsia="pt-BR"/>
+          <w:lang w:eastAsia="pt-BR"/>
         </w:rPr>
         <w:t>.</w:t>
       </w:r>
@@ -8847,7 +8768,7 @@
           <w:color w:val="50FA7B"/>
           <w:sz w:val="23"/>
           <w:szCs w:val="23"/>
-          <w:lang w:val="en-US" w:eastAsia="pt-BR"/>
+          <w:lang w:eastAsia="pt-BR"/>
         </w:rPr>
         <w:t>log</w:t>
       </w:r>
@@ -8857,17 +8778,19 @@
           <w:color w:val="F8F8F2"/>
           <w:sz w:val="23"/>
           <w:szCs w:val="23"/>
-          <w:lang w:val="en-US" w:eastAsia="pt-BR"/>
+          <w:lang w:eastAsia="pt-BR"/>
         </w:rPr>
         <w:t>(</w:t>
       </w:r>
+      <w:proofErr w:type="spellStart"/>
+      <w:proofErr w:type="gramStart"/>
       <w:r>
         <w:rPr>
           <w:rFonts w:ascii="Consolas" w:eastAsia="Times New Roman" w:hAnsi="Consolas" w:cs="Times New Roman"/>
           <w:color w:val="BD93F9"/>
           <w:sz w:val="23"/>
           <w:szCs w:val="23"/>
-          <w:lang w:val="en-US" w:eastAsia="pt-BR"/>
+          <w:lang w:eastAsia="pt-BR"/>
         </w:rPr>
         <w:t>itc</w:t>
       </w:r>
@@ -8877,7 +8800,7 @@
           <w:color w:val="F8F8F2"/>
           <w:sz w:val="23"/>
           <w:szCs w:val="23"/>
-          <w:lang w:val="en-US" w:eastAsia="pt-BR"/>
+          <w:lang w:eastAsia="pt-BR"/>
         </w:rPr>
         <w:t>.</w:t>
       </w:r>
@@ -8887,19 +8810,43 @@
           <w:color w:val="50FA7B"/>
           <w:sz w:val="23"/>
           <w:szCs w:val="23"/>
-          <w:lang w:val="en-US" w:eastAsia="pt-BR"/>
+          <w:lang w:eastAsia="pt-BR"/>
         </w:rPr>
         <w:t>next</w:t>
       </w:r>
-      <w:r>
-        <w:rPr>
-          <w:rFonts w:ascii="Consolas" w:eastAsia="Times New Roman" w:hAnsi="Consolas" w:cs="Times New Roman"/>
-          <w:color w:val="F8F8F2"/>
-          <w:sz w:val="23"/>
-          <w:szCs w:val="23"/>
-          <w:lang w:val="en-US" w:eastAsia="pt-BR"/>
-        </w:rPr>
-        <w:t>().value)</w:t>
+      <w:proofErr w:type="spellEnd"/>
+      <w:proofErr w:type="gramEnd"/>
+      <w:r>
+        <w:rPr>
+          <w:rFonts w:ascii="Consolas" w:eastAsia="Times New Roman" w:hAnsi="Consolas" w:cs="Times New Roman"/>
+          <w:color w:val="F8F8F2"/>
+          <w:sz w:val="23"/>
+          <w:szCs w:val="23"/>
+          <w:lang w:eastAsia="pt-BR"/>
+        </w:rPr>
+        <w:t>().</w:t>
+      </w:r>
+      <w:proofErr w:type="spellStart"/>
+      <w:r>
+        <w:rPr>
+          <w:rFonts w:ascii="Consolas" w:eastAsia="Times New Roman" w:hAnsi="Consolas" w:cs="Times New Roman"/>
+          <w:color w:val="F8F8F2"/>
+          <w:sz w:val="23"/>
+          <w:szCs w:val="23"/>
+          <w:lang w:eastAsia="pt-BR"/>
+        </w:rPr>
+        <w:t>value</w:t>
+      </w:r>
+      <w:proofErr w:type="spellEnd"/>
+      <w:r>
+        <w:rPr>
+          <w:rFonts w:ascii="Consolas" w:eastAsia="Times New Roman" w:hAnsi="Consolas" w:cs="Times New Roman"/>
+          <w:color w:val="F8F8F2"/>
+          <w:sz w:val="23"/>
+          <w:szCs w:val="23"/>
+          <w:lang w:eastAsia="pt-BR"/>
+        </w:rPr>
+        <w:t>)</w:t>
       </w:r>
     </w:p>
     <w:p>
@@ -8954,6 +8901,7 @@
         </w:rPr>
         <w:t>(</w:t>
       </w:r>
+      <w:proofErr w:type="spellStart"/>
       <w:r>
         <w:rPr>
           <w:rFonts w:ascii="Consolas" w:eastAsia="Times New Roman" w:hAnsi="Consolas" w:cs="Times New Roman"/>
@@ -8984,6 +8932,7 @@
         </w:rPr>
         <w:t>next</w:t>
       </w:r>
+      <w:proofErr w:type="spellEnd"/>
       <w:r>
         <w:rPr>
           <w:rFonts w:ascii="Consolas" w:eastAsia="Times New Roman" w:hAnsi="Consolas" w:cs="Times New Roman"/>
@@ -10227,22 +10176,229 @@
           <w:sz w:val="36"/>
           <w:szCs w:val="36"/>
         </w:rPr>
-        <w:t>Vídeo 2</w:t>
-      </w:r>
-      <w:r>
+        <w:t>Vídeo 29.</w:t>
+      </w:r>
+    </w:p>
+    <w:p>
+      <w:pPr>
+        <w:rPr>
+          <w:sz w:val="28"/>
+          <w:szCs w:val="36"/>
+        </w:rPr>
+      </w:pPr>
+      <w:r>
+        <w:rPr>
+          <w:sz w:val="28"/>
+          <w:szCs w:val="36"/>
+        </w:rPr>
+        <w:t xml:space="preserve">Maps: Tem a funcionalidade de percorrer </w:t>
+      </w:r>
+      <w:proofErr w:type="spellStart"/>
+      <w:r>
+        <w:rPr>
+          <w:sz w:val="28"/>
+          <w:szCs w:val="36"/>
+        </w:rPr>
+        <w:t>arrays</w:t>
+      </w:r>
+      <w:proofErr w:type="spellEnd"/>
+      <w:r>
+        <w:rPr>
+          <w:sz w:val="28"/>
+          <w:szCs w:val="36"/>
+        </w:rPr>
+        <w:t>. Sendo usado para trabalhar com os elementos da coleção.</w:t>
+      </w:r>
+    </w:p>
+    <w:p>
+      <w:pPr>
+        <w:rPr>
+          <w:b/>
+          <w:bCs/>
+          <w:sz w:val="28"/>
+          <w:szCs w:val="36"/>
+        </w:rPr>
+      </w:pPr>
+      <w:r>
+        <w:rPr>
+          <w:sz w:val="28"/>
+          <w:szCs w:val="36"/>
+        </w:rPr>
+        <w:t>Funciona assim:</w:t>
+      </w:r>
+      <w:r>
+        <w:rPr>
+          <w:sz w:val="28"/>
+          <w:szCs w:val="36"/>
+        </w:rPr>
+        <w:br/>
+      </w:r>
+      <w:proofErr w:type="spellStart"/>
+      <w:r>
+        <w:rPr>
+          <w:sz w:val="28"/>
+          <w:szCs w:val="36"/>
+        </w:rPr>
+        <w:t>lista.</w:t>
+      </w:r>
+      <w:r>
+        <w:rPr>
+          <w:b/>
+          <w:bCs/>
+          <w:sz w:val="28"/>
+          <w:szCs w:val="36"/>
+        </w:rPr>
+        <w:t>map</w:t>
+      </w:r>
+      <w:proofErr w:type="spellEnd"/>
+      <w:r>
+        <w:rPr>
+          <w:b/>
+          <w:bCs/>
+          <w:sz w:val="28"/>
+          <w:szCs w:val="36"/>
+        </w:rPr>
+        <w:t>(</w:t>
+      </w:r>
+      <w:r>
+        <w:rPr>
+          <w:b/>
+          <w:bCs/>
+          <w:sz w:val="28"/>
+          <w:szCs w:val="36"/>
+        </w:rPr>
+        <w:t>({elemento}, {índice}) =&gt; {</w:t>
+      </w:r>
+    </w:p>
+    <w:p>
+      <w:pPr>
+        <w:rPr>
+          <w:b/>
+          <w:bCs/>
+          <w:sz w:val="28"/>
+          <w:szCs w:val="36"/>
+        </w:rPr>
+      </w:pPr>
+      <w:r>
+        <w:rPr>
+          <w:b/>
+          <w:bCs/>
+          <w:sz w:val="28"/>
+          <w:szCs w:val="36"/>
+        </w:rPr>
+        <w:tab/>
+      </w:r>
+    </w:p>
+    <w:p>
+      <w:pPr>
+        <w:rPr>
+          <w:b/>
+          <w:bCs/>
+          <w:sz w:val="28"/>
+          <w:szCs w:val="36"/>
+        </w:rPr>
+      </w:pPr>
+      <w:r>
+        <w:rPr>
+          <w:b/>
+          <w:bCs/>
+          <w:sz w:val="28"/>
+          <w:szCs w:val="36"/>
+        </w:rPr>
+        <w:t>}</w:t>
+      </w:r>
+      <w:r>
+        <w:rPr>
+          <w:b/>
+          <w:bCs/>
+          <w:sz w:val="28"/>
+          <w:szCs w:val="36"/>
+        </w:rPr>
+        <w:t>)</w:t>
+      </w:r>
+      <w:r>
+        <w:rPr>
+          <w:b/>
+          <w:bCs/>
+          <w:sz w:val="28"/>
+          <w:szCs w:val="36"/>
+        </w:rPr>
+        <w:tab/>
+      </w:r>
+    </w:p>
+    <w:p>
+      <w:pPr>
+        <w:rPr>
+          <w:b/>
+          <w:bCs/>
+          <w:sz w:val="28"/>
+          <w:szCs w:val="36"/>
+        </w:rPr>
+      </w:pPr>
+    </w:p>
+    <w:p>
+      <w:pPr>
         <w:rPr>
           <w:color w:val="FF0000"/>
           <w:sz w:val="36"/>
           <w:szCs w:val="36"/>
         </w:rPr>
-        <w:t>9</w:t>
-      </w:r>
+      </w:pPr>
       <w:r>
         <w:rPr>
           <w:color w:val="FF0000"/>
           <w:sz w:val="36"/>
           <w:szCs w:val="36"/>
         </w:rPr>
+        <w:t>Vídeo 30.</w:t>
+      </w:r>
+    </w:p>
+    <w:p>
+      <w:pPr>
+        <w:rPr>
+          <w:sz w:val="28"/>
+          <w:szCs w:val="36"/>
+        </w:rPr>
+      </w:pPr>
+      <w:proofErr w:type="spellStart"/>
+      <w:r>
+        <w:rPr>
+          <w:sz w:val="28"/>
+          <w:szCs w:val="36"/>
+        </w:rPr>
+        <w:t>This</w:t>
+      </w:r>
+      <w:proofErr w:type="spellEnd"/>
+      <w:r>
+        <w:rPr>
+          <w:sz w:val="28"/>
+          <w:szCs w:val="36"/>
+        </w:rPr>
+        <w:t xml:space="preserve">: </w:t>
+      </w:r>
+      <w:r>
+        <w:rPr>
+          <w:sz w:val="28"/>
+          <w:szCs w:val="36"/>
+        </w:rPr>
+        <w:t xml:space="preserve">É para fazer uma referencia ao elemento de uma função, por exemplo aluno(nome), então seria </w:t>
+      </w:r>
+      <w:proofErr w:type="spellStart"/>
+      <w:proofErr w:type="gramStart"/>
+      <w:r>
+        <w:rPr>
+          <w:sz w:val="28"/>
+          <w:szCs w:val="36"/>
+        </w:rPr>
+        <w:t>this.nome</w:t>
+      </w:r>
+      <w:proofErr w:type="spellEnd"/>
+      <w:proofErr w:type="gramEnd"/>
+      <w:r>
+        <w:rPr>
+          <w:sz w:val="28"/>
+          <w:szCs w:val="36"/>
+        </w:rPr>
         <w:t>.</w:t>
       </w:r>
     </w:p>
@@ -10258,7 +10414,7 @@
           <w:sz w:val="28"/>
           <w:szCs w:val="36"/>
         </w:rPr>
-        <w:t xml:space="preserve">Maps: Tem a funcionalidade de percorrer </w:t>
+        <w:t xml:space="preserve">Ao invés de usar </w:t>
       </w:r>
       <w:proofErr w:type="spellStart"/>
       <w:r>
@@ -10266,7 +10422,7 @@
           <w:sz w:val="28"/>
           <w:szCs w:val="36"/>
         </w:rPr>
-        <w:t>arrays</w:t>
+        <w:t>novoNome</w:t>
       </w:r>
       <w:proofErr w:type="spellEnd"/>
       <w:r>
@@ -10274,115 +10430,1625 @@
           <w:sz w:val="28"/>
           <w:szCs w:val="36"/>
         </w:rPr>
-        <w:t>. Sendo usado para trabalhar com os elementos da coleção.</w:t>
-      </w:r>
-    </w:p>
-    <w:p>
-      <w:pPr>
-        <w:rPr>
-          <w:b/>
-          <w:bCs/>
-          <w:sz w:val="28"/>
-          <w:szCs w:val="36"/>
-        </w:rPr>
-      </w:pPr>
-      <w:r>
-        <w:rPr>
-          <w:sz w:val="28"/>
-          <w:szCs w:val="36"/>
-        </w:rPr>
-        <w:t>Funciona assim:</w:t>
-      </w:r>
-      <w:r>
-        <w:rPr>
-          <w:sz w:val="28"/>
-          <w:szCs w:val="36"/>
-        </w:rPr>
-        <w:br/>
+        <w:t xml:space="preserve"> = nome, você usa o </w:t>
       </w:r>
       <w:proofErr w:type="spellStart"/>
-      <w:r>
-        <w:rPr>
-          <w:sz w:val="28"/>
-          <w:szCs w:val="36"/>
-        </w:rPr>
-        <w:t>lista.</w:t>
-      </w:r>
-      <w:r>
-        <w:rPr>
-          <w:b/>
-          <w:bCs/>
-          <w:sz w:val="28"/>
-          <w:szCs w:val="36"/>
-        </w:rPr>
-        <w:t>map</w:t>
+      <w:proofErr w:type="gramStart"/>
+      <w:r>
+        <w:rPr>
+          <w:sz w:val="28"/>
+          <w:szCs w:val="36"/>
+        </w:rPr>
+        <w:t>this.nome</w:t>
       </w:r>
       <w:proofErr w:type="spellEnd"/>
-      <w:r>
-        <w:rPr>
-          <w:b/>
-          <w:bCs/>
-          <w:sz w:val="28"/>
-          <w:szCs w:val="36"/>
+      <w:proofErr w:type="gramEnd"/>
+      <w:r>
+        <w:rPr>
+          <w:sz w:val="28"/>
+          <w:szCs w:val="36"/>
+        </w:rPr>
+        <w:t xml:space="preserve">. </w:t>
+      </w:r>
+    </w:p>
+    <w:p>
+      <w:pPr>
+        <w:rPr>
+          <w:sz w:val="28"/>
+          <w:szCs w:val="36"/>
+        </w:rPr>
+      </w:pPr>
+      <w:r>
+        <w:rPr>
+          <w:sz w:val="28"/>
+          <w:szCs w:val="36"/>
+        </w:rPr>
+        <w:t xml:space="preserve">Em contexto de função: Usamos o </w:t>
+      </w:r>
+      <w:proofErr w:type="spellStart"/>
+      <w:proofErr w:type="gramStart"/>
+      <w:r>
+        <w:rPr>
+          <w:sz w:val="28"/>
+          <w:szCs w:val="36"/>
+        </w:rPr>
+        <w:t>this</w:t>
+      </w:r>
+      <w:proofErr w:type="spellEnd"/>
+      <w:r>
+        <w:rPr>
+          <w:sz w:val="28"/>
+          <w:szCs w:val="36"/>
+        </w:rPr>
+        <w:t>.{</w:t>
+      </w:r>
+      <w:proofErr w:type="gramEnd"/>
+      <w:r>
+        <w:rPr>
+          <w:sz w:val="28"/>
+          <w:szCs w:val="36"/>
+        </w:rPr>
+        <w:t>nome função} para inserir uma função dentro do contexto da função principal.</w:t>
+      </w:r>
+    </w:p>
+    <w:p>
+      <w:pPr>
+        <w:rPr>
+          <w:color w:val="FF0000"/>
+          <w:sz w:val="36"/>
+          <w:szCs w:val="36"/>
+        </w:rPr>
+      </w:pPr>
+      <w:r>
+        <w:rPr>
+          <w:color w:val="FF0000"/>
+          <w:sz w:val="36"/>
+          <w:szCs w:val="36"/>
+        </w:rPr>
+        <w:t>Vídeo 3</w:t>
+      </w:r>
+      <w:r>
+        <w:rPr>
+          <w:color w:val="FF0000"/>
+          <w:sz w:val="36"/>
+          <w:szCs w:val="36"/>
+        </w:rPr>
+        <w:t>1</w:t>
+      </w:r>
+      <w:r>
+        <w:rPr>
+          <w:color w:val="FF0000"/>
+          <w:sz w:val="36"/>
+          <w:szCs w:val="36"/>
+        </w:rPr>
+        <w:t>.</w:t>
+      </w:r>
+    </w:p>
+    <w:p>
+      <w:pPr>
+        <w:rPr>
+          <w:sz w:val="28"/>
+          <w:szCs w:val="36"/>
+        </w:rPr>
+      </w:pPr>
+      <w:proofErr w:type="spellStart"/>
+      <w:r>
+        <w:rPr>
+          <w:sz w:val="28"/>
+          <w:szCs w:val="36"/>
+        </w:rPr>
+        <w:t>getElementById</w:t>
+      </w:r>
+      <w:proofErr w:type="spellEnd"/>
+      <w:r>
+        <w:rPr>
+          <w:sz w:val="28"/>
+          <w:szCs w:val="36"/>
+        </w:rPr>
+        <w:t xml:space="preserve"> = Pega o elemento do </w:t>
+      </w:r>
+      <w:proofErr w:type="spellStart"/>
+      <w:r>
+        <w:rPr>
+          <w:sz w:val="28"/>
+          <w:szCs w:val="36"/>
+        </w:rPr>
+        <w:t>html</w:t>
+      </w:r>
+      <w:proofErr w:type="spellEnd"/>
+      <w:r>
+        <w:rPr>
+          <w:sz w:val="28"/>
+          <w:szCs w:val="36"/>
+        </w:rPr>
+        <w:t xml:space="preserve"> pelo id, podendo fazer qualquer tipo de manipulação. </w:t>
+      </w:r>
+    </w:p>
+    <w:p>
+      <w:pPr>
+        <w:shd w:val="clear" w:color="auto" w:fill="282A36"/>
+        <w:spacing w:after="0" w:line="300" w:lineRule="atLeast"/>
+        <w:rPr>
+          <w:rFonts w:ascii="Consolas" w:eastAsia="Times New Roman" w:hAnsi="Consolas" w:cs="Times New Roman"/>
+          <w:color w:val="F8F8F2"/>
+          <w:sz w:val="23"/>
+          <w:szCs w:val="23"/>
+          <w:lang w:val="en-US" w:eastAsia="pt-BR"/>
+        </w:rPr>
+      </w:pPr>
+      <w:r>
+        <w:rPr>
+          <w:rFonts w:ascii="Consolas" w:eastAsia="Times New Roman" w:hAnsi="Consolas" w:cs="Times New Roman"/>
+          <w:color w:val="FF79C6"/>
+          <w:sz w:val="23"/>
+          <w:szCs w:val="23"/>
+          <w:lang w:val="en-US" w:eastAsia="pt-BR"/>
+        </w:rPr>
+        <w:lastRenderedPageBreak/>
+        <w:t>const</w:t>
+      </w:r>
+      <w:r>
+        <w:rPr>
+          <w:rFonts w:ascii="Consolas" w:eastAsia="Times New Roman" w:hAnsi="Consolas" w:cs="Times New Roman"/>
+          <w:color w:val="F8F8F2"/>
+          <w:sz w:val="23"/>
+          <w:szCs w:val="23"/>
+          <w:lang w:val="en-US" w:eastAsia="pt-BR"/>
+        </w:rPr>
+        <w:t xml:space="preserve"> </w:t>
+      </w:r>
+      <w:r>
+        <w:rPr>
+          <w:rFonts w:ascii="Consolas" w:eastAsia="Times New Roman" w:hAnsi="Consolas" w:cs="Times New Roman"/>
+          <w:color w:val="BD93F9"/>
+          <w:sz w:val="23"/>
+          <w:szCs w:val="23"/>
+          <w:lang w:val="en-US" w:eastAsia="pt-BR"/>
+        </w:rPr>
+        <w:t>dc1</w:t>
+      </w:r>
+      <w:r>
+        <w:rPr>
+          <w:rFonts w:ascii="Consolas" w:eastAsia="Times New Roman" w:hAnsi="Consolas" w:cs="Times New Roman"/>
+          <w:color w:val="F8F8F2"/>
+          <w:sz w:val="23"/>
+          <w:szCs w:val="23"/>
+          <w:lang w:val="en-US" w:eastAsia="pt-BR"/>
+        </w:rPr>
+        <w:t xml:space="preserve"> </w:t>
+      </w:r>
+      <w:r>
+        <w:rPr>
+          <w:rFonts w:ascii="Consolas" w:eastAsia="Times New Roman" w:hAnsi="Consolas" w:cs="Times New Roman"/>
+          <w:color w:val="FF79C6"/>
+          <w:sz w:val="23"/>
+          <w:szCs w:val="23"/>
+          <w:lang w:val="en-US" w:eastAsia="pt-BR"/>
+        </w:rPr>
+        <w:t>=</w:t>
+      </w:r>
+      <w:r>
+        <w:rPr>
+          <w:rFonts w:ascii="Consolas" w:eastAsia="Times New Roman" w:hAnsi="Consolas" w:cs="Times New Roman"/>
+          <w:color w:val="F8F8F2"/>
+          <w:sz w:val="23"/>
+          <w:szCs w:val="23"/>
+          <w:lang w:val="en-US" w:eastAsia="pt-BR"/>
+        </w:rPr>
+        <w:t xml:space="preserve"> </w:t>
+      </w:r>
+      <w:proofErr w:type="spellStart"/>
+      <w:r>
+        <w:rPr>
+          <w:rFonts w:ascii="Consolas" w:eastAsia="Times New Roman" w:hAnsi="Consolas" w:cs="Times New Roman"/>
+          <w:color w:val="BD93F9"/>
+          <w:sz w:val="23"/>
+          <w:szCs w:val="23"/>
+          <w:lang w:val="en-US" w:eastAsia="pt-BR"/>
+        </w:rPr>
+        <w:t>document</w:t>
+      </w:r>
+      <w:r>
+        <w:rPr>
+          <w:rFonts w:ascii="Consolas" w:eastAsia="Times New Roman" w:hAnsi="Consolas" w:cs="Times New Roman"/>
+          <w:color w:val="F8F8F2"/>
+          <w:sz w:val="23"/>
+          <w:szCs w:val="23"/>
+          <w:lang w:val="en-US" w:eastAsia="pt-BR"/>
+        </w:rPr>
+        <w:t>.</w:t>
+      </w:r>
+      <w:r>
+        <w:rPr>
+          <w:rFonts w:ascii="Consolas" w:eastAsia="Times New Roman" w:hAnsi="Consolas" w:cs="Times New Roman"/>
+          <w:color w:val="50FA7B"/>
+          <w:sz w:val="23"/>
+          <w:szCs w:val="23"/>
+          <w:lang w:val="en-US" w:eastAsia="pt-BR"/>
+        </w:rPr>
+        <w:t>getElementById</w:t>
+      </w:r>
+      <w:proofErr w:type="spellEnd"/>
+      <w:r>
+        <w:rPr>
+          <w:rFonts w:ascii="Consolas" w:eastAsia="Times New Roman" w:hAnsi="Consolas" w:cs="Times New Roman"/>
+          <w:color w:val="F8F8F2"/>
+          <w:sz w:val="23"/>
+          <w:szCs w:val="23"/>
+          <w:lang w:val="en-US" w:eastAsia="pt-BR"/>
         </w:rPr>
         <w:t>(</w:t>
       </w:r>
       <w:r>
         <w:rPr>
-          <w:b/>
-          <w:bCs/>
-          <w:sz w:val="28"/>
-          <w:szCs w:val="36"/>
-        </w:rPr>
-        <w:t>({elemento}, {índice}) =&gt; {</w:t>
-      </w:r>
-    </w:p>
-    <w:p>
-      <w:pPr>
-        <w:rPr>
-          <w:b/>
-          <w:bCs/>
-          <w:sz w:val="28"/>
-          <w:szCs w:val="36"/>
-        </w:rPr>
-      </w:pPr>
-      <w:r>
-        <w:rPr>
-          <w:b/>
-          <w:bCs/>
-          <w:sz w:val="28"/>
-          <w:szCs w:val="36"/>
-        </w:rPr>
-        <w:tab/>
-      </w:r>
+          <w:rFonts w:ascii="Consolas" w:eastAsia="Times New Roman" w:hAnsi="Consolas" w:cs="Times New Roman"/>
+          <w:color w:val="E9F284"/>
+          <w:sz w:val="23"/>
+          <w:szCs w:val="23"/>
+          <w:lang w:val="en-US" w:eastAsia="pt-BR"/>
+        </w:rPr>
+        <w:t>"</w:t>
+      </w:r>
+      <w:r>
+        <w:rPr>
+          <w:rFonts w:ascii="Consolas" w:eastAsia="Times New Roman" w:hAnsi="Consolas" w:cs="Times New Roman"/>
+          <w:color w:val="F1FA8C"/>
+          <w:sz w:val="23"/>
+          <w:szCs w:val="23"/>
+          <w:lang w:val="en-US" w:eastAsia="pt-BR"/>
+        </w:rPr>
+        <w:t>c1</w:t>
+      </w:r>
+      <w:r>
+        <w:rPr>
+          <w:rFonts w:ascii="Consolas" w:eastAsia="Times New Roman" w:hAnsi="Consolas" w:cs="Times New Roman"/>
+          <w:color w:val="E9F284"/>
+          <w:sz w:val="23"/>
+          <w:szCs w:val="23"/>
+          <w:lang w:val="en-US" w:eastAsia="pt-BR"/>
+        </w:rPr>
+        <w:t>"</w:t>
+      </w:r>
+      <w:r>
+        <w:rPr>
+          <w:rFonts w:ascii="Consolas" w:eastAsia="Times New Roman" w:hAnsi="Consolas" w:cs="Times New Roman"/>
+          <w:color w:val="F8F8F2"/>
+          <w:sz w:val="23"/>
+          <w:szCs w:val="23"/>
+          <w:lang w:val="en-US" w:eastAsia="pt-BR"/>
+        </w:rPr>
+        <w:t>);</w:t>
+      </w:r>
+    </w:p>
+    <w:p>
+      <w:pPr>
+        <w:shd w:val="clear" w:color="auto" w:fill="282A36"/>
+        <w:spacing w:after="0" w:line="300" w:lineRule="atLeast"/>
+        <w:rPr>
+          <w:rFonts w:ascii="Consolas" w:eastAsia="Times New Roman" w:hAnsi="Consolas" w:cs="Times New Roman"/>
+          <w:color w:val="F8F8F2"/>
+          <w:sz w:val="23"/>
+          <w:szCs w:val="23"/>
+          <w:lang w:val="en-US" w:eastAsia="pt-BR"/>
+        </w:rPr>
+      </w:pPr>
+      <w:r>
+        <w:rPr>
+          <w:rFonts w:ascii="Consolas" w:eastAsia="Times New Roman" w:hAnsi="Consolas" w:cs="Times New Roman"/>
+          <w:color w:val="BD93F9"/>
+          <w:sz w:val="23"/>
+          <w:szCs w:val="23"/>
+          <w:lang w:val="en-US" w:eastAsia="pt-BR"/>
+        </w:rPr>
+        <w:t>console</w:t>
+      </w:r>
+      <w:r>
+        <w:rPr>
+          <w:rFonts w:ascii="Consolas" w:eastAsia="Times New Roman" w:hAnsi="Consolas" w:cs="Times New Roman"/>
+          <w:color w:val="F8F8F2"/>
+          <w:sz w:val="23"/>
+          <w:szCs w:val="23"/>
+          <w:lang w:val="en-US" w:eastAsia="pt-BR"/>
+        </w:rPr>
+        <w:t>.</w:t>
+      </w:r>
+      <w:r>
+        <w:rPr>
+          <w:rFonts w:ascii="Consolas" w:eastAsia="Times New Roman" w:hAnsi="Consolas" w:cs="Times New Roman"/>
+          <w:color w:val="50FA7B"/>
+          <w:sz w:val="23"/>
+          <w:szCs w:val="23"/>
+          <w:lang w:val="en-US" w:eastAsia="pt-BR"/>
+        </w:rPr>
+        <w:t>log</w:t>
+      </w:r>
+      <w:r>
+        <w:rPr>
+          <w:rFonts w:ascii="Consolas" w:eastAsia="Times New Roman" w:hAnsi="Consolas" w:cs="Times New Roman"/>
+          <w:color w:val="F8F8F2"/>
+          <w:sz w:val="23"/>
+          <w:szCs w:val="23"/>
+          <w:lang w:val="en-US" w:eastAsia="pt-BR"/>
+        </w:rPr>
+        <w:t>(</w:t>
+      </w:r>
+      <w:r>
+        <w:rPr>
+          <w:rFonts w:ascii="Consolas" w:eastAsia="Times New Roman" w:hAnsi="Consolas" w:cs="Times New Roman"/>
+          <w:color w:val="BD93F9"/>
+          <w:sz w:val="23"/>
+          <w:szCs w:val="23"/>
+          <w:lang w:val="en-US" w:eastAsia="pt-BR"/>
+        </w:rPr>
+        <w:t>dc1</w:t>
+      </w:r>
+      <w:r>
+        <w:rPr>
+          <w:rFonts w:ascii="Consolas" w:eastAsia="Times New Roman" w:hAnsi="Consolas" w:cs="Times New Roman"/>
+          <w:color w:val="F8F8F2"/>
+          <w:sz w:val="23"/>
+          <w:szCs w:val="23"/>
+          <w:lang w:val="en-US" w:eastAsia="pt-BR"/>
+        </w:rPr>
+        <w:t>);</w:t>
+      </w:r>
+    </w:p>
+    <w:p>
+      <w:pPr>
+        <w:shd w:val="clear" w:color="auto" w:fill="282A36"/>
+        <w:spacing w:after="0" w:line="300" w:lineRule="atLeast"/>
+        <w:rPr>
+          <w:rFonts w:ascii="Consolas" w:eastAsia="Times New Roman" w:hAnsi="Consolas" w:cs="Times New Roman"/>
+          <w:color w:val="F8F8F2"/>
+          <w:sz w:val="23"/>
+          <w:szCs w:val="23"/>
+          <w:lang w:val="en-US" w:eastAsia="pt-BR"/>
+        </w:rPr>
+      </w:pPr>
+      <w:r>
+        <w:rPr>
+          <w:rFonts w:ascii="Consolas" w:eastAsia="Times New Roman" w:hAnsi="Consolas" w:cs="Times New Roman"/>
+          <w:color w:val="BD93F9"/>
+          <w:sz w:val="23"/>
+          <w:szCs w:val="23"/>
+          <w:lang w:val="en-US" w:eastAsia="pt-BR"/>
+        </w:rPr>
+        <w:t>console</w:t>
+      </w:r>
+      <w:r>
+        <w:rPr>
+          <w:rFonts w:ascii="Consolas" w:eastAsia="Times New Roman" w:hAnsi="Consolas" w:cs="Times New Roman"/>
+          <w:color w:val="F8F8F2"/>
+          <w:sz w:val="23"/>
+          <w:szCs w:val="23"/>
+          <w:lang w:val="en-US" w:eastAsia="pt-BR"/>
+        </w:rPr>
+        <w:t>.</w:t>
+      </w:r>
+      <w:r>
+        <w:rPr>
+          <w:rFonts w:ascii="Consolas" w:eastAsia="Times New Roman" w:hAnsi="Consolas" w:cs="Times New Roman"/>
+          <w:color w:val="50FA7B"/>
+          <w:sz w:val="23"/>
+          <w:szCs w:val="23"/>
+          <w:lang w:val="en-US" w:eastAsia="pt-BR"/>
+        </w:rPr>
+        <w:t>log</w:t>
+      </w:r>
+      <w:r>
+        <w:rPr>
+          <w:rFonts w:ascii="Consolas" w:eastAsia="Times New Roman" w:hAnsi="Consolas" w:cs="Times New Roman"/>
+          <w:color w:val="F8F8F2"/>
+          <w:sz w:val="23"/>
+          <w:szCs w:val="23"/>
+          <w:lang w:val="en-US" w:eastAsia="pt-BR"/>
+        </w:rPr>
+        <w:t>(</w:t>
+      </w:r>
+      <w:r>
+        <w:rPr>
+          <w:rFonts w:ascii="Consolas" w:eastAsia="Times New Roman" w:hAnsi="Consolas" w:cs="Times New Roman"/>
+          <w:color w:val="BD93F9"/>
+          <w:sz w:val="23"/>
+          <w:szCs w:val="23"/>
+          <w:lang w:val="en-US" w:eastAsia="pt-BR"/>
+        </w:rPr>
+        <w:t>dc1</w:t>
+      </w:r>
+      <w:r>
+        <w:rPr>
+          <w:rFonts w:ascii="Consolas" w:eastAsia="Times New Roman" w:hAnsi="Consolas" w:cs="Times New Roman"/>
+          <w:color w:val="F8F8F2"/>
+          <w:sz w:val="23"/>
+          <w:szCs w:val="23"/>
+          <w:lang w:val="en-US" w:eastAsia="pt-BR"/>
+        </w:rPr>
+        <w:t>.id);</w:t>
+      </w:r>
+    </w:p>
+    <w:p>
+      <w:pPr>
+        <w:shd w:val="clear" w:color="auto" w:fill="282A36"/>
+        <w:spacing w:after="0" w:line="300" w:lineRule="atLeast"/>
+        <w:rPr>
+          <w:rFonts w:ascii="Consolas" w:eastAsia="Times New Roman" w:hAnsi="Consolas" w:cs="Times New Roman"/>
+          <w:color w:val="F8F8F2"/>
+          <w:sz w:val="23"/>
+          <w:szCs w:val="23"/>
+          <w:lang w:val="en-US" w:eastAsia="pt-BR"/>
+        </w:rPr>
+      </w:pPr>
+      <w:r>
+        <w:rPr>
+          <w:rFonts w:ascii="Consolas" w:eastAsia="Times New Roman" w:hAnsi="Consolas" w:cs="Times New Roman"/>
+          <w:color w:val="BD93F9"/>
+          <w:sz w:val="23"/>
+          <w:szCs w:val="23"/>
+          <w:lang w:val="en-US" w:eastAsia="pt-BR"/>
+        </w:rPr>
+        <w:t>dc1</w:t>
+      </w:r>
+      <w:r>
+        <w:rPr>
+          <w:rFonts w:ascii="Consolas" w:eastAsia="Times New Roman" w:hAnsi="Consolas" w:cs="Times New Roman"/>
+          <w:color w:val="F8F8F2"/>
+          <w:sz w:val="23"/>
+          <w:szCs w:val="23"/>
+          <w:lang w:val="en-US" w:eastAsia="pt-BR"/>
+        </w:rPr>
+        <w:t xml:space="preserve">.innerHTML </w:t>
+      </w:r>
+      <w:r>
+        <w:rPr>
+          <w:rFonts w:ascii="Consolas" w:eastAsia="Times New Roman" w:hAnsi="Consolas" w:cs="Times New Roman"/>
+          <w:color w:val="FF79C6"/>
+          <w:sz w:val="23"/>
+          <w:szCs w:val="23"/>
+          <w:lang w:val="en-US" w:eastAsia="pt-BR"/>
+        </w:rPr>
+        <w:t>=</w:t>
+      </w:r>
+      <w:r>
+        <w:rPr>
+          <w:rFonts w:ascii="Consolas" w:eastAsia="Times New Roman" w:hAnsi="Consolas" w:cs="Times New Roman"/>
+          <w:color w:val="F8F8F2"/>
+          <w:sz w:val="23"/>
+          <w:szCs w:val="23"/>
+          <w:lang w:val="en-US" w:eastAsia="pt-BR"/>
+        </w:rPr>
+        <w:t xml:space="preserve"> </w:t>
+      </w:r>
+      <w:r>
+        <w:rPr>
+          <w:rFonts w:ascii="Consolas" w:eastAsia="Times New Roman" w:hAnsi="Consolas" w:cs="Times New Roman"/>
+          <w:color w:val="E9F284"/>
+          <w:sz w:val="23"/>
+          <w:szCs w:val="23"/>
+          <w:lang w:val="en-US" w:eastAsia="pt-BR"/>
+        </w:rPr>
+        <w:t>"</w:t>
+      </w:r>
+      <w:proofErr w:type="spellStart"/>
+      <w:r>
+        <w:rPr>
+          <w:rFonts w:ascii="Consolas" w:eastAsia="Times New Roman" w:hAnsi="Consolas" w:cs="Times New Roman"/>
+          <w:color w:val="F1FA8C"/>
+          <w:sz w:val="23"/>
+          <w:szCs w:val="23"/>
+          <w:lang w:val="en-US" w:eastAsia="pt-BR"/>
+        </w:rPr>
+        <w:t>Olá</w:t>
+      </w:r>
+      <w:proofErr w:type="spellEnd"/>
+      <w:r>
+        <w:rPr>
+          <w:rFonts w:ascii="Consolas" w:eastAsia="Times New Roman" w:hAnsi="Consolas" w:cs="Times New Roman"/>
+          <w:color w:val="F1FA8C"/>
+          <w:sz w:val="23"/>
+          <w:szCs w:val="23"/>
+          <w:lang w:val="en-US" w:eastAsia="pt-BR"/>
+        </w:rPr>
+        <w:t xml:space="preserve"> Mundo</w:t>
+      </w:r>
+      <w:r>
+        <w:rPr>
+          <w:rFonts w:ascii="Consolas" w:eastAsia="Times New Roman" w:hAnsi="Consolas" w:cs="Times New Roman"/>
+          <w:color w:val="E9F284"/>
+          <w:sz w:val="23"/>
+          <w:szCs w:val="23"/>
+          <w:lang w:val="en-US" w:eastAsia="pt-BR"/>
+        </w:rPr>
+        <w:t>"</w:t>
+      </w:r>
+    </w:p>
+    <w:p>
+      <w:pPr>
+        <w:shd w:val="clear" w:color="auto" w:fill="282A36"/>
+        <w:spacing w:after="0" w:line="300" w:lineRule="atLeast"/>
+        <w:rPr>
+          <w:rFonts w:ascii="Consolas" w:eastAsia="Times New Roman" w:hAnsi="Consolas" w:cs="Times New Roman"/>
+          <w:color w:val="F8F8F2"/>
+          <w:sz w:val="23"/>
+          <w:szCs w:val="23"/>
+          <w:lang w:val="en-US" w:eastAsia="pt-BR"/>
+        </w:rPr>
+      </w:pPr>
+      <w:r>
+        <w:rPr>
+          <w:rFonts w:ascii="Consolas" w:eastAsia="Times New Roman" w:hAnsi="Consolas" w:cs="Times New Roman"/>
+          <w:color w:val="BD93F9"/>
+          <w:sz w:val="23"/>
+          <w:szCs w:val="23"/>
+          <w:lang w:val="en-US" w:eastAsia="pt-BR"/>
+        </w:rPr>
+        <w:t>console</w:t>
+      </w:r>
+      <w:r>
+        <w:rPr>
+          <w:rFonts w:ascii="Consolas" w:eastAsia="Times New Roman" w:hAnsi="Consolas" w:cs="Times New Roman"/>
+          <w:color w:val="F8F8F2"/>
+          <w:sz w:val="23"/>
+          <w:szCs w:val="23"/>
+          <w:lang w:val="en-US" w:eastAsia="pt-BR"/>
+        </w:rPr>
+        <w:t>.</w:t>
+      </w:r>
+      <w:r>
+        <w:rPr>
+          <w:rFonts w:ascii="Consolas" w:eastAsia="Times New Roman" w:hAnsi="Consolas" w:cs="Times New Roman"/>
+          <w:color w:val="50FA7B"/>
+          <w:sz w:val="23"/>
+          <w:szCs w:val="23"/>
+          <w:lang w:val="en-US" w:eastAsia="pt-BR"/>
+        </w:rPr>
+        <w:t>log</w:t>
+      </w:r>
+      <w:r>
+        <w:rPr>
+          <w:rFonts w:ascii="Consolas" w:eastAsia="Times New Roman" w:hAnsi="Consolas" w:cs="Times New Roman"/>
+          <w:color w:val="F8F8F2"/>
+          <w:sz w:val="23"/>
+          <w:szCs w:val="23"/>
+          <w:lang w:val="en-US" w:eastAsia="pt-BR"/>
+        </w:rPr>
+        <w:t>(</w:t>
+      </w:r>
+      <w:r>
+        <w:rPr>
+          <w:rFonts w:ascii="Consolas" w:eastAsia="Times New Roman" w:hAnsi="Consolas" w:cs="Times New Roman"/>
+          <w:color w:val="BD93F9"/>
+          <w:sz w:val="23"/>
+          <w:szCs w:val="23"/>
+          <w:lang w:val="en-US" w:eastAsia="pt-BR"/>
+        </w:rPr>
+        <w:t>dc1</w:t>
+      </w:r>
+      <w:r>
+        <w:rPr>
+          <w:rFonts w:ascii="Consolas" w:eastAsia="Times New Roman" w:hAnsi="Consolas" w:cs="Times New Roman"/>
+          <w:color w:val="F8F8F2"/>
+          <w:sz w:val="23"/>
+          <w:szCs w:val="23"/>
+          <w:lang w:val="en-US" w:eastAsia="pt-BR"/>
+        </w:rPr>
+        <w:t>.innerHTML)</w:t>
+      </w:r>
+    </w:p>
+    <w:p>
+      <w:pPr>
+        <w:rPr>
+          <w:color w:val="FF0000"/>
+          <w:sz w:val="36"/>
+          <w:szCs w:val="36"/>
+          <w:lang w:val="en-US"/>
+        </w:rPr>
+      </w:pPr>
+    </w:p>
+    <w:p>
+      <w:pPr>
+        <w:rPr>
+          <w:color w:val="FF0000"/>
+          <w:sz w:val="36"/>
+          <w:szCs w:val="36"/>
+        </w:rPr>
+      </w:pPr>
+      <w:r>
+        <w:rPr>
+          <w:color w:val="FF0000"/>
+          <w:sz w:val="36"/>
+          <w:szCs w:val="36"/>
+        </w:rPr>
+        <w:t>Vídeo 31.</w:t>
+      </w:r>
+    </w:p>
+    <w:p>
+      <w:pPr>
+        <w:rPr>
+          <w:sz w:val="28"/>
+          <w:szCs w:val="36"/>
+        </w:rPr>
+      </w:pPr>
+      <w:proofErr w:type="spellStart"/>
+      <w:r>
+        <w:rPr>
+          <w:sz w:val="28"/>
+          <w:szCs w:val="36"/>
+        </w:rPr>
+        <w:t>getElementByTagName</w:t>
+      </w:r>
+      <w:proofErr w:type="spellEnd"/>
+      <w:r>
+        <w:rPr>
+          <w:sz w:val="28"/>
+          <w:szCs w:val="36"/>
+        </w:rPr>
+        <w:t xml:space="preserve">: Pega o elemento </w:t>
+      </w:r>
+      <w:proofErr w:type="spellStart"/>
+      <w:r>
+        <w:rPr>
+          <w:sz w:val="28"/>
+          <w:szCs w:val="36"/>
+        </w:rPr>
+        <w:t>html</w:t>
+      </w:r>
+      <w:proofErr w:type="spellEnd"/>
+      <w:r>
+        <w:rPr>
+          <w:sz w:val="28"/>
+          <w:szCs w:val="36"/>
+        </w:rPr>
+        <w:t xml:space="preserve"> pelo nome da </w:t>
+      </w:r>
+      <w:proofErr w:type="spellStart"/>
+      <w:r>
+        <w:rPr>
+          <w:sz w:val="28"/>
+          <w:szCs w:val="36"/>
+        </w:rPr>
+        <w:t>tag</w:t>
+      </w:r>
+      <w:proofErr w:type="spellEnd"/>
+      <w:r>
+        <w:rPr>
+          <w:sz w:val="28"/>
+          <w:szCs w:val="36"/>
+        </w:rPr>
+        <w:t>.</w:t>
+      </w:r>
+    </w:p>
+    <w:p>
+      <w:pPr>
+        <w:shd w:val="clear" w:color="auto" w:fill="282A36"/>
+        <w:spacing w:after="0" w:line="300" w:lineRule="atLeast"/>
+        <w:rPr>
+          <w:rFonts w:ascii="Consolas" w:eastAsia="Times New Roman" w:hAnsi="Consolas" w:cs="Times New Roman"/>
+          <w:color w:val="F8F8F2"/>
+          <w:sz w:val="23"/>
+          <w:szCs w:val="23"/>
+          <w:lang w:val="en-US" w:eastAsia="pt-BR"/>
+        </w:rPr>
+      </w:pPr>
+      <w:r>
+        <w:rPr>
+          <w:rFonts w:ascii="Consolas" w:eastAsia="Times New Roman" w:hAnsi="Consolas" w:cs="Times New Roman"/>
+          <w:color w:val="FF79C6"/>
+          <w:sz w:val="23"/>
+          <w:szCs w:val="23"/>
+          <w:lang w:val="en-US" w:eastAsia="pt-BR"/>
+        </w:rPr>
+        <w:t>const</w:t>
+      </w:r>
+      <w:r>
+        <w:rPr>
+          <w:rFonts w:ascii="Consolas" w:eastAsia="Times New Roman" w:hAnsi="Consolas" w:cs="Times New Roman"/>
+          <w:color w:val="F8F8F2"/>
+          <w:sz w:val="23"/>
+          <w:szCs w:val="23"/>
+          <w:lang w:val="en-US" w:eastAsia="pt-BR"/>
+        </w:rPr>
+        <w:t xml:space="preserve"> </w:t>
+      </w:r>
+      <w:proofErr w:type="spellStart"/>
+      <w:r>
+        <w:rPr>
+          <w:rFonts w:ascii="Consolas" w:eastAsia="Times New Roman" w:hAnsi="Consolas" w:cs="Times New Roman"/>
+          <w:color w:val="BD93F9"/>
+          <w:sz w:val="23"/>
+          <w:szCs w:val="23"/>
+          <w:lang w:val="en-US" w:eastAsia="pt-BR"/>
+        </w:rPr>
+        <w:t>arrayId</w:t>
+      </w:r>
+      <w:proofErr w:type="spellEnd"/>
+      <w:r>
+        <w:rPr>
+          <w:rFonts w:ascii="Consolas" w:eastAsia="Times New Roman" w:hAnsi="Consolas" w:cs="Times New Roman"/>
+          <w:color w:val="F8F8F2"/>
+          <w:sz w:val="23"/>
+          <w:szCs w:val="23"/>
+          <w:lang w:val="en-US" w:eastAsia="pt-BR"/>
+        </w:rPr>
+        <w:t xml:space="preserve"> </w:t>
+      </w:r>
+      <w:r>
+        <w:rPr>
+          <w:rFonts w:ascii="Consolas" w:eastAsia="Times New Roman" w:hAnsi="Consolas" w:cs="Times New Roman"/>
+          <w:color w:val="FF79C6"/>
+          <w:sz w:val="23"/>
+          <w:szCs w:val="23"/>
+          <w:lang w:val="en-US" w:eastAsia="pt-BR"/>
+        </w:rPr>
+        <w:t>=</w:t>
+      </w:r>
+      <w:r>
+        <w:rPr>
+          <w:rFonts w:ascii="Consolas" w:eastAsia="Times New Roman" w:hAnsi="Consolas" w:cs="Times New Roman"/>
+          <w:color w:val="F8F8F2"/>
+          <w:sz w:val="23"/>
+          <w:szCs w:val="23"/>
+          <w:lang w:val="en-US" w:eastAsia="pt-BR"/>
+        </w:rPr>
+        <w:t xml:space="preserve"> [</w:t>
+      </w:r>
+      <w:r>
+        <w:rPr>
+          <w:rFonts w:ascii="Consolas" w:eastAsia="Times New Roman" w:hAnsi="Consolas" w:cs="Times New Roman"/>
+          <w:color w:val="BD93F9"/>
+          <w:sz w:val="23"/>
+          <w:szCs w:val="23"/>
+          <w:lang w:val="en-US" w:eastAsia="pt-BR"/>
+        </w:rPr>
+        <w:t>dc1</w:t>
+      </w:r>
+      <w:r>
+        <w:rPr>
+          <w:rFonts w:ascii="Consolas" w:eastAsia="Times New Roman" w:hAnsi="Consolas" w:cs="Times New Roman"/>
+          <w:color w:val="F8F8F2"/>
+          <w:sz w:val="23"/>
+          <w:szCs w:val="23"/>
+          <w:lang w:val="en-US" w:eastAsia="pt-BR"/>
+        </w:rPr>
+        <w:t xml:space="preserve">, </w:t>
+      </w:r>
+      <w:r>
+        <w:rPr>
+          <w:rFonts w:ascii="Consolas" w:eastAsia="Times New Roman" w:hAnsi="Consolas" w:cs="Times New Roman"/>
+          <w:color w:val="BD93F9"/>
+          <w:sz w:val="23"/>
+          <w:szCs w:val="23"/>
+          <w:lang w:val="en-US" w:eastAsia="pt-BR"/>
+        </w:rPr>
+        <w:t>dc2</w:t>
+      </w:r>
+      <w:r>
+        <w:rPr>
+          <w:rFonts w:ascii="Consolas" w:eastAsia="Times New Roman" w:hAnsi="Consolas" w:cs="Times New Roman"/>
+          <w:color w:val="F8F8F2"/>
+          <w:sz w:val="23"/>
+          <w:szCs w:val="23"/>
+          <w:lang w:val="en-US" w:eastAsia="pt-BR"/>
+        </w:rPr>
+        <w:t xml:space="preserve">, </w:t>
+      </w:r>
+      <w:r>
+        <w:rPr>
+          <w:rFonts w:ascii="Consolas" w:eastAsia="Times New Roman" w:hAnsi="Consolas" w:cs="Times New Roman"/>
+          <w:color w:val="BD93F9"/>
+          <w:sz w:val="23"/>
+          <w:szCs w:val="23"/>
+          <w:lang w:val="en-US" w:eastAsia="pt-BR"/>
+        </w:rPr>
+        <w:t>dc3</w:t>
+      </w:r>
+      <w:r>
+        <w:rPr>
+          <w:rFonts w:ascii="Consolas" w:eastAsia="Times New Roman" w:hAnsi="Consolas" w:cs="Times New Roman"/>
+          <w:color w:val="F8F8F2"/>
+          <w:sz w:val="23"/>
+          <w:szCs w:val="23"/>
+          <w:lang w:val="en-US" w:eastAsia="pt-BR"/>
+        </w:rPr>
+        <w:t xml:space="preserve">, </w:t>
+      </w:r>
+      <w:r>
+        <w:rPr>
+          <w:rFonts w:ascii="Consolas" w:eastAsia="Times New Roman" w:hAnsi="Consolas" w:cs="Times New Roman"/>
+          <w:color w:val="BD93F9"/>
+          <w:sz w:val="23"/>
+          <w:szCs w:val="23"/>
+          <w:lang w:val="en-US" w:eastAsia="pt-BR"/>
+        </w:rPr>
+        <w:t>dc4</w:t>
+      </w:r>
+      <w:r>
+        <w:rPr>
+          <w:rFonts w:ascii="Consolas" w:eastAsia="Times New Roman" w:hAnsi="Consolas" w:cs="Times New Roman"/>
+          <w:color w:val="F8F8F2"/>
+          <w:sz w:val="23"/>
+          <w:szCs w:val="23"/>
+          <w:lang w:val="en-US" w:eastAsia="pt-BR"/>
+        </w:rPr>
+        <w:t xml:space="preserve">, </w:t>
+      </w:r>
+      <w:r>
+        <w:rPr>
+          <w:rFonts w:ascii="Consolas" w:eastAsia="Times New Roman" w:hAnsi="Consolas" w:cs="Times New Roman"/>
+          <w:color w:val="BD93F9"/>
+          <w:sz w:val="23"/>
+          <w:szCs w:val="23"/>
+          <w:lang w:val="en-US" w:eastAsia="pt-BR"/>
+        </w:rPr>
+        <w:t>dc5</w:t>
+      </w:r>
+      <w:r>
+        <w:rPr>
+          <w:rFonts w:ascii="Consolas" w:eastAsia="Times New Roman" w:hAnsi="Consolas" w:cs="Times New Roman"/>
+          <w:color w:val="F8F8F2"/>
+          <w:sz w:val="23"/>
+          <w:szCs w:val="23"/>
+          <w:lang w:val="en-US" w:eastAsia="pt-BR"/>
+        </w:rPr>
+        <w:t xml:space="preserve">, </w:t>
+      </w:r>
+      <w:r>
+        <w:rPr>
+          <w:rFonts w:ascii="Consolas" w:eastAsia="Times New Roman" w:hAnsi="Consolas" w:cs="Times New Roman"/>
+          <w:color w:val="BD93F9"/>
+          <w:sz w:val="23"/>
+          <w:szCs w:val="23"/>
+          <w:lang w:val="en-US" w:eastAsia="pt-BR"/>
+        </w:rPr>
+        <w:t>dc6</w:t>
+      </w:r>
+      <w:r>
+        <w:rPr>
+          <w:rFonts w:ascii="Consolas" w:eastAsia="Times New Roman" w:hAnsi="Consolas" w:cs="Times New Roman"/>
+          <w:color w:val="F8F8F2"/>
+          <w:sz w:val="23"/>
+          <w:szCs w:val="23"/>
+          <w:lang w:val="en-US" w:eastAsia="pt-BR"/>
+        </w:rPr>
+        <w:t>];</w:t>
+      </w:r>
+    </w:p>
+    <w:p>
+      <w:pPr>
+        <w:shd w:val="clear" w:color="auto" w:fill="282A36"/>
+        <w:spacing w:after="0" w:line="300" w:lineRule="atLeast"/>
+        <w:rPr>
+          <w:rFonts w:ascii="Consolas" w:eastAsia="Times New Roman" w:hAnsi="Consolas" w:cs="Times New Roman"/>
+          <w:color w:val="F8F8F2"/>
+          <w:sz w:val="23"/>
+          <w:szCs w:val="23"/>
+          <w:lang w:eastAsia="pt-BR"/>
+        </w:rPr>
+      </w:pPr>
+      <w:proofErr w:type="spellStart"/>
+      <w:r>
+        <w:rPr>
+          <w:rFonts w:ascii="Consolas" w:eastAsia="Times New Roman" w:hAnsi="Consolas" w:cs="Times New Roman"/>
+          <w:color w:val="FF79C6"/>
+          <w:sz w:val="23"/>
+          <w:szCs w:val="23"/>
+          <w:lang w:eastAsia="pt-BR"/>
+        </w:rPr>
+        <w:t>const</w:t>
+      </w:r>
+      <w:proofErr w:type="spellEnd"/>
+      <w:r>
+        <w:rPr>
+          <w:rFonts w:ascii="Consolas" w:eastAsia="Times New Roman" w:hAnsi="Consolas" w:cs="Times New Roman"/>
+          <w:color w:val="F8F8F2"/>
+          <w:sz w:val="23"/>
+          <w:szCs w:val="23"/>
+          <w:lang w:eastAsia="pt-BR"/>
+        </w:rPr>
+        <w:t xml:space="preserve"> </w:t>
+      </w:r>
+      <w:proofErr w:type="spellStart"/>
+      <w:r>
+        <w:rPr>
+          <w:rFonts w:ascii="Consolas" w:eastAsia="Times New Roman" w:hAnsi="Consolas" w:cs="Times New Roman"/>
+          <w:color w:val="BD93F9"/>
+          <w:sz w:val="23"/>
+          <w:szCs w:val="23"/>
+          <w:lang w:eastAsia="pt-BR"/>
+        </w:rPr>
+        <w:t>colecaoHTML</w:t>
+      </w:r>
+      <w:proofErr w:type="spellEnd"/>
+      <w:r>
+        <w:rPr>
+          <w:rFonts w:ascii="Consolas" w:eastAsia="Times New Roman" w:hAnsi="Consolas" w:cs="Times New Roman"/>
+          <w:color w:val="F8F8F2"/>
+          <w:sz w:val="23"/>
+          <w:szCs w:val="23"/>
+          <w:lang w:eastAsia="pt-BR"/>
+        </w:rPr>
+        <w:t xml:space="preserve"> </w:t>
+      </w:r>
+      <w:r>
+        <w:rPr>
+          <w:rFonts w:ascii="Consolas" w:eastAsia="Times New Roman" w:hAnsi="Consolas" w:cs="Times New Roman"/>
+          <w:color w:val="FF79C6"/>
+          <w:sz w:val="23"/>
+          <w:szCs w:val="23"/>
+          <w:lang w:eastAsia="pt-BR"/>
+        </w:rPr>
+        <w:t>=</w:t>
+      </w:r>
+      <w:r>
+        <w:rPr>
+          <w:rFonts w:ascii="Consolas" w:eastAsia="Times New Roman" w:hAnsi="Consolas" w:cs="Times New Roman"/>
+          <w:color w:val="F8F8F2"/>
+          <w:sz w:val="23"/>
+          <w:szCs w:val="23"/>
+          <w:lang w:eastAsia="pt-BR"/>
+        </w:rPr>
+        <w:t xml:space="preserve"> </w:t>
+      </w:r>
+      <w:proofErr w:type="spellStart"/>
+      <w:proofErr w:type="gramStart"/>
+      <w:r>
+        <w:rPr>
+          <w:rFonts w:ascii="Consolas" w:eastAsia="Times New Roman" w:hAnsi="Consolas" w:cs="Times New Roman"/>
+          <w:color w:val="BD93F9"/>
+          <w:sz w:val="23"/>
+          <w:szCs w:val="23"/>
+          <w:lang w:eastAsia="pt-BR"/>
+        </w:rPr>
+        <w:t>document</w:t>
+      </w:r>
+      <w:r>
+        <w:rPr>
+          <w:rFonts w:ascii="Consolas" w:eastAsia="Times New Roman" w:hAnsi="Consolas" w:cs="Times New Roman"/>
+          <w:color w:val="F8F8F2"/>
+          <w:sz w:val="23"/>
+          <w:szCs w:val="23"/>
+          <w:lang w:eastAsia="pt-BR"/>
+        </w:rPr>
+        <w:t>.</w:t>
+      </w:r>
+      <w:r>
+        <w:rPr>
+          <w:rFonts w:ascii="Consolas" w:eastAsia="Times New Roman" w:hAnsi="Consolas" w:cs="Times New Roman"/>
+          <w:color w:val="50FA7B"/>
+          <w:sz w:val="23"/>
+          <w:szCs w:val="23"/>
+          <w:lang w:eastAsia="pt-BR"/>
+        </w:rPr>
+        <w:t>getElementsByTagName</w:t>
+      </w:r>
+      <w:proofErr w:type="spellEnd"/>
+      <w:proofErr w:type="gramEnd"/>
+      <w:r>
+        <w:rPr>
+          <w:rFonts w:ascii="Consolas" w:eastAsia="Times New Roman" w:hAnsi="Consolas" w:cs="Times New Roman"/>
+          <w:color w:val="F8F8F2"/>
+          <w:sz w:val="23"/>
+          <w:szCs w:val="23"/>
+          <w:lang w:eastAsia="pt-BR"/>
+        </w:rPr>
+        <w:t>(</w:t>
+      </w:r>
+      <w:r>
+        <w:rPr>
+          <w:rFonts w:ascii="Consolas" w:eastAsia="Times New Roman" w:hAnsi="Consolas" w:cs="Times New Roman"/>
+          <w:color w:val="E9F284"/>
+          <w:sz w:val="23"/>
+          <w:szCs w:val="23"/>
+          <w:lang w:eastAsia="pt-BR"/>
+        </w:rPr>
+        <w:t>"</w:t>
+      </w:r>
+      <w:proofErr w:type="spellStart"/>
+      <w:r>
+        <w:rPr>
+          <w:rFonts w:ascii="Consolas" w:eastAsia="Times New Roman" w:hAnsi="Consolas" w:cs="Times New Roman"/>
+          <w:color w:val="F1FA8C"/>
+          <w:sz w:val="23"/>
+          <w:szCs w:val="23"/>
+          <w:lang w:eastAsia="pt-BR"/>
+        </w:rPr>
+        <w:t>div</w:t>
+      </w:r>
+      <w:proofErr w:type="spellEnd"/>
+      <w:r>
+        <w:rPr>
+          <w:rFonts w:ascii="Consolas" w:eastAsia="Times New Roman" w:hAnsi="Consolas" w:cs="Times New Roman"/>
+          <w:color w:val="E9F284"/>
+          <w:sz w:val="23"/>
+          <w:szCs w:val="23"/>
+          <w:lang w:eastAsia="pt-BR"/>
+        </w:rPr>
+        <w:t>"</w:t>
+      </w:r>
+      <w:r>
+        <w:rPr>
+          <w:rFonts w:ascii="Consolas" w:eastAsia="Times New Roman" w:hAnsi="Consolas" w:cs="Times New Roman"/>
+          <w:color w:val="F8F8F2"/>
+          <w:sz w:val="23"/>
+          <w:szCs w:val="23"/>
+          <w:lang w:eastAsia="pt-BR"/>
+        </w:rPr>
+        <w:t>)</w:t>
+      </w:r>
+    </w:p>
+    <w:p>
+      <w:pPr>
+        <w:shd w:val="clear" w:color="auto" w:fill="282A36"/>
+        <w:spacing w:after="0" w:line="300" w:lineRule="atLeast"/>
+        <w:rPr>
+          <w:rFonts w:ascii="Consolas" w:eastAsia="Times New Roman" w:hAnsi="Consolas" w:cs="Times New Roman"/>
+          <w:color w:val="F8F8F2"/>
+          <w:sz w:val="23"/>
+          <w:szCs w:val="23"/>
+          <w:lang w:eastAsia="pt-BR"/>
+        </w:rPr>
+      </w:pPr>
+    </w:p>
+    <w:p>
+      <w:pPr>
+        <w:shd w:val="clear" w:color="auto" w:fill="282A36"/>
+        <w:spacing w:after="0" w:line="300" w:lineRule="atLeast"/>
+        <w:rPr>
+          <w:rFonts w:ascii="Consolas" w:eastAsia="Times New Roman" w:hAnsi="Consolas" w:cs="Times New Roman"/>
+          <w:color w:val="F8F8F2"/>
+          <w:sz w:val="23"/>
+          <w:szCs w:val="23"/>
+          <w:lang w:eastAsia="pt-BR"/>
+        </w:rPr>
+      </w:pPr>
+      <w:r>
+        <w:rPr>
+          <w:rFonts w:ascii="Consolas" w:eastAsia="Times New Roman" w:hAnsi="Consolas" w:cs="Times New Roman"/>
+          <w:color w:val="BD93F9"/>
+          <w:sz w:val="23"/>
+          <w:szCs w:val="23"/>
+          <w:lang w:eastAsia="pt-BR"/>
+        </w:rPr>
+        <w:t>console</w:t>
+      </w:r>
+      <w:r>
+        <w:rPr>
+          <w:rFonts w:ascii="Consolas" w:eastAsia="Times New Roman" w:hAnsi="Consolas" w:cs="Times New Roman"/>
+          <w:color w:val="F8F8F2"/>
+          <w:sz w:val="23"/>
+          <w:szCs w:val="23"/>
+          <w:lang w:eastAsia="pt-BR"/>
+        </w:rPr>
+        <w:t>.</w:t>
+      </w:r>
+      <w:r>
+        <w:rPr>
+          <w:rFonts w:ascii="Consolas" w:eastAsia="Times New Roman" w:hAnsi="Consolas" w:cs="Times New Roman"/>
+          <w:color w:val="50FA7B"/>
+          <w:sz w:val="23"/>
+          <w:szCs w:val="23"/>
+          <w:lang w:eastAsia="pt-BR"/>
+        </w:rPr>
+        <w:t>log</w:t>
+      </w:r>
+      <w:r>
+        <w:rPr>
+          <w:rFonts w:ascii="Consolas" w:eastAsia="Times New Roman" w:hAnsi="Consolas" w:cs="Times New Roman"/>
+          <w:color w:val="F8F8F2"/>
+          <w:sz w:val="23"/>
+          <w:szCs w:val="23"/>
+          <w:lang w:eastAsia="pt-BR"/>
+        </w:rPr>
+        <w:t>(</w:t>
+      </w:r>
+      <w:proofErr w:type="spellStart"/>
+      <w:r>
+        <w:rPr>
+          <w:rFonts w:ascii="Consolas" w:eastAsia="Times New Roman" w:hAnsi="Consolas" w:cs="Times New Roman"/>
+          <w:color w:val="BD93F9"/>
+          <w:sz w:val="23"/>
+          <w:szCs w:val="23"/>
+          <w:lang w:eastAsia="pt-BR"/>
+        </w:rPr>
+        <w:t>colecaoHTML</w:t>
+      </w:r>
+      <w:proofErr w:type="spellEnd"/>
+      <w:r>
+        <w:rPr>
+          <w:rFonts w:ascii="Consolas" w:eastAsia="Times New Roman" w:hAnsi="Consolas" w:cs="Times New Roman"/>
+          <w:color w:val="F8F8F2"/>
+          <w:sz w:val="23"/>
+          <w:szCs w:val="23"/>
+          <w:lang w:eastAsia="pt-BR"/>
+        </w:rPr>
+        <w:t>)</w:t>
+      </w:r>
+    </w:p>
+    <w:p>
+      <w:pPr>
+        <w:shd w:val="clear" w:color="auto" w:fill="282A36"/>
+        <w:spacing w:after="0" w:line="300" w:lineRule="atLeast"/>
+        <w:rPr>
+          <w:rFonts w:ascii="Consolas" w:eastAsia="Times New Roman" w:hAnsi="Consolas" w:cs="Times New Roman"/>
+          <w:color w:val="F8F8F2"/>
+          <w:sz w:val="23"/>
+          <w:szCs w:val="23"/>
+          <w:lang w:eastAsia="pt-BR"/>
+        </w:rPr>
+      </w:pPr>
+      <w:r>
+        <w:rPr>
+          <w:rFonts w:ascii="Consolas" w:eastAsia="Times New Roman" w:hAnsi="Consolas" w:cs="Times New Roman"/>
+          <w:color w:val="BD93F9"/>
+          <w:sz w:val="23"/>
+          <w:szCs w:val="23"/>
+          <w:lang w:eastAsia="pt-BR"/>
+        </w:rPr>
+        <w:t>console</w:t>
+      </w:r>
+      <w:r>
+        <w:rPr>
+          <w:rFonts w:ascii="Consolas" w:eastAsia="Times New Roman" w:hAnsi="Consolas" w:cs="Times New Roman"/>
+          <w:color w:val="F8F8F2"/>
+          <w:sz w:val="23"/>
+          <w:szCs w:val="23"/>
+          <w:lang w:eastAsia="pt-BR"/>
+        </w:rPr>
+        <w:t>.</w:t>
+      </w:r>
+      <w:r>
+        <w:rPr>
+          <w:rFonts w:ascii="Consolas" w:eastAsia="Times New Roman" w:hAnsi="Consolas" w:cs="Times New Roman"/>
+          <w:color w:val="50FA7B"/>
+          <w:sz w:val="23"/>
+          <w:szCs w:val="23"/>
+          <w:lang w:eastAsia="pt-BR"/>
+        </w:rPr>
+        <w:t>log</w:t>
+      </w:r>
+      <w:r>
+        <w:rPr>
+          <w:rFonts w:ascii="Consolas" w:eastAsia="Times New Roman" w:hAnsi="Consolas" w:cs="Times New Roman"/>
+          <w:color w:val="F8F8F2"/>
+          <w:sz w:val="23"/>
+          <w:szCs w:val="23"/>
+          <w:lang w:eastAsia="pt-BR"/>
+        </w:rPr>
+        <w:t>(</w:t>
+      </w:r>
+      <w:proofErr w:type="spellStart"/>
+      <w:r>
+        <w:rPr>
+          <w:rFonts w:ascii="Consolas" w:eastAsia="Times New Roman" w:hAnsi="Consolas" w:cs="Times New Roman"/>
+          <w:color w:val="BD93F9"/>
+          <w:sz w:val="23"/>
+          <w:szCs w:val="23"/>
+          <w:lang w:eastAsia="pt-BR"/>
+        </w:rPr>
+        <w:t>arrayId</w:t>
+      </w:r>
+      <w:proofErr w:type="spellEnd"/>
+      <w:r>
+        <w:rPr>
+          <w:rFonts w:ascii="Consolas" w:eastAsia="Times New Roman" w:hAnsi="Consolas" w:cs="Times New Roman"/>
+          <w:color w:val="F8F8F2"/>
+          <w:sz w:val="23"/>
+          <w:szCs w:val="23"/>
+          <w:lang w:eastAsia="pt-BR"/>
+        </w:rPr>
+        <w:t>)</w:t>
+      </w:r>
+    </w:p>
+    <w:p>
+      <w:pPr>
+        <w:rPr>
+          <w:sz w:val="28"/>
+          <w:szCs w:val="36"/>
+        </w:rPr>
+      </w:pPr>
+    </w:p>
+    <w:p>
+      <w:pPr>
+        <w:rPr>
+          <w:sz w:val="28"/>
+          <w:szCs w:val="36"/>
+        </w:rPr>
+      </w:pPr>
+      <w:r>
+        <w:rPr>
+          <w:sz w:val="28"/>
+          <w:szCs w:val="36"/>
+        </w:rPr>
+        <w:t xml:space="preserve">A diferença: O tipo vai ser diferente, sendo o array do tipo Array e o </w:t>
+      </w:r>
+      <w:proofErr w:type="spellStart"/>
+      <w:r>
+        <w:rPr>
+          <w:sz w:val="28"/>
+          <w:szCs w:val="36"/>
+        </w:rPr>
+        <w:t>colecao</w:t>
+      </w:r>
+      <w:r>
+        <w:rPr>
+          <w:sz w:val="28"/>
+          <w:szCs w:val="36"/>
+        </w:rPr>
+        <w:t>HTML</w:t>
+      </w:r>
+      <w:proofErr w:type="spellEnd"/>
+      <w:r>
+        <w:rPr>
+          <w:sz w:val="28"/>
+          <w:szCs w:val="36"/>
+        </w:rPr>
+        <w:t xml:space="preserve"> do tipo HTMLCollection.</w:t>
+      </w:r>
+    </w:p>
+    <w:p>
+      <w:pPr>
+        <w:rPr>
+          <w:sz w:val="28"/>
+          <w:szCs w:val="36"/>
+        </w:rPr>
+      </w:pPr>
+      <w:r>
+        <w:rPr>
+          <w:sz w:val="28"/>
+          <w:szCs w:val="36"/>
+        </w:rPr>
+        <w:t xml:space="preserve">Sendo um array da para usar tudo relacionado a array (Métodos). Mesma coisa com o </w:t>
+      </w:r>
+      <w:proofErr w:type="spellStart"/>
+      <w:r>
+        <w:rPr>
+          <w:sz w:val="28"/>
+          <w:szCs w:val="36"/>
+        </w:rPr>
+        <w:t>colecaoHTML</w:t>
+      </w:r>
+      <w:proofErr w:type="spellEnd"/>
+      <w:r>
+        <w:rPr>
+          <w:sz w:val="28"/>
+          <w:szCs w:val="36"/>
+        </w:rPr>
+        <w:t>, porém muito menos métodos para serem usados.</w:t>
+      </w:r>
+    </w:p>
+    <w:p>
+      <w:pPr>
+        <w:rPr>
+          <w:sz w:val="28"/>
+          <w:szCs w:val="36"/>
+        </w:rPr>
+      </w:pPr>
+      <w:r>
+        <w:rPr>
+          <w:sz w:val="28"/>
+          <w:szCs w:val="36"/>
+        </w:rPr>
+        <w:t xml:space="preserve">Para transformar em array: </w:t>
+      </w:r>
+    </w:p>
+    <w:p>
+      <w:pPr>
+        <w:shd w:val="clear" w:color="auto" w:fill="282A36"/>
+        <w:spacing w:after="0" w:line="300" w:lineRule="atLeast"/>
+        <w:rPr>
+          <w:rFonts w:ascii="Consolas" w:eastAsia="Times New Roman" w:hAnsi="Consolas" w:cs="Times New Roman"/>
+          <w:color w:val="F8F8F2"/>
+          <w:sz w:val="23"/>
+          <w:szCs w:val="23"/>
+          <w:lang w:eastAsia="pt-BR"/>
+        </w:rPr>
+      </w:pPr>
+      <w:proofErr w:type="spellStart"/>
+      <w:r>
+        <w:rPr>
+          <w:rFonts w:ascii="Consolas" w:eastAsia="Times New Roman" w:hAnsi="Consolas" w:cs="Times New Roman"/>
+          <w:color w:val="F8F8F2"/>
+          <w:sz w:val="23"/>
+          <w:szCs w:val="23"/>
+          <w:lang w:eastAsia="pt-BR"/>
+        </w:rPr>
+        <w:t>colecaoHTML</w:t>
+      </w:r>
+      <w:proofErr w:type="spellEnd"/>
+      <w:r>
+        <w:rPr>
+          <w:rFonts w:ascii="Consolas" w:eastAsia="Times New Roman" w:hAnsi="Consolas" w:cs="Times New Roman"/>
+          <w:color w:val="F8F8F2"/>
+          <w:sz w:val="23"/>
+          <w:szCs w:val="23"/>
+          <w:lang w:eastAsia="pt-BR"/>
+        </w:rPr>
+        <w:t xml:space="preserve"> </w:t>
+      </w:r>
+      <w:r>
+        <w:rPr>
+          <w:rFonts w:ascii="Consolas" w:eastAsia="Times New Roman" w:hAnsi="Consolas" w:cs="Times New Roman"/>
+          <w:color w:val="FF79C6"/>
+          <w:sz w:val="23"/>
+          <w:szCs w:val="23"/>
+          <w:lang w:eastAsia="pt-BR"/>
+        </w:rPr>
+        <w:t>=</w:t>
+      </w:r>
+      <w:r>
+        <w:rPr>
+          <w:rFonts w:ascii="Consolas" w:eastAsia="Times New Roman" w:hAnsi="Consolas" w:cs="Times New Roman"/>
+          <w:color w:val="F8F8F2"/>
+          <w:sz w:val="23"/>
+          <w:szCs w:val="23"/>
+          <w:lang w:eastAsia="pt-BR"/>
+        </w:rPr>
+        <w:t xml:space="preserve"> [</w:t>
+      </w:r>
+      <w:r>
+        <w:rPr>
+          <w:rFonts w:ascii="Consolas" w:eastAsia="Times New Roman" w:hAnsi="Consolas" w:cs="Times New Roman"/>
+          <w:color w:val="FF79C6"/>
+          <w:sz w:val="23"/>
+          <w:szCs w:val="23"/>
+          <w:lang w:eastAsia="pt-BR"/>
+        </w:rPr>
+        <w:t>...</w:t>
+      </w:r>
+      <w:proofErr w:type="spellStart"/>
+      <w:r>
+        <w:rPr>
+          <w:rFonts w:ascii="Consolas" w:eastAsia="Times New Roman" w:hAnsi="Consolas" w:cs="Times New Roman"/>
+          <w:color w:val="F8F8F2"/>
+          <w:sz w:val="23"/>
+          <w:szCs w:val="23"/>
+          <w:lang w:eastAsia="pt-BR"/>
+        </w:rPr>
+        <w:t>colecaoHTML</w:t>
+      </w:r>
+      <w:proofErr w:type="spellEnd"/>
+      <w:r>
+        <w:rPr>
+          <w:rFonts w:ascii="Consolas" w:eastAsia="Times New Roman" w:hAnsi="Consolas" w:cs="Times New Roman"/>
+          <w:color w:val="F8F8F2"/>
+          <w:sz w:val="23"/>
+          <w:szCs w:val="23"/>
+          <w:lang w:eastAsia="pt-BR"/>
+        </w:rPr>
+        <w:t>]</w:t>
+      </w:r>
+    </w:p>
+    <w:p>
+      <w:pPr>
+        <w:rPr>
+          <w:sz w:val="28"/>
+          <w:szCs w:val="36"/>
+        </w:rPr>
+      </w:pPr>
+    </w:p>
+    <w:p>
+      <w:pPr>
+        <w:rPr>
+          <w:sz w:val="28"/>
+          <w:szCs w:val="36"/>
+        </w:rPr>
+      </w:pPr>
       <w:bookmarkStart w:id="1" w:name="_GoBack"/>
       <w:bookmarkEnd w:id="1"/>
-    </w:p>
-    <w:p>
-      <w:pPr>
-        <w:rPr>
-          <w:sz w:val="28"/>
-          <w:szCs w:val="28"/>
-        </w:rPr>
-      </w:pPr>
-      <w:r>
-        <w:rPr>
-          <w:b/>
-          <w:bCs/>
-          <w:sz w:val="28"/>
-          <w:szCs w:val="36"/>
-        </w:rPr>
-        <w:t>}</w:t>
-      </w:r>
-      <w:r>
-        <w:rPr>
-          <w:b/>
-          <w:bCs/>
-          <w:sz w:val="28"/>
-          <w:szCs w:val="36"/>
-        </w:rPr>
-        <w:t>)</w:t>
-      </w:r>
+      <w:r>
+        <w:rPr>
+          <w:sz w:val="28"/>
+          <w:szCs w:val="36"/>
+        </w:rPr>
+        <w:t xml:space="preserve">Para fazer sendo uma constante: </w:t>
+      </w:r>
+    </w:p>
+    <w:p>
+      <w:pPr>
+        <w:shd w:val="clear" w:color="auto" w:fill="282A36"/>
+        <w:spacing w:after="0" w:line="300" w:lineRule="atLeast"/>
+        <w:rPr>
+          <w:rFonts w:ascii="Consolas" w:eastAsia="Times New Roman" w:hAnsi="Consolas" w:cs="Times New Roman"/>
+          <w:color w:val="F8F8F2"/>
+          <w:sz w:val="23"/>
+          <w:szCs w:val="23"/>
+          <w:lang w:eastAsia="pt-BR"/>
+        </w:rPr>
+      </w:pPr>
+      <w:proofErr w:type="spellStart"/>
+      <w:r>
+        <w:rPr>
+          <w:rFonts w:ascii="Consolas" w:eastAsia="Times New Roman" w:hAnsi="Consolas" w:cs="Times New Roman"/>
+          <w:color w:val="FF79C6"/>
+          <w:sz w:val="23"/>
+          <w:szCs w:val="23"/>
+          <w:lang w:eastAsia="pt-BR"/>
+        </w:rPr>
+        <w:t>const</w:t>
+      </w:r>
+      <w:proofErr w:type="spellEnd"/>
+      <w:r>
+        <w:rPr>
+          <w:rFonts w:ascii="Consolas" w:eastAsia="Times New Roman" w:hAnsi="Consolas" w:cs="Times New Roman"/>
+          <w:color w:val="F8F8F2"/>
+          <w:sz w:val="23"/>
+          <w:szCs w:val="23"/>
+          <w:lang w:eastAsia="pt-BR"/>
+        </w:rPr>
+        <w:t xml:space="preserve"> </w:t>
+      </w:r>
+      <w:proofErr w:type="spellStart"/>
+      <w:r>
+        <w:rPr>
+          <w:rFonts w:ascii="Consolas" w:eastAsia="Times New Roman" w:hAnsi="Consolas" w:cs="Times New Roman"/>
+          <w:color w:val="BD93F9"/>
+          <w:sz w:val="23"/>
+          <w:szCs w:val="23"/>
+          <w:lang w:eastAsia="pt-BR"/>
+        </w:rPr>
+        <w:t>colecaoHTML</w:t>
+      </w:r>
+      <w:proofErr w:type="spellEnd"/>
+      <w:r>
+        <w:rPr>
+          <w:rFonts w:ascii="Consolas" w:eastAsia="Times New Roman" w:hAnsi="Consolas" w:cs="Times New Roman"/>
+          <w:color w:val="F8F8F2"/>
+          <w:sz w:val="23"/>
+          <w:szCs w:val="23"/>
+          <w:lang w:eastAsia="pt-BR"/>
+        </w:rPr>
+        <w:t xml:space="preserve"> </w:t>
+      </w:r>
+      <w:r>
+        <w:rPr>
+          <w:rFonts w:ascii="Consolas" w:eastAsia="Times New Roman" w:hAnsi="Consolas" w:cs="Times New Roman"/>
+          <w:color w:val="FF79C6"/>
+          <w:sz w:val="23"/>
+          <w:szCs w:val="23"/>
+          <w:lang w:eastAsia="pt-BR"/>
+        </w:rPr>
+        <w:t>=</w:t>
+      </w:r>
+      <w:r>
+        <w:rPr>
+          <w:rFonts w:ascii="Consolas" w:eastAsia="Times New Roman" w:hAnsi="Consolas" w:cs="Times New Roman"/>
+          <w:color w:val="F8F8F2"/>
+          <w:sz w:val="23"/>
+          <w:szCs w:val="23"/>
+          <w:lang w:eastAsia="pt-BR"/>
+        </w:rPr>
+        <w:t xml:space="preserve"> [</w:t>
+      </w:r>
+      <w:r>
+        <w:rPr>
+          <w:rFonts w:ascii="Consolas" w:eastAsia="Times New Roman" w:hAnsi="Consolas" w:cs="Times New Roman"/>
+          <w:color w:val="FF79C6"/>
+          <w:sz w:val="23"/>
+          <w:szCs w:val="23"/>
+          <w:lang w:eastAsia="pt-BR"/>
+        </w:rPr>
+        <w:t>...</w:t>
+      </w:r>
+      <w:proofErr w:type="spellStart"/>
+      <w:proofErr w:type="gramStart"/>
+      <w:r>
+        <w:rPr>
+          <w:rFonts w:ascii="Consolas" w:eastAsia="Times New Roman" w:hAnsi="Consolas" w:cs="Times New Roman"/>
+          <w:color w:val="BD93F9"/>
+          <w:sz w:val="23"/>
+          <w:szCs w:val="23"/>
+          <w:lang w:eastAsia="pt-BR"/>
+        </w:rPr>
+        <w:t>document</w:t>
+      </w:r>
+      <w:r>
+        <w:rPr>
+          <w:rFonts w:ascii="Consolas" w:eastAsia="Times New Roman" w:hAnsi="Consolas" w:cs="Times New Roman"/>
+          <w:color w:val="F8F8F2"/>
+          <w:sz w:val="23"/>
+          <w:szCs w:val="23"/>
+          <w:lang w:eastAsia="pt-BR"/>
+        </w:rPr>
+        <w:t>.</w:t>
+      </w:r>
+      <w:r>
+        <w:rPr>
+          <w:rFonts w:ascii="Consolas" w:eastAsia="Times New Roman" w:hAnsi="Consolas" w:cs="Times New Roman"/>
+          <w:color w:val="50FA7B"/>
+          <w:sz w:val="23"/>
+          <w:szCs w:val="23"/>
+          <w:lang w:eastAsia="pt-BR"/>
+        </w:rPr>
+        <w:t>getElementsByTagName</w:t>
+      </w:r>
+      <w:proofErr w:type="spellEnd"/>
+      <w:proofErr w:type="gramEnd"/>
+      <w:r>
+        <w:rPr>
+          <w:rFonts w:ascii="Consolas" w:eastAsia="Times New Roman" w:hAnsi="Consolas" w:cs="Times New Roman"/>
+          <w:color w:val="F8F8F2"/>
+          <w:sz w:val="23"/>
+          <w:szCs w:val="23"/>
+          <w:lang w:eastAsia="pt-BR"/>
+        </w:rPr>
+        <w:t>(</w:t>
+      </w:r>
+      <w:r>
+        <w:rPr>
+          <w:rFonts w:ascii="Consolas" w:eastAsia="Times New Roman" w:hAnsi="Consolas" w:cs="Times New Roman"/>
+          <w:color w:val="E9F284"/>
+          <w:sz w:val="23"/>
+          <w:szCs w:val="23"/>
+          <w:lang w:eastAsia="pt-BR"/>
+        </w:rPr>
+        <w:t>"</w:t>
+      </w:r>
+      <w:proofErr w:type="spellStart"/>
+      <w:r>
+        <w:rPr>
+          <w:rFonts w:ascii="Consolas" w:eastAsia="Times New Roman" w:hAnsi="Consolas" w:cs="Times New Roman"/>
+          <w:color w:val="F1FA8C"/>
+          <w:sz w:val="23"/>
+          <w:szCs w:val="23"/>
+          <w:lang w:eastAsia="pt-BR"/>
+        </w:rPr>
+        <w:t>div</w:t>
+      </w:r>
+      <w:proofErr w:type="spellEnd"/>
+      <w:r>
+        <w:rPr>
+          <w:rFonts w:ascii="Consolas" w:eastAsia="Times New Roman" w:hAnsi="Consolas" w:cs="Times New Roman"/>
+          <w:color w:val="E9F284"/>
+          <w:sz w:val="23"/>
+          <w:szCs w:val="23"/>
+          <w:lang w:eastAsia="pt-BR"/>
+        </w:rPr>
+        <w:t>"</w:t>
+      </w:r>
+      <w:r>
+        <w:rPr>
+          <w:rFonts w:ascii="Consolas" w:eastAsia="Times New Roman" w:hAnsi="Consolas" w:cs="Times New Roman"/>
+          <w:color w:val="F8F8F2"/>
+          <w:sz w:val="23"/>
+          <w:szCs w:val="23"/>
+          <w:lang w:eastAsia="pt-BR"/>
+        </w:rPr>
+        <w:t>)]</w:t>
+      </w:r>
+    </w:p>
+    <w:p>
+      <w:pPr>
+        <w:rPr>
+          <w:sz w:val="28"/>
+          <w:szCs w:val="36"/>
+        </w:rPr>
+      </w:pPr>
+    </w:p>
+    <w:p>
+      <w:pPr>
+        <w:rPr>
+          <w:color w:val="FF0000"/>
+          <w:sz w:val="36"/>
+          <w:szCs w:val="36"/>
+        </w:rPr>
+      </w:pPr>
+    </w:p>
+    <w:p>
+      <w:pPr>
+        <w:rPr>
+          <w:color w:val="FF0000"/>
+          <w:sz w:val="36"/>
+          <w:szCs w:val="36"/>
+        </w:rPr>
+      </w:pPr>
+    </w:p>
+    <w:p>
+      <w:pPr>
+        <w:rPr>
+          <w:color w:val="FF0000"/>
+          <w:sz w:val="36"/>
+          <w:szCs w:val="36"/>
+        </w:rPr>
+      </w:pPr>
     </w:p>
     <w:sectPr>
       <w:pgSz w:w="11906" w:h="16838"/>
@@ -11557,7 +13223,7 @@
   <w:style w:type="paragraph" w:default="1" w:styleId="Normal">
     <w:name w:val="Normal"/>
     <w:qFormat/>
-    <w:rsid w:val="001C6DC5"/>
+    <w:rsid w:val="00E81D61"/>
   </w:style>
   <w:style w:type="paragraph" w:styleId="Ttulo3">
     <w:name w:val="heading 3"/>

</xml_diff>

<commit_message>
Aprendido querySelector e querySelectorAll
</commit_message>
<xml_diff>
--- a/Javascript.docx
+++ b/Javascript.docx
@@ -8,7 +8,13 @@
       </w:pPr>
       <w:proofErr w:type="spellStart"/>
       <w:r>
-        <w:t>Javascript</w:t>
+        <w:t>Java</w:t>
+      </w:r>
+      <w:r>
+        <w:t>S</w:t>
+      </w:r>
+      <w:r>
+        <w:t>cript</w:t>
       </w:r>
       <w:proofErr w:type="spellEnd"/>
     </w:p>
@@ -10505,22 +10511,559 @@
           <w:sz w:val="36"/>
           <w:szCs w:val="36"/>
         </w:rPr>
-        <w:t>Vídeo 3</w:t>
-      </w:r>
-      <w:r>
+        <w:t>Vídeo 31.</w:t>
+      </w:r>
+    </w:p>
+    <w:p>
+      <w:pPr>
+        <w:rPr>
+          <w:sz w:val="28"/>
+          <w:szCs w:val="36"/>
+        </w:rPr>
+      </w:pPr>
+      <w:proofErr w:type="spellStart"/>
+      <w:r>
+        <w:rPr>
+          <w:sz w:val="28"/>
+          <w:szCs w:val="36"/>
+        </w:rPr>
+        <w:t>getElementById</w:t>
+      </w:r>
+      <w:proofErr w:type="spellEnd"/>
+      <w:r>
+        <w:rPr>
+          <w:sz w:val="28"/>
+          <w:szCs w:val="36"/>
+        </w:rPr>
+        <w:t xml:space="preserve"> = Pega o elemento do </w:t>
+      </w:r>
+      <w:proofErr w:type="spellStart"/>
+      <w:r>
+        <w:rPr>
+          <w:sz w:val="28"/>
+          <w:szCs w:val="36"/>
+        </w:rPr>
+        <w:t>html</w:t>
+      </w:r>
+      <w:proofErr w:type="spellEnd"/>
+      <w:r>
+        <w:rPr>
+          <w:sz w:val="28"/>
+          <w:szCs w:val="36"/>
+        </w:rPr>
+        <w:t xml:space="preserve"> pelo id, podendo fazer qualquer tipo de manipulação. </w:t>
+      </w:r>
+    </w:p>
+    <w:p>
+      <w:pPr>
+        <w:shd w:val="clear" w:color="auto" w:fill="282A36"/>
+        <w:spacing w:after="0" w:line="300" w:lineRule="atLeast"/>
+        <w:rPr>
+          <w:rFonts w:ascii="Consolas" w:eastAsia="Times New Roman" w:hAnsi="Consolas" w:cs="Times New Roman"/>
+          <w:color w:val="F8F8F2"/>
+          <w:sz w:val="23"/>
+          <w:szCs w:val="23"/>
+          <w:lang w:val="en-US" w:eastAsia="pt-BR"/>
+        </w:rPr>
+      </w:pPr>
+      <w:r>
+        <w:rPr>
+          <w:rFonts w:ascii="Consolas" w:eastAsia="Times New Roman" w:hAnsi="Consolas" w:cs="Times New Roman"/>
+          <w:color w:val="FF79C6"/>
+          <w:sz w:val="23"/>
+          <w:szCs w:val="23"/>
+          <w:lang w:val="en-US" w:eastAsia="pt-BR"/>
+        </w:rPr>
+        <w:lastRenderedPageBreak/>
+        <w:t>const</w:t>
+      </w:r>
+      <w:r>
+        <w:rPr>
+          <w:rFonts w:ascii="Consolas" w:eastAsia="Times New Roman" w:hAnsi="Consolas" w:cs="Times New Roman"/>
+          <w:color w:val="F8F8F2"/>
+          <w:sz w:val="23"/>
+          <w:szCs w:val="23"/>
+          <w:lang w:val="en-US" w:eastAsia="pt-BR"/>
+        </w:rPr>
+        <w:t xml:space="preserve"> </w:t>
+      </w:r>
+      <w:r>
+        <w:rPr>
+          <w:rFonts w:ascii="Consolas" w:eastAsia="Times New Roman" w:hAnsi="Consolas" w:cs="Times New Roman"/>
+          <w:color w:val="BD93F9"/>
+          <w:sz w:val="23"/>
+          <w:szCs w:val="23"/>
+          <w:lang w:val="en-US" w:eastAsia="pt-BR"/>
+        </w:rPr>
+        <w:t>dc1</w:t>
+      </w:r>
+      <w:r>
+        <w:rPr>
+          <w:rFonts w:ascii="Consolas" w:eastAsia="Times New Roman" w:hAnsi="Consolas" w:cs="Times New Roman"/>
+          <w:color w:val="F8F8F2"/>
+          <w:sz w:val="23"/>
+          <w:szCs w:val="23"/>
+          <w:lang w:val="en-US" w:eastAsia="pt-BR"/>
+        </w:rPr>
+        <w:t xml:space="preserve"> </w:t>
+      </w:r>
+      <w:r>
+        <w:rPr>
+          <w:rFonts w:ascii="Consolas" w:eastAsia="Times New Roman" w:hAnsi="Consolas" w:cs="Times New Roman"/>
+          <w:color w:val="FF79C6"/>
+          <w:sz w:val="23"/>
+          <w:szCs w:val="23"/>
+          <w:lang w:val="en-US" w:eastAsia="pt-BR"/>
+        </w:rPr>
+        <w:t>=</w:t>
+      </w:r>
+      <w:r>
+        <w:rPr>
+          <w:rFonts w:ascii="Consolas" w:eastAsia="Times New Roman" w:hAnsi="Consolas" w:cs="Times New Roman"/>
+          <w:color w:val="F8F8F2"/>
+          <w:sz w:val="23"/>
+          <w:szCs w:val="23"/>
+          <w:lang w:val="en-US" w:eastAsia="pt-BR"/>
+        </w:rPr>
+        <w:t xml:space="preserve"> </w:t>
+      </w:r>
+      <w:proofErr w:type="spellStart"/>
+      <w:r>
+        <w:rPr>
+          <w:rFonts w:ascii="Consolas" w:eastAsia="Times New Roman" w:hAnsi="Consolas" w:cs="Times New Roman"/>
+          <w:color w:val="BD93F9"/>
+          <w:sz w:val="23"/>
+          <w:szCs w:val="23"/>
+          <w:lang w:val="en-US" w:eastAsia="pt-BR"/>
+        </w:rPr>
+        <w:t>document</w:t>
+      </w:r>
+      <w:r>
+        <w:rPr>
+          <w:rFonts w:ascii="Consolas" w:eastAsia="Times New Roman" w:hAnsi="Consolas" w:cs="Times New Roman"/>
+          <w:color w:val="F8F8F2"/>
+          <w:sz w:val="23"/>
+          <w:szCs w:val="23"/>
+          <w:lang w:val="en-US" w:eastAsia="pt-BR"/>
+        </w:rPr>
+        <w:t>.</w:t>
+      </w:r>
+      <w:r>
+        <w:rPr>
+          <w:rFonts w:ascii="Consolas" w:eastAsia="Times New Roman" w:hAnsi="Consolas" w:cs="Times New Roman"/>
+          <w:color w:val="50FA7B"/>
+          <w:sz w:val="23"/>
+          <w:szCs w:val="23"/>
+          <w:lang w:val="en-US" w:eastAsia="pt-BR"/>
+        </w:rPr>
+        <w:t>getElementById</w:t>
+      </w:r>
+      <w:proofErr w:type="spellEnd"/>
+      <w:r>
+        <w:rPr>
+          <w:rFonts w:ascii="Consolas" w:eastAsia="Times New Roman" w:hAnsi="Consolas" w:cs="Times New Roman"/>
+          <w:color w:val="F8F8F2"/>
+          <w:sz w:val="23"/>
+          <w:szCs w:val="23"/>
+          <w:lang w:val="en-US" w:eastAsia="pt-BR"/>
+        </w:rPr>
+        <w:t>(</w:t>
+      </w:r>
+      <w:r>
+        <w:rPr>
+          <w:rFonts w:ascii="Consolas" w:eastAsia="Times New Roman" w:hAnsi="Consolas" w:cs="Times New Roman"/>
+          <w:color w:val="E9F284"/>
+          <w:sz w:val="23"/>
+          <w:szCs w:val="23"/>
+          <w:lang w:val="en-US" w:eastAsia="pt-BR"/>
+        </w:rPr>
+        <w:t>"</w:t>
+      </w:r>
+      <w:r>
+        <w:rPr>
+          <w:rFonts w:ascii="Consolas" w:eastAsia="Times New Roman" w:hAnsi="Consolas" w:cs="Times New Roman"/>
+          <w:color w:val="F1FA8C"/>
+          <w:sz w:val="23"/>
+          <w:szCs w:val="23"/>
+          <w:lang w:val="en-US" w:eastAsia="pt-BR"/>
+        </w:rPr>
+        <w:t>c1</w:t>
+      </w:r>
+      <w:r>
+        <w:rPr>
+          <w:rFonts w:ascii="Consolas" w:eastAsia="Times New Roman" w:hAnsi="Consolas" w:cs="Times New Roman"/>
+          <w:color w:val="E9F284"/>
+          <w:sz w:val="23"/>
+          <w:szCs w:val="23"/>
+          <w:lang w:val="en-US" w:eastAsia="pt-BR"/>
+        </w:rPr>
+        <w:t>"</w:t>
+      </w:r>
+      <w:r>
+        <w:rPr>
+          <w:rFonts w:ascii="Consolas" w:eastAsia="Times New Roman" w:hAnsi="Consolas" w:cs="Times New Roman"/>
+          <w:color w:val="F8F8F2"/>
+          <w:sz w:val="23"/>
+          <w:szCs w:val="23"/>
+          <w:lang w:val="en-US" w:eastAsia="pt-BR"/>
+        </w:rPr>
+        <w:t>);</w:t>
+      </w:r>
+    </w:p>
+    <w:p>
+      <w:pPr>
+        <w:shd w:val="clear" w:color="auto" w:fill="282A36"/>
+        <w:spacing w:after="0" w:line="300" w:lineRule="atLeast"/>
+        <w:rPr>
+          <w:rFonts w:ascii="Consolas" w:eastAsia="Times New Roman" w:hAnsi="Consolas" w:cs="Times New Roman"/>
+          <w:color w:val="F8F8F2"/>
+          <w:sz w:val="23"/>
+          <w:szCs w:val="23"/>
+          <w:lang w:val="en-US" w:eastAsia="pt-BR"/>
+        </w:rPr>
+      </w:pPr>
+      <w:r>
+        <w:rPr>
+          <w:rFonts w:ascii="Consolas" w:eastAsia="Times New Roman" w:hAnsi="Consolas" w:cs="Times New Roman"/>
+          <w:color w:val="BD93F9"/>
+          <w:sz w:val="23"/>
+          <w:szCs w:val="23"/>
+          <w:lang w:val="en-US" w:eastAsia="pt-BR"/>
+        </w:rPr>
+        <w:t>console</w:t>
+      </w:r>
+      <w:r>
+        <w:rPr>
+          <w:rFonts w:ascii="Consolas" w:eastAsia="Times New Roman" w:hAnsi="Consolas" w:cs="Times New Roman"/>
+          <w:color w:val="F8F8F2"/>
+          <w:sz w:val="23"/>
+          <w:szCs w:val="23"/>
+          <w:lang w:val="en-US" w:eastAsia="pt-BR"/>
+        </w:rPr>
+        <w:t>.</w:t>
+      </w:r>
+      <w:r>
+        <w:rPr>
+          <w:rFonts w:ascii="Consolas" w:eastAsia="Times New Roman" w:hAnsi="Consolas" w:cs="Times New Roman"/>
+          <w:color w:val="50FA7B"/>
+          <w:sz w:val="23"/>
+          <w:szCs w:val="23"/>
+          <w:lang w:val="en-US" w:eastAsia="pt-BR"/>
+        </w:rPr>
+        <w:t>log</w:t>
+      </w:r>
+      <w:r>
+        <w:rPr>
+          <w:rFonts w:ascii="Consolas" w:eastAsia="Times New Roman" w:hAnsi="Consolas" w:cs="Times New Roman"/>
+          <w:color w:val="F8F8F2"/>
+          <w:sz w:val="23"/>
+          <w:szCs w:val="23"/>
+          <w:lang w:val="en-US" w:eastAsia="pt-BR"/>
+        </w:rPr>
+        <w:t>(</w:t>
+      </w:r>
+      <w:r>
+        <w:rPr>
+          <w:rFonts w:ascii="Consolas" w:eastAsia="Times New Roman" w:hAnsi="Consolas" w:cs="Times New Roman"/>
+          <w:color w:val="BD93F9"/>
+          <w:sz w:val="23"/>
+          <w:szCs w:val="23"/>
+          <w:lang w:val="en-US" w:eastAsia="pt-BR"/>
+        </w:rPr>
+        <w:t>dc1</w:t>
+      </w:r>
+      <w:r>
+        <w:rPr>
+          <w:rFonts w:ascii="Consolas" w:eastAsia="Times New Roman" w:hAnsi="Consolas" w:cs="Times New Roman"/>
+          <w:color w:val="F8F8F2"/>
+          <w:sz w:val="23"/>
+          <w:szCs w:val="23"/>
+          <w:lang w:val="en-US" w:eastAsia="pt-BR"/>
+        </w:rPr>
+        <w:t>);</w:t>
+      </w:r>
+    </w:p>
+    <w:p>
+      <w:pPr>
+        <w:shd w:val="clear" w:color="auto" w:fill="282A36"/>
+        <w:spacing w:after="0" w:line="300" w:lineRule="atLeast"/>
+        <w:rPr>
+          <w:rFonts w:ascii="Consolas" w:eastAsia="Times New Roman" w:hAnsi="Consolas" w:cs="Times New Roman"/>
+          <w:color w:val="F8F8F2"/>
+          <w:sz w:val="23"/>
+          <w:szCs w:val="23"/>
+          <w:lang w:val="en-US" w:eastAsia="pt-BR"/>
+        </w:rPr>
+      </w:pPr>
+      <w:r>
+        <w:rPr>
+          <w:rFonts w:ascii="Consolas" w:eastAsia="Times New Roman" w:hAnsi="Consolas" w:cs="Times New Roman"/>
+          <w:color w:val="BD93F9"/>
+          <w:sz w:val="23"/>
+          <w:szCs w:val="23"/>
+          <w:lang w:val="en-US" w:eastAsia="pt-BR"/>
+        </w:rPr>
+        <w:t>console</w:t>
+      </w:r>
+      <w:r>
+        <w:rPr>
+          <w:rFonts w:ascii="Consolas" w:eastAsia="Times New Roman" w:hAnsi="Consolas" w:cs="Times New Roman"/>
+          <w:color w:val="F8F8F2"/>
+          <w:sz w:val="23"/>
+          <w:szCs w:val="23"/>
+          <w:lang w:val="en-US" w:eastAsia="pt-BR"/>
+        </w:rPr>
+        <w:t>.</w:t>
+      </w:r>
+      <w:r>
+        <w:rPr>
+          <w:rFonts w:ascii="Consolas" w:eastAsia="Times New Roman" w:hAnsi="Consolas" w:cs="Times New Roman"/>
+          <w:color w:val="50FA7B"/>
+          <w:sz w:val="23"/>
+          <w:szCs w:val="23"/>
+          <w:lang w:val="en-US" w:eastAsia="pt-BR"/>
+        </w:rPr>
+        <w:t>log</w:t>
+      </w:r>
+      <w:r>
+        <w:rPr>
+          <w:rFonts w:ascii="Consolas" w:eastAsia="Times New Roman" w:hAnsi="Consolas" w:cs="Times New Roman"/>
+          <w:color w:val="F8F8F2"/>
+          <w:sz w:val="23"/>
+          <w:szCs w:val="23"/>
+          <w:lang w:val="en-US" w:eastAsia="pt-BR"/>
+        </w:rPr>
+        <w:t>(</w:t>
+      </w:r>
+      <w:r>
+        <w:rPr>
+          <w:rFonts w:ascii="Consolas" w:eastAsia="Times New Roman" w:hAnsi="Consolas" w:cs="Times New Roman"/>
+          <w:color w:val="BD93F9"/>
+          <w:sz w:val="23"/>
+          <w:szCs w:val="23"/>
+          <w:lang w:val="en-US" w:eastAsia="pt-BR"/>
+        </w:rPr>
+        <w:t>dc1</w:t>
+      </w:r>
+      <w:r>
+        <w:rPr>
+          <w:rFonts w:ascii="Consolas" w:eastAsia="Times New Roman" w:hAnsi="Consolas" w:cs="Times New Roman"/>
+          <w:color w:val="F8F8F2"/>
+          <w:sz w:val="23"/>
+          <w:szCs w:val="23"/>
+          <w:lang w:val="en-US" w:eastAsia="pt-BR"/>
+        </w:rPr>
+        <w:t>.id);</w:t>
+      </w:r>
+    </w:p>
+    <w:p>
+      <w:pPr>
+        <w:shd w:val="clear" w:color="auto" w:fill="282A36"/>
+        <w:spacing w:after="0" w:line="300" w:lineRule="atLeast"/>
+        <w:rPr>
+          <w:rFonts w:ascii="Consolas" w:eastAsia="Times New Roman" w:hAnsi="Consolas" w:cs="Times New Roman"/>
+          <w:color w:val="F8F8F2"/>
+          <w:sz w:val="23"/>
+          <w:szCs w:val="23"/>
+          <w:lang w:val="en-US" w:eastAsia="pt-BR"/>
+        </w:rPr>
+      </w:pPr>
+      <w:r>
+        <w:rPr>
+          <w:rFonts w:ascii="Consolas" w:eastAsia="Times New Roman" w:hAnsi="Consolas" w:cs="Times New Roman"/>
+          <w:color w:val="BD93F9"/>
+          <w:sz w:val="23"/>
+          <w:szCs w:val="23"/>
+          <w:lang w:val="en-US" w:eastAsia="pt-BR"/>
+        </w:rPr>
+        <w:t>dc1</w:t>
+      </w:r>
+      <w:r>
+        <w:rPr>
+          <w:rFonts w:ascii="Consolas" w:eastAsia="Times New Roman" w:hAnsi="Consolas" w:cs="Times New Roman"/>
+          <w:color w:val="F8F8F2"/>
+          <w:sz w:val="23"/>
+          <w:szCs w:val="23"/>
+          <w:lang w:val="en-US" w:eastAsia="pt-BR"/>
+        </w:rPr>
+        <w:t xml:space="preserve">.innerHTML </w:t>
+      </w:r>
+      <w:r>
+        <w:rPr>
+          <w:rFonts w:ascii="Consolas" w:eastAsia="Times New Roman" w:hAnsi="Consolas" w:cs="Times New Roman"/>
+          <w:color w:val="FF79C6"/>
+          <w:sz w:val="23"/>
+          <w:szCs w:val="23"/>
+          <w:lang w:val="en-US" w:eastAsia="pt-BR"/>
+        </w:rPr>
+        <w:t>=</w:t>
+      </w:r>
+      <w:r>
+        <w:rPr>
+          <w:rFonts w:ascii="Consolas" w:eastAsia="Times New Roman" w:hAnsi="Consolas" w:cs="Times New Roman"/>
+          <w:color w:val="F8F8F2"/>
+          <w:sz w:val="23"/>
+          <w:szCs w:val="23"/>
+          <w:lang w:val="en-US" w:eastAsia="pt-BR"/>
+        </w:rPr>
+        <w:t xml:space="preserve"> </w:t>
+      </w:r>
+      <w:r>
+        <w:rPr>
+          <w:rFonts w:ascii="Consolas" w:eastAsia="Times New Roman" w:hAnsi="Consolas" w:cs="Times New Roman"/>
+          <w:color w:val="E9F284"/>
+          <w:sz w:val="23"/>
+          <w:szCs w:val="23"/>
+          <w:lang w:val="en-US" w:eastAsia="pt-BR"/>
+        </w:rPr>
+        <w:t>"</w:t>
+      </w:r>
+      <w:proofErr w:type="spellStart"/>
+      <w:r>
+        <w:rPr>
+          <w:rFonts w:ascii="Consolas" w:eastAsia="Times New Roman" w:hAnsi="Consolas" w:cs="Times New Roman"/>
+          <w:color w:val="F1FA8C"/>
+          <w:sz w:val="23"/>
+          <w:szCs w:val="23"/>
+          <w:lang w:val="en-US" w:eastAsia="pt-BR"/>
+        </w:rPr>
+        <w:t>Olá</w:t>
+      </w:r>
+      <w:proofErr w:type="spellEnd"/>
+      <w:r>
+        <w:rPr>
+          <w:rFonts w:ascii="Consolas" w:eastAsia="Times New Roman" w:hAnsi="Consolas" w:cs="Times New Roman"/>
+          <w:color w:val="F1FA8C"/>
+          <w:sz w:val="23"/>
+          <w:szCs w:val="23"/>
+          <w:lang w:val="en-US" w:eastAsia="pt-BR"/>
+        </w:rPr>
+        <w:t xml:space="preserve"> Mundo</w:t>
+      </w:r>
+      <w:r>
+        <w:rPr>
+          <w:rFonts w:ascii="Consolas" w:eastAsia="Times New Roman" w:hAnsi="Consolas" w:cs="Times New Roman"/>
+          <w:color w:val="E9F284"/>
+          <w:sz w:val="23"/>
+          <w:szCs w:val="23"/>
+          <w:lang w:val="en-US" w:eastAsia="pt-BR"/>
+        </w:rPr>
+        <w:t>"</w:t>
+      </w:r>
+    </w:p>
+    <w:p>
+      <w:pPr>
+        <w:shd w:val="clear" w:color="auto" w:fill="282A36"/>
+        <w:spacing w:after="0" w:line="300" w:lineRule="atLeast"/>
+        <w:rPr>
+          <w:rFonts w:ascii="Consolas" w:eastAsia="Times New Roman" w:hAnsi="Consolas" w:cs="Times New Roman"/>
+          <w:color w:val="F8F8F2"/>
+          <w:sz w:val="23"/>
+          <w:szCs w:val="23"/>
+          <w:lang w:val="en-US" w:eastAsia="pt-BR"/>
+        </w:rPr>
+      </w:pPr>
+      <w:r>
+        <w:rPr>
+          <w:rFonts w:ascii="Consolas" w:eastAsia="Times New Roman" w:hAnsi="Consolas" w:cs="Times New Roman"/>
+          <w:color w:val="BD93F9"/>
+          <w:sz w:val="23"/>
+          <w:szCs w:val="23"/>
+          <w:lang w:val="en-US" w:eastAsia="pt-BR"/>
+        </w:rPr>
+        <w:t>console</w:t>
+      </w:r>
+      <w:r>
+        <w:rPr>
+          <w:rFonts w:ascii="Consolas" w:eastAsia="Times New Roman" w:hAnsi="Consolas" w:cs="Times New Roman"/>
+          <w:color w:val="F8F8F2"/>
+          <w:sz w:val="23"/>
+          <w:szCs w:val="23"/>
+          <w:lang w:val="en-US" w:eastAsia="pt-BR"/>
+        </w:rPr>
+        <w:t>.</w:t>
+      </w:r>
+      <w:r>
+        <w:rPr>
+          <w:rFonts w:ascii="Consolas" w:eastAsia="Times New Roman" w:hAnsi="Consolas" w:cs="Times New Roman"/>
+          <w:color w:val="50FA7B"/>
+          <w:sz w:val="23"/>
+          <w:szCs w:val="23"/>
+          <w:lang w:val="en-US" w:eastAsia="pt-BR"/>
+        </w:rPr>
+        <w:t>log</w:t>
+      </w:r>
+      <w:r>
+        <w:rPr>
+          <w:rFonts w:ascii="Consolas" w:eastAsia="Times New Roman" w:hAnsi="Consolas" w:cs="Times New Roman"/>
+          <w:color w:val="F8F8F2"/>
+          <w:sz w:val="23"/>
+          <w:szCs w:val="23"/>
+          <w:lang w:val="en-US" w:eastAsia="pt-BR"/>
+        </w:rPr>
+        <w:t>(</w:t>
+      </w:r>
+      <w:r>
+        <w:rPr>
+          <w:rFonts w:ascii="Consolas" w:eastAsia="Times New Roman" w:hAnsi="Consolas" w:cs="Times New Roman"/>
+          <w:color w:val="BD93F9"/>
+          <w:sz w:val="23"/>
+          <w:szCs w:val="23"/>
+          <w:lang w:val="en-US" w:eastAsia="pt-BR"/>
+        </w:rPr>
+        <w:t>dc1</w:t>
+      </w:r>
+      <w:r>
+        <w:rPr>
+          <w:rFonts w:ascii="Consolas" w:eastAsia="Times New Roman" w:hAnsi="Consolas" w:cs="Times New Roman"/>
+          <w:color w:val="F8F8F2"/>
+          <w:sz w:val="23"/>
+          <w:szCs w:val="23"/>
+          <w:lang w:val="en-US" w:eastAsia="pt-BR"/>
+        </w:rPr>
+        <w:t>.innerHTML)</w:t>
+      </w:r>
+    </w:p>
+    <w:p>
+      <w:pPr>
         <w:rPr>
           <w:color w:val="FF0000"/>
           <w:sz w:val="36"/>
           <w:szCs w:val="36"/>
-        </w:rPr>
-        <w:t>1</w:t>
-      </w:r>
-      <w:r>
+          <w:lang w:val="en-US"/>
+        </w:rPr>
+      </w:pPr>
+    </w:p>
+    <w:p>
+      <w:pPr>
         <w:rPr>
           <w:color w:val="FF0000"/>
           <w:sz w:val="36"/>
           <w:szCs w:val="36"/>
         </w:rPr>
+      </w:pPr>
+      <w:r>
+        <w:rPr>
+          <w:color w:val="FF0000"/>
+          <w:sz w:val="36"/>
+          <w:szCs w:val="36"/>
+        </w:rPr>
+        <w:t>Vídeo 3</w:t>
+      </w:r>
+      <w:r>
+        <w:rPr>
+          <w:color w:val="FF0000"/>
+          <w:sz w:val="36"/>
+          <w:szCs w:val="36"/>
+        </w:rPr>
+        <w:t>2</w:t>
+      </w:r>
+      <w:r>
+        <w:rPr>
+          <w:color w:val="FF0000"/>
+          <w:sz w:val="36"/>
+          <w:szCs w:val="36"/>
+        </w:rPr>
         <w:t>.</w:t>
       </w:r>
     </w:p>
@@ -10537,7 +11080,7 @@
           <w:sz w:val="28"/>
           <w:szCs w:val="36"/>
         </w:rPr>
-        <w:t>getElementById</w:t>
+        <w:t>getElementByTagName</w:t>
       </w:r>
       <w:proofErr w:type="spellEnd"/>
       <w:r>
@@ -10545,7 +11088,7 @@
           <w:sz w:val="28"/>
           <w:szCs w:val="36"/>
         </w:rPr>
-        <w:t xml:space="preserve"> = Pega o elemento do </w:t>
+        <w:t xml:space="preserve">: Pega o elemento </w:t>
       </w:r>
       <w:proofErr w:type="spellStart"/>
       <w:r>
@@ -10561,7 +11104,23 @@
           <w:sz w:val="28"/>
           <w:szCs w:val="36"/>
         </w:rPr>
-        <w:t xml:space="preserve"> pelo id, podendo fazer qualquer tipo de manipulação. </w:t>
+        <w:t xml:space="preserve"> pelo nome da </w:t>
+      </w:r>
+      <w:proofErr w:type="spellStart"/>
+      <w:r>
+        <w:rPr>
+          <w:sz w:val="28"/>
+          <w:szCs w:val="36"/>
+        </w:rPr>
+        <w:t>tag</w:t>
+      </w:r>
+      <w:proofErr w:type="spellEnd"/>
+      <w:r>
+        <w:rPr>
+          <w:sz w:val="28"/>
+          <w:szCs w:val="36"/>
+        </w:rPr>
+        <w:t>.</w:t>
       </w:r>
     </w:p>
     <w:p>
@@ -10584,7 +11143,6 @@
           <w:szCs w:val="23"/>
           <w:lang w:val="en-US" w:eastAsia="pt-BR"/>
         </w:rPr>
-        <w:lastRenderedPageBreak/>
         <w:t>const</w:t>
       </w:r>
       <w:r>
@@ -10597,6 +11155,7 @@
         </w:rPr>
         <w:t xml:space="preserve"> </w:t>
       </w:r>
+      <w:proofErr w:type="spellStart"/>
       <w:r>
         <w:rPr>
           <w:rFonts w:ascii="Consolas" w:eastAsia="Times New Roman" w:hAnsi="Consolas" w:cs="Times New Roman"/>
@@ -10605,6 +11164,47 @@
           <w:szCs w:val="23"/>
           <w:lang w:val="en-US" w:eastAsia="pt-BR"/>
         </w:rPr>
+        <w:t>arrayId</w:t>
+      </w:r>
+      <w:proofErr w:type="spellEnd"/>
+      <w:r>
+        <w:rPr>
+          <w:rFonts w:ascii="Consolas" w:eastAsia="Times New Roman" w:hAnsi="Consolas" w:cs="Times New Roman"/>
+          <w:color w:val="F8F8F2"/>
+          <w:sz w:val="23"/>
+          <w:szCs w:val="23"/>
+          <w:lang w:val="en-US" w:eastAsia="pt-BR"/>
+        </w:rPr>
+        <w:t xml:space="preserve"> </w:t>
+      </w:r>
+      <w:r>
+        <w:rPr>
+          <w:rFonts w:ascii="Consolas" w:eastAsia="Times New Roman" w:hAnsi="Consolas" w:cs="Times New Roman"/>
+          <w:color w:val="FF79C6"/>
+          <w:sz w:val="23"/>
+          <w:szCs w:val="23"/>
+          <w:lang w:val="en-US" w:eastAsia="pt-BR"/>
+        </w:rPr>
+        <w:t>=</w:t>
+      </w:r>
+      <w:r>
+        <w:rPr>
+          <w:rFonts w:ascii="Consolas" w:eastAsia="Times New Roman" w:hAnsi="Consolas" w:cs="Times New Roman"/>
+          <w:color w:val="F8F8F2"/>
+          <w:sz w:val="23"/>
+          <w:szCs w:val="23"/>
+          <w:lang w:val="en-US" w:eastAsia="pt-BR"/>
+        </w:rPr>
+        <w:t xml:space="preserve"> [</w:t>
+      </w:r>
+      <w:r>
+        <w:rPr>
+          <w:rFonts w:ascii="Consolas" w:eastAsia="Times New Roman" w:hAnsi="Consolas" w:cs="Times New Roman"/>
+          <w:color w:val="BD93F9"/>
+          <w:sz w:val="23"/>
+          <w:szCs w:val="23"/>
+          <w:lang w:val="en-US" w:eastAsia="pt-BR"/>
+        </w:rPr>
         <w:t>dc1</w:t>
       </w:r>
       <w:r>
@@ -10615,29 +11215,8 @@
           <w:szCs w:val="23"/>
           <w:lang w:val="en-US" w:eastAsia="pt-BR"/>
         </w:rPr>
-        <w:t xml:space="preserve"> </w:t>
-      </w:r>
-      <w:r>
-        <w:rPr>
-          <w:rFonts w:ascii="Consolas" w:eastAsia="Times New Roman" w:hAnsi="Consolas" w:cs="Times New Roman"/>
-          <w:color w:val="FF79C6"/>
-          <w:sz w:val="23"/>
-          <w:szCs w:val="23"/>
-          <w:lang w:val="en-US" w:eastAsia="pt-BR"/>
-        </w:rPr>
-        <w:t>=</w:t>
-      </w:r>
-      <w:r>
-        <w:rPr>
-          <w:rFonts w:ascii="Consolas" w:eastAsia="Times New Roman" w:hAnsi="Consolas" w:cs="Times New Roman"/>
-          <w:color w:val="F8F8F2"/>
-          <w:sz w:val="23"/>
-          <w:szCs w:val="23"/>
-          <w:lang w:val="en-US" w:eastAsia="pt-BR"/>
-        </w:rPr>
-        <w:t xml:space="preserve"> </w:t>
-      </w:r>
-      <w:proofErr w:type="spellStart"/>
+        <w:t xml:space="preserve">, </w:t>
+      </w:r>
       <w:r>
         <w:rPr>
           <w:rFonts w:ascii="Consolas" w:eastAsia="Times New Roman" w:hAnsi="Consolas" w:cs="Times New Roman"/>
@@ -10646,78 +11225,97 @@
           <w:szCs w:val="23"/>
           <w:lang w:val="en-US" w:eastAsia="pt-BR"/>
         </w:rPr>
-        <w:t>document</w:t>
-      </w:r>
-      <w:r>
-        <w:rPr>
-          <w:rFonts w:ascii="Consolas" w:eastAsia="Times New Roman" w:hAnsi="Consolas" w:cs="Times New Roman"/>
-          <w:color w:val="F8F8F2"/>
-          <w:sz w:val="23"/>
-          <w:szCs w:val="23"/>
-          <w:lang w:val="en-US" w:eastAsia="pt-BR"/>
-        </w:rPr>
-        <w:t>.</w:t>
-      </w:r>
-      <w:r>
-        <w:rPr>
-          <w:rFonts w:ascii="Consolas" w:eastAsia="Times New Roman" w:hAnsi="Consolas" w:cs="Times New Roman"/>
-          <w:color w:val="50FA7B"/>
-          <w:sz w:val="23"/>
-          <w:szCs w:val="23"/>
-          <w:lang w:val="en-US" w:eastAsia="pt-BR"/>
-        </w:rPr>
-        <w:t>getElementById</w:t>
-      </w:r>
-      <w:proofErr w:type="spellEnd"/>
-      <w:r>
-        <w:rPr>
-          <w:rFonts w:ascii="Consolas" w:eastAsia="Times New Roman" w:hAnsi="Consolas" w:cs="Times New Roman"/>
-          <w:color w:val="F8F8F2"/>
-          <w:sz w:val="23"/>
-          <w:szCs w:val="23"/>
-          <w:lang w:val="en-US" w:eastAsia="pt-BR"/>
-        </w:rPr>
-        <w:t>(</w:t>
-      </w:r>
-      <w:r>
-        <w:rPr>
-          <w:rFonts w:ascii="Consolas" w:eastAsia="Times New Roman" w:hAnsi="Consolas" w:cs="Times New Roman"/>
-          <w:color w:val="E9F284"/>
-          <w:sz w:val="23"/>
-          <w:szCs w:val="23"/>
-          <w:lang w:val="en-US" w:eastAsia="pt-BR"/>
-        </w:rPr>
-        <w:t>"</w:t>
-      </w:r>
-      <w:r>
-        <w:rPr>
-          <w:rFonts w:ascii="Consolas" w:eastAsia="Times New Roman" w:hAnsi="Consolas" w:cs="Times New Roman"/>
-          <w:color w:val="F1FA8C"/>
-          <w:sz w:val="23"/>
-          <w:szCs w:val="23"/>
-          <w:lang w:val="en-US" w:eastAsia="pt-BR"/>
-        </w:rPr>
-        <w:t>c1</w:t>
-      </w:r>
-      <w:r>
-        <w:rPr>
-          <w:rFonts w:ascii="Consolas" w:eastAsia="Times New Roman" w:hAnsi="Consolas" w:cs="Times New Roman"/>
-          <w:color w:val="E9F284"/>
-          <w:sz w:val="23"/>
-          <w:szCs w:val="23"/>
-          <w:lang w:val="en-US" w:eastAsia="pt-BR"/>
-        </w:rPr>
-        <w:t>"</w:t>
-      </w:r>
-      <w:r>
-        <w:rPr>
-          <w:rFonts w:ascii="Consolas" w:eastAsia="Times New Roman" w:hAnsi="Consolas" w:cs="Times New Roman"/>
-          <w:color w:val="F8F8F2"/>
-          <w:sz w:val="23"/>
-          <w:szCs w:val="23"/>
-          <w:lang w:val="en-US" w:eastAsia="pt-BR"/>
-        </w:rPr>
-        <w:t>);</w:t>
+        <w:t>dc2</w:t>
+      </w:r>
+      <w:r>
+        <w:rPr>
+          <w:rFonts w:ascii="Consolas" w:eastAsia="Times New Roman" w:hAnsi="Consolas" w:cs="Times New Roman"/>
+          <w:color w:val="F8F8F2"/>
+          <w:sz w:val="23"/>
+          <w:szCs w:val="23"/>
+          <w:lang w:val="en-US" w:eastAsia="pt-BR"/>
+        </w:rPr>
+        <w:t xml:space="preserve">, </w:t>
+      </w:r>
+      <w:r>
+        <w:rPr>
+          <w:rFonts w:ascii="Consolas" w:eastAsia="Times New Roman" w:hAnsi="Consolas" w:cs="Times New Roman"/>
+          <w:color w:val="BD93F9"/>
+          <w:sz w:val="23"/>
+          <w:szCs w:val="23"/>
+          <w:lang w:val="en-US" w:eastAsia="pt-BR"/>
+        </w:rPr>
+        <w:t>dc3</w:t>
+      </w:r>
+      <w:r>
+        <w:rPr>
+          <w:rFonts w:ascii="Consolas" w:eastAsia="Times New Roman" w:hAnsi="Consolas" w:cs="Times New Roman"/>
+          <w:color w:val="F8F8F2"/>
+          <w:sz w:val="23"/>
+          <w:szCs w:val="23"/>
+          <w:lang w:val="en-US" w:eastAsia="pt-BR"/>
+        </w:rPr>
+        <w:t xml:space="preserve">, </w:t>
+      </w:r>
+      <w:r>
+        <w:rPr>
+          <w:rFonts w:ascii="Consolas" w:eastAsia="Times New Roman" w:hAnsi="Consolas" w:cs="Times New Roman"/>
+          <w:color w:val="BD93F9"/>
+          <w:sz w:val="23"/>
+          <w:szCs w:val="23"/>
+          <w:lang w:val="en-US" w:eastAsia="pt-BR"/>
+        </w:rPr>
+        <w:t>dc4</w:t>
+      </w:r>
+      <w:r>
+        <w:rPr>
+          <w:rFonts w:ascii="Consolas" w:eastAsia="Times New Roman" w:hAnsi="Consolas" w:cs="Times New Roman"/>
+          <w:color w:val="F8F8F2"/>
+          <w:sz w:val="23"/>
+          <w:szCs w:val="23"/>
+          <w:lang w:val="en-US" w:eastAsia="pt-BR"/>
+        </w:rPr>
+        <w:t xml:space="preserve">, </w:t>
+      </w:r>
+      <w:r>
+        <w:rPr>
+          <w:rFonts w:ascii="Consolas" w:eastAsia="Times New Roman" w:hAnsi="Consolas" w:cs="Times New Roman"/>
+          <w:color w:val="BD93F9"/>
+          <w:sz w:val="23"/>
+          <w:szCs w:val="23"/>
+          <w:lang w:val="en-US" w:eastAsia="pt-BR"/>
+        </w:rPr>
+        <w:t>dc5</w:t>
+      </w:r>
+      <w:r>
+        <w:rPr>
+          <w:rFonts w:ascii="Consolas" w:eastAsia="Times New Roman" w:hAnsi="Consolas" w:cs="Times New Roman"/>
+          <w:color w:val="F8F8F2"/>
+          <w:sz w:val="23"/>
+          <w:szCs w:val="23"/>
+          <w:lang w:val="en-US" w:eastAsia="pt-BR"/>
+        </w:rPr>
+        <w:t xml:space="preserve">, </w:t>
+      </w:r>
+      <w:r>
+        <w:rPr>
+          <w:rFonts w:ascii="Consolas" w:eastAsia="Times New Roman" w:hAnsi="Consolas" w:cs="Times New Roman"/>
+          <w:color w:val="BD93F9"/>
+          <w:sz w:val="23"/>
+          <w:szCs w:val="23"/>
+          <w:lang w:val="en-US" w:eastAsia="pt-BR"/>
+        </w:rPr>
+        <w:t>dc6</w:t>
+      </w:r>
+      <w:r>
+        <w:rPr>
+          <w:rFonts w:ascii="Consolas" w:eastAsia="Times New Roman" w:hAnsi="Consolas" w:cs="Times New Roman"/>
+          <w:color w:val="F8F8F2"/>
+          <w:sz w:val="23"/>
+          <w:szCs w:val="23"/>
+          <w:lang w:val="en-US" w:eastAsia="pt-BR"/>
+        </w:rPr>
+        <w:t>];</w:t>
       </w:r>
     </w:p>
     <w:p>
@@ -10729,26 +11327,92 @@
           <w:color w:val="F8F8F2"/>
           <w:sz w:val="23"/>
           <w:szCs w:val="23"/>
-          <w:lang w:val="en-US" w:eastAsia="pt-BR"/>
-        </w:rPr>
-      </w:pPr>
+          <w:lang w:eastAsia="pt-BR"/>
+        </w:rPr>
+      </w:pPr>
+      <w:proofErr w:type="spellStart"/>
+      <w:r>
+        <w:rPr>
+          <w:rFonts w:ascii="Consolas" w:eastAsia="Times New Roman" w:hAnsi="Consolas" w:cs="Times New Roman"/>
+          <w:color w:val="FF79C6"/>
+          <w:sz w:val="23"/>
+          <w:szCs w:val="23"/>
+          <w:lang w:eastAsia="pt-BR"/>
+        </w:rPr>
+        <w:t>const</w:t>
+      </w:r>
+      <w:proofErr w:type="spellEnd"/>
+      <w:r>
+        <w:rPr>
+          <w:rFonts w:ascii="Consolas" w:eastAsia="Times New Roman" w:hAnsi="Consolas" w:cs="Times New Roman"/>
+          <w:color w:val="F8F8F2"/>
+          <w:sz w:val="23"/>
+          <w:szCs w:val="23"/>
+          <w:lang w:eastAsia="pt-BR"/>
+        </w:rPr>
+        <w:t xml:space="preserve"> </w:t>
+      </w:r>
+      <w:proofErr w:type="spellStart"/>
       <w:r>
         <w:rPr>
           <w:rFonts w:ascii="Consolas" w:eastAsia="Times New Roman" w:hAnsi="Consolas" w:cs="Times New Roman"/>
           <w:color w:val="BD93F9"/>
           <w:sz w:val="23"/>
           <w:szCs w:val="23"/>
-          <w:lang w:val="en-US" w:eastAsia="pt-BR"/>
-        </w:rPr>
-        <w:t>console</w:t>
-      </w:r>
-      <w:r>
-        <w:rPr>
-          <w:rFonts w:ascii="Consolas" w:eastAsia="Times New Roman" w:hAnsi="Consolas" w:cs="Times New Roman"/>
-          <w:color w:val="F8F8F2"/>
-          <w:sz w:val="23"/>
-          <w:szCs w:val="23"/>
-          <w:lang w:val="en-US" w:eastAsia="pt-BR"/>
+          <w:lang w:eastAsia="pt-BR"/>
+        </w:rPr>
+        <w:t>colecaoHTML</w:t>
+      </w:r>
+      <w:proofErr w:type="spellEnd"/>
+      <w:r>
+        <w:rPr>
+          <w:rFonts w:ascii="Consolas" w:eastAsia="Times New Roman" w:hAnsi="Consolas" w:cs="Times New Roman"/>
+          <w:color w:val="F8F8F2"/>
+          <w:sz w:val="23"/>
+          <w:szCs w:val="23"/>
+          <w:lang w:eastAsia="pt-BR"/>
+        </w:rPr>
+        <w:t xml:space="preserve"> </w:t>
+      </w:r>
+      <w:r>
+        <w:rPr>
+          <w:rFonts w:ascii="Consolas" w:eastAsia="Times New Roman" w:hAnsi="Consolas" w:cs="Times New Roman"/>
+          <w:color w:val="FF79C6"/>
+          <w:sz w:val="23"/>
+          <w:szCs w:val="23"/>
+          <w:lang w:eastAsia="pt-BR"/>
+        </w:rPr>
+        <w:t>=</w:t>
+      </w:r>
+      <w:r>
+        <w:rPr>
+          <w:rFonts w:ascii="Consolas" w:eastAsia="Times New Roman" w:hAnsi="Consolas" w:cs="Times New Roman"/>
+          <w:color w:val="F8F8F2"/>
+          <w:sz w:val="23"/>
+          <w:szCs w:val="23"/>
+          <w:lang w:eastAsia="pt-BR"/>
+        </w:rPr>
+        <w:t xml:space="preserve"> </w:t>
+      </w:r>
+      <w:proofErr w:type="spellStart"/>
+      <w:proofErr w:type="gramStart"/>
+      <w:r>
+        <w:rPr>
+          <w:rFonts w:ascii="Consolas" w:eastAsia="Times New Roman" w:hAnsi="Consolas" w:cs="Times New Roman"/>
+          <w:color w:val="BD93F9"/>
+          <w:sz w:val="23"/>
+          <w:szCs w:val="23"/>
+          <w:lang w:eastAsia="pt-BR"/>
+        </w:rPr>
+        <w:t>document</w:t>
+      </w:r>
+      <w:r>
+        <w:rPr>
+          <w:rFonts w:ascii="Consolas" w:eastAsia="Times New Roman" w:hAnsi="Consolas" w:cs="Times New Roman"/>
+          <w:color w:val="F8F8F2"/>
+          <w:sz w:val="23"/>
+          <w:szCs w:val="23"/>
+          <w:lang w:eastAsia="pt-BR"/>
         </w:rPr>
         <w:t>.</w:t>
       </w:r>
@@ -10758,39 +11422,63 @@
           <w:color w:val="50FA7B"/>
           <w:sz w:val="23"/>
           <w:szCs w:val="23"/>
-          <w:lang w:val="en-US" w:eastAsia="pt-BR"/>
-        </w:rPr>
-        <w:t>log</w:t>
-      </w:r>
-      <w:r>
-        <w:rPr>
-          <w:rFonts w:ascii="Consolas" w:eastAsia="Times New Roman" w:hAnsi="Consolas" w:cs="Times New Roman"/>
-          <w:color w:val="F8F8F2"/>
-          <w:sz w:val="23"/>
-          <w:szCs w:val="23"/>
-          <w:lang w:val="en-US" w:eastAsia="pt-BR"/>
+          <w:lang w:eastAsia="pt-BR"/>
+        </w:rPr>
+        <w:t>getElementsByTagName</w:t>
+      </w:r>
+      <w:proofErr w:type="spellEnd"/>
+      <w:proofErr w:type="gramEnd"/>
+      <w:r>
+        <w:rPr>
+          <w:rFonts w:ascii="Consolas" w:eastAsia="Times New Roman" w:hAnsi="Consolas" w:cs="Times New Roman"/>
+          <w:color w:val="F8F8F2"/>
+          <w:sz w:val="23"/>
+          <w:szCs w:val="23"/>
+          <w:lang w:eastAsia="pt-BR"/>
         </w:rPr>
         <w:t>(</w:t>
       </w:r>
       <w:r>
         <w:rPr>
           <w:rFonts w:ascii="Consolas" w:eastAsia="Times New Roman" w:hAnsi="Consolas" w:cs="Times New Roman"/>
-          <w:color w:val="BD93F9"/>
-          <w:sz w:val="23"/>
-          <w:szCs w:val="23"/>
-          <w:lang w:val="en-US" w:eastAsia="pt-BR"/>
-        </w:rPr>
-        <w:t>dc1</w:t>
-      </w:r>
-      <w:r>
-        <w:rPr>
-          <w:rFonts w:ascii="Consolas" w:eastAsia="Times New Roman" w:hAnsi="Consolas" w:cs="Times New Roman"/>
-          <w:color w:val="F8F8F2"/>
-          <w:sz w:val="23"/>
-          <w:szCs w:val="23"/>
-          <w:lang w:val="en-US" w:eastAsia="pt-BR"/>
-        </w:rPr>
-        <w:t>);</w:t>
+          <w:color w:val="E9F284"/>
+          <w:sz w:val="23"/>
+          <w:szCs w:val="23"/>
+          <w:lang w:eastAsia="pt-BR"/>
+        </w:rPr>
+        <w:t>"</w:t>
+      </w:r>
+      <w:proofErr w:type="spellStart"/>
+      <w:r>
+        <w:rPr>
+          <w:rFonts w:ascii="Consolas" w:eastAsia="Times New Roman" w:hAnsi="Consolas" w:cs="Times New Roman"/>
+          <w:color w:val="F1FA8C"/>
+          <w:sz w:val="23"/>
+          <w:szCs w:val="23"/>
+          <w:lang w:eastAsia="pt-BR"/>
+        </w:rPr>
+        <w:t>div</w:t>
+      </w:r>
+      <w:proofErr w:type="spellEnd"/>
+      <w:r>
+        <w:rPr>
+          <w:rFonts w:ascii="Consolas" w:eastAsia="Times New Roman" w:hAnsi="Consolas" w:cs="Times New Roman"/>
+          <w:color w:val="E9F284"/>
+          <w:sz w:val="23"/>
+          <w:szCs w:val="23"/>
+          <w:lang w:eastAsia="pt-BR"/>
+        </w:rPr>
+        <w:t>"</w:t>
+      </w:r>
+      <w:r>
+        <w:rPr>
+          <w:rFonts w:ascii="Consolas" w:eastAsia="Times New Roman" w:hAnsi="Consolas" w:cs="Times New Roman"/>
+          <w:color w:val="F8F8F2"/>
+          <w:sz w:val="23"/>
+          <w:szCs w:val="23"/>
+          <w:lang w:eastAsia="pt-BR"/>
+        </w:rPr>
+        <w:t>)</w:t>
       </w:r>
     </w:p>
     <w:p>
@@ -10802,69 +11490,9 @@
           <w:color w:val="F8F8F2"/>
           <w:sz w:val="23"/>
           <w:szCs w:val="23"/>
-          <w:lang w:val="en-US" w:eastAsia="pt-BR"/>
-        </w:rPr>
-      </w:pPr>
-      <w:r>
-        <w:rPr>
-          <w:rFonts w:ascii="Consolas" w:eastAsia="Times New Roman" w:hAnsi="Consolas" w:cs="Times New Roman"/>
-          <w:color w:val="BD93F9"/>
-          <w:sz w:val="23"/>
-          <w:szCs w:val="23"/>
-          <w:lang w:val="en-US" w:eastAsia="pt-BR"/>
-        </w:rPr>
-        <w:t>console</w:t>
-      </w:r>
-      <w:r>
-        <w:rPr>
-          <w:rFonts w:ascii="Consolas" w:eastAsia="Times New Roman" w:hAnsi="Consolas" w:cs="Times New Roman"/>
-          <w:color w:val="F8F8F2"/>
-          <w:sz w:val="23"/>
-          <w:szCs w:val="23"/>
-          <w:lang w:val="en-US" w:eastAsia="pt-BR"/>
-        </w:rPr>
-        <w:t>.</w:t>
-      </w:r>
-      <w:r>
-        <w:rPr>
-          <w:rFonts w:ascii="Consolas" w:eastAsia="Times New Roman" w:hAnsi="Consolas" w:cs="Times New Roman"/>
-          <w:color w:val="50FA7B"/>
-          <w:sz w:val="23"/>
-          <w:szCs w:val="23"/>
-          <w:lang w:val="en-US" w:eastAsia="pt-BR"/>
-        </w:rPr>
-        <w:t>log</w:t>
-      </w:r>
-      <w:r>
-        <w:rPr>
-          <w:rFonts w:ascii="Consolas" w:eastAsia="Times New Roman" w:hAnsi="Consolas" w:cs="Times New Roman"/>
-          <w:color w:val="F8F8F2"/>
-          <w:sz w:val="23"/>
-          <w:szCs w:val="23"/>
-          <w:lang w:val="en-US" w:eastAsia="pt-BR"/>
-        </w:rPr>
-        <w:t>(</w:t>
-      </w:r>
-      <w:r>
-        <w:rPr>
-          <w:rFonts w:ascii="Consolas" w:eastAsia="Times New Roman" w:hAnsi="Consolas" w:cs="Times New Roman"/>
-          <w:color w:val="BD93F9"/>
-          <w:sz w:val="23"/>
-          <w:szCs w:val="23"/>
-          <w:lang w:val="en-US" w:eastAsia="pt-BR"/>
-        </w:rPr>
-        <w:t>dc1</w:t>
-      </w:r>
-      <w:r>
-        <w:rPr>
-          <w:rFonts w:ascii="Consolas" w:eastAsia="Times New Roman" w:hAnsi="Consolas" w:cs="Times New Roman"/>
-          <w:color w:val="F8F8F2"/>
-          <w:sz w:val="23"/>
-          <w:szCs w:val="23"/>
-          <w:lang w:val="en-US" w:eastAsia="pt-BR"/>
-        </w:rPr>
-        <w:t>.id);</w:t>
-      </w:r>
+          <w:lang w:eastAsia="pt-BR"/>
+        </w:rPr>
+      </w:pPr>
     </w:p>
     <w:p>
       <w:pPr>
@@ -10875,7 +11503,7 @@
           <w:color w:val="F8F8F2"/>
           <w:sz w:val="23"/>
           <w:szCs w:val="23"/>
-          <w:lang w:val="en-US" w:eastAsia="pt-BR"/>
+          <w:lang w:eastAsia="pt-BR"/>
         </w:rPr>
       </w:pPr>
       <w:r>
@@ -10884,81 +11512,61 @@
           <w:color w:val="BD93F9"/>
           <w:sz w:val="23"/>
           <w:szCs w:val="23"/>
-          <w:lang w:val="en-US" w:eastAsia="pt-BR"/>
-        </w:rPr>
-        <w:t>dc1</w:t>
-      </w:r>
-      <w:r>
-        <w:rPr>
-          <w:rFonts w:ascii="Consolas" w:eastAsia="Times New Roman" w:hAnsi="Consolas" w:cs="Times New Roman"/>
-          <w:color w:val="F8F8F2"/>
-          <w:sz w:val="23"/>
-          <w:szCs w:val="23"/>
-          <w:lang w:val="en-US" w:eastAsia="pt-BR"/>
-        </w:rPr>
-        <w:t xml:space="preserve">.innerHTML </w:t>
-      </w:r>
-      <w:r>
-        <w:rPr>
-          <w:rFonts w:ascii="Consolas" w:eastAsia="Times New Roman" w:hAnsi="Consolas" w:cs="Times New Roman"/>
-          <w:color w:val="FF79C6"/>
-          <w:sz w:val="23"/>
-          <w:szCs w:val="23"/>
-          <w:lang w:val="en-US" w:eastAsia="pt-BR"/>
-        </w:rPr>
-        <w:t>=</w:t>
-      </w:r>
-      <w:r>
-        <w:rPr>
-          <w:rFonts w:ascii="Consolas" w:eastAsia="Times New Roman" w:hAnsi="Consolas" w:cs="Times New Roman"/>
-          <w:color w:val="F8F8F2"/>
-          <w:sz w:val="23"/>
-          <w:szCs w:val="23"/>
-          <w:lang w:val="en-US" w:eastAsia="pt-BR"/>
-        </w:rPr>
-        <w:t xml:space="preserve"> </w:t>
-      </w:r>
-      <w:r>
-        <w:rPr>
-          <w:rFonts w:ascii="Consolas" w:eastAsia="Times New Roman" w:hAnsi="Consolas" w:cs="Times New Roman"/>
-          <w:color w:val="E9F284"/>
-          <w:sz w:val="23"/>
-          <w:szCs w:val="23"/>
-          <w:lang w:val="en-US" w:eastAsia="pt-BR"/>
-        </w:rPr>
-        <w:t>"</w:t>
+          <w:lang w:eastAsia="pt-BR"/>
+        </w:rPr>
+        <w:t>console</w:t>
+      </w:r>
+      <w:r>
+        <w:rPr>
+          <w:rFonts w:ascii="Consolas" w:eastAsia="Times New Roman" w:hAnsi="Consolas" w:cs="Times New Roman"/>
+          <w:color w:val="F8F8F2"/>
+          <w:sz w:val="23"/>
+          <w:szCs w:val="23"/>
+          <w:lang w:eastAsia="pt-BR"/>
+        </w:rPr>
+        <w:t>.</w:t>
+      </w:r>
+      <w:r>
+        <w:rPr>
+          <w:rFonts w:ascii="Consolas" w:eastAsia="Times New Roman" w:hAnsi="Consolas" w:cs="Times New Roman"/>
+          <w:color w:val="50FA7B"/>
+          <w:sz w:val="23"/>
+          <w:szCs w:val="23"/>
+          <w:lang w:eastAsia="pt-BR"/>
+        </w:rPr>
+        <w:t>log</w:t>
+      </w:r>
+      <w:r>
+        <w:rPr>
+          <w:rFonts w:ascii="Consolas" w:eastAsia="Times New Roman" w:hAnsi="Consolas" w:cs="Times New Roman"/>
+          <w:color w:val="F8F8F2"/>
+          <w:sz w:val="23"/>
+          <w:szCs w:val="23"/>
+          <w:lang w:eastAsia="pt-BR"/>
+        </w:rPr>
+        <w:t>(</w:t>
       </w:r>
       <w:proofErr w:type="spellStart"/>
       <w:r>
         <w:rPr>
           <w:rFonts w:ascii="Consolas" w:eastAsia="Times New Roman" w:hAnsi="Consolas" w:cs="Times New Roman"/>
-          <w:color w:val="F1FA8C"/>
-          <w:sz w:val="23"/>
-          <w:szCs w:val="23"/>
-          <w:lang w:val="en-US" w:eastAsia="pt-BR"/>
-        </w:rPr>
-        <w:t>Olá</w:t>
+          <w:color w:val="BD93F9"/>
+          <w:sz w:val="23"/>
+          <w:szCs w:val="23"/>
+          <w:lang w:eastAsia="pt-BR"/>
+        </w:rPr>
+        <w:t>colecaoHTML</w:t>
       </w:r>
       <w:proofErr w:type="spellEnd"/>
       <w:r>
         <w:rPr>
           <w:rFonts w:ascii="Consolas" w:eastAsia="Times New Roman" w:hAnsi="Consolas" w:cs="Times New Roman"/>
-          <w:color w:val="F1FA8C"/>
-          <w:sz w:val="23"/>
-          <w:szCs w:val="23"/>
-          <w:lang w:val="en-US" w:eastAsia="pt-BR"/>
-        </w:rPr>
-        <w:t xml:space="preserve"> Mundo</w:t>
-      </w:r>
-      <w:r>
-        <w:rPr>
-          <w:rFonts w:ascii="Consolas" w:eastAsia="Times New Roman" w:hAnsi="Consolas" w:cs="Times New Roman"/>
-          <w:color w:val="E9F284"/>
-          <w:sz w:val="23"/>
-          <w:szCs w:val="23"/>
-          <w:lang w:val="en-US" w:eastAsia="pt-BR"/>
-        </w:rPr>
-        <w:t>"</w:t>
+          <w:color w:val="F8F8F2"/>
+          <w:sz w:val="23"/>
+          <w:szCs w:val="23"/>
+          <w:lang w:eastAsia="pt-BR"/>
+        </w:rPr>
+        <w:t>)</w:t>
       </w:r>
     </w:p>
     <w:p>
@@ -10970,7 +11578,7 @@
           <w:color w:val="F8F8F2"/>
           <w:sz w:val="23"/>
           <w:szCs w:val="23"/>
-          <w:lang w:val="en-US" w:eastAsia="pt-BR"/>
+          <w:lang w:eastAsia="pt-BR"/>
         </w:rPr>
       </w:pPr>
       <w:r>
@@ -10979,7 +11587,7 @@
           <w:color w:val="BD93F9"/>
           <w:sz w:val="23"/>
           <w:szCs w:val="23"/>
-          <w:lang w:val="en-US" w:eastAsia="pt-BR"/>
+          <w:lang w:eastAsia="pt-BR"/>
         </w:rPr>
         <w:t>console</w:t>
       </w:r>
@@ -10989,7 +11597,7 @@
           <w:color w:val="F8F8F2"/>
           <w:sz w:val="23"/>
           <w:szCs w:val="23"/>
-          <w:lang w:val="en-US" w:eastAsia="pt-BR"/>
+          <w:lang w:eastAsia="pt-BR"/>
         </w:rPr>
         <w:t>.</w:t>
       </w:r>
@@ -10999,7 +11607,7 @@
           <w:color w:val="50FA7B"/>
           <w:sz w:val="23"/>
           <w:szCs w:val="23"/>
-          <w:lang w:val="en-US" w:eastAsia="pt-BR"/>
+          <w:lang w:eastAsia="pt-BR"/>
         </w:rPr>
         <w:t>log</w:t>
       </w:r>
@@ -11009,30 +11617,431 @@
           <w:color w:val="F8F8F2"/>
           <w:sz w:val="23"/>
           <w:szCs w:val="23"/>
-          <w:lang w:val="en-US" w:eastAsia="pt-BR"/>
+          <w:lang w:eastAsia="pt-BR"/>
         </w:rPr>
         <w:t>(</w:t>
       </w:r>
+      <w:proofErr w:type="spellStart"/>
       <w:r>
         <w:rPr>
           <w:rFonts w:ascii="Consolas" w:eastAsia="Times New Roman" w:hAnsi="Consolas" w:cs="Times New Roman"/>
           <w:color w:val="BD93F9"/>
           <w:sz w:val="23"/>
           <w:szCs w:val="23"/>
-          <w:lang w:val="en-US" w:eastAsia="pt-BR"/>
-        </w:rPr>
-        <w:t>dc1</w:t>
-      </w:r>
-      <w:r>
-        <w:rPr>
-          <w:rFonts w:ascii="Consolas" w:eastAsia="Times New Roman" w:hAnsi="Consolas" w:cs="Times New Roman"/>
-          <w:color w:val="F8F8F2"/>
-          <w:sz w:val="23"/>
-          <w:szCs w:val="23"/>
-          <w:lang w:val="en-US" w:eastAsia="pt-BR"/>
-        </w:rPr>
-        <w:t>.innerHTML)</w:t>
-      </w:r>
+          <w:lang w:eastAsia="pt-BR"/>
+        </w:rPr>
+        <w:t>arrayId</w:t>
+      </w:r>
+      <w:proofErr w:type="spellEnd"/>
+      <w:r>
+        <w:rPr>
+          <w:rFonts w:ascii="Consolas" w:eastAsia="Times New Roman" w:hAnsi="Consolas" w:cs="Times New Roman"/>
+          <w:color w:val="F8F8F2"/>
+          <w:sz w:val="23"/>
+          <w:szCs w:val="23"/>
+          <w:lang w:eastAsia="pt-BR"/>
+        </w:rPr>
+        <w:t>)</w:t>
+      </w:r>
+    </w:p>
+    <w:p>
+      <w:pPr>
+        <w:rPr>
+          <w:sz w:val="28"/>
+          <w:szCs w:val="36"/>
+        </w:rPr>
+      </w:pPr>
+    </w:p>
+    <w:p>
+      <w:pPr>
+        <w:rPr>
+          <w:sz w:val="28"/>
+          <w:szCs w:val="36"/>
+        </w:rPr>
+      </w:pPr>
+      <w:r>
+        <w:rPr>
+          <w:sz w:val="28"/>
+          <w:szCs w:val="36"/>
+        </w:rPr>
+        <w:t xml:space="preserve">A diferença: O tipo vai ser diferente, sendo o array do tipo Array e o </w:t>
+      </w:r>
+      <w:proofErr w:type="spellStart"/>
+      <w:r>
+        <w:rPr>
+          <w:sz w:val="28"/>
+          <w:szCs w:val="36"/>
+        </w:rPr>
+        <w:t>colecao</w:t>
+      </w:r>
+      <w:r>
+        <w:rPr>
+          <w:sz w:val="28"/>
+          <w:szCs w:val="36"/>
+        </w:rPr>
+        <w:t>HTML</w:t>
+      </w:r>
+      <w:proofErr w:type="spellEnd"/>
+      <w:r>
+        <w:rPr>
+          <w:sz w:val="28"/>
+          <w:szCs w:val="36"/>
+        </w:rPr>
+        <w:t xml:space="preserve"> do tipo </w:t>
+      </w:r>
+      <w:proofErr w:type="spellStart"/>
+      <w:r>
+        <w:rPr>
+          <w:sz w:val="28"/>
+          <w:szCs w:val="36"/>
+        </w:rPr>
+        <w:t>HTMLCollection</w:t>
+      </w:r>
+      <w:proofErr w:type="spellEnd"/>
+      <w:r>
+        <w:rPr>
+          <w:sz w:val="28"/>
+          <w:szCs w:val="36"/>
+        </w:rPr>
+        <w:t>.</w:t>
+      </w:r>
+    </w:p>
+    <w:p>
+      <w:pPr>
+        <w:rPr>
+          <w:sz w:val="28"/>
+          <w:szCs w:val="36"/>
+        </w:rPr>
+      </w:pPr>
+      <w:r>
+        <w:rPr>
+          <w:sz w:val="28"/>
+          <w:szCs w:val="36"/>
+        </w:rPr>
+        <w:t xml:space="preserve">Sendo um array da para usar tudo relacionado a array (Métodos). Mesma coisa com o </w:t>
+      </w:r>
+      <w:proofErr w:type="spellStart"/>
+      <w:r>
+        <w:rPr>
+          <w:sz w:val="28"/>
+          <w:szCs w:val="36"/>
+        </w:rPr>
+        <w:t>colecaoHTML</w:t>
+      </w:r>
+      <w:proofErr w:type="spellEnd"/>
+      <w:r>
+        <w:rPr>
+          <w:sz w:val="28"/>
+          <w:szCs w:val="36"/>
+        </w:rPr>
+        <w:t>, porém muito menos métodos para serem usados.</w:t>
+      </w:r>
+    </w:p>
+    <w:p>
+      <w:pPr>
+        <w:rPr>
+          <w:sz w:val="28"/>
+          <w:szCs w:val="36"/>
+        </w:rPr>
+      </w:pPr>
+      <w:r>
+        <w:rPr>
+          <w:sz w:val="28"/>
+          <w:szCs w:val="36"/>
+        </w:rPr>
+        <w:t xml:space="preserve">Para transformar em array: </w:t>
+      </w:r>
+    </w:p>
+    <w:p>
+      <w:pPr>
+        <w:shd w:val="clear" w:color="auto" w:fill="282A36"/>
+        <w:spacing w:after="0" w:line="300" w:lineRule="atLeast"/>
+        <w:rPr>
+          <w:rFonts w:ascii="Consolas" w:eastAsia="Times New Roman" w:hAnsi="Consolas" w:cs="Times New Roman"/>
+          <w:color w:val="F8F8F2"/>
+          <w:sz w:val="23"/>
+          <w:szCs w:val="23"/>
+          <w:lang w:eastAsia="pt-BR"/>
+        </w:rPr>
+      </w:pPr>
+      <w:proofErr w:type="spellStart"/>
+      <w:r>
+        <w:rPr>
+          <w:rFonts w:ascii="Consolas" w:eastAsia="Times New Roman" w:hAnsi="Consolas" w:cs="Times New Roman"/>
+          <w:color w:val="F8F8F2"/>
+          <w:sz w:val="23"/>
+          <w:szCs w:val="23"/>
+          <w:lang w:eastAsia="pt-BR"/>
+        </w:rPr>
+        <w:t>colecaoHTML</w:t>
+      </w:r>
+      <w:proofErr w:type="spellEnd"/>
+      <w:r>
+        <w:rPr>
+          <w:rFonts w:ascii="Consolas" w:eastAsia="Times New Roman" w:hAnsi="Consolas" w:cs="Times New Roman"/>
+          <w:color w:val="F8F8F2"/>
+          <w:sz w:val="23"/>
+          <w:szCs w:val="23"/>
+          <w:lang w:eastAsia="pt-BR"/>
+        </w:rPr>
+        <w:t xml:space="preserve"> </w:t>
+      </w:r>
+      <w:r>
+        <w:rPr>
+          <w:rFonts w:ascii="Consolas" w:eastAsia="Times New Roman" w:hAnsi="Consolas" w:cs="Times New Roman"/>
+          <w:color w:val="FF79C6"/>
+          <w:sz w:val="23"/>
+          <w:szCs w:val="23"/>
+          <w:lang w:eastAsia="pt-BR"/>
+        </w:rPr>
+        <w:t>=</w:t>
+      </w:r>
+      <w:r>
+        <w:rPr>
+          <w:rFonts w:ascii="Consolas" w:eastAsia="Times New Roman" w:hAnsi="Consolas" w:cs="Times New Roman"/>
+          <w:color w:val="F8F8F2"/>
+          <w:sz w:val="23"/>
+          <w:szCs w:val="23"/>
+          <w:lang w:eastAsia="pt-BR"/>
+        </w:rPr>
+        <w:t xml:space="preserve"> [</w:t>
+      </w:r>
+      <w:r>
+        <w:rPr>
+          <w:rFonts w:ascii="Consolas" w:eastAsia="Times New Roman" w:hAnsi="Consolas" w:cs="Times New Roman"/>
+          <w:color w:val="FF79C6"/>
+          <w:sz w:val="23"/>
+          <w:szCs w:val="23"/>
+          <w:lang w:eastAsia="pt-BR"/>
+        </w:rPr>
+        <w:t>...</w:t>
+      </w:r>
+      <w:proofErr w:type="spellStart"/>
+      <w:r>
+        <w:rPr>
+          <w:rFonts w:ascii="Consolas" w:eastAsia="Times New Roman" w:hAnsi="Consolas" w:cs="Times New Roman"/>
+          <w:color w:val="F8F8F2"/>
+          <w:sz w:val="23"/>
+          <w:szCs w:val="23"/>
+          <w:lang w:eastAsia="pt-BR"/>
+        </w:rPr>
+        <w:t>colecaoHTML</w:t>
+      </w:r>
+      <w:proofErr w:type="spellEnd"/>
+      <w:r>
+        <w:rPr>
+          <w:rFonts w:ascii="Consolas" w:eastAsia="Times New Roman" w:hAnsi="Consolas" w:cs="Times New Roman"/>
+          <w:color w:val="F8F8F2"/>
+          <w:sz w:val="23"/>
+          <w:szCs w:val="23"/>
+          <w:lang w:eastAsia="pt-BR"/>
+        </w:rPr>
+        <w:t>]</w:t>
+      </w:r>
+    </w:p>
+    <w:p>
+      <w:pPr>
+        <w:rPr>
+          <w:sz w:val="28"/>
+          <w:szCs w:val="36"/>
+        </w:rPr>
+      </w:pPr>
+    </w:p>
+    <w:p>
+      <w:pPr>
+        <w:rPr>
+          <w:sz w:val="28"/>
+          <w:szCs w:val="36"/>
+        </w:rPr>
+      </w:pPr>
+      <w:r>
+        <w:rPr>
+          <w:sz w:val="28"/>
+          <w:szCs w:val="36"/>
+        </w:rPr>
+        <w:t xml:space="preserve">Para fazer sendo uma constante: </w:t>
+      </w:r>
+    </w:p>
+    <w:p>
+      <w:pPr>
+        <w:shd w:val="clear" w:color="auto" w:fill="282A36"/>
+        <w:spacing w:after="0" w:line="300" w:lineRule="atLeast"/>
+        <w:rPr>
+          <w:rFonts w:ascii="Consolas" w:eastAsia="Times New Roman" w:hAnsi="Consolas" w:cs="Times New Roman"/>
+          <w:color w:val="F8F8F2"/>
+          <w:sz w:val="23"/>
+          <w:szCs w:val="23"/>
+          <w:lang w:eastAsia="pt-BR"/>
+        </w:rPr>
+      </w:pPr>
+      <w:proofErr w:type="spellStart"/>
+      <w:r>
+        <w:rPr>
+          <w:rFonts w:ascii="Consolas" w:eastAsia="Times New Roman" w:hAnsi="Consolas" w:cs="Times New Roman"/>
+          <w:color w:val="FF79C6"/>
+          <w:sz w:val="23"/>
+          <w:szCs w:val="23"/>
+          <w:lang w:eastAsia="pt-BR"/>
+        </w:rPr>
+        <w:t>const</w:t>
+      </w:r>
+      <w:proofErr w:type="spellEnd"/>
+      <w:r>
+        <w:rPr>
+          <w:rFonts w:ascii="Consolas" w:eastAsia="Times New Roman" w:hAnsi="Consolas" w:cs="Times New Roman"/>
+          <w:color w:val="F8F8F2"/>
+          <w:sz w:val="23"/>
+          <w:szCs w:val="23"/>
+          <w:lang w:eastAsia="pt-BR"/>
+        </w:rPr>
+        <w:t xml:space="preserve"> </w:t>
+      </w:r>
+      <w:proofErr w:type="spellStart"/>
+      <w:r>
+        <w:rPr>
+          <w:rFonts w:ascii="Consolas" w:eastAsia="Times New Roman" w:hAnsi="Consolas" w:cs="Times New Roman"/>
+          <w:color w:val="BD93F9"/>
+          <w:sz w:val="23"/>
+          <w:szCs w:val="23"/>
+          <w:lang w:eastAsia="pt-BR"/>
+        </w:rPr>
+        <w:t>colecaoHTML</w:t>
+      </w:r>
+      <w:proofErr w:type="spellEnd"/>
+      <w:r>
+        <w:rPr>
+          <w:rFonts w:ascii="Consolas" w:eastAsia="Times New Roman" w:hAnsi="Consolas" w:cs="Times New Roman"/>
+          <w:color w:val="F8F8F2"/>
+          <w:sz w:val="23"/>
+          <w:szCs w:val="23"/>
+          <w:lang w:eastAsia="pt-BR"/>
+        </w:rPr>
+        <w:t xml:space="preserve"> </w:t>
+      </w:r>
+      <w:r>
+        <w:rPr>
+          <w:rFonts w:ascii="Consolas" w:eastAsia="Times New Roman" w:hAnsi="Consolas" w:cs="Times New Roman"/>
+          <w:color w:val="FF79C6"/>
+          <w:sz w:val="23"/>
+          <w:szCs w:val="23"/>
+          <w:lang w:eastAsia="pt-BR"/>
+        </w:rPr>
+        <w:t>=</w:t>
+      </w:r>
+      <w:r>
+        <w:rPr>
+          <w:rFonts w:ascii="Consolas" w:eastAsia="Times New Roman" w:hAnsi="Consolas" w:cs="Times New Roman"/>
+          <w:color w:val="F8F8F2"/>
+          <w:sz w:val="23"/>
+          <w:szCs w:val="23"/>
+          <w:lang w:eastAsia="pt-BR"/>
+        </w:rPr>
+        <w:t xml:space="preserve"> [</w:t>
+      </w:r>
+      <w:r>
+        <w:rPr>
+          <w:rFonts w:ascii="Consolas" w:eastAsia="Times New Roman" w:hAnsi="Consolas" w:cs="Times New Roman"/>
+          <w:color w:val="FF79C6"/>
+          <w:sz w:val="23"/>
+          <w:szCs w:val="23"/>
+          <w:lang w:eastAsia="pt-BR"/>
+        </w:rPr>
+        <w:t>...</w:t>
+      </w:r>
+      <w:proofErr w:type="spellStart"/>
+      <w:proofErr w:type="gramStart"/>
+      <w:r>
+        <w:rPr>
+          <w:rFonts w:ascii="Consolas" w:eastAsia="Times New Roman" w:hAnsi="Consolas" w:cs="Times New Roman"/>
+          <w:color w:val="BD93F9"/>
+          <w:sz w:val="23"/>
+          <w:szCs w:val="23"/>
+          <w:lang w:eastAsia="pt-BR"/>
+        </w:rPr>
+        <w:t>document</w:t>
+      </w:r>
+      <w:r>
+        <w:rPr>
+          <w:rFonts w:ascii="Consolas" w:eastAsia="Times New Roman" w:hAnsi="Consolas" w:cs="Times New Roman"/>
+          <w:color w:val="F8F8F2"/>
+          <w:sz w:val="23"/>
+          <w:szCs w:val="23"/>
+          <w:lang w:eastAsia="pt-BR"/>
+        </w:rPr>
+        <w:t>.</w:t>
+      </w:r>
+      <w:r>
+        <w:rPr>
+          <w:rFonts w:ascii="Consolas" w:eastAsia="Times New Roman" w:hAnsi="Consolas" w:cs="Times New Roman"/>
+          <w:color w:val="50FA7B"/>
+          <w:sz w:val="23"/>
+          <w:szCs w:val="23"/>
+          <w:lang w:eastAsia="pt-BR"/>
+        </w:rPr>
+        <w:t>getElementsByTagName</w:t>
+      </w:r>
+      <w:proofErr w:type="spellEnd"/>
+      <w:proofErr w:type="gramEnd"/>
+      <w:r>
+        <w:rPr>
+          <w:rFonts w:ascii="Consolas" w:eastAsia="Times New Roman" w:hAnsi="Consolas" w:cs="Times New Roman"/>
+          <w:color w:val="F8F8F2"/>
+          <w:sz w:val="23"/>
+          <w:szCs w:val="23"/>
+          <w:lang w:eastAsia="pt-BR"/>
+        </w:rPr>
+        <w:t>(</w:t>
+      </w:r>
+      <w:r>
+        <w:rPr>
+          <w:rFonts w:ascii="Consolas" w:eastAsia="Times New Roman" w:hAnsi="Consolas" w:cs="Times New Roman"/>
+          <w:color w:val="E9F284"/>
+          <w:sz w:val="23"/>
+          <w:szCs w:val="23"/>
+          <w:lang w:eastAsia="pt-BR"/>
+        </w:rPr>
+        <w:t>"</w:t>
+      </w:r>
+      <w:proofErr w:type="spellStart"/>
+      <w:r>
+        <w:rPr>
+          <w:rFonts w:ascii="Consolas" w:eastAsia="Times New Roman" w:hAnsi="Consolas" w:cs="Times New Roman"/>
+          <w:color w:val="F1FA8C"/>
+          <w:sz w:val="23"/>
+          <w:szCs w:val="23"/>
+          <w:lang w:eastAsia="pt-BR"/>
+        </w:rPr>
+        <w:t>div</w:t>
+      </w:r>
+      <w:proofErr w:type="spellEnd"/>
+      <w:r>
+        <w:rPr>
+          <w:rFonts w:ascii="Consolas" w:eastAsia="Times New Roman" w:hAnsi="Consolas" w:cs="Times New Roman"/>
+          <w:color w:val="E9F284"/>
+          <w:sz w:val="23"/>
+          <w:szCs w:val="23"/>
+          <w:lang w:eastAsia="pt-BR"/>
+        </w:rPr>
+        <w:t>"</w:t>
+      </w:r>
+      <w:r>
+        <w:rPr>
+          <w:rFonts w:ascii="Consolas" w:eastAsia="Times New Roman" w:hAnsi="Consolas" w:cs="Times New Roman"/>
+          <w:color w:val="F8F8F2"/>
+          <w:sz w:val="23"/>
+          <w:szCs w:val="23"/>
+          <w:lang w:eastAsia="pt-BR"/>
+        </w:rPr>
+        <w:t>)]</w:t>
+      </w:r>
+    </w:p>
+    <w:p>
+      <w:pPr>
+        <w:rPr>
+          <w:sz w:val="28"/>
+          <w:szCs w:val="36"/>
+        </w:rPr>
+      </w:pPr>
     </w:p>
     <w:p>
       <w:pPr>
@@ -11040,31 +12049,38 @@
           <w:color w:val="FF0000"/>
           <w:sz w:val="36"/>
           <w:szCs w:val="36"/>
-          <w:lang w:val="en-US"/>
-        </w:rPr>
-      </w:pPr>
-    </w:p>
-    <w:p>
-      <w:pPr>
+        </w:rPr>
+      </w:pPr>
+      <w:r>
         <w:rPr>
           <w:color w:val="FF0000"/>
           <w:sz w:val="36"/>
           <w:szCs w:val="36"/>
         </w:rPr>
-      </w:pPr>
+        <w:t>Vídeo 3</w:t>
+      </w:r>
       <w:r>
         <w:rPr>
           <w:color w:val="FF0000"/>
           <w:sz w:val="36"/>
           <w:szCs w:val="36"/>
         </w:rPr>
-        <w:t>Vídeo 31.</w:t>
-      </w:r>
-    </w:p>
-    <w:p>
-      <w:pPr>
-        <w:rPr>
-          <w:sz w:val="28"/>
+        <w:t>3</w:t>
+      </w:r>
+      <w:r>
+        <w:rPr>
+          <w:color w:val="FF0000"/>
+          <w:sz w:val="36"/>
+          <w:szCs w:val="36"/>
+        </w:rPr>
+        <w:t>.</w:t>
+      </w:r>
+    </w:p>
+    <w:p>
+      <w:pPr>
+        <w:rPr>
+          <w:color w:val="FF0000"/>
+          <w:sz w:val="36"/>
           <w:szCs w:val="36"/>
         </w:rPr>
       </w:pPr>
@@ -11074,7 +12090,21 @@
           <w:sz w:val="28"/>
           <w:szCs w:val="36"/>
         </w:rPr>
-        <w:t>getElementByTagName</w:t>
+        <w:t>getElementBy</w:t>
+      </w:r>
+      <w:r>
+        <w:rPr>
+          <w:sz w:val="28"/>
+          <w:szCs w:val="36"/>
+        </w:rPr>
+        <w:t>Class</w:t>
+      </w:r>
+      <w:r>
+        <w:rPr>
+          <w:sz w:val="28"/>
+          <w:szCs w:val="36"/>
+        </w:rPr>
+        <w:t>Name</w:t>
       </w:r>
       <w:proofErr w:type="spellEnd"/>
       <w:r>
@@ -11098,7 +12128,7 @@
           <w:sz w:val="28"/>
           <w:szCs w:val="36"/>
         </w:rPr>
-        <w:t xml:space="preserve"> pelo nome da </w:t>
+        <w:t xml:space="preserve"> pela class. E também retorna um </w:t>
       </w:r>
       <w:proofErr w:type="spellStart"/>
       <w:r>
@@ -11106,16 +12136,9 @@
           <w:sz w:val="28"/>
           <w:szCs w:val="36"/>
         </w:rPr>
-        <w:t>tag</w:t>
+        <w:t>HTMLColletion</w:t>
       </w:r>
       <w:proofErr w:type="spellEnd"/>
-      <w:r>
-        <w:rPr>
-          <w:sz w:val="28"/>
-          <w:szCs w:val="36"/>
-        </w:rPr>
-        <w:t>.</w:t>
-      </w:r>
     </w:p>
     <w:p>
       <w:pPr>
@@ -11126,26 +12149,28 @@
           <w:color w:val="F8F8F2"/>
           <w:sz w:val="23"/>
           <w:szCs w:val="23"/>
-          <w:lang w:val="en-US" w:eastAsia="pt-BR"/>
-        </w:rPr>
-      </w:pPr>
+          <w:lang w:eastAsia="pt-BR"/>
+        </w:rPr>
+      </w:pPr>
+      <w:proofErr w:type="spellStart"/>
       <w:r>
         <w:rPr>
           <w:rFonts w:ascii="Consolas" w:eastAsia="Times New Roman" w:hAnsi="Consolas" w:cs="Times New Roman"/>
           <w:color w:val="FF79C6"/>
           <w:sz w:val="23"/>
           <w:szCs w:val="23"/>
-          <w:lang w:val="en-US" w:eastAsia="pt-BR"/>
+          <w:lang w:eastAsia="pt-BR"/>
         </w:rPr>
         <w:t>const</w:t>
       </w:r>
-      <w:r>
-        <w:rPr>
-          <w:rFonts w:ascii="Consolas" w:eastAsia="Times New Roman" w:hAnsi="Consolas" w:cs="Times New Roman"/>
-          <w:color w:val="F8F8F2"/>
-          <w:sz w:val="23"/>
-          <w:szCs w:val="23"/>
-          <w:lang w:val="en-US" w:eastAsia="pt-BR"/>
+      <w:proofErr w:type="spellEnd"/>
+      <w:r>
+        <w:rPr>
+          <w:rFonts w:ascii="Consolas" w:eastAsia="Times New Roman" w:hAnsi="Consolas" w:cs="Times New Roman"/>
+          <w:color w:val="F8F8F2"/>
+          <w:sz w:val="23"/>
+          <w:szCs w:val="23"/>
+          <w:lang w:eastAsia="pt-BR"/>
         </w:rPr>
         <w:t xml:space="preserve"> </w:t>
       </w:r>
@@ -11156,9 +12181,9 @@
           <w:color w:val="BD93F9"/>
           <w:sz w:val="23"/>
           <w:szCs w:val="23"/>
-          <w:lang w:val="en-US" w:eastAsia="pt-BR"/>
-        </w:rPr>
-        <w:t>arrayId</w:t>
+          <w:lang w:eastAsia="pt-BR"/>
+        </w:rPr>
+        <w:t>cursosTodos</w:t>
       </w:r>
       <w:proofErr w:type="spellEnd"/>
       <w:r>
@@ -11167,7 +12192,7 @@
           <w:color w:val="F8F8F2"/>
           <w:sz w:val="23"/>
           <w:szCs w:val="23"/>
-          <w:lang w:val="en-US" w:eastAsia="pt-BR"/>
+          <w:lang w:eastAsia="pt-BR"/>
         </w:rPr>
         <w:t xml:space="preserve"> </w:t>
       </w:r>
@@ -11177,7 +12202,7 @@
           <w:color w:val="FF79C6"/>
           <w:sz w:val="23"/>
           <w:szCs w:val="23"/>
-          <w:lang w:val="en-US" w:eastAsia="pt-BR"/>
+          <w:lang w:eastAsia="pt-BR"/>
         </w:rPr>
         <w:t>=</w:t>
       </w:r>
@@ -11187,129 +12212,103 @@
           <w:color w:val="F8F8F2"/>
           <w:sz w:val="23"/>
           <w:szCs w:val="23"/>
-          <w:lang w:val="en-US" w:eastAsia="pt-BR"/>
+          <w:lang w:eastAsia="pt-BR"/>
         </w:rPr>
         <w:t xml:space="preserve"> [</w:t>
       </w:r>
       <w:r>
         <w:rPr>
           <w:rFonts w:ascii="Consolas" w:eastAsia="Times New Roman" w:hAnsi="Consolas" w:cs="Times New Roman"/>
+          <w:color w:val="FF79C6"/>
+          <w:sz w:val="23"/>
+          <w:szCs w:val="23"/>
+          <w:lang w:eastAsia="pt-BR"/>
+        </w:rPr>
+        <w:t>...</w:t>
+      </w:r>
+      <w:proofErr w:type="spellStart"/>
+      <w:proofErr w:type="gramStart"/>
+      <w:r>
+        <w:rPr>
+          <w:rFonts w:ascii="Consolas" w:eastAsia="Times New Roman" w:hAnsi="Consolas" w:cs="Times New Roman"/>
           <w:color w:val="BD93F9"/>
           <w:sz w:val="23"/>
           <w:szCs w:val="23"/>
-          <w:lang w:val="en-US" w:eastAsia="pt-BR"/>
-        </w:rPr>
-        <w:t>dc1</w:t>
-      </w:r>
-      <w:r>
-        <w:rPr>
-          <w:rFonts w:ascii="Consolas" w:eastAsia="Times New Roman" w:hAnsi="Consolas" w:cs="Times New Roman"/>
-          <w:color w:val="F8F8F2"/>
-          <w:sz w:val="23"/>
-          <w:szCs w:val="23"/>
-          <w:lang w:val="en-US" w:eastAsia="pt-BR"/>
-        </w:rPr>
-        <w:t xml:space="preserve">, </w:t>
-      </w:r>
-      <w:r>
-        <w:rPr>
-          <w:rFonts w:ascii="Consolas" w:eastAsia="Times New Roman" w:hAnsi="Consolas" w:cs="Times New Roman"/>
-          <w:color w:val="BD93F9"/>
-          <w:sz w:val="23"/>
-          <w:szCs w:val="23"/>
-          <w:lang w:val="en-US" w:eastAsia="pt-BR"/>
-        </w:rPr>
-        <w:t>dc2</w:t>
-      </w:r>
-      <w:r>
-        <w:rPr>
-          <w:rFonts w:ascii="Consolas" w:eastAsia="Times New Roman" w:hAnsi="Consolas" w:cs="Times New Roman"/>
-          <w:color w:val="F8F8F2"/>
-          <w:sz w:val="23"/>
-          <w:szCs w:val="23"/>
-          <w:lang w:val="en-US" w:eastAsia="pt-BR"/>
-        </w:rPr>
-        <w:t xml:space="preserve">, </w:t>
-      </w:r>
-      <w:r>
-        <w:rPr>
-          <w:rFonts w:ascii="Consolas" w:eastAsia="Times New Roman" w:hAnsi="Consolas" w:cs="Times New Roman"/>
-          <w:color w:val="BD93F9"/>
-          <w:sz w:val="23"/>
-          <w:szCs w:val="23"/>
-          <w:lang w:val="en-US" w:eastAsia="pt-BR"/>
-        </w:rPr>
-        <w:t>dc3</w:t>
-      </w:r>
-      <w:r>
-        <w:rPr>
-          <w:rFonts w:ascii="Consolas" w:eastAsia="Times New Roman" w:hAnsi="Consolas" w:cs="Times New Roman"/>
-          <w:color w:val="F8F8F2"/>
-          <w:sz w:val="23"/>
-          <w:szCs w:val="23"/>
-          <w:lang w:val="en-US" w:eastAsia="pt-BR"/>
-        </w:rPr>
-        <w:t xml:space="preserve">, </w:t>
-      </w:r>
-      <w:r>
-        <w:rPr>
-          <w:rFonts w:ascii="Consolas" w:eastAsia="Times New Roman" w:hAnsi="Consolas" w:cs="Times New Roman"/>
-          <w:color w:val="BD93F9"/>
-          <w:sz w:val="23"/>
-          <w:szCs w:val="23"/>
-          <w:lang w:val="en-US" w:eastAsia="pt-BR"/>
-        </w:rPr>
-        <w:t>dc4</w:t>
-      </w:r>
-      <w:r>
-        <w:rPr>
-          <w:rFonts w:ascii="Consolas" w:eastAsia="Times New Roman" w:hAnsi="Consolas" w:cs="Times New Roman"/>
-          <w:color w:val="F8F8F2"/>
-          <w:sz w:val="23"/>
-          <w:szCs w:val="23"/>
-          <w:lang w:val="en-US" w:eastAsia="pt-BR"/>
-        </w:rPr>
-        <w:t xml:space="preserve">, </w:t>
-      </w:r>
-      <w:r>
-        <w:rPr>
-          <w:rFonts w:ascii="Consolas" w:eastAsia="Times New Roman" w:hAnsi="Consolas" w:cs="Times New Roman"/>
-          <w:color w:val="BD93F9"/>
-          <w:sz w:val="23"/>
-          <w:szCs w:val="23"/>
-          <w:lang w:val="en-US" w:eastAsia="pt-BR"/>
-        </w:rPr>
-        <w:t>dc5</w:t>
-      </w:r>
-      <w:r>
-        <w:rPr>
-          <w:rFonts w:ascii="Consolas" w:eastAsia="Times New Roman" w:hAnsi="Consolas" w:cs="Times New Roman"/>
-          <w:color w:val="F8F8F2"/>
-          <w:sz w:val="23"/>
-          <w:szCs w:val="23"/>
-          <w:lang w:val="en-US" w:eastAsia="pt-BR"/>
-        </w:rPr>
-        <w:t xml:space="preserve">, </w:t>
-      </w:r>
-      <w:r>
-        <w:rPr>
-          <w:rFonts w:ascii="Consolas" w:eastAsia="Times New Roman" w:hAnsi="Consolas" w:cs="Times New Roman"/>
-          <w:color w:val="BD93F9"/>
-          <w:sz w:val="23"/>
-          <w:szCs w:val="23"/>
-          <w:lang w:val="en-US" w:eastAsia="pt-BR"/>
-        </w:rPr>
-        <w:t>dc6</w:t>
-      </w:r>
-      <w:r>
-        <w:rPr>
-          <w:rFonts w:ascii="Consolas" w:eastAsia="Times New Roman" w:hAnsi="Consolas" w:cs="Times New Roman"/>
-          <w:color w:val="F8F8F2"/>
-          <w:sz w:val="23"/>
-          <w:szCs w:val="23"/>
-          <w:lang w:val="en-US" w:eastAsia="pt-BR"/>
-        </w:rPr>
-        <w:t>];</w:t>
+          <w:lang w:eastAsia="pt-BR"/>
+        </w:rPr>
+        <w:t>document</w:t>
+      </w:r>
+      <w:r>
+        <w:rPr>
+          <w:rFonts w:ascii="Consolas" w:eastAsia="Times New Roman" w:hAnsi="Consolas" w:cs="Times New Roman"/>
+          <w:color w:val="F8F8F2"/>
+          <w:sz w:val="23"/>
+          <w:szCs w:val="23"/>
+          <w:lang w:eastAsia="pt-BR"/>
+        </w:rPr>
+        <w:t>.</w:t>
+      </w:r>
+      <w:r>
+        <w:rPr>
+          <w:rFonts w:ascii="Consolas" w:eastAsia="Times New Roman" w:hAnsi="Consolas" w:cs="Times New Roman"/>
+          <w:color w:val="50FA7B"/>
+          <w:sz w:val="23"/>
+          <w:szCs w:val="23"/>
+          <w:lang w:eastAsia="pt-BR"/>
+        </w:rPr>
+        <w:t>getElementsByClassName</w:t>
+      </w:r>
+      <w:proofErr w:type="spellEnd"/>
+      <w:proofErr w:type="gramEnd"/>
+      <w:r>
+        <w:rPr>
+          <w:rFonts w:ascii="Consolas" w:eastAsia="Times New Roman" w:hAnsi="Consolas" w:cs="Times New Roman"/>
+          <w:color w:val="F8F8F2"/>
+          <w:sz w:val="23"/>
+          <w:szCs w:val="23"/>
+          <w:lang w:eastAsia="pt-BR"/>
+        </w:rPr>
+        <w:t>(</w:t>
+      </w:r>
+      <w:r>
+        <w:rPr>
+          <w:rFonts w:ascii="Consolas" w:eastAsia="Times New Roman" w:hAnsi="Consolas" w:cs="Times New Roman"/>
+          <w:color w:val="E9F284"/>
+          <w:sz w:val="23"/>
+          <w:szCs w:val="23"/>
+          <w:lang w:eastAsia="pt-BR"/>
+        </w:rPr>
+        <w:t>"</w:t>
+      </w:r>
+      <w:r>
+        <w:rPr>
+          <w:rFonts w:ascii="Consolas" w:eastAsia="Times New Roman" w:hAnsi="Consolas" w:cs="Times New Roman"/>
+          <w:color w:val="F1FA8C"/>
+          <w:sz w:val="23"/>
+          <w:szCs w:val="23"/>
+          <w:lang w:eastAsia="pt-BR"/>
+        </w:rPr>
+        <w:t>curso</w:t>
+      </w:r>
+      <w:r>
+        <w:rPr>
+          <w:rFonts w:ascii="Consolas" w:eastAsia="Times New Roman" w:hAnsi="Consolas" w:cs="Times New Roman"/>
+          <w:color w:val="E9F284"/>
+          <w:sz w:val="23"/>
+          <w:szCs w:val="23"/>
+          <w:lang w:eastAsia="pt-BR"/>
+        </w:rPr>
+        <w:t>"</w:t>
+      </w:r>
+      <w:r>
+        <w:rPr>
+          <w:rFonts w:ascii="Consolas" w:eastAsia="Times New Roman" w:hAnsi="Consolas" w:cs="Times New Roman"/>
+          <w:color w:val="F8F8F2"/>
+          <w:sz w:val="23"/>
+          <w:szCs w:val="23"/>
+          <w:lang w:eastAsia="pt-BR"/>
+        </w:rPr>
+        <w:t>)]</w:t>
       </w:r>
     </w:p>
     <w:p>
@@ -11346,7 +12345,6 @@
         </w:rPr>
         <w:t xml:space="preserve"> </w:t>
       </w:r>
-      <w:proofErr w:type="spellStart"/>
       <w:r>
         <w:rPr>
           <w:rFonts w:ascii="Consolas" w:eastAsia="Times New Roman" w:hAnsi="Consolas" w:cs="Times New Roman"/>
@@ -11355,9 +12353,8 @@
           <w:szCs w:val="23"/>
           <w:lang w:eastAsia="pt-BR"/>
         </w:rPr>
-        <w:t>colecaoHTML</w:t>
-      </w:r>
-      <w:proofErr w:type="spellEnd"/>
+        <w:t>cursosC1</w:t>
+      </w:r>
       <w:r>
         <w:rPr>
           <w:rFonts w:ascii="Consolas" w:eastAsia="Times New Roman" w:hAnsi="Consolas" w:cs="Times New Roman"/>
@@ -11386,7 +12383,17 @@
           <w:szCs w:val="23"/>
           <w:lang w:eastAsia="pt-BR"/>
         </w:rPr>
-        <w:t xml:space="preserve"> </w:t>
+        <w:t xml:space="preserve"> [</w:t>
+      </w:r>
+      <w:r>
+        <w:rPr>
+          <w:rFonts w:ascii="Consolas" w:eastAsia="Times New Roman" w:hAnsi="Consolas" w:cs="Times New Roman"/>
+          <w:color w:val="FF79C6"/>
+          <w:sz w:val="23"/>
+          <w:szCs w:val="23"/>
+          <w:lang w:eastAsia="pt-BR"/>
+        </w:rPr>
+        <w:t>...</w:t>
       </w:r>
       <w:proofErr w:type="spellStart"/>
       <w:proofErr w:type="gramStart"/>
@@ -11418,7 +12425,7 @@
           <w:szCs w:val="23"/>
           <w:lang w:eastAsia="pt-BR"/>
         </w:rPr>
-        <w:t>getElementsByTagName</w:t>
+        <w:t>getElementsByClassName</w:t>
       </w:r>
       <w:proofErr w:type="spellEnd"/>
       <w:proofErr w:type="gramEnd"/>
@@ -11442,7 +12449,6 @@
         </w:rPr>
         <w:t>"</w:t>
       </w:r>
-      <w:proofErr w:type="spellStart"/>
       <w:r>
         <w:rPr>
           <w:rFonts w:ascii="Consolas" w:eastAsia="Times New Roman" w:hAnsi="Consolas" w:cs="Times New Roman"/>
@@ -11451,9 +12457,8 @@
           <w:szCs w:val="23"/>
           <w:lang w:eastAsia="pt-BR"/>
         </w:rPr>
-        <w:t>div</w:t>
-      </w:r>
-      <w:proofErr w:type="spellEnd"/>
+        <w:t>c1</w:t>
+      </w:r>
       <w:r>
         <w:rPr>
           <w:rFonts w:ascii="Consolas" w:eastAsia="Times New Roman" w:hAnsi="Consolas" w:cs="Times New Roman"/>
@@ -11472,7 +12477,45 @@
           <w:szCs w:val="23"/>
           <w:lang w:eastAsia="pt-BR"/>
         </w:rPr>
-        <w:t>)</w:t>
+        <w:t>)]</w:t>
+      </w:r>
+    </w:p>
+    <w:p>
+      <w:pPr>
+        <w:rPr>
+          <w:color w:val="FF0000"/>
+          <w:sz w:val="36"/>
+          <w:szCs w:val="36"/>
+        </w:rPr>
+      </w:pPr>
+    </w:p>
+    <w:p>
+      <w:pPr>
+        <w:rPr>
+          <w:sz w:val="28"/>
+          <w:szCs w:val="36"/>
+        </w:rPr>
+      </w:pPr>
+      <w:r>
+        <w:rPr>
+          <w:sz w:val="28"/>
+          <w:szCs w:val="36"/>
+        </w:rPr>
+        <w:t xml:space="preserve">Se </w:t>
+      </w:r>
+      <w:r>
+        <w:rPr>
+          <w:sz w:val="28"/>
+          <w:szCs w:val="36"/>
+        </w:rPr>
+        <w:t xml:space="preserve">quiser </w:t>
+      </w:r>
+      <w:r>
+        <w:rPr>
+          <w:sz w:val="28"/>
+          <w:szCs w:val="36"/>
+        </w:rPr>
+        <w:t>pegar somente um elemento:</w:t>
       </w:r>
     </w:p>
     <w:p>
@@ -11481,12 +12524,338 @@
         <w:spacing w:after="0" w:line="300" w:lineRule="atLeast"/>
         <w:rPr>
           <w:rFonts w:ascii="Consolas" w:eastAsia="Times New Roman" w:hAnsi="Consolas" w:cs="Times New Roman"/>
-          <w:color w:val="F8F8F2"/>
-          <w:sz w:val="23"/>
-          <w:szCs w:val="23"/>
-          <w:lang w:eastAsia="pt-BR"/>
-        </w:rPr>
-      </w:pPr>
+          <w:b/>
+          <w:bCs/>
+          <w:i/>
+          <w:iCs/>
+          <w:color w:val="F8F8F2"/>
+          <w:sz w:val="23"/>
+          <w:szCs w:val="23"/>
+          <w:u w:val="single"/>
+          <w:lang w:eastAsia="pt-BR"/>
+        </w:rPr>
+      </w:pPr>
+      <w:proofErr w:type="spellStart"/>
+      <w:r>
+        <w:rPr>
+          <w:rFonts w:ascii="Consolas" w:eastAsia="Times New Roman" w:hAnsi="Consolas" w:cs="Times New Roman"/>
+          <w:color w:val="FF79C6"/>
+          <w:sz w:val="23"/>
+          <w:szCs w:val="23"/>
+          <w:lang w:eastAsia="pt-BR"/>
+        </w:rPr>
+        <w:t>const</w:t>
+      </w:r>
+      <w:proofErr w:type="spellEnd"/>
+      <w:r>
+        <w:rPr>
+          <w:rFonts w:ascii="Consolas" w:eastAsia="Times New Roman" w:hAnsi="Consolas" w:cs="Times New Roman"/>
+          <w:color w:val="F8F8F2"/>
+          <w:sz w:val="23"/>
+          <w:szCs w:val="23"/>
+          <w:lang w:eastAsia="pt-BR"/>
+        </w:rPr>
+        <w:t xml:space="preserve"> </w:t>
+      </w:r>
+      <w:proofErr w:type="spellStart"/>
+      <w:r>
+        <w:rPr>
+          <w:rFonts w:ascii="Consolas" w:eastAsia="Times New Roman" w:hAnsi="Consolas" w:cs="Times New Roman"/>
+          <w:color w:val="BD93F9"/>
+          <w:sz w:val="23"/>
+          <w:szCs w:val="23"/>
+          <w:lang w:eastAsia="pt-BR"/>
+        </w:rPr>
+        <w:t>cursoEspecial</w:t>
+      </w:r>
+      <w:proofErr w:type="spellEnd"/>
+      <w:r>
+        <w:rPr>
+          <w:rFonts w:ascii="Consolas" w:eastAsia="Times New Roman" w:hAnsi="Consolas" w:cs="Times New Roman"/>
+          <w:color w:val="F8F8F2"/>
+          <w:sz w:val="23"/>
+          <w:szCs w:val="23"/>
+          <w:lang w:eastAsia="pt-BR"/>
+        </w:rPr>
+        <w:t xml:space="preserve"> </w:t>
+      </w:r>
+      <w:r>
+        <w:rPr>
+          <w:rFonts w:ascii="Consolas" w:eastAsia="Times New Roman" w:hAnsi="Consolas" w:cs="Times New Roman"/>
+          <w:color w:val="FF79C6"/>
+          <w:sz w:val="23"/>
+          <w:szCs w:val="23"/>
+          <w:lang w:eastAsia="pt-BR"/>
+        </w:rPr>
+        <w:t>=</w:t>
+      </w:r>
+      <w:r>
+        <w:rPr>
+          <w:rFonts w:ascii="Consolas" w:eastAsia="Times New Roman" w:hAnsi="Consolas" w:cs="Times New Roman"/>
+          <w:color w:val="F8F8F2"/>
+          <w:sz w:val="23"/>
+          <w:szCs w:val="23"/>
+          <w:lang w:eastAsia="pt-BR"/>
+        </w:rPr>
+        <w:t xml:space="preserve"> </w:t>
+      </w:r>
+      <w:proofErr w:type="spellStart"/>
+      <w:proofErr w:type="gramStart"/>
+      <w:r>
+        <w:rPr>
+          <w:rFonts w:ascii="Consolas" w:eastAsia="Times New Roman" w:hAnsi="Consolas" w:cs="Times New Roman"/>
+          <w:color w:val="BD93F9"/>
+          <w:sz w:val="23"/>
+          <w:szCs w:val="23"/>
+          <w:lang w:eastAsia="pt-BR"/>
+        </w:rPr>
+        <w:t>document</w:t>
+      </w:r>
+      <w:r>
+        <w:rPr>
+          <w:rFonts w:ascii="Consolas" w:eastAsia="Times New Roman" w:hAnsi="Consolas" w:cs="Times New Roman"/>
+          <w:color w:val="F8F8F2"/>
+          <w:sz w:val="23"/>
+          <w:szCs w:val="23"/>
+          <w:lang w:eastAsia="pt-BR"/>
+        </w:rPr>
+        <w:t>.</w:t>
+      </w:r>
+      <w:r>
+        <w:rPr>
+          <w:rFonts w:ascii="Consolas" w:eastAsia="Times New Roman" w:hAnsi="Consolas" w:cs="Times New Roman"/>
+          <w:color w:val="50FA7B"/>
+          <w:sz w:val="23"/>
+          <w:szCs w:val="23"/>
+          <w:lang w:eastAsia="pt-BR"/>
+        </w:rPr>
+        <w:t>getElementsByClassName</w:t>
+      </w:r>
+      <w:proofErr w:type="spellEnd"/>
+      <w:proofErr w:type="gramEnd"/>
+      <w:r>
+        <w:rPr>
+          <w:rFonts w:ascii="Consolas" w:eastAsia="Times New Roman" w:hAnsi="Consolas" w:cs="Times New Roman"/>
+          <w:color w:val="F8F8F2"/>
+          <w:sz w:val="23"/>
+          <w:szCs w:val="23"/>
+          <w:lang w:eastAsia="pt-BR"/>
+        </w:rPr>
+        <w:t>(</w:t>
+      </w:r>
+      <w:r>
+        <w:rPr>
+          <w:rFonts w:ascii="Consolas" w:eastAsia="Times New Roman" w:hAnsi="Consolas" w:cs="Times New Roman"/>
+          <w:color w:val="E9F284"/>
+          <w:sz w:val="23"/>
+          <w:szCs w:val="23"/>
+          <w:lang w:eastAsia="pt-BR"/>
+        </w:rPr>
+        <w:t>"</w:t>
+      </w:r>
+      <w:r>
+        <w:rPr>
+          <w:rFonts w:ascii="Consolas" w:eastAsia="Times New Roman" w:hAnsi="Consolas" w:cs="Times New Roman"/>
+          <w:color w:val="F1FA8C"/>
+          <w:sz w:val="23"/>
+          <w:szCs w:val="23"/>
+          <w:lang w:eastAsia="pt-BR"/>
+        </w:rPr>
+        <w:t>curso</w:t>
+      </w:r>
+      <w:r>
+        <w:rPr>
+          <w:rFonts w:ascii="Consolas" w:eastAsia="Times New Roman" w:hAnsi="Consolas" w:cs="Times New Roman"/>
+          <w:color w:val="E9F284"/>
+          <w:sz w:val="23"/>
+          <w:szCs w:val="23"/>
+          <w:lang w:eastAsia="pt-BR"/>
+        </w:rPr>
+        <w:t>"</w:t>
+      </w:r>
+      <w:r>
+        <w:rPr>
+          <w:rFonts w:ascii="Consolas" w:eastAsia="Times New Roman" w:hAnsi="Consolas" w:cs="Times New Roman"/>
+          <w:color w:val="F8F8F2"/>
+          <w:sz w:val="23"/>
+          <w:szCs w:val="23"/>
+          <w:lang w:eastAsia="pt-BR"/>
+        </w:rPr>
+        <w:t>)</w:t>
+      </w:r>
+      <w:r>
+        <w:rPr>
+          <w:rFonts w:ascii="Consolas" w:eastAsia="Times New Roman" w:hAnsi="Consolas" w:cs="Times New Roman"/>
+          <w:b/>
+          <w:bCs/>
+          <w:i/>
+          <w:iCs/>
+          <w:color w:val="F8F8F2"/>
+          <w:sz w:val="23"/>
+          <w:szCs w:val="23"/>
+          <w:u w:val="single"/>
+          <w:lang w:eastAsia="pt-BR"/>
+        </w:rPr>
+        <w:t>[</w:t>
+      </w:r>
+      <w:r>
+        <w:rPr>
+          <w:rFonts w:ascii="Consolas" w:eastAsia="Times New Roman" w:hAnsi="Consolas" w:cs="Times New Roman"/>
+          <w:b/>
+          <w:bCs/>
+          <w:i/>
+          <w:iCs/>
+          <w:color w:val="BD93F9"/>
+          <w:sz w:val="23"/>
+          <w:szCs w:val="23"/>
+          <w:u w:val="single"/>
+          <w:lang w:eastAsia="pt-BR"/>
+        </w:rPr>
+        <w:t>0</w:t>
+      </w:r>
+      <w:r>
+        <w:rPr>
+          <w:rFonts w:ascii="Consolas" w:eastAsia="Times New Roman" w:hAnsi="Consolas" w:cs="Times New Roman"/>
+          <w:b/>
+          <w:bCs/>
+          <w:i/>
+          <w:iCs/>
+          <w:color w:val="F8F8F2"/>
+          <w:sz w:val="23"/>
+          <w:szCs w:val="23"/>
+          <w:u w:val="single"/>
+          <w:lang w:eastAsia="pt-BR"/>
+        </w:rPr>
+        <w:t>]</w:t>
+      </w:r>
+    </w:p>
+    <w:p>
+      <w:pPr>
+        <w:rPr>
+          <w:color w:val="FF0000"/>
+          <w:sz w:val="36"/>
+          <w:szCs w:val="36"/>
+        </w:rPr>
+      </w:pPr>
+    </w:p>
+    <w:p>
+      <w:pPr>
+        <w:rPr>
+          <w:color w:val="FF0000"/>
+          <w:sz w:val="36"/>
+          <w:szCs w:val="36"/>
+        </w:rPr>
+      </w:pPr>
+      <w:r>
+        <w:rPr>
+          <w:color w:val="FF0000"/>
+          <w:sz w:val="36"/>
+          <w:szCs w:val="36"/>
+        </w:rPr>
+        <w:t>Vídeo 3</w:t>
+      </w:r>
+      <w:r>
+        <w:rPr>
+          <w:color w:val="FF0000"/>
+          <w:sz w:val="36"/>
+          <w:szCs w:val="36"/>
+        </w:rPr>
+        <w:t>4</w:t>
+      </w:r>
+      <w:r>
+        <w:rPr>
+          <w:color w:val="FF0000"/>
+          <w:sz w:val="36"/>
+          <w:szCs w:val="36"/>
+        </w:rPr>
+        <w:t>.</w:t>
+      </w:r>
+    </w:p>
+    <w:p>
+      <w:pPr>
+        <w:rPr>
+          <w:sz w:val="28"/>
+          <w:szCs w:val="36"/>
+        </w:rPr>
+      </w:pPr>
+      <w:proofErr w:type="spellStart"/>
+      <w:r>
+        <w:rPr>
+          <w:sz w:val="28"/>
+          <w:szCs w:val="36"/>
+        </w:rPr>
+        <w:t>QuerySelector</w:t>
+      </w:r>
+      <w:proofErr w:type="spellEnd"/>
+      <w:r>
+        <w:rPr>
+          <w:sz w:val="28"/>
+          <w:szCs w:val="36"/>
+        </w:rPr>
+        <w:t xml:space="preserve">: Você não precisa especificar qual </w:t>
+      </w:r>
+      <w:r>
+        <w:rPr>
+          <w:sz w:val="28"/>
+          <w:szCs w:val="36"/>
+        </w:rPr>
+        <w:t xml:space="preserve">é o elemento, se é por id, </w:t>
+      </w:r>
+      <w:proofErr w:type="spellStart"/>
+      <w:r>
+        <w:rPr>
+          <w:sz w:val="28"/>
+          <w:szCs w:val="36"/>
+        </w:rPr>
+        <w:t>class</w:t>
+      </w:r>
+      <w:proofErr w:type="spellEnd"/>
+      <w:r>
+        <w:rPr>
+          <w:sz w:val="28"/>
+          <w:szCs w:val="36"/>
+        </w:rPr>
+        <w:t xml:space="preserve">, </w:t>
+      </w:r>
+      <w:proofErr w:type="spellStart"/>
+      <w:r>
+        <w:rPr>
+          <w:sz w:val="28"/>
+          <w:szCs w:val="36"/>
+        </w:rPr>
+        <w:t>tag</w:t>
+      </w:r>
+      <w:proofErr w:type="spellEnd"/>
+      <w:r>
+        <w:rPr>
+          <w:sz w:val="28"/>
+          <w:szCs w:val="36"/>
+        </w:rPr>
+        <w:t xml:space="preserve"> </w:t>
+      </w:r>
+      <w:proofErr w:type="spellStart"/>
+      <w:r>
+        <w:rPr>
+          <w:sz w:val="28"/>
+          <w:szCs w:val="36"/>
+        </w:rPr>
+        <w:t>name</w:t>
+      </w:r>
+      <w:proofErr w:type="spellEnd"/>
+      <w:r>
+        <w:rPr>
+          <w:sz w:val="28"/>
+          <w:szCs w:val="36"/>
+        </w:rPr>
+        <w:t>. Ele é genérico</w:t>
+      </w:r>
+      <w:r>
+        <w:rPr>
+          <w:sz w:val="28"/>
+          <w:szCs w:val="36"/>
+        </w:rPr>
+        <w:t xml:space="preserve">. Mas ele vai pegar somente o primeiro parâmetro que você falou para ele pegar. </w:t>
+      </w:r>
     </w:p>
     <w:p>
       <w:pPr>
@@ -11500,6 +12869,29 @@
           <w:lang w:eastAsia="pt-BR"/>
         </w:rPr>
       </w:pPr>
+      <w:proofErr w:type="spellStart"/>
+      <w:r>
+        <w:rPr>
+          <w:rFonts w:ascii="Consolas" w:eastAsia="Times New Roman" w:hAnsi="Consolas" w:cs="Times New Roman"/>
+          <w:color w:val="FF79C6"/>
+          <w:sz w:val="23"/>
+          <w:szCs w:val="23"/>
+          <w:lang w:eastAsia="pt-BR"/>
+        </w:rPr>
+        <w:t>const</w:t>
+      </w:r>
+      <w:proofErr w:type="spellEnd"/>
+      <w:r>
+        <w:rPr>
+          <w:rFonts w:ascii="Consolas" w:eastAsia="Times New Roman" w:hAnsi="Consolas" w:cs="Times New Roman"/>
+          <w:color w:val="F8F8F2"/>
+          <w:sz w:val="23"/>
+          <w:szCs w:val="23"/>
+          <w:lang w:eastAsia="pt-BR"/>
+        </w:rPr>
+        <w:t xml:space="preserve"> </w:t>
+      </w:r>
+      <w:proofErr w:type="spellStart"/>
       <w:r>
         <w:rPr>
           <w:rFonts w:ascii="Consolas" w:eastAsia="Times New Roman" w:hAnsi="Consolas" w:cs="Times New Roman"/>
@@ -11508,7 +12900,50 @@
           <w:szCs w:val="23"/>
           <w:lang w:eastAsia="pt-BR"/>
         </w:rPr>
-        <w:t>console</w:t>
+        <w:t>queryDiv</w:t>
+      </w:r>
+      <w:proofErr w:type="spellEnd"/>
+      <w:r>
+        <w:rPr>
+          <w:rFonts w:ascii="Consolas" w:eastAsia="Times New Roman" w:hAnsi="Consolas" w:cs="Times New Roman"/>
+          <w:color w:val="F8F8F2"/>
+          <w:sz w:val="23"/>
+          <w:szCs w:val="23"/>
+          <w:lang w:eastAsia="pt-BR"/>
+        </w:rPr>
+        <w:t xml:space="preserve"> </w:t>
+      </w:r>
+      <w:r>
+        <w:rPr>
+          <w:rFonts w:ascii="Consolas" w:eastAsia="Times New Roman" w:hAnsi="Consolas" w:cs="Times New Roman"/>
+          <w:color w:val="FF79C6"/>
+          <w:sz w:val="23"/>
+          <w:szCs w:val="23"/>
+          <w:lang w:eastAsia="pt-BR"/>
+        </w:rPr>
+        <w:t>=</w:t>
+      </w:r>
+      <w:r>
+        <w:rPr>
+          <w:rFonts w:ascii="Consolas" w:eastAsia="Times New Roman" w:hAnsi="Consolas" w:cs="Times New Roman"/>
+          <w:color w:val="F8F8F2"/>
+          <w:sz w:val="23"/>
+          <w:szCs w:val="23"/>
+          <w:lang w:eastAsia="pt-BR"/>
+        </w:rPr>
+        <w:t xml:space="preserve"> </w:t>
+      </w:r>
+      <w:proofErr w:type="spellStart"/>
+      <w:proofErr w:type="gramStart"/>
+      <w:r>
+        <w:rPr>
+          <w:rFonts w:ascii="Consolas" w:eastAsia="Times New Roman" w:hAnsi="Consolas" w:cs="Times New Roman"/>
+          <w:color w:val="BD93F9"/>
+          <w:sz w:val="23"/>
+          <w:szCs w:val="23"/>
+          <w:lang w:eastAsia="pt-BR"/>
+        </w:rPr>
+        <w:t>document</w:t>
       </w:r>
       <w:r>
         <w:rPr>
@@ -11528,8 +12963,10 @@
           <w:szCs w:val="23"/>
           <w:lang w:eastAsia="pt-BR"/>
         </w:rPr>
-        <w:t>log</w:t>
-      </w:r>
+        <w:t>querySelector</w:t>
+      </w:r>
+      <w:proofErr w:type="spellEnd"/>
+      <w:proofErr w:type="gramEnd"/>
       <w:r>
         <w:rPr>
           <w:rFonts w:ascii="Consolas" w:eastAsia="Times New Roman" w:hAnsi="Consolas" w:cs="Times New Roman"/>
@@ -11540,27 +12977,79 @@
         </w:rPr>
         <w:t>(</w:t>
       </w:r>
+      <w:r>
+        <w:rPr>
+          <w:rFonts w:ascii="Consolas" w:eastAsia="Times New Roman" w:hAnsi="Consolas" w:cs="Times New Roman"/>
+          <w:color w:val="E9F284"/>
+          <w:sz w:val="23"/>
+          <w:szCs w:val="23"/>
+          <w:lang w:eastAsia="pt-BR"/>
+        </w:rPr>
+        <w:t>"</w:t>
+      </w:r>
       <w:proofErr w:type="spellStart"/>
       <w:r>
         <w:rPr>
           <w:rFonts w:ascii="Consolas" w:eastAsia="Times New Roman" w:hAnsi="Consolas" w:cs="Times New Roman"/>
-          <w:color w:val="BD93F9"/>
-          <w:sz w:val="23"/>
-          <w:szCs w:val="23"/>
-          <w:lang w:eastAsia="pt-BR"/>
-        </w:rPr>
-        <w:t>colecaoHTML</w:t>
+          <w:color w:val="F1FA8C"/>
+          <w:sz w:val="23"/>
+          <w:szCs w:val="23"/>
+          <w:lang w:eastAsia="pt-BR"/>
+        </w:rPr>
+        <w:t>div</w:t>
       </w:r>
       <w:proofErr w:type="spellEnd"/>
       <w:r>
         <w:rPr>
           <w:rFonts w:ascii="Consolas" w:eastAsia="Times New Roman" w:hAnsi="Consolas" w:cs="Times New Roman"/>
+          <w:color w:val="E9F284"/>
+          <w:sz w:val="23"/>
+          <w:szCs w:val="23"/>
+          <w:lang w:eastAsia="pt-BR"/>
+        </w:rPr>
+        <w:t>"</w:t>
+      </w:r>
+      <w:r>
+        <w:rPr>
+          <w:rFonts w:ascii="Consolas" w:eastAsia="Times New Roman" w:hAnsi="Consolas" w:cs="Times New Roman"/>
           <w:color w:val="F8F8F2"/>
           <w:sz w:val="23"/>
           <w:szCs w:val="23"/>
           <w:lang w:eastAsia="pt-BR"/>
         </w:rPr>
         <w:t>)</w:t>
+      </w:r>
+    </w:p>
+    <w:p>
+      <w:pPr>
+        <w:rPr>
+          <w:sz w:val="28"/>
+          <w:szCs w:val="36"/>
+        </w:rPr>
+      </w:pPr>
+    </w:p>
+    <w:p>
+      <w:pPr>
+        <w:rPr>
+          <w:sz w:val="28"/>
+          <w:szCs w:val="36"/>
+        </w:rPr>
+      </w:pPr>
+      <w:proofErr w:type="spellStart"/>
+      <w:r>
+        <w:rPr>
+          <w:sz w:val="28"/>
+          <w:szCs w:val="36"/>
+        </w:rPr>
+        <w:t>QuerySelectorAll</w:t>
+      </w:r>
+      <w:proofErr w:type="spellEnd"/>
+      <w:r>
+        <w:rPr>
+          <w:sz w:val="28"/>
+          <w:szCs w:val="36"/>
+        </w:rPr>
+        <w:t>: Ele retorna uma coleção com todos elementos colocado no parâmetro.</w:t>
       </w:r>
     </w:p>
     <w:p>
@@ -11575,6 +13064,29 @@
           <w:lang w:eastAsia="pt-BR"/>
         </w:rPr>
       </w:pPr>
+      <w:proofErr w:type="spellStart"/>
+      <w:r>
+        <w:rPr>
+          <w:rFonts w:ascii="Consolas" w:eastAsia="Times New Roman" w:hAnsi="Consolas" w:cs="Times New Roman"/>
+          <w:color w:val="FF79C6"/>
+          <w:sz w:val="23"/>
+          <w:szCs w:val="23"/>
+          <w:lang w:eastAsia="pt-BR"/>
+        </w:rPr>
+        <w:t>const</w:t>
+      </w:r>
+      <w:proofErr w:type="spellEnd"/>
+      <w:r>
+        <w:rPr>
+          <w:rFonts w:ascii="Consolas" w:eastAsia="Times New Roman" w:hAnsi="Consolas" w:cs="Times New Roman"/>
+          <w:color w:val="F8F8F2"/>
+          <w:sz w:val="23"/>
+          <w:szCs w:val="23"/>
+          <w:lang w:eastAsia="pt-BR"/>
+        </w:rPr>
+        <w:t xml:space="preserve"> </w:t>
+      </w:r>
+      <w:proofErr w:type="spellStart"/>
       <w:r>
         <w:rPr>
           <w:rFonts w:ascii="Consolas" w:eastAsia="Times New Roman" w:hAnsi="Consolas" w:cs="Times New Roman"/>
@@ -11583,7 +13095,50 @@
           <w:szCs w:val="23"/>
           <w:lang w:eastAsia="pt-BR"/>
         </w:rPr>
-        <w:t>console</w:t>
+        <w:t>queryDivTodas</w:t>
+      </w:r>
+      <w:proofErr w:type="spellEnd"/>
+      <w:r>
+        <w:rPr>
+          <w:rFonts w:ascii="Consolas" w:eastAsia="Times New Roman" w:hAnsi="Consolas" w:cs="Times New Roman"/>
+          <w:color w:val="F8F8F2"/>
+          <w:sz w:val="23"/>
+          <w:szCs w:val="23"/>
+          <w:lang w:eastAsia="pt-BR"/>
+        </w:rPr>
+        <w:t xml:space="preserve"> </w:t>
+      </w:r>
+      <w:r>
+        <w:rPr>
+          <w:rFonts w:ascii="Consolas" w:eastAsia="Times New Roman" w:hAnsi="Consolas" w:cs="Times New Roman"/>
+          <w:color w:val="FF79C6"/>
+          <w:sz w:val="23"/>
+          <w:szCs w:val="23"/>
+          <w:lang w:eastAsia="pt-BR"/>
+        </w:rPr>
+        <w:t>=</w:t>
+      </w:r>
+      <w:r>
+        <w:rPr>
+          <w:rFonts w:ascii="Consolas" w:eastAsia="Times New Roman" w:hAnsi="Consolas" w:cs="Times New Roman"/>
+          <w:color w:val="F8F8F2"/>
+          <w:sz w:val="23"/>
+          <w:szCs w:val="23"/>
+          <w:lang w:eastAsia="pt-BR"/>
+        </w:rPr>
+        <w:t xml:space="preserve"> </w:t>
+      </w:r>
+      <w:proofErr w:type="spellStart"/>
+      <w:proofErr w:type="gramStart"/>
+      <w:r>
+        <w:rPr>
+          <w:rFonts w:ascii="Consolas" w:eastAsia="Times New Roman" w:hAnsi="Consolas" w:cs="Times New Roman"/>
+          <w:color w:val="BD93F9"/>
+          <w:sz w:val="23"/>
+          <w:szCs w:val="23"/>
+          <w:lang w:eastAsia="pt-BR"/>
+        </w:rPr>
+        <w:t>document</w:t>
       </w:r>
       <w:r>
         <w:rPr>
@@ -11603,8 +13158,10 @@
           <w:szCs w:val="23"/>
           <w:lang w:eastAsia="pt-BR"/>
         </w:rPr>
-        <w:t>log</w:t>
-      </w:r>
+        <w:t>querySelectorAll</w:t>
+      </w:r>
+      <w:proofErr w:type="spellEnd"/>
+      <w:proofErr w:type="gramEnd"/>
       <w:r>
         <w:rPr>
           <w:rFonts w:ascii="Consolas" w:eastAsia="Times New Roman" w:hAnsi="Consolas" w:cs="Times New Roman"/>
@@ -11615,21 +13172,41 @@
         </w:rPr>
         <w:t>(</w:t>
       </w:r>
+      <w:r>
+        <w:rPr>
+          <w:rFonts w:ascii="Consolas" w:eastAsia="Times New Roman" w:hAnsi="Consolas" w:cs="Times New Roman"/>
+          <w:color w:val="E9F284"/>
+          <w:sz w:val="23"/>
+          <w:szCs w:val="23"/>
+          <w:lang w:eastAsia="pt-BR"/>
+        </w:rPr>
+        <w:t>"</w:t>
+      </w:r>
       <w:proofErr w:type="spellStart"/>
       <w:r>
         <w:rPr>
           <w:rFonts w:ascii="Consolas" w:eastAsia="Times New Roman" w:hAnsi="Consolas" w:cs="Times New Roman"/>
-          <w:color w:val="BD93F9"/>
-          <w:sz w:val="23"/>
-          <w:szCs w:val="23"/>
-          <w:lang w:eastAsia="pt-BR"/>
-        </w:rPr>
-        <w:t>arrayId</w:t>
+          <w:color w:val="F1FA8C"/>
+          <w:sz w:val="23"/>
+          <w:szCs w:val="23"/>
+          <w:lang w:eastAsia="pt-BR"/>
+        </w:rPr>
+        <w:t>div</w:t>
       </w:r>
       <w:proofErr w:type="spellEnd"/>
       <w:r>
         <w:rPr>
           <w:rFonts w:ascii="Consolas" w:eastAsia="Times New Roman" w:hAnsi="Consolas" w:cs="Times New Roman"/>
+          <w:color w:val="E9F284"/>
+          <w:sz w:val="23"/>
+          <w:szCs w:val="23"/>
+          <w:lang w:eastAsia="pt-BR"/>
+        </w:rPr>
+        <w:t>"</w:t>
+      </w:r>
+      <w:r>
+        <w:rPr>
+          <w:rFonts w:ascii="Consolas" w:eastAsia="Times New Roman" w:hAnsi="Consolas" w:cs="Times New Roman"/>
           <w:color w:val="F8F8F2"/>
           <w:sz w:val="23"/>
           <w:szCs w:val="23"/>
@@ -11658,76 +13235,7 @@
           <w:sz w:val="28"/>
           <w:szCs w:val="36"/>
         </w:rPr>
-        <w:t xml:space="preserve">A diferença: O tipo vai ser diferente, sendo o array do tipo Array e o </w:t>
-      </w:r>
-      <w:proofErr w:type="spellStart"/>
-      <w:r>
-        <w:rPr>
-          <w:sz w:val="28"/>
-          <w:szCs w:val="36"/>
-        </w:rPr>
-        <w:t>colecao</w:t>
-      </w:r>
-      <w:r>
-        <w:rPr>
-          <w:sz w:val="28"/>
-          <w:szCs w:val="36"/>
-        </w:rPr>
-        <w:t>HTML</w:t>
-      </w:r>
-      <w:proofErr w:type="spellEnd"/>
-      <w:r>
-        <w:rPr>
-          <w:sz w:val="28"/>
-          <w:szCs w:val="36"/>
-        </w:rPr>
-        <w:t xml:space="preserve"> do tipo HTMLCollection.</w:t>
-      </w:r>
-    </w:p>
-    <w:p>
-      <w:pPr>
-        <w:rPr>
-          <w:sz w:val="28"/>
-          <w:szCs w:val="36"/>
-        </w:rPr>
-      </w:pPr>
-      <w:r>
-        <w:rPr>
-          <w:sz w:val="28"/>
-          <w:szCs w:val="36"/>
-        </w:rPr>
-        <w:t xml:space="preserve">Sendo um array da para usar tudo relacionado a array (Métodos). Mesma coisa com o </w:t>
-      </w:r>
-      <w:proofErr w:type="spellStart"/>
-      <w:r>
-        <w:rPr>
-          <w:sz w:val="28"/>
-          <w:szCs w:val="36"/>
-        </w:rPr>
-        <w:t>colecaoHTML</w:t>
-      </w:r>
-      <w:proofErr w:type="spellEnd"/>
-      <w:r>
-        <w:rPr>
-          <w:sz w:val="28"/>
-          <w:szCs w:val="36"/>
-        </w:rPr>
-        <w:t>, porém muito menos métodos para serem usados.</w:t>
-      </w:r>
-    </w:p>
-    <w:p>
-      <w:pPr>
-        <w:rPr>
-          <w:sz w:val="28"/>
-          <w:szCs w:val="36"/>
-        </w:rPr>
-      </w:pPr>
-      <w:r>
-        <w:rPr>
-          <w:sz w:val="28"/>
-          <w:szCs w:val="36"/>
-        </w:rPr>
-        <w:t xml:space="preserve">Para transformar em array: </w:t>
+        <w:t>Uso usando classe e id:</w:t>
       </w:r>
     </w:p>
     <w:p>
@@ -11746,12 +13254,12 @@
       <w:r>
         <w:rPr>
           <w:rFonts w:ascii="Consolas" w:eastAsia="Times New Roman" w:hAnsi="Consolas" w:cs="Times New Roman"/>
-          <w:color w:val="F8F8F2"/>
-          <w:sz w:val="23"/>
-          <w:szCs w:val="23"/>
-          <w:lang w:eastAsia="pt-BR"/>
-        </w:rPr>
-        <w:t>colecaoHTML</w:t>
+          <w:color w:val="FF79C6"/>
+          <w:sz w:val="23"/>
+          <w:szCs w:val="23"/>
+          <w:lang w:eastAsia="pt-BR"/>
+        </w:rPr>
+        <w:t>const</w:t>
       </w:r>
       <w:proofErr w:type="spellEnd"/>
       <w:r>
@@ -11767,6 +13275,26 @@
       <w:r>
         <w:rPr>
           <w:rFonts w:ascii="Consolas" w:eastAsia="Times New Roman" w:hAnsi="Consolas" w:cs="Times New Roman"/>
+          <w:color w:val="BD93F9"/>
+          <w:sz w:val="23"/>
+          <w:szCs w:val="23"/>
+          <w:lang w:eastAsia="pt-BR"/>
+        </w:rPr>
+        <w:t>queryC2</w:t>
+      </w:r>
+      <w:r>
+        <w:rPr>
+          <w:rFonts w:ascii="Consolas" w:eastAsia="Times New Roman" w:hAnsi="Consolas" w:cs="Times New Roman"/>
+          <w:color w:val="F8F8F2"/>
+          <w:sz w:val="23"/>
+          <w:szCs w:val="23"/>
+          <w:lang w:eastAsia="pt-BR"/>
+        </w:rPr>
+        <w:t xml:space="preserve"> </w:t>
+      </w:r>
+      <w:r>
+        <w:rPr>
+          <w:rFonts w:ascii="Consolas" w:eastAsia="Times New Roman" w:hAnsi="Consolas" w:cs="Times New Roman"/>
           <w:color w:val="FF79C6"/>
           <w:sz w:val="23"/>
           <w:szCs w:val="23"/>
@@ -11795,52 +13323,776 @@
         <w:t>...</w:t>
       </w:r>
       <w:proofErr w:type="spellStart"/>
-      <w:r>
-        <w:rPr>
-          <w:rFonts w:ascii="Consolas" w:eastAsia="Times New Roman" w:hAnsi="Consolas" w:cs="Times New Roman"/>
-          <w:color w:val="F8F8F2"/>
-          <w:sz w:val="23"/>
-          <w:szCs w:val="23"/>
-          <w:lang w:eastAsia="pt-BR"/>
-        </w:rPr>
-        <w:t>colecaoHTML</w:t>
+      <w:proofErr w:type="gramStart"/>
+      <w:r>
+        <w:rPr>
+          <w:rFonts w:ascii="Consolas" w:eastAsia="Times New Roman" w:hAnsi="Consolas" w:cs="Times New Roman"/>
+          <w:color w:val="BD93F9"/>
+          <w:sz w:val="23"/>
+          <w:szCs w:val="23"/>
+          <w:lang w:eastAsia="pt-BR"/>
+        </w:rPr>
+        <w:t>document</w:t>
+      </w:r>
+      <w:r>
+        <w:rPr>
+          <w:rFonts w:ascii="Consolas" w:eastAsia="Times New Roman" w:hAnsi="Consolas" w:cs="Times New Roman"/>
+          <w:color w:val="F8F8F2"/>
+          <w:sz w:val="23"/>
+          <w:szCs w:val="23"/>
+          <w:lang w:eastAsia="pt-BR"/>
+        </w:rPr>
+        <w:t>.</w:t>
+      </w:r>
+      <w:r>
+        <w:rPr>
+          <w:rFonts w:ascii="Consolas" w:eastAsia="Times New Roman" w:hAnsi="Consolas" w:cs="Times New Roman"/>
+          <w:color w:val="50FA7B"/>
+          <w:sz w:val="23"/>
+          <w:szCs w:val="23"/>
+          <w:lang w:eastAsia="pt-BR"/>
+        </w:rPr>
+        <w:t>querySelectorAll</w:t>
       </w:r>
       <w:proofErr w:type="spellEnd"/>
-      <w:r>
-        <w:rPr>
-          <w:rFonts w:ascii="Consolas" w:eastAsia="Times New Roman" w:hAnsi="Consolas" w:cs="Times New Roman"/>
-          <w:color w:val="F8F8F2"/>
+      <w:proofErr w:type="gramEnd"/>
+      <w:r>
+        <w:rPr>
+          <w:rFonts w:ascii="Consolas" w:eastAsia="Times New Roman" w:hAnsi="Consolas" w:cs="Times New Roman"/>
+          <w:color w:val="F8F8F2"/>
+          <w:sz w:val="23"/>
+          <w:szCs w:val="23"/>
+          <w:lang w:eastAsia="pt-BR"/>
+        </w:rPr>
+        <w:t>(</w:t>
+      </w:r>
+      <w:r>
+        <w:rPr>
+          <w:rFonts w:ascii="Consolas" w:eastAsia="Times New Roman" w:hAnsi="Consolas" w:cs="Times New Roman"/>
+          <w:color w:val="E9F284"/>
+          <w:sz w:val="23"/>
+          <w:szCs w:val="23"/>
+          <w:lang w:eastAsia="pt-BR"/>
+        </w:rPr>
+        <w:t>"</w:t>
+      </w:r>
+      <w:r>
+        <w:rPr>
+          <w:rFonts w:ascii="Consolas" w:eastAsia="Times New Roman" w:hAnsi="Consolas" w:cs="Times New Roman"/>
+          <w:color w:val="F1FA8C"/>
+          <w:sz w:val="23"/>
+          <w:szCs w:val="23"/>
+          <w:lang w:eastAsia="pt-BR"/>
+        </w:rPr>
+        <w:t>.c2</w:t>
+      </w:r>
+      <w:r>
+        <w:rPr>
+          <w:rFonts w:ascii="Consolas" w:eastAsia="Times New Roman" w:hAnsi="Consolas" w:cs="Times New Roman"/>
+          <w:color w:val="E9F284"/>
+          <w:sz w:val="23"/>
+          <w:szCs w:val="23"/>
+          <w:lang w:eastAsia="pt-BR"/>
+        </w:rPr>
+        <w:t>"</w:t>
+      </w:r>
+      <w:r>
+        <w:rPr>
+          <w:rFonts w:ascii="Consolas" w:eastAsia="Times New Roman" w:hAnsi="Consolas" w:cs="Times New Roman"/>
+          <w:color w:val="F8F8F2"/>
+          <w:sz w:val="23"/>
+          <w:szCs w:val="23"/>
+          <w:lang w:eastAsia="pt-BR"/>
+        </w:rPr>
+        <w:t>)]</w:t>
+      </w:r>
+    </w:p>
+    <w:p>
+      <w:pPr>
+        <w:shd w:val="clear" w:color="auto" w:fill="282A36"/>
+        <w:spacing w:after="0" w:line="300" w:lineRule="atLeast"/>
+        <w:rPr>
+          <w:rFonts w:ascii="Consolas" w:eastAsia="Times New Roman" w:hAnsi="Consolas" w:cs="Times New Roman"/>
+          <w:color w:val="F8F8F2"/>
+          <w:sz w:val="23"/>
+          <w:szCs w:val="23"/>
+          <w:lang w:eastAsia="pt-BR"/>
+        </w:rPr>
+      </w:pPr>
+      <w:proofErr w:type="spellStart"/>
+      <w:r>
+        <w:rPr>
+          <w:rFonts w:ascii="Consolas" w:eastAsia="Times New Roman" w:hAnsi="Consolas" w:cs="Times New Roman"/>
+          <w:color w:val="FF79C6"/>
+          <w:sz w:val="23"/>
+          <w:szCs w:val="23"/>
+          <w:lang w:eastAsia="pt-BR"/>
+        </w:rPr>
+        <w:t>const</w:t>
+      </w:r>
+      <w:proofErr w:type="spellEnd"/>
+      <w:r>
+        <w:rPr>
+          <w:rFonts w:ascii="Consolas" w:eastAsia="Times New Roman" w:hAnsi="Consolas" w:cs="Times New Roman"/>
+          <w:color w:val="F8F8F2"/>
+          <w:sz w:val="23"/>
+          <w:szCs w:val="23"/>
+          <w:lang w:eastAsia="pt-BR"/>
+        </w:rPr>
+        <w:t xml:space="preserve"> </w:t>
+      </w:r>
+      <w:proofErr w:type="spellStart"/>
+      <w:r>
+        <w:rPr>
+          <w:rFonts w:ascii="Consolas" w:eastAsia="Times New Roman" w:hAnsi="Consolas" w:cs="Times New Roman"/>
+          <w:color w:val="BD93F9"/>
+          <w:sz w:val="23"/>
+          <w:szCs w:val="23"/>
+          <w:lang w:eastAsia="pt-BR"/>
+        </w:rPr>
+        <w:t>queryId</w:t>
+      </w:r>
+      <w:proofErr w:type="spellEnd"/>
+      <w:r>
+        <w:rPr>
+          <w:rFonts w:ascii="Consolas" w:eastAsia="Times New Roman" w:hAnsi="Consolas" w:cs="Times New Roman"/>
+          <w:color w:val="F8F8F2"/>
+          <w:sz w:val="23"/>
+          <w:szCs w:val="23"/>
+          <w:lang w:eastAsia="pt-BR"/>
+        </w:rPr>
+        <w:t xml:space="preserve"> </w:t>
+      </w:r>
+      <w:r>
+        <w:rPr>
+          <w:rFonts w:ascii="Consolas" w:eastAsia="Times New Roman" w:hAnsi="Consolas" w:cs="Times New Roman"/>
+          <w:color w:val="FF79C6"/>
+          <w:sz w:val="23"/>
+          <w:szCs w:val="23"/>
+          <w:lang w:eastAsia="pt-BR"/>
+        </w:rPr>
+        <w:t>=</w:t>
+      </w:r>
+      <w:r>
+        <w:rPr>
+          <w:rFonts w:ascii="Consolas" w:eastAsia="Times New Roman" w:hAnsi="Consolas" w:cs="Times New Roman"/>
+          <w:color w:val="F8F8F2"/>
+          <w:sz w:val="23"/>
+          <w:szCs w:val="23"/>
+          <w:lang w:eastAsia="pt-BR"/>
+        </w:rPr>
+        <w:t xml:space="preserve"> </w:t>
+      </w:r>
+      <w:proofErr w:type="spellStart"/>
+      <w:proofErr w:type="gramStart"/>
+      <w:r>
+        <w:rPr>
+          <w:rFonts w:ascii="Consolas" w:eastAsia="Times New Roman" w:hAnsi="Consolas" w:cs="Times New Roman"/>
+          <w:color w:val="BD93F9"/>
+          <w:sz w:val="23"/>
+          <w:szCs w:val="23"/>
+          <w:lang w:eastAsia="pt-BR"/>
+        </w:rPr>
+        <w:t>document</w:t>
+      </w:r>
+      <w:r>
+        <w:rPr>
+          <w:rFonts w:ascii="Consolas" w:eastAsia="Times New Roman" w:hAnsi="Consolas" w:cs="Times New Roman"/>
+          <w:color w:val="F8F8F2"/>
+          <w:sz w:val="23"/>
+          <w:szCs w:val="23"/>
+          <w:lang w:eastAsia="pt-BR"/>
+        </w:rPr>
+        <w:t>.</w:t>
+      </w:r>
+      <w:r>
+        <w:rPr>
+          <w:rFonts w:ascii="Consolas" w:eastAsia="Times New Roman" w:hAnsi="Consolas" w:cs="Times New Roman"/>
+          <w:color w:val="50FA7B"/>
+          <w:sz w:val="23"/>
+          <w:szCs w:val="23"/>
+          <w:lang w:eastAsia="pt-BR"/>
+        </w:rPr>
+        <w:t>querySelector</w:t>
+      </w:r>
+      <w:proofErr w:type="spellEnd"/>
+      <w:proofErr w:type="gramEnd"/>
+      <w:r>
+        <w:rPr>
+          <w:rFonts w:ascii="Consolas" w:eastAsia="Times New Roman" w:hAnsi="Consolas" w:cs="Times New Roman"/>
+          <w:color w:val="F8F8F2"/>
+          <w:sz w:val="23"/>
+          <w:szCs w:val="23"/>
+          <w:lang w:eastAsia="pt-BR"/>
+        </w:rPr>
+        <w:t>(</w:t>
+      </w:r>
+      <w:r>
+        <w:rPr>
+          <w:rFonts w:ascii="Consolas" w:eastAsia="Times New Roman" w:hAnsi="Consolas" w:cs="Times New Roman"/>
+          <w:color w:val="E9F284"/>
+          <w:sz w:val="23"/>
+          <w:szCs w:val="23"/>
+          <w:lang w:eastAsia="pt-BR"/>
+        </w:rPr>
+        <w:t>"</w:t>
+      </w:r>
+      <w:r>
+        <w:rPr>
+          <w:rFonts w:ascii="Consolas" w:eastAsia="Times New Roman" w:hAnsi="Consolas" w:cs="Times New Roman"/>
+          <w:color w:val="F1FA8C"/>
+          <w:sz w:val="23"/>
+          <w:szCs w:val="23"/>
+          <w:lang w:eastAsia="pt-BR"/>
+        </w:rPr>
+        <w:t>#c1</w:t>
+      </w:r>
+      <w:r>
+        <w:rPr>
+          <w:rFonts w:ascii="Consolas" w:eastAsia="Times New Roman" w:hAnsi="Consolas" w:cs="Times New Roman"/>
+          <w:color w:val="E9F284"/>
+          <w:sz w:val="23"/>
+          <w:szCs w:val="23"/>
+          <w:lang w:eastAsia="pt-BR"/>
+        </w:rPr>
+        <w:t>"</w:t>
+      </w:r>
+      <w:r>
+        <w:rPr>
+          <w:rFonts w:ascii="Consolas" w:eastAsia="Times New Roman" w:hAnsi="Consolas" w:cs="Times New Roman"/>
+          <w:color w:val="F8F8F2"/>
+          <w:sz w:val="23"/>
+          <w:szCs w:val="23"/>
+          <w:lang w:eastAsia="pt-BR"/>
+        </w:rPr>
+        <w:t>)</w:t>
+      </w:r>
+    </w:p>
+    <w:p>
+      <w:pPr>
+        <w:rPr>
+          <w:sz w:val="28"/>
+          <w:szCs w:val="36"/>
+        </w:rPr>
+      </w:pPr>
+    </w:p>
+    <w:p>
+      <w:pPr>
+        <w:rPr>
+          <w:sz w:val="28"/>
+          <w:szCs w:val="36"/>
+        </w:rPr>
+      </w:pPr>
+      <w:r>
+        <w:rPr>
+          <w:sz w:val="28"/>
+          <w:szCs w:val="36"/>
+        </w:rPr>
+        <w:t xml:space="preserve">Podemos também pegar mais de um elemento: </w:t>
+      </w:r>
+    </w:p>
+    <w:p>
+      <w:pPr>
+        <w:shd w:val="clear" w:color="auto" w:fill="282A36"/>
+        <w:spacing w:after="0" w:line="300" w:lineRule="atLeast"/>
+        <w:rPr>
+          <w:rFonts w:ascii="Consolas" w:eastAsia="Times New Roman" w:hAnsi="Consolas" w:cs="Times New Roman"/>
+          <w:color w:val="F8F8F2"/>
+          <w:sz w:val="23"/>
+          <w:szCs w:val="23"/>
+          <w:lang w:eastAsia="pt-BR"/>
+        </w:rPr>
+      </w:pPr>
+      <w:proofErr w:type="spellStart"/>
+      <w:r>
+        <w:rPr>
+          <w:rFonts w:ascii="Consolas" w:eastAsia="Times New Roman" w:hAnsi="Consolas" w:cs="Times New Roman"/>
+          <w:color w:val="FF79C6"/>
+          <w:sz w:val="23"/>
+          <w:szCs w:val="23"/>
+          <w:lang w:eastAsia="pt-BR"/>
+        </w:rPr>
+        <w:t>const</w:t>
+      </w:r>
+      <w:proofErr w:type="spellEnd"/>
+      <w:r>
+        <w:rPr>
+          <w:rFonts w:ascii="Consolas" w:eastAsia="Times New Roman" w:hAnsi="Consolas" w:cs="Times New Roman"/>
+          <w:color w:val="F8F8F2"/>
+          <w:sz w:val="23"/>
+          <w:szCs w:val="23"/>
+          <w:lang w:eastAsia="pt-BR"/>
+        </w:rPr>
+        <w:t xml:space="preserve"> </w:t>
+      </w:r>
+      <w:proofErr w:type="spellStart"/>
+      <w:r>
+        <w:rPr>
+          <w:rFonts w:ascii="Consolas" w:eastAsia="Times New Roman" w:hAnsi="Consolas" w:cs="Times New Roman"/>
+          <w:color w:val="BD93F9"/>
+          <w:sz w:val="23"/>
+          <w:szCs w:val="23"/>
+          <w:lang w:eastAsia="pt-BR"/>
+        </w:rPr>
+        <w:t>queryDiv</w:t>
+      </w:r>
+      <w:proofErr w:type="spellEnd"/>
+      <w:r>
+        <w:rPr>
+          <w:rFonts w:ascii="Consolas" w:eastAsia="Times New Roman" w:hAnsi="Consolas" w:cs="Times New Roman"/>
+          <w:color w:val="F8F8F2"/>
+          <w:sz w:val="23"/>
+          <w:szCs w:val="23"/>
+          <w:lang w:eastAsia="pt-BR"/>
+        </w:rPr>
+        <w:t xml:space="preserve"> </w:t>
+      </w:r>
+      <w:r>
+        <w:rPr>
+          <w:rFonts w:ascii="Consolas" w:eastAsia="Times New Roman" w:hAnsi="Consolas" w:cs="Times New Roman"/>
+          <w:color w:val="FF79C6"/>
+          <w:sz w:val="23"/>
+          <w:szCs w:val="23"/>
+          <w:lang w:eastAsia="pt-BR"/>
+        </w:rPr>
+        <w:t>=</w:t>
+      </w:r>
+      <w:r>
+        <w:rPr>
+          <w:rFonts w:ascii="Consolas" w:eastAsia="Times New Roman" w:hAnsi="Consolas" w:cs="Times New Roman"/>
+          <w:color w:val="F8F8F2"/>
+          <w:sz w:val="23"/>
+          <w:szCs w:val="23"/>
+          <w:lang w:eastAsia="pt-BR"/>
+        </w:rPr>
+        <w:t xml:space="preserve"> </w:t>
+      </w:r>
+      <w:proofErr w:type="spellStart"/>
+      <w:proofErr w:type="gramStart"/>
+      <w:r>
+        <w:rPr>
+          <w:rFonts w:ascii="Consolas" w:eastAsia="Times New Roman" w:hAnsi="Consolas" w:cs="Times New Roman"/>
+          <w:color w:val="BD93F9"/>
+          <w:sz w:val="23"/>
+          <w:szCs w:val="23"/>
+          <w:lang w:eastAsia="pt-BR"/>
+        </w:rPr>
+        <w:t>document</w:t>
+      </w:r>
+      <w:r>
+        <w:rPr>
+          <w:rFonts w:ascii="Consolas" w:eastAsia="Times New Roman" w:hAnsi="Consolas" w:cs="Times New Roman"/>
+          <w:color w:val="F8F8F2"/>
+          <w:sz w:val="23"/>
+          <w:szCs w:val="23"/>
+          <w:lang w:eastAsia="pt-BR"/>
+        </w:rPr>
+        <w:t>.</w:t>
+      </w:r>
+      <w:r>
+        <w:rPr>
+          <w:rFonts w:ascii="Consolas" w:eastAsia="Times New Roman" w:hAnsi="Consolas" w:cs="Times New Roman"/>
+          <w:color w:val="50FA7B"/>
+          <w:sz w:val="23"/>
+          <w:szCs w:val="23"/>
+          <w:lang w:eastAsia="pt-BR"/>
+        </w:rPr>
+        <w:t>querySelector</w:t>
+      </w:r>
+      <w:proofErr w:type="spellEnd"/>
+      <w:proofErr w:type="gramEnd"/>
+      <w:r>
+        <w:rPr>
+          <w:rFonts w:ascii="Consolas" w:eastAsia="Times New Roman" w:hAnsi="Consolas" w:cs="Times New Roman"/>
+          <w:color w:val="F8F8F2"/>
+          <w:sz w:val="23"/>
+          <w:szCs w:val="23"/>
+          <w:lang w:eastAsia="pt-BR"/>
+        </w:rPr>
+        <w:t>(</w:t>
+      </w:r>
+      <w:r>
+        <w:rPr>
+          <w:rFonts w:ascii="Consolas" w:eastAsia="Times New Roman" w:hAnsi="Consolas" w:cs="Times New Roman"/>
+          <w:color w:val="E9F284"/>
+          <w:sz w:val="23"/>
+          <w:szCs w:val="23"/>
+          <w:lang w:eastAsia="pt-BR"/>
+        </w:rPr>
+        <w:t>"</w:t>
+      </w:r>
+      <w:proofErr w:type="spellStart"/>
+      <w:r>
+        <w:rPr>
+          <w:rFonts w:ascii="Consolas" w:eastAsia="Times New Roman" w:hAnsi="Consolas" w:cs="Times New Roman"/>
+          <w:color w:val="F1FA8C"/>
+          <w:sz w:val="23"/>
+          <w:szCs w:val="23"/>
+          <w:lang w:eastAsia="pt-BR"/>
+        </w:rPr>
+        <w:t>div</w:t>
+      </w:r>
+      <w:proofErr w:type="spellEnd"/>
+      <w:r>
+        <w:rPr>
+          <w:rFonts w:ascii="Consolas" w:eastAsia="Times New Roman" w:hAnsi="Consolas" w:cs="Times New Roman"/>
+          <w:color w:val="F1FA8C"/>
+          <w:sz w:val="23"/>
+          <w:szCs w:val="23"/>
+          <w:lang w:eastAsia="pt-BR"/>
+        </w:rPr>
+        <w:t>, p</w:t>
+      </w:r>
+      <w:r>
+        <w:rPr>
+          <w:rFonts w:ascii="Consolas" w:eastAsia="Times New Roman" w:hAnsi="Consolas" w:cs="Times New Roman"/>
+          <w:color w:val="E9F284"/>
+          <w:sz w:val="23"/>
+          <w:szCs w:val="23"/>
+          <w:lang w:eastAsia="pt-BR"/>
+        </w:rPr>
+        <w:t>"</w:t>
+      </w:r>
+      <w:r>
+        <w:rPr>
+          <w:rFonts w:ascii="Consolas" w:eastAsia="Times New Roman" w:hAnsi="Consolas" w:cs="Times New Roman"/>
+          <w:color w:val="F8F8F2"/>
+          <w:sz w:val="23"/>
+          <w:szCs w:val="23"/>
+          <w:lang w:eastAsia="pt-BR"/>
+        </w:rPr>
+        <w:t>)</w:t>
+      </w:r>
+    </w:p>
+    <w:p>
+      <w:pPr>
+        <w:rPr>
+          <w:sz w:val="28"/>
+          <w:szCs w:val="36"/>
+        </w:rPr>
+      </w:pPr>
+      <w:r>
+        <w:rPr>
+          <w:sz w:val="28"/>
+          <w:szCs w:val="36"/>
+        </w:rPr>
+        <w:t xml:space="preserve"> </w:t>
+      </w:r>
+    </w:p>
+    <w:p>
+      <w:pPr>
+        <w:rPr>
+          <w:sz w:val="28"/>
+          <w:szCs w:val="36"/>
+        </w:rPr>
+      </w:pPr>
+      <w:r>
+        <w:rPr>
+          <w:sz w:val="28"/>
+          <w:szCs w:val="36"/>
+        </w:rPr>
+        <w:t xml:space="preserve">Pegar somente a </w:t>
+      </w:r>
+      <w:proofErr w:type="spellStart"/>
+      <w:r>
+        <w:rPr>
+          <w:sz w:val="28"/>
+          <w:szCs w:val="36"/>
+        </w:rPr>
+        <w:t>tag</w:t>
+      </w:r>
+      <w:proofErr w:type="spellEnd"/>
+      <w:r>
+        <w:rPr>
+          <w:sz w:val="28"/>
+          <w:szCs w:val="36"/>
+        </w:rPr>
+        <w:t xml:space="preserve"> que possui tal atributo: </w:t>
+      </w:r>
+    </w:p>
+    <w:p>
+      <w:pPr>
+        <w:shd w:val="clear" w:color="auto" w:fill="282A36"/>
+        <w:spacing w:after="0" w:line="300" w:lineRule="atLeast"/>
+        <w:rPr>
+          <w:rFonts w:ascii="Consolas" w:eastAsia="Times New Roman" w:hAnsi="Consolas" w:cs="Times New Roman"/>
+          <w:color w:val="F8F8F2"/>
+          <w:sz w:val="23"/>
+          <w:szCs w:val="23"/>
+          <w:lang w:eastAsia="pt-BR"/>
+        </w:rPr>
+      </w:pPr>
+      <w:proofErr w:type="spellStart"/>
+      <w:r>
+        <w:rPr>
+          <w:rFonts w:ascii="Consolas" w:eastAsia="Times New Roman" w:hAnsi="Consolas" w:cs="Times New Roman"/>
+          <w:color w:val="FF79C6"/>
+          <w:sz w:val="23"/>
+          <w:szCs w:val="23"/>
+          <w:lang w:eastAsia="pt-BR"/>
+        </w:rPr>
+        <w:t>const</w:t>
+      </w:r>
+      <w:proofErr w:type="spellEnd"/>
+      <w:r>
+        <w:rPr>
+          <w:rFonts w:ascii="Consolas" w:eastAsia="Times New Roman" w:hAnsi="Consolas" w:cs="Times New Roman"/>
+          <w:color w:val="F8F8F2"/>
+          <w:sz w:val="23"/>
+          <w:szCs w:val="23"/>
+          <w:lang w:eastAsia="pt-BR"/>
+        </w:rPr>
+        <w:t xml:space="preserve"> </w:t>
+      </w:r>
+      <w:proofErr w:type="spellStart"/>
+      <w:r>
+        <w:rPr>
+          <w:rFonts w:ascii="Consolas" w:eastAsia="Times New Roman" w:hAnsi="Consolas" w:cs="Times New Roman"/>
+          <w:color w:val="BD93F9"/>
+          <w:sz w:val="23"/>
+          <w:szCs w:val="23"/>
+          <w:lang w:eastAsia="pt-BR"/>
+        </w:rPr>
+        <w:t>queryExemplo</w:t>
+      </w:r>
+      <w:proofErr w:type="spellEnd"/>
+      <w:r>
+        <w:rPr>
+          <w:rFonts w:ascii="Consolas" w:eastAsia="Times New Roman" w:hAnsi="Consolas" w:cs="Times New Roman"/>
+          <w:color w:val="F8F8F2"/>
+          <w:sz w:val="23"/>
+          <w:szCs w:val="23"/>
+          <w:lang w:eastAsia="pt-BR"/>
+        </w:rPr>
+        <w:t xml:space="preserve"> </w:t>
+      </w:r>
+      <w:r>
+        <w:rPr>
+          <w:rFonts w:ascii="Consolas" w:eastAsia="Times New Roman" w:hAnsi="Consolas" w:cs="Times New Roman"/>
+          <w:color w:val="FF79C6"/>
+          <w:sz w:val="23"/>
+          <w:szCs w:val="23"/>
+          <w:lang w:eastAsia="pt-BR"/>
+        </w:rPr>
+        <w:t>=</w:t>
+      </w:r>
+      <w:r>
+        <w:rPr>
+          <w:rFonts w:ascii="Consolas" w:eastAsia="Times New Roman" w:hAnsi="Consolas" w:cs="Times New Roman"/>
+          <w:color w:val="F8F8F2"/>
+          <w:sz w:val="23"/>
+          <w:szCs w:val="23"/>
+          <w:lang w:eastAsia="pt-BR"/>
+        </w:rPr>
+        <w:t xml:space="preserve"> </w:t>
+      </w:r>
+      <w:proofErr w:type="spellStart"/>
+      <w:proofErr w:type="gramStart"/>
+      <w:r>
+        <w:rPr>
+          <w:rFonts w:ascii="Consolas" w:eastAsia="Times New Roman" w:hAnsi="Consolas" w:cs="Times New Roman"/>
+          <w:color w:val="BD93F9"/>
+          <w:sz w:val="23"/>
+          <w:szCs w:val="23"/>
+          <w:lang w:eastAsia="pt-BR"/>
+        </w:rPr>
+        <w:t>document</w:t>
+      </w:r>
+      <w:r>
+        <w:rPr>
+          <w:rFonts w:ascii="Consolas" w:eastAsia="Times New Roman" w:hAnsi="Consolas" w:cs="Times New Roman"/>
+          <w:color w:val="F8F8F2"/>
+          <w:sz w:val="23"/>
+          <w:szCs w:val="23"/>
+          <w:lang w:eastAsia="pt-BR"/>
+        </w:rPr>
+        <w:t>.</w:t>
+      </w:r>
+      <w:r>
+        <w:rPr>
+          <w:rFonts w:ascii="Consolas" w:eastAsia="Times New Roman" w:hAnsi="Consolas" w:cs="Times New Roman"/>
+          <w:color w:val="50FA7B"/>
+          <w:sz w:val="23"/>
+          <w:szCs w:val="23"/>
+          <w:lang w:eastAsia="pt-BR"/>
+        </w:rPr>
+        <w:t>querySelectorAll</w:t>
+      </w:r>
+      <w:proofErr w:type="spellEnd"/>
+      <w:proofErr w:type="gramEnd"/>
+      <w:r>
+        <w:rPr>
+          <w:rFonts w:ascii="Consolas" w:eastAsia="Times New Roman" w:hAnsi="Consolas" w:cs="Times New Roman"/>
+          <w:color w:val="F8F8F2"/>
+          <w:sz w:val="23"/>
+          <w:szCs w:val="23"/>
+          <w:lang w:eastAsia="pt-BR"/>
+        </w:rPr>
+        <w:t>(</w:t>
+      </w:r>
+      <w:r>
+        <w:rPr>
+          <w:rFonts w:ascii="Consolas" w:eastAsia="Times New Roman" w:hAnsi="Consolas" w:cs="Times New Roman"/>
+          <w:color w:val="E9F284"/>
+          <w:sz w:val="23"/>
+          <w:szCs w:val="23"/>
+          <w:lang w:eastAsia="pt-BR"/>
+        </w:rPr>
+        <w:t>"</w:t>
+      </w:r>
+      <w:proofErr w:type="spellStart"/>
+      <w:r>
+        <w:rPr>
+          <w:rFonts w:ascii="Consolas" w:eastAsia="Times New Roman" w:hAnsi="Consolas" w:cs="Times New Roman"/>
+          <w:color w:val="F1FA8C"/>
+          <w:sz w:val="23"/>
+          <w:szCs w:val="23"/>
+          <w:lang w:eastAsia="pt-BR"/>
+        </w:rPr>
+        <w:t>div</w:t>
+      </w:r>
+      <w:proofErr w:type="spellEnd"/>
+      <w:r>
+        <w:rPr>
+          <w:rFonts w:ascii="Consolas" w:eastAsia="Times New Roman" w:hAnsi="Consolas" w:cs="Times New Roman"/>
+          <w:color w:val="F1FA8C"/>
+          <w:sz w:val="23"/>
+          <w:szCs w:val="23"/>
+          <w:lang w:eastAsia="pt-BR"/>
+        </w:rPr>
+        <w:t>[</w:t>
+      </w:r>
+      <w:proofErr w:type="spellStart"/>
+      <w:r>
+        <w:rPr>
+          <w:rFonts w:ascii="Consolas" w:eastAsia="Times New Roman" w:hAnsi="Consolas" w:cs="Times New Roman"/>
+          <w:color w:val="F1FA8C"/>
+          <w:sz w:val="23"/>
+          <w:szCs w:val="23"/>
+          <w:lang w:eastAsia="pt-BR"/>
+        </w:rPr>
+        <w:t>class</w:t>
+      </w:r>
+      <w:proofErr w:type="spellEnd"/>
+      <w:r>
+        <w:rPr>
+          <w:rFonts w:ascii="Consolas" w:eastAsia="Times New Roman" w:hAnsi="Consolas" w:cs="Times New Roman"/>
+          <w:color w:val="F1FA8C"/>
           <w:sz w:val="23"/>
           <w:szCs w:val="23"/>
           <w:lang w:eastAsia="pt-BR"/>
         </w:rPr>
         <w:t>]</w:t>
       </w:r>
-    </w:p>
-    <w:p>
-      <w:pPr>
-        <w:rPr>
-          <w:sz w:val="28"/>
-          <w:szCs w:val="36"/>
-        </w:rPr>
-      </w:pPr>
-    </w:p>
-    <w:p>
-      <w:pPr>
-        <w:rPr>
-          <w:sz w:val="28"/>
-          <w:szCs w:val="36"/>
-        </w:rPr>
-      </w:pPr>
+      <w:r>
+        <w:rPr>
+          <w:rFonts w:ascii="Consolas" w:eastAsia="Times New Roman" w:hAnsi="Consolas" w:cs="Times New Roman"/>
+          <w:color w:val="E9F284"/>
+          <w:sz w:val="23"/>
+          <w:szCs w:val="23"/>
+          <w:lang w:eastAsia="pt-BR"/>
+        </w:rPr>
+        <w:t>"</w:t>
+      </w:r>
+      <w:r>
+        <w:rPr>
+          <w:rFonts w:ascii="Consolas" w:eastAsia="Times New Roman" w:hAnsi="Consolas" w:cs="Times New Roman"/>
+          <w:color w:val="F8F8F2"/>
+          <w:sz w:val="23"/>
+          <w:szCs w:val="23"/>
+          <w:lang w:eastAsia="pt-BR"/>
+        </w:rPr>
+        <w:t>)</w:t>
+      </w:r>
+    </w:p>
+    <w:p>
+      <w:pPr>
+        <w:rPr>
+          <w:sz w:val="28"/>
+          <w:szCs w:val="36"/>
+        </w:rPr>
+      </w:pPr>
+    </w:p>
+    <w:p>
+      <w:pPr>
+        <w:rPr>
+          <w:sz w:val="28"/>
+          <w:szCs w:val="36"/>
+        </w:rPr>
+      </w:pPr>
+      <w:r>
+        <w:rPr>
+          <w:sz w:val="28"/>
+          <w:szCs w:val="36"/>
+        </w:rPr>
+        <w:t xml:space="preserve">Pegar tal </w:t>
+      </w:r>
+      <w:proofErr w:type="spellStart"/>
+      <w:r>
+        <w:rPr>
+          <w:sz w:val="28"/>
+          <w:szCs w:val="36"/>
+        </w:rPr>
+        <w:t>tag</w:t>
+      </w:r>
+      <w:proofErr w:type="spellEnd"/>
+      <w:r>
+        <w:rPr>
+          <w:sz w:val="28"/>
+          <w:szCs w:val="36"/>
+        </w:rPr>
+        <w:t xml:space="preserve"> que </w:t>
+      </w:r>
+      <w:proofErr w:type="spellStart"/>
+      <w:r>
+        <w:rPr>
+          <w:sz w:val="28"/>
+          <w:szCs w:val="36"/>
+        </w:rPr>
+        <w:t>esta</w:t>
+      </w:r>
+      <w:proofErr w:type="spellEnd"/>
+      <w:r>
+        <w:rPr>
+          <w:sz w:val="28"/>
+          <w:szCs w:val="36"/>
+        </w:rPr>
+        <w:t xml:space="preserve"> dentro de outra </w:t>
+      </w:r>
+      <w:proofErr w:type="spellStart"/>
+      <w:r>
+        <w:rPr>
+          <w:sz w:val="28"/>
+          <w:szCs w:val="36"/>
+        </w:rPr>
+        <w:t>tag</w:t>
+      </w:r>
+      <w:proofErr w:type="spellEnd"/>
+      <w:r>
+        <w:rPr>
+          <w:sz w:val="28"/>
+          <w:szCs w:val="36"/>
+        </w:rPr>
+        <w:t xml:space="preserve">; </w:t>
+      </w:r>
+      <w:proofErr w:type="spellStart"/>
+      <w:r>
+        <w:rPr>
+          <w:sz w:val="28"/>
+          <w:szCs w:val="36"/>
+        </w:rPr>
+        <w:t>div</w:t>
+      </w:r>
+      <w:proofErr w:type="spellEnd"/>
+      <w:r>
+        <w:rPr>
+          <w:sz w:val="28"/>
+          <w:szCs w:val="36"/>
+        </w:rPr>
+        <w:t xml:space="preserve"> e p</w:t>
+      </w:r>
       <w:bookmarkStart w:id="1" w:name="_GoBack"/>
       <w:bookmarkEnd w:id="1"/>
-      <w:r>
-        <w:rPr>
-          <w:sz w:val="28"/>
-          <w:szCs w:val="36"/>
-        </w:rPr>
-        <w:t xml:space="preserve">Para fazer sendo uma constante: </w:t>
-      </w:r>
     </w:p>
     <w:p>
       <w:pPr>
@@ -11885,7 +14137,7 @@
           <w:szCs w:val="23"/>
           <w:lang w:eastAsia="pt-BR"/>
         </w:rPr>
-        <w:t>colecaoHTML</w:t>
+        <w:t>queryExemplo</w:t>
       </w:r>
       <w:proofErr w:type="spellEnd"/>
       <w:r>
@@ -11916,17 +14168,7 @@
           <w:szCs w:val="23"/>
           <w:lang w:eastAsia="pt-BR"/>
         </w:rPr>
-        <w:t xml:space="preserve"> [</w:t>
-      </w:r>
-      <w:r>
-        <w:rPr>
-          <w:rFonts w:ascii="Consolas" w:eastAsia="Times New Roman" w:hAnsi="Consolas" w:cs="Times New Roman"/>
-          <w:color w:val="FF79C6"/>
-          <w:sz w:val="23"/>
-          <w:szCs w:val="23"/>
-          <w:lang w:eastAsia="pt-BR"/>
-        </w:rPr>
-        <w:t>...</w:t>
+        <w:t xml:space="preserve"> </w:t>
       </w:r>
       <w:proofErr w:type="spellStart"/>
       <w:proofErr w:type="gramStart"/>
@@ -11958,7 +14200,7 @@
           <w:szCs w:val="23"/>
           <w:lang w:eastAsia="pt-BR"/>
         </w:rPr>
-        <w:t>getElementsByTagName</w:t>
+        <w:t>querySelectorAll</w:t>
       </w:r>
       <w:proofErr w:type="spellEnd"/>
       <w:proofErr w:type="gramEnd"/>
@@ -11997,6 +14239,16 @@
       <w:r>
         <w:rPr>
           <w:rFonts w:ascii="Consolas" w:eastAsia="Times New Roman" w:hAnsi="Consolas" w:cs="Times New Roman"/>
+          <w:color w:val="F1FA8C"/>
+          <w:sz w:val="23"/>
+          <w:szCs w:val="23"/>
+          <w:lang w:eastAsia="pt-BR"/>
+        </w:rPr>
+        <w:t xml:space="preserve"> &gt; p</w:t>
+      </w:r>
+      <w:r>
+        <w:rPr>
+          <w:rFonts w:ascii="Consolas" w:eastAsia="Times New Roman" w:hAnsi="Consolas" w:cs="Times New Roman"/>
           <w:color w:val="E9F284"/>
           <w:sz w:val="23"/>
           <w:szCs w:val="23"/>
@@ -12012,40 +14264,29 @@
           <w:szCs w:val="23"/>
           <w:lang w:eastAsia="pt-BR"/>
         </w:rPr>
-        <w:t>)]</w:t>
-      </w:r>
-    </w:p>
-    <w:p>
-      <w:pPr>
-        <w:rPr>
-          <w:sz w:val="28"/>
-          <w:szCs w:val="36"/>
-        </w:rPr>
-      </w:pPr>
-    </w:p>
-    <w:p>
-      <w:pPr>
-        <w:rPr>
-          <w:color w:val="FF0000"/>
-          <w:sz w:val="36"/>
-          <w:szCs w:val="36"/>
-        </w:rPr>
-      </w:pPr>
-    </w:p>
-    <w:p>
-      <w:pPr>
-        <w:rPr>
-          <w:color w:val="FF0000"/>
-          <w:sz w:val="36"/>
-          <w:szCs w:val="36"/>
-        </w:rPr>
-      </w:pPr>
-    </w:p>
-    <w:p>
-      <w:pPr>
-        <w:rPr>
-          <w:color w:val="FF0000"/>
-          <w:sz w:val="36"/>
+        <w:t>)</w:t>
+      </w:r>
+    </w:p>
+    <w:p>
+      <w:pPr>
+        <w:rPr>
+          <w:sz w:val="28"/>
+          <w:szCs w:val="36"/>
+        </w:rPr>
+      </w:pPr>
+    </w:p>
+    <w:p>
+      <w:pPr>
+        <w:rPr>
+          <w:sz w:val="28"/>
+          <w:szCs w:val="36"/>
+        </w:rPr>
+      </w:pPr>
+    </w:p>
+    <w:p>
+      <w:pPr>
+        <w:rPr>
+          <w:sz w:val="28"/>
           <w:szCs w:val="36"/>
         </w:rPr>
       </w:pPr>
@@ -13223,7 +15464,7 @@
   <w:style w:type="paragraph" w:default="1" w:styleId="Normal">
     <w:name w:val="Normal"/>
     <w:qFormat/>
-    <w:rsid w:val="00E81D61"/>
+    <w:rsid w:val="00253E0E"/>
   </w:style>
   <w:style w:type="paragraph" w:styleId="Ttulo3">
     <w:name w:val="heading 3"/>

</xml_diff>